<commit_message>
User + Auth API contracts and DTO
</commit_message>
<xml_diff>
--- a/docs/ProjectDoc.docx
+++ b/docs/ProjectDoc.docx
@@ -1,6 +1,6 @@
 
 <file path=word/document.xml><?xml version="1.0" encoding="utf-8"?>
-<w:document xmlns:wpc="http://schemas.microsoft.com/office/word/2010/wordprocessingCanvas" xmlns:cx="http://schemas.microsoft.com/office/drawing/2014/chartex" xmlns:cx1="http://schemas.microsoft.com/office/drawing/2015/9/8/chartex" xmlns:cx2="http://schemas.microsoft.com/office/drawing/2015/10/21/chartex" xmlns:cx3="http://schemas.microsoft.com/office/drawing/2016/5/9/chartex" xmlns:cx4="http://schemas.microsoft.com/office/drawing/2016/5/10/chartex" xmlns:cx5="http://schemas.microsoft.com/office/drawing/2016/5/11/chartex" xmlns:cx6="http://schemas.microsoft.com/office/drawing/2016/5/12/chartex" xmlns:cx7="http://schemas.microsoft.com/office/drawing/2016/5/13/chartex" xmlns:cx8="http://schemas.microsoft.com/office/drawing/2016/5/14/chartex" xmlns:mc="http://schemas.openxmlformats.org/markup-compatibility/2006" xmlns:aink="http://schemas.microsoft.com/office/drawing/2016/ink" xmlns:am3d="http://schemas.microsoft.com/office/drawing/2017/model3d" xmlns:o="urn:schemas-microsoft-com:office:office" xmlns:r="http://schemas.openxmlformats.org/officeDocument/2006/relationships" xmlns:m="http://schemas.openxmlformats.org/officeDocument/2006/math" xmlns:v="urn:schemas-microsoft-com:vml" xmlns:wp14="http://schemas.microsoft.com/office/word/2010/wordprocessingDrawing" xmlns:wp="http://schemas.openxmlformats.org/drawingml/2006/wordprocessingDrawing" xmlns:w10="urn:schemas-microsoft-com:office:word" xmlns:w="http://schemas.openxmlformats.org/wordprocessingml/2006/main" xmlns:w14="http://schemas.microsoft.com/office/word/2010/wordml" xmlns:w15="http://schemas.microsoft.com/office/word/2012/wordml" xmlns:w16cex="http://schemas.microsoft.com/office/word/2018/wordml/cex" xmlns:w16cid="http://schemas.microsoft.com/office/word/2016/wordml/cid" xmlns:w16="http://schemas.microsoft.com/office/word/2018/wordml" xmlns:w16sdtdh="http://schemas.microsoft.com/office/word/2020/wordml/sdtdatahash" xmlns:w16se="http://schemas.microsoft.com/office/word/2015/wordml/symex" xmlns:wpg="http://schemas.microsoft.com/office/word/2010/wordprocessingGroup" xmlns:wpi="http://schemas.microsoft.com/office/word/2010/wordprocessingInk" xmlns:wne="http://schemas.microsoft.com/office/word/2006/wordml" xmlns:wps="http://schemas.microsoft.com/office/word/2010/wordprocessingShape" mc:Ignorable="w14 w15 w16se w16cid w16 w16cex w16sdtdh wp14">
+<w:document xmlns:wpc="http://schemas.microsoft.com/office/word/2010/wordprocessingCanvas" xmlns:cx="http://schemas.microsoft.com/office/drawing/2014/chartex" xmlns:cx1="http://schemas.microsoft.com/office/drawing/2015/9/8/chartex" xmlns:cx2="http://schemas.microsoft.com/office/drawing/2015/10/21/chartex" xmlns:cx3="http://schemas.microsoft.com/office/drawing/2016/5/9/chartex" xmlns:cx4="http://schemas.microsoft.com/office/drawing/2016/5/10/chartex" xmlns:cx5="http://schemas.microsoft.com/office/drawing/2016/5/11/chartex" xmlns:cx6="http://schemas.microsoft.com/office/drawing/2016/5/12/chartex" xmlns:cx7="http://schemas.microsoft.com/office/drawing/2016/5/13/chartex" xmlns:cx8="http://schemas.microsoft.com/office/drawing/2016/5/14/chartex" xmlns:mc="http://schemas.openxmlformats.org/markup-compatibility/2006" xmlns:aink="http://schemas.microsoft.com/office/drawing/2016/ink" xmlns:am3d="http://schemas.microsoft.com/office/drawing/2017/model3d" xmlns:o="urn:schemas-microsoft-com:office:office" xmlns:oel="http://schemas.microsoft.com/office/2019/extlst" xmlns:r="http://schemas.openxmlformats.org/officeDocument/2006/relationships" xmlns:m="http://schemas.openxmlformats.org/officeDocument/2006/math" xmlns:v="urn:schemas-microsoft-com:vml" xmlns:wp14="http://schemas.microsoft.com/office/word/2010/wordprocessingDrawing" xmlns:wp="http://schemas.openxmlformats.org/drawingml/2006/wordprocessingDrawing" xmlns:w10="urn:schemas-microsoft-com:office:word" xmlns:w="http://schemas.openxmlformats.org/wordprocessingml/2006/main" xmlns:w14="http://schemas.microsoft.com/office/word/2010/wordml" xmlns:w15="http://schemas.microsoft.com/office/word/2012/wordml" xmlns:w16cex="http://schemas.microsoft.com/office/word/2018/wordml/cex" xmlns:w16cid="http://schemas.microsoft.com/office/word/2016/wordml/cid" xmlns:w16="http://schemas.microsoft.com/office/word/2018/wordml" xmlns:w16du="http://schemas.microsoft.com/office/word/2023/wordml/word16du" xmlns:w16sdtdh="http://schemas.microsoft.com/office/word/2020/wordml/sdtdatahash" xmlns:w16sdtfl="http://schemas.microsoft.com/office/word/2024/wordml/sdtformatlock" xmlns:w16se="http://schemas.microsoft.com/office/word/2015/wordml/symex" xmlns:wpg="http://schemas.microsoft.com/office/word/2010/wordprocessingGroup" xmlns:wpi="http://schemas.microsoft.com/office/word/2010/wordprocessingInk" xmlns:wne="http://schemas.microsoft.com/office/word/2006/wordml" xmlns:wps="http://schemas.microsoft.com/office/word/2010/wordprocessingShape" mc:Ignorable="w14 w15 w16se w16cid w16 w16cex w16sdtdh w16sdtfl w16du wp14">
   <w:body>
     <w:p>
       <w:pPr>
@@ -4816,46 +4816,1176 @@
     </w:p>
     <w:p>
       <w:pPr>
-        <w:pStyle w:val="NormalWeb"/>
-      </w:pPr>
-    </w:p>
-    <w:p>
-      <w:pPr>
-        <w:pStyle w:val="NormalWeb"/>
-      </w:pPr>
-    </w:p>
-    <w:p>
-      <w:pPr>
-        <w:pStyle w:val="NormalWeb"/>
-      </w:pPr>
-    </w:p>
-    <w:p>
-      <w:pPr>
-        <w:rPr>
-          <w:lang w:val="ru-RU"/>
-        </w:rPr>
-      </w:pPr>
-    </w:p>
-    <w:p>
-      <w:pPr>
-        <w:rPr>
-          <w:lang w:val="ru-RU"/>
-        </w:rPr>
-      </w:pPr>
-    </w:p>
-    <w:p>
-      <w:pPr>
-        <w:rPr>
-          <w:lang w:val="ru-RU"/>
-        </w:rPr>
-      </w:pPr>
-    </w:p>
-    <w:p>
-      <w:pPr>
-        <w:rPr>
-          <w:lang w:val="ru-RU"/>
-        </w:rPr>
-      </w:pPr>
+        <w:pStyle w:val="Heading2"/>
+        <w:rPr>
+          <w:lang w:val="ru-RU"/>
+        </w:rPr>
+      </w:pPr>
+      <w:r>
+        <w:rPr>
+          <w:lang w:val="ru-RU"/>
+        </w:rPr>
+        <w:t xml:space="preserve">Проектирование </w:t>
+      </w:r>
+      <w:r>
+        <w:rPr>
+          <w:lang w:val="en-US"/>
+        </w:rPr>
+        <w:t>API</w:t>
+      </w:r>
+      <w:r>
+        <w:rPr>
+          <w:lang w:val="ru-RU"/>
+        </w:rPr>
+        <w:t xml:space="preserve"> + </w:t>
+      </w:r>
+      <w:r>
+        <w:rPr>
+          <w:lang w:val="en-US"/>
+        </w:rPr>
+        <w:t>DTO</w:t>
+      </w:r>
+      <w:r>
+        <w:rPr>
+          <w:lang w:val="ru-RU"/>
+        </w:rPr>
+        <w:t xml:space="preserve"> </w:t>
+      </w:r>
+      <w:r>
+        <w:rPr>
+          <w:lang w:val="ru-RU"/>
+        </w:rPr>
+        <w:t>по ресурсам</w:t>
+      </w:r>
+    </w:p>
+    <w:p>
+      <w:pPr>
+        <w:rPr>
+          <w:b/>
+          <w:bCs/>
+          <w:lang w:val="en-US"/>
+        </w:rPr>
+      </w:pPr>
+      <w:r>
+        <w:rPr>
+          <w:b/>
+          <w:bCs/>
+          <w:lang w:val="en-US"/>
+        </w:rPr>
+        <w:t>Auth</w:t>
+      </w:r>
+      <w:r>
+        <w:rPr>
+          <w:b/>
+          <w:bCs/>
+          <w:lang w:val="ru-RU"/>
+        </w:rPr>
+        <w:t xml:space="preserve"> </w:t>
+      </w:r>
+    </w:p>
+    <w:p>
+      <w:pPr>
+        <w:rPr>
+          <w:lang w:val="en-US"/>
+        </w:rPr>
+      </w:pPr>
+      <w:r>
+        <w:rPr>
+          <w:lang w:val="en-US"/>
+        </w:rPr>
+        <w:t>Api contracts</w:t>
+      </w:r>
+    </w:p>
+    <w:p>
+      <w:pPr>
+        <w:pStyle w:val="ListParagraph"/>
+        <w:numPr>
+          <w:ilvl w:val="0"/>
+          <w:numId w:val="41"/>
+        </w:numPr>
+        <w:rPr>
+          <w:lang w:val="ru-RU"/>
+        </w:rPr>
+      </w:pPr>
+      <w:r>
+        <w:rPr>
+          <w:lang w:val="en-US"/>
+        </w:rPr>
+        <w:t>POST</w:t>
+      </w:r>
+      <w:r>
+        <w:rPr>
+          <w:lang w:val="ru-RU"/>
+        </w:rPr>
+        <w:t xml:space="preserve"> /</w:t>
+      </w:r>
+      <w:r>
+        <w:rPr>
+          <w:lang w:val="en-US"/>
+        </w:rPr>
+        <w:t>api</w:t>
+      </w:r>
+      <w:r>
+        <w:rPr>
+          <w:lang w:val="ru-RU"/>
+        </w:rPr>
+        <w:t>/</w:t>
+      </w:r>
+      <w:r>
+        <w:rPr>
+          <w:lang w:val="en-US"/>
+        </w:rPr>
+        <w:t>auth</w:t>
+      </w:r>
+      <w:r>
+        <w:rPr>
+          <w:lang w:val="ru-RU"/>
+        </w:rPr>
+        <w:t>/</w:t>
+      </w:r>
+      <w:r>
+        <w:rPr>
+          <w:lang w:val="en-US"/>
+        </w:rPr>
+        <w:t>register</w:t>
+      </w:r>
+      <w:r>
+        <w:rPr>
+          <w:lang w:val="ru-RU"/>
+        </w:rPr>
+        <w:t xml:space="preserve"> – регистрация пользователя</w:t>
+      </w:r>
+      <w:r>
+        <w:rPr>
+          <w:lang w:val="ru-RU"/>
+        </w:rPr>
+        <w:t xml:space="preserve"> (в тч роль)</w:t>
+      </w:r>
+    </w:p>
+    <w:p>
+      <w:pPr>
+        <w:pStyle w:val="ListParagraph"/>
+        <w:numPr>
+          <w:ilvl w:val="0"/>
+          <w:numId w:val="41"/>
+        </w:numPr>
+        <w:rPr>
+          <w:lang w:val="en-US"/>
+        </w:rPr>
+      </w:pPr>
+      <w:r>
+        <w:rPr>
+          <w:lang w:val="en-US"/>
+        </w:rPr>
+        <w:t xml:space="preserve">POST </w:t>
+      </w:r>
+      <w:r>
+        <w:rPr>
+          <w:lang w:val="en-US"/>
+        </w:rPr>
+        <w:t>/api/</w:t>
+      </w:r>
+      <w:r>
+        <w:rPr>
+          <w:lang w:val="en-US"/>
+        </w:rPr>
+        <w:t xml:space="preserve">auth/login – </w:t>
+      </w:r>
+      <w:r>
+        <w:rPr>
+          <w:lang w:val="ru-RU"/>
+        </w:rPr>
+        <w:t>вход</w:t>
+      </w:r>
+      <w:r>
+        <w:rPr>
+          <w:lang w:val="en-US"/>
+        </w:rPr>
+        <w:t xml:space="preserve"> </w:t>
+      </w:r>
+      <w:r>
+        <w:rPr>
+          <w:lang w:val="ru-RU"/>
+        </w:rPr>
+        <w:t>в</w:t>
+      </w:r>
+      <w:r>
+        <w:rPr>
+          <w:lang w:val="en-US"/>
+        </w:rPr>
+        <w:t xml:space="preserve"> </w:t>
+      </w:r>
+      <w:r>
+        <w:rPr>
+          <w:lang w:val="ru-RU"/>
+        </w:rPr>
+        <w:t>систему</w:t>
+      </w:r>
+    </w:p>
+    <w:p>
+      <w:pPr>
+        <w:rPr>
+          <w:lang w:val="ru-RU"/>
+        </w:rPr>
+      </w:pPr>
+      <w:r>
+        <w:rPr>
+          <w:lang w:val="ru-RU"/>
+        </w:rPr>
+        <w:t xml:space="preserve">Проверять уникальность </w:t>
+      </w:r>
+      <w:r>
+        <w:rPr>
+          <w:lang w:val="en-US"/>
+        </w:rPr>
+        <w:t>login</w:t>
+      </w:r>
+      <w:r>
+        <w:rPr>
+          <w:lang w:val="ru-RU"/>
+        </w:rPr>
+        <w:t xml:space="preserve"> при регистрации</w:t>
+      </w:r>
+    </w:p>
+    <w:p>
+      <w:pPr>
+        <w:rPr>
+          <w:lang w:val="en-US"/>
+        </w:rPr>
+      </w:pPr>
+      <w:r>
+        <w:rPr>
+          <w:lang w:val="en-US"/>
+        </w:rPr>
+        <w:t>Dto</w:t>
+      </w:r>
+    </w:p>
+    <w:p>
+      <w:pPr>
+        <w:rPr>
+          <w:lang w:val="en-US"/>
+        </w:rPr>
+      </w:pPr>
+      <w:r>
+        <w:rPr>
+          <w:lang w:val="en-US"/>
+        </w:rPr>
+        <w:t>RegisterRequest:</w:t>
+      </w:r>
+    </w:p>
+    <w:p>
+      <w:pPr>
+        <w:pStyle w:val="ListParagraph"/>
+        <w:numPr>
+          <w:ilvl w:val="0"/>
+          <w:numId w:val="42"/>
+        </w:numPr>
+        <w:rPr>
+          <w:lang w:val="en-US"/>
+        </w:rPr>
+      </w:pPr>
+      <w:r>
+        <w:rPr>
+          <w:lang w:val="en-US"/>
+        </w:rPr>
+        <w:t>login</w:t>
+      </w:r>
+    </w:p>
+    <w:p>
+      <w:pPr>
+        <w:pStyle w:val="ListParagraph"/>
+        <w:numPr>
+          <w:ilvl w:val="0"/>
+          <w:numId w:val="42"/>
+        </w:numPr>
+        <w:rPr>
+          <w:lang w:val="en-US"/>
+        </w:rPr>
+      </w:pPr>
+      <w:r>
+        <w:rPr>
+          <w:lang w:val="en-US"/>
+        </w:rPr>
+        <w:t>password</w:t>
+      </w:r>
+    </w:p>
+    <w:p>
+      <w:pPr>
+        <w:pStyle w:val="ListParagraph"/>
+        <w:numPr>
+          <w:ilvl w:val="0"/>
+          <w:numId w:val="42"/>
+        </w:numPr>
+        <w:rPr>
+          <w:lang w:val="en-US"/>
+        </w:rPr>
+      </w:pPr>
+      <w:r>
+        <w:rPr>
+          <w:lang w:val="en-US"/>
+        </w:rPr>
+        <w:t>first</w:t>
+      </w:r>
+      <w:r>
+        <w:rPr>
+          <w:lang w:val="en-US"/>
+        </w:rPr>
+        <w:t>N</w:t>
+      </w:r>
+      <w:r>
+        <w:rPr>
+          <w:lang w:val="en-US"/>
+        </w:rPr>
+        <w:t>ame</w:t>
+      </w:r>
+    </w:p>
+    <w:p>
+      <w:pPr>
+        <w:pStyle w:val="ListParagraph"/>
+        <w:numPr>
+          <w:ilvl w:val="0"/>
+          <w:numId w:val="42"/>
+        </w:numPr>
+        <w:rPr>
+          <w:lang w:val="en-US"/>
+        </w:rPr>
+      </w:pPr>
+      <w:r>
+        <w:rPr>
+          <w:lang w:val="en-US"/>
+        </w:rPr>
+        <w:t>last</w:t>
+      </w:r>
+      <w:r>
+        <w:rPr>
+          <w:lang w:val="en-US"/>
+        </w:rPr>
+        <w:t>N</w:t>
+      </w:r>
+      <w:r>
+        <w:rPr>
+          <w:lang w:val="en-US"/>
+        </w:rPr>
+        <w:t>ame</w:t>
+      </w:r>
+    </w:p>
+    <w:p>
+      <w:pPr>
+        <w:pStyle w:val="ListParagraph"/>
+        <w:numPr>
+          <w:ilvl w:val="0"/>
+          <w:numId w:val="42"/>
+        </w:numPr>
+        <w:rPr>
+          <w:lang w:val="en-US"/>
+        </w:rPr>
+      </w:pPr>
+      <w:r>
+        <w:rPr>
+          <w:lang w:val="en-US"/>
+        </w:rPr>
+        <w:t>phone</w:t>
+      </w:r>
+    </w:p>
+    <w:p>
+      <w:pPr>
+        <w:pStyle w:val="ListParagraph"/>
+        <w:numPr>
+          <w:ilvl w:val="0"/>
+          <w:numId w:val="42"/>
+        </w:numPr>
+        <w:rPr>
+          <w:lang w:val="en-US"/>
+        </w:rPr>
+      </w:pPr>
+      <w:r>
+        <w:rPr>
+          <w:lang w:val="en-US"/>
+        </w:rPr>
+        <w:t>role</w:t>
+      </w:r>
+    </w:p>
+    <w:p>
+      <w:pPr>
+        <w:rPr>
+          <w:lang w:val="en-US"/>
+        </w:rPr>
+      </w:pPr>
+      <w:r>
+        <w:rPr>
+          <w:lang w:val="en-US"/>
+        </w:rPr>
+        <w:t>LoginRequest:</w:t>
+      </w:r>
+    </w:p>
+    <w:p>
+      <w:pPr>
+        <w:pStyle w:val="ListParagraph"/>
+        <w:numPr>
+          <w:ilvl w:val="0"/>
+          <w:numId w:val="43"/>
+        </w:numPr>
+        <w:rPr>
+          <w:lang w:val="en-US"/>
+        </w:rPr>
+      </w:pPr>
+      <w:r>
+        <w:rPr>
+          <w:lang w:val="en-US"/>
+        </w:rPr>
+        <w:t>login</w:t>
+      </w:r>
+    </w:p>
+    <w:p>
+      <w:pPr>
+        <w:pStyle w:val="ListParagraph"/>
+        <w:numPr>
+          <w:ilvl w:val="0"/>
+          <w:numId w:val="43"/>
+        </w:numPr>
+        <w:rPr>
+          <w:lang w:val="en-US"/>
+        </w:rPr>
+      </w:pPr>
+      <w:r>
+        <w:rPr>
+          <w:lang w:val="en-US"/>
+        </w:rPr>
+        <w:t>password</w:t>
+      </w:r>
+    </w:p>
+    <w:p>
+      <w:pPr>
+        <w:rPr>
+          <w:lang w:val="en-US"/>
+        </w:rPr>
+      </w:pPr>
+      <w:r>
+        <w:rPr>
+          <w:lang w:val="en-US"/>
+        </w:rPr>
+        <w:t>AuthResponse:</w:t>
+      </w:r>
+    </w:p>
+    <w:p>
+      <w:pPr>
+        <w:pStyle w:val="ListParagraph"/>
+        <w:numPr>
+          <w:ilvl w:val="0"/>
+          <w:numId w:val="44"/>
+        </w:numPr>
+        <w:rPr>
+          <w:lang w:val="en-US"/>
+        </w:rPr>
+      </w:pPr>
+      <w:r>
+        <w:rPr>
+          <w:lang w:val="en-US"/>
+        </w:rPr>
+        <w:t>userId</w:t>
+      </w:r>
+    </w:p>
+    <w:p>
+      <w:pPr>
+        <w:pStyle w:val="ListParagraph"/>
+        <w:numPr>
+          <w:ilvl w:val="0"/>
+          <w:numId w:val="44"/>
+        </w:numPr>
+        <w:rPr>
+          <w:lang w:val="en-US"/>
+        </w:rPr>
+      </w:pPr>
+      <w:r>
+        <w:rPr>
+          <w:lang w:val="en-US"/>
+        </w:rPr>
+        <w:t>login</w:t>
+      </w:r>
+    </w:p>
+    <w:p>
+      <w:pPr>
+        <w:pStyle w:val="ListParagraph"/>
+        <w:numPr>
+          <w:ilvl w:val="0"/>
+          <w:numId w:val="44"/>
+        </w:numPr>
+        <w:rPr>
+          <w:lang w:val="en-US"/>
+        </w:rPr>
+      </w:pPr>
+      <w:r>
+        <w:rPr>
+          <w:lang w:val="en-US"/>
+        </w:rPr>
+        <w:t>role</w:t>
+      </w:r>
+    </w:p>
+    <w:p>
+      <w:pPr>
+        <w:pStyle w:val="ListParagraph"/>
+        <w:numPr>
+          <w:ilvl w:val="0"/>
+          <w:numId w:val="44"/>
+        </w:numPr>
+        <w:rPr>
+          <w:lang w:val="en-US"/>
+        </w:rPr>
+      </w:pPr>
+      <w:r>
+        <w:rPr>
+          <w:lang w:val="en-US"/>
+        </w:rPr>
+        <w:t>token</w:t>
+      </w:r>
+    </w:p>
+    <w:p>
+      <w:pPr>
+        <w:pStyle w:val="ListParagraph"/>
+        <w:rPr>
+          <w:lang w:val="ru-RU"/>
+        </w:rPr>
+      </w:pPr>
+      <w:r>
+        <w:rPr>
+          <w:lang w:val="ru-RU"/>
+        </w:rPr>
+        <w:t>(</w:t>
+      </w:r>
+      <w:r>
+        <w:rPr>
+          <w:lang w:val="ru-RU"/>
+        </w:rPr>
+        <w:t>AuthResponse используется и при регистрации, и при логине</w:t>
+      </w:r>
+      <w:r>
+        <w:rPr>
+          <w:lang w:val="ru-RU"/>
+        </w:rPr>
+        <w:t>)</w:t>
+      </w:r>
+    </w:p>
+    <w:p>
+      <w:pPr>
+        <w:rPr>
+          <w:lang w:val="ru-RU"/>
+        </w:rPr>
+      </w:pPr>
+    </w:p>
+    <w:p>
+      <w:pPr>
+        <w:rPr>
+          <w:b/>
+          <w:bCs/>
+          <w:lang w:val="en-US"/>
+        </w:rPr>
+      </w:pPr>
+      <w:r>
+        <w:rPr>
+          <w:b/>
+          <w:bCs/>
+          <w:lang w:val="en-US"/>
+        </w:rPr>
+        <w:t>Users</w:t>
+      </w:r>
+    </w:p>
+    <w:p>
+      <w:pPr>
+        <w:rPr>
+          <w:lang w:val="en-US"/>
+        </w:rPr>
+      </w:pPr>
+      <w:r>
+        <w:rPr>
+          <w:lang w:val="en-US"/>
+        </w:rPr>
+        <w:t>Api contracts</w:t>
+      </w:r>
+    </w:p>
+    <w:p>
+      <w:pPr>
+        <w:pStyle w:val="ListParagraph"/>
+        <w:numPr>
+          <w:ilvl w:val="0"/>
+          <w:numId w:val="45"/>
+        </w:numPr>
+        <w:rPr>
+          <w:lang w:val="ru-RU"/>
+        </w:rPr>
+      </w:pPr>
+      <w:r>
+        <w:rPr>
+          <w:lang w:val="en-US"/>
+        </w:rPr>
+        <w:t>GET</w:t>
+      </w:r>
+      <w:r>
+        <w:rPr>
+          <w:lang w:val="ru-RU"/>
+        </w:rPr>
+        <w:t xml:space="preserve"> </w:t>
+      </w:r>
+      <w:r>
+        <w:rPr>
+          <w:lang w:val="ru-RU"/>
+        </w:rPr>
+        <w:t>/</w:t>
+      </w:r>
+      <w:r>
+        <w:rPr>
+          <w:lang w:val="en-US"/>
+        </w:rPr>
+        <w:t>api</w:t>
+      </w:r>
+      <w:r>
+        <w:rPr>
+          <w:lang w:val="ru-RU"/>
+        </w:rPr>
+        <w:t>/</w:t>
+      </w:r>
+      <w:r>
+        <w:rPr>
+          <w:lang w:val="en-US"/>
+        </w:rPr>
+        <w:t>users</w:t>
+      </w:r>
+      <w:r>
+        <w:rPr>
+          <w:lang w:val="ru-RU"/>
+        </w:rPr>
+        <w:t>/</w:t>
+      </w:r>
+      <w:r>
+        <w:rPr>
+          <w:lang w:val="en-US"/>
+        </w:rPr>
+        <w:t>me</w:t>
+      </w:r>
+      <w:r>
+        <w:rPr>
+          <w:lang w:val="ru-RU"/>
+        </w:rPr>
+        <w:t xml:space="preserve"> - получение данных текущего пользователя</w:t>
+      </w:r>
+    </w:p>
+    <w:p>
+      <w:pPr>
+        <w:pStyle w:val="ListParagraph"/>
+        <w:numPr>
+          <w:ilvl w:val="0"/>
+          <w:numId w:val="45"/>
+        </w:numPr>
+        <w:rPr>
+          <w:lang w:val="ru-RU"/>
+        </w:rPr>
+      </w:pPr>
+      <w:r>
+        <w:rPr>
+          <w:lang w:val="en-US"/>
+        </w:rPr>
+        <w:t>PATCH</w:t>
+      </w:r>
+      <w:r>
+        <w:rPr>
+          <w:lang w:val="ru-RU"/>
+        </w:rPr>
+        <w:t xml:space="preserve"> </w:t>
+      </w:r>
+      <w:r>
+        <w:rPr>
+          <w:lang w:val="ru-RU"/>
+        </w:rPr>
+        <w:t>/</w:t>
+      </w:r>
+      <w:r>
+        <w:rPr>
+          <w:lang w:val="en-US"/>
+        </w:rPr>
+        <w:t>api</w:t>
+      </w:r>
+      <w:r>
+        <w:rPr>
+          <w:lang w:val="ru-RU"/>
+        </w:rPr>
+        <w:t>/</w:t>
+      </w:r>
+      <w:r>
+        <w:rPr>
+          <w:lang w:val="en-US"/>
+        </w:rPr>
+        <w:t>users</w:t>
+      </w:r>
+      <w:r>
+        <w:rPr>
+          <w:lang w:val="ru-RU"/>
+        </w:rPr>
+        <w:t>/</w:t>
+      </w:r>
+      <w:r>
+        <w:rPr>
+          <w:lang w:val="en-US"/>
+        </w:rPr>
+        <w:t>me</w:t>
+      </w:r>
+      <w:r>
+        <w:rPr>
+          <w:lang w:val="ru-RU"/>
+        </w:rPr>
+        <w:t xml:space="preserve"> – </w:t>
+      </w:r>
+      <w:r>
+        <w:rPr>
+          <w:lang w:val="ru-RU"/>
+        </w:rPr>
+        <w:t>изменение данных профиля пользователя</w:t>
+      </w:r>
+    </w:p>
+    <w:p>
+      <w:pPr>
+        <w:pStyle w:val="ListParagraph"/>
+        <w:numPr>
+          <w:ilvl w:val="0"/>
+          <w:numId w:val="45"/>
+        </w:numPr>
+        <w:rPr>
+          <w:lang w:val="ru-RU"/>
+        </w:rPr>
+      </w:pPr>
+      <w:r>
+        <w:rPr>
+          <w:lang w:val="en-US"/>
+        </w:rPr>
+        <w:t>PATCH</w:t>
+      </w:r>
+      <w:r>
+        <w:rPr>
+          <w:lang w:val="ru-RU"/>
+        </w:rPr>
+        <w:t xml:space="preserve"> /</w:t>
+      </w:r>
+      <w:r>
+        <w:rPr>
+          <w:lang w:val="en-US"/>
+        </w:rPr>
+        <w:t>api</w:t>
+      </w:r>
+      <w:r>
+        <w:rPr>
+          <w:lang w:val="ru-RU"/>
+        </w:rPr>
+        <w:t>/</w:t>
+      </w:r>
+      <w:r>
+        <w:rPr>
+          <w:lang w:val="en-US"/>
+        </w:rPr>
+        <w:t>users</w:t>
+      </w:r>
+      <w:r>
+        <w:rPr>
+          <w:lang w:val="ru-RU"/>
+        </w:rPr>
+        <w:t>/</w:t>
+      </w:r>
+      <w:r>
+        <w:rPr>
+          <w:lang w:val="en-US"/>
+        </w:rPr>
+        <w:t>me</w:t>
+      </w:r>
+      <w:r>
+        <w:rPr>
+          <w:lang w:val="ru-RU"/>
+        </w:rPr>
+        <w:t>/</w:t>
+      </w:r>
+      <w:r>
+        <w:rPr>
+          <w:lang w:val="en-US"/>
+        </w:rPr>
+        <w:t>password</w:t>
+      </w:r>
+      <w:r>
+        <w:rPr>
+          <w:lang w:val="ru-RU"/>
+        </w:rPr>
+        <w:t xml:space="preserve"> – </w:t>
+      </w:r>
+      <w:r>
+        <w:rPr>
+          <w:lang w:val="ru-RU"/>
+        </w:rPr>
+        <w:t>изменение</w:t>
+      </w:r>
+      <w:r>
+        <w:rPr>
+          <w:lang w:val="ru-RU"/>
+        </w:rPr>
+        <w:t xml:space="preserve"> </w:t>
+      </w:r>
+      <w:r>
+        <w:rPr>
+          <w:lang w:val="ru-RU"/>
+        </w:rPr>
+        <w:t>пароля пользователя</w:t>
+      </w:r>
+    </w:p>
+    <w:p>
+      <w:pPr>
+        <w:pStyle w:val="ListParagraph"/>
+        <w:rPr>
+          <w:lang w:val="ru-RU"/>
+        </w:rPr>
+      </w:pPr>
+      <w:r>
+        <w:rPr>
+          <w:lang w:val="ru-RU"/>
+        </w:rPr>
+        <w:lastRenderedPageBreak/>
+        <w:t>(не возвращает ничего, просто подтверждает успешное изменение пароля)</w:t>
+      </w:r>
+    </w:p>
+    <w:p>
+      <w:pPr>
+        <w:rPr>
+          <w:lang w:val="en-US"/>
+        </w:rPr>
+      </w:pPr>
+      <w:r>
+        <w:rPr>
+          <w:lang w:val="en-US"/>
+        </w:rPr>
+        <w:t>DTO</w:t>
+      </w:r>
+    </w:p>
+    <w:p>
+      <w:pPr>
+        <w:rPr>
+          <w:lang w:val="en-US"/>
+        </w:rPr>
+      </w:pPr>
+      <w:r>
+        <w:rPr>
+          <w:lang w:val="en-US"/>
+        </w:rPr>
+        <w:t>UserProfileResponse</w:t>
+      </w:r>
+    </w:p>
+    <w:p>
+      <w:pPr>
+        <w:pStyle w:val="ListParagraph"/>
+        <w:numPr>
+          <w:ilvl w:val="0"/>
+          <w:numId w:val="46"/>
+        </w:numPr>
+        <w:rPr>
+          <w:lang w:val="en-US"/>
+        </w:rPr>
+      </w:pPr>
+      <w:r>
+        <w:rPr>
+          <w:lang w:val="en-US"/>
+        </w:rPr>
+        <w:t>userId</w:t>
+      </w:r>
+    </w:p>
+    <w:p>
+      <w:pPr>
+        <w:pStyle w:val="ListParagraph"/>
+        <w:numPr>
+          <w:ilvl w:val="0"/>
+          <w:numId w:val="46"/>
+        </w:numPr>
+        <w:rPr>
+          <w:lang w:val="en-US"/>
+        </w:rPr>
+      </w:pPr>
+      <w:r>
+        <w:rPr>
+          <w:lang w:val="en-US"/>
+        </w:rPr>
+        <w:t>login</w:t>
+      </w:r>
+    </w:p>
+    <w:p>
+      <w:pPr>
+        <w:pStyle w:val="ListParagraph"/>
+        <w:numPr>
+          <w:ilvl w:val="0"/>
+          <w:numId w:val="46"/>
+        </w:numPr>
+        <w:rPr>
+          <w:lang w:val="en-US"/>
+        </w:rPr>
+      </w:pPr>
+      <w:r>
+        <w:rPr>
+          <w:lang w:val="en-US"/>
+        </w:rPr>
+        <w:t>firstName</w:t>
+      </w:r>
+    </w:p>
+    <w:p>
+      <w:pPr>
+        <w:pStyle w:val="ListParagraph"/>
+        <w:numPr>
+          <w:ilvl w:val="0"/>
+          <w:numId w:val="46"/>
+        </w:numPr>
+        <w:rPr>
+          <w:lang w:val="en-US"/>
+        </w:rPr>
+      </w:pPr>
+      <w:r>
+        <w:rPr>
+          <w:lang w:val="en-US"/>
+        </w:rPr>
+        <w:t>lastName</w:t>
+      </w:r>
+    </w:p>
+    <w:p>
+      <w:pPr>
+        <w:pStyle w:val="ListParagraph"/>
+        <w:numPr>
+          <w:ilvl w:val="0"/>
+          <w:numId w:val="46"/>
+        </w:numPr>
+        <w:rPr>
+          <w:lang w:val="en-US"/>
+        </w:rPr>
+      </w:pPr>
+      <w:r>
+        <w:rPr>
+          <w:lang w:val="en-US"/>
+        </w:rPr>
+        <w:t>phone</w:t>
+      </w:r>
+    </w:p>
+    <w:p>
+      <w:pPr>
+        <w:pStyle w:val="ListParagraph"/>
+        <w:numPr>
+          <w:ilvl w:val="0"/>
+          <w:numId w:val="46"/>
+        </w:numPr>
+        <w:rPr>
+          <w:lang w:val="en-US"/>
+        </w:rPr>
+      </w:pPr>
+      <w:r>
+        <w:rPr>
+          <w:lang w:val="en-US"/>
+        </w:rPr>
+        <w:t>role</w:t>
+      </w:r>
+    </w:p>
+    <w:p>
+      <w:pPr>
+        <w:pStyle w:val="ListParagraph"/>
+        <w:numPr>
+          <w:ilvl w:val="0"/>
+          <w:numId w:val="46"/>
+        </w:numPr>
+        <w:rPr>
+          <w:lang w:val="en-US"/>
+        </w:rPr>
+      </w:pPr>
+      <w:r>
+        <w:rPr>
+          <w:lang w:val="en-US"/>
+        </w:rPr>
+        <w:t>createdAt</w:t>
+      </w:r>
+    </w:p>
+    <w:p>
+      <w:pPr>
+        <w:pStyle w:val="ListParagraph"/>
+        <w:numPr>
+          <w:ilvl w:val="0"/>
+          <w:numId w:val="46"/>
+        </w:numPr>
+        <w:rPr>
+          <w:lang w:val="en-US"/>
+        </w:rPr>
+      </w:pPr>
+      <w:r>
+        <w:rPr>
+          <w:lang w:val="en-US"/>
+        </w:rPr>
+        <w:t>daysSinceRegistration</w:t>
+      </w:r>
+      <w:r>
+        <w:rPr>
+          <w:lang w:val="ru-RU"/>
+        </w:rPr>
+        <w:t xml:space="preserve"> </w:t>
+      </w:r>
+      <w:r>
+        <w:rPr>
+          <w:lang w:val="ru-RU"/>
+        </w:rPr>
+        <w:t>(рассчитывается)</w:t>
+      </w:r>
+    </w:p>
+    <w:p>
+      <w:pPr>
+        <w:pStyle w:val="ListParagraph"/>
+        <w:numPr>
+          <w:ilvl w:val="0"/>
+          <w:numId w:val="46"/>
+        </w:numPr>
+        <w:rPr>
+          <w:lang w:val="en-US"/>
+        </w:rPr>
+      </w:pPr>
+      <w:r>
+        <w:rPr>
+          <w:lang w:val="en-US"/>
+        </w:rPr>
+        <w:t>completedOrdersCount</w:t>
+      </w:r>
+      <w:r>
+        <w:rPr>
+          <w:lang w:val="ru-RU"/>
+        </w:rPr>
+        <w:t xml:space="preserve"> (рассчитывается)</w:t>
+      </w:r>
+    </w:p>
+    <w:p>
+      <w:pPr>
+        <w:rPr>
+          <w:lang w:val="en-US"/>
+        </w:rPr>
+      </w:pPr>
+      <w:r>
+        <w:rPr>
+          <w:lang w:val="en-US"/>
+        </w:rPr>
+        <w:t>UpdateUserProfileRequest</w:t>
+      </w:r>
+    </w:p>
+    <w:p>
+      <w:pPr>
+        <w:pStyle w:val="ListParagraph"/>
+        <w:numPr>
+          <w:ilvl w:val="0"/>
+          <w:numId w:val="47"/>
+        </w:numPr>
+        <w:rPr>
+          <w:lang w:val="en-US"/>
+        </w:rPr>
+      </w:pPr>
+      <w:r>
+        <w:rPr>
+          <w:lang w:val="en-US"/>
+        </w:rPr>
+        <w:t>firstName</w:t>
+      </w:r>
+    </w:p>
+    <w:p>
+      <w:pPr>
+        <w:pStyle w:val="ListParagraph"/>
+        <w:numPr>
+          <w:ilvl w:val="0"/>
+          <w:numId w:val="47"/>
+        </w:numPr>
+        <w:rPr>
+          <w:lang w:val="en-US"/>
+        </w:rPr>
+      </w:pPr>
+      <w:r>
+        <w:rPr>
+          <w:lang w:val="en-US"/>
+        </w:rPr>
+        <w:t>lastName</w:t>
+      </w:r>
+    </w:p>
+    <w:p>
+      <w:pPr>
+        <w:pStyle w:val="ListParagraph"/>
+        <w:numPr>
+          <w:ilvl w:val="0"/>
+          <w:numId w:val="47"/>
+        </w:numPr>
+        <w:rPr>
+          <w:lang w:val="en-US"/>
+        </w:rPr>
+      </w:pPr>
+      <w:r>
+        <w:rPr>
+          <w:lang w:val="en-US"/>
+        </w:rPr>
+        <w:t>phone</w:t>
+      </w:r>
+    </w:p>
+    <w:p>
+      <w:pPr>
+        <w:pStyle w:val="ListParagraph"/>
+        <w:rPr>
+          <w:lang w:val="en-US"/>
+        </w:rPr>
+      </w:pPr>
+      <w:r>
+        <w:rPr>
+          <w:lang w:val="en-US"/>
+        </w:rPr>
+        <w:t>(</w:t>
+      </w:r>
+      <w:r>
+        <w:rPr>
+          <w:lang w:val="ru-RU"/>
+        </w:rPr>
+        <w:t>все поля опциональны)</w:t>
+      </w:r>
+    </w:p>
+    <w:p>
+      <w:pPr>
+        <w:rPr>
+          <w:lang w:val="en-US"/>
+        </w:rPr>
+      </w:pPr>
+      <w:r>
+        <w:rPr>
+          <w:lang w:val="en-US"/>
+        </w:rPr>
+        <w:t>ChangePasswordRequest</w:t>
+      </w:r>
+    </w:p>
+    <w:p>
+      <w:pPr>
+        <w:pStyle w:val="ListParagraph"/>
+        <w:numPr>
+          <w:ilvl w:val="0"/>
+          <w:numId w:val="48"/>
+        </w:numPr>
+        <w:rPr>
+          <w:lang w:val="en-US"/>
+        </w:rPr>
+      </w:pPr>
+      <w:r>
+        <w:rPr>
+          <w:lang w:val="en-US"/>
+        </w:rPr>
+        <w:t>currentPassword</w:t>
+      </w:r>
+    </w:p>
+    <w:p>
+      <w:pPr>
+        <w:pStyle w:val="ListParagraph"/>
+        <w:numPr>
+          <w:ilvl w:val="0"/>
+          <w:numId w:val="48"/>
+        </w:numPr>
+        <w:rPr>
+          <w:lang w:val="en-US"/>
+        </w:rPr>
+      </w:pPr>
+      <w:r>
+        <w:rPr>
+          <w:lang w:val="en-US"/>
+        </w:rPr>
+        <w:t>newPassword</w:t>
+      </w:r>
     </w:p>
     <w:p>
       <w:pPr>
@@ -4916,7 +6046,7 @@
 </file>
 
 <file path=word/numbering.xml><?xml version="1.0" encoding="utf-8"?>
-<w:numbering xmlns:wpc="http://schemas.microsoft.com/office/word/2010/wordprocessingCanvas" xmlns:cx="http://schemas.microsoft.com/office/drawing/2014/chartex" xmlns:cx1="http://schemas.microsoft.com/office/drawing/2015/9/8/chartex" xmlns:cx2="http://schemas.microsoft.com/office/drawing/2015/10/21/chartex" xmlns:cx3="http://schemas.microsoft.com/office/drawing/2016/5/9/chartex" xmlns:cx4="http://schemas.microsoft.com/office/drawing/2016/5/10/chartex" xmlns:cx5="http://schemas.microsoft.com/office/drawing/2016/5/11/chartex" xmlns:cx6="http://schemas.microsoft.com/office/drawing/2016/5/12/chartex" xmlns:cx7="http://schemas.microsoft.com/office/drawing/2016/5/13/chartex" xmlns:cx8="http://schemas.microsoft.com/office/drawing/2016/5/14/chartex" xmlns:mc="http://schemas.openxmlformats.org/markup-compatibility/2006" xmlns:aink="http://schemas.microsoft.com/office/drawing/2016/ink" xmlns:am3d="http://schemas.microsoft.com/office/drawing/2017/model3d" xmlns:o="urn:schemas-microsoft-com:office:office" xmlns:r="http://schemas.openxmlformats.org/officeDocument/2006/relationships" xmlns:m="http://schemas.openxmlformats.org/officeDocument/2006/math" xmlns:v="urn:schemas-microsoft-com:vml" xmlns:wp14="http://schemas.microsoft.com/office/word/2010/wordprocessingDrawing" xmlns:wp="http://schemas.openxmlformats.org/drawingml/2006/wordprocessingDrawing" xmlns:w10="urn:schemas-microsoft-com:office:word" xmlns:w="http://schemas.openxmlformats.org/wordprocessingml/2006/main" xmlns:w14="http://schemas.microsoft.com/office/word/2010/wordml" xmlns:w15="http://schemas.microsoft.com/office/word/2012/wordml" xmlns:w16cex="http://schemas.microsoft.com/office/word/2018/wordml/cex" xmlns:w16cid="http://schemas.microsoft.com/office/word/2016/wordml/cid" xmlns:w16="http://schemas.microsoft.com/office/word/2018/wordml" xmlns:w16sdtdh="http://schemas.microsoft.com/office/word/2020/wordml/sdtdatahash" xmlns:w16se="http://schemas.microsoft.com/office/word/2015/wordml/symex" xmlns:wpg="http://schemas.microsoft.com/office/word/2010/wordprocessingGroup" xmlns:wpi="http://schemas.microsoft.com/office/word/2010/wordprocessingInk" xmlns:wne="http://schemas.microsoft.com/office/word/2006/wordml" xmlns:wps="http://schemas.microsoft.com/office/word/2010/wordprocessingShape" mc:Ignorable="w14 w15 w16se w16cid w16 w16cex w16sdtdh wp14">
+<w:numbering xmlns:wpc="http://schemas.microsoft.com/office/word/2010/wordprocessingCanvas" xmlns:cx="http://schemas.microsoft.com/office/drawing/2014/chartex" xmlns:cx1="http://schemas.microsoft.com/office/drawing/2015/9/8/chartex" xmlns:cx2="http://schemas.microsoft.com/office/drawing/2015/10/21/chartex" xmlns:cx3="http://schemas.microsoft.com/office/drawing/2016/5/9/chartex" xmlns:cx4="http://schemas.microsoft.com/office/drawing/2016/5/10/chartex" xmlns:cx5="http://schemas.microsoft.com/office/drawing/2016/5/11/chartex" xmlns:cx6="http://schemas.microsoft.com/office/drawing/2016/5/12/chartex" xmlns:cx7="http://schemas.microsoft.com/office/drawing/2016/5/13/chartex" xmlns:cx8="http://schemas.microsoft.com/office/drawing/2016/5/14/chartex" xmlns:mc="http://schemas.openxmlformats.org/markup-compatibility/2006" xmlns:aink="http://schemas.microsoft.com/office/drawing/2016/ink" xmlns:am3d="http://schemas.microsoft.com/office/drawing/2017/model3d" xmlns:o="urn:schemas-microsoft-com:office:office" xmlns:oel="http://schemas.microsoft.com/office/2019/extlst" xmlns:r="http://schemas.openxmlformats.org/officeDocument/2006/relationships" xmlns:m="http://schemas.openxmlformats.org/officeDocument/2006/math" xmlns:v="urn:schemas-microsoft-com:vml" xmlns:wp14="http://schemas.microsoft.com/office/word/2010/wordprocessingDrawing" xmlns:wp="http://schemas.openxmlformats.org/drawingml/2006/wordprocessingDrawing" xmlns:w10="urn:schemas-microsoft-com:office:word" xmlns:w="http://schemas.openxmlformats.org/wordprocessingml/2006/main" xmlns:w14="http://schemas.microsoft.com/office/word/2010/wordml" xmlns:w15="http://schemas.microsoft.com/office/word/2012/wordml" xmlns:w16cex="http://schemas.microsoft.com/office/word/2018/wordml/cex" xmlns:w16cid="http://schemas.microsoft.com/office/word/2016/wordml/cid" xmlns:w16="http://schemas.microsoft.com/office/word/2018/wordml" xmlns:w16du="http://schemas.microsoft.com/office/word/2023/wordml/word16du" xmlns:w16sdtdh="http://schemas.microsoft.com/office/word/2020/wordml/sdtdatahash" xmlns:w16sdtfl="http://schemas.microsoft.com/office/word/2024/wordml/sdtformatlock" xmlns:w16se="http://schemas.microsoft.com/office/word/2015/wordml/symex" xmlns:wpg="http://schemas.microsoft.com/office/word/2010/wordprocessingGroup" xmlns:wpi="http://schemas.microsoft.com/office/word/2010/wordprocessingInk" xmlns:wne="http://schemas.microsoft.com/office/word/2006/wordml" xmlns:wps="http://schemas.microsoft.com/office/word/2010/wordprocessingShape" mc:Ignorable="w14 w15 w16se w16cid w16 w16cex w16sdtdh w16sdtfl w16du wp14">
   <w:abstractNum w:abstractNumId="0" w15:restartNumberingAfterBreak="0">
     <w:nsid w:val="003B1325"/>
     <w:multiLevelType w:val="hybridMultilevel"/>
@@ -5406,6 +6536,119 @@
     </w:lvl>
   </w:abstractNum>
   <w:abstractNum w:abstractNumId="4" w15:restartNumberingAfterBreak="0">
+    <w:nsid w:val="187A2E4C"/>
+    <w:multiLevelType w:val="hybridMultilevel"/>
+    <w:tmpl w:val="B69042C6"/>
+    <w:lvl w:ilvl="0" w:tplc="04190003">
+      <w:start w:val="1"/>
+      <w:numFmt w:val="bullet"/>
+      <w:lvlText w:val="o"/>
+      <w:lvlJc w:val="left"/>
+      <w:pPr>
+        <w:ind w:left="720" w:hanging="360"/>
+      </w:pPr>
+      <w:rPr>
+        <w:rFonts w:ascii="Courier New" w:hAnsi="Courier New" w:cs="Courier New" w:hint="default"/>
+      </w:rPr>
+    </w:lvl>
+    <w:lvl w:ilvl="1" w:tplc="08090003" w:tentative="1">
+      <w:start w:val="1"/>
+      <w:numFmt w:val="bullet"/>
+      <w:lvlText w:val="o"/>
+      <w:lvlJc w:val="left"/>
+      <w:pPr>
+        <w:ind w:left="1440" w:hanging="360"/>
+      </w:pPr>
+      <w:rPr>
+        <w:rFonts w:ascii="Courier New" w:hAnsi="Courier New" w:cs="Courier New" w:hint="default"/>
+      </w:rPr>
+    </w:lvl>
+    <w:lvl w:ilvl="2" w:tplc="08090005" w:tentative="1">
+      <w:start w:val="1"/>
+      <w:numFmt w:val="bullet"/>
+      <w:lvlText w:val=""/>
+      <w:lvlJc w:val="left"/>
+      <w:pPr>
+        <w:ind w:left="2160" w:hanging="360"/>
+      </w:pPr>
+      <w:rPr>
+        <w:rFonts w:ascii="Wingdings" w:hAnsi="Wingdings" w:hint="default"/>
+      </w:rPr>
+    </w:lvl>
+    <w:lvl w:ilvl="3" w:tplc="08090001" w:tentative="1">
+      <w:start w:val="1"/>
+      <w:numFmt w:val="bullet"/>
+      <w:lvlText w:val=""/>
+      <w:lvlJc w:val="left"/>
+      <w:pPr>
+        <w:ind w:left="2880" w:hanging="360"/>
+      </w:pPr>
+      <w:rPr>
+        <w:rFonts w:ascii="Symbol" w:hAnsi="Symbol" w:hint="default"/>
+      </w:rPr>
+    </w:lvl>
+    <w:lvl w:ilvl="4" w:tplc="08090003" w:tentative="1">
+      <w:start w:val="1"/>
+      <w:numFmt w:val="bullet"/>
+      <w:lvlText w:val="o"/>
+      <w:lvlJc w:val="left"/>
+      <w:pPr>
+        <w:ind w:left="3600" w:hanging="360"/>
+      </w:pPr>
+      <w:rPr>
+        <w:rFonts w:ascii="Courier New" w:hAnsi="Courier New" w:cs="Courier New" w:hint="default"/>
+      </w:rPr>
+    </w:lvl>
+    <w:lvl w:ilvl="5" w:tplc="08090005" w:tentative="1">
+      <w:start w:val="1"/>
+      <w:numFmt w:val="bullet"/>
+      <w:lvlText w:val=""/>
+      <w:lvlJc w:val="left"/>
+      <w:pPr>
+        <w:ind w:left="4320" w:hanging="360"/>
+      </w:pPr>
+      <w:rPr>
+        <w:rFonts w:ascii="Wingdings" w:hAnsi="Wingdings" w:hint="default"/>
+      </w:rPr>
+    </w:lvl>
+    <w:lvl w:ilvl="6" w:tplc="08090001" w:tentative="1">
+      <w:start w:val="1"/>
+      <w:numFmt w:val="bullet"/>
+      <w:lvlText w:val=""/>
+      <w:lvlJc w:val="left"/>
+      <w:pPr>
+        <w:ind w:left="5040" w:hanging="360"/>
+      </w:pPr>
+      <w:rPr>
+        <w:rFonts w:ascii="Symbol" w:hAnsi="Symbol" w:hint="default"/>
+      </w:rPr>
+    </w:lvl>
+    <w:lvl w:ilvl="7" w:tplc="08090003" w:tentative="1">
+      <w:start w:val="1"/>
+      <w:numFmt w:val="bullet"/>
+      <w:lvlText w:val="o"/>
+      <w:lvlJc w:val="left"/>
+      <w:pPr>
+        <w:ind w:left="5760" w:hanging="360"/>
+      </w:pPr>
+      <w:rPr>
+        <w:rFonts w:ascii="Courier New" w:hAnsi="Courier New" w:cs="Courier New" w:hint="default"/>
+      </w:rPr>
+    </w:lvl>
+    <w:lvl w:ilvl="8" w:tplc="08090005" w:tentative="1">
+      <w:start w:val="1"/>
+      <w:numFmt w:val="bullet"/>
+      <w:lvlText w:val=""/>
+      <w:lvlJc w:val="left"/>
+      <w:pPr>
+        <w:ind w:left="6480" w:hanging="360"/>
+      </w:pPr>
+      <w:rPr>
+        <w:rFonts w:ascii="Wingdings" w:hAnsi="Wingdings" w:hint="default"/>
+      </w:rPr>
+    </w:lvl>
+  </w:abstractNum>
+  <w:abstractNum w:abstractNumId="5" w15:restartNumberingAfterBreak="0">
     <w:nsid w:val="1C56494D"/>
     <w:multiLevelType w:val="hybridMultilevel"/>
     <w:tmpl w:val="B20616AC"/>
@@ -5518,7 +6761,7 @@
       </w:rPr>
     </w:lvl>
   </w:abstractNum>
-  <w:abstractNum w:abstractNumId="5" w15:restartNumberingAfterBreak="0">
+  <w:abstractNum w:abstractNumId="6" w15:restartNumberingAfterBreak="0">
     <w:nsid w:val="1ED4653D"/>
     <w:multiLevelType w:val="hybridMultilevel"/>
     <w:tmpl w:val="23E0B08E"/>
@@ -5630,7 +6873,346 @@
       </w:rPr>
     </w:lvl>
   </w:abstractNum>
-  <w:abstractNum w:abstractNumId="6" w15:restartNumberingAfterBreak="0">
+  <w:abstractNum w:abstractNumId="7" w15:restartNumberingAfterBreak="0">
+    <w:nsid w:val="21405381"/>
+    <w:multiLevelType w:val="hybridMultilevel"/>
+    <w:tmpl w:val="8FA8AD64"/>
+    <w:lvl w:ilvl="0" w:tplc="04190003">
+      <w:start w:val="1"/>
+      <w:numFmt w:val="bullet"/>
+      <w:lvlText w:val="o"/>
+      <w:lvlJc w:val="left"/>
+      <w:pPr>
+        <w:ind w:left="720" w:hanging="360"/>
+      </w:pPr>
+      <w:rPr>
+        <w:rFonts w:ascii="Courier New" w:hAnsi="Courier New" w:cs="Courier New" w:hint="default"/>
+      </w:rPr>
+    </w:lvl>
+    <w:lvl w:ilvl="1" w:tplc="08090003" w:tentative="1">
+      <w:start w:val="1"/>
+      <w:numFmt w:val="bullet"/>
+      <w:lvlText w:val="o"/>
+      <w:lvlJc w:val="left"/>
+      <w:pPr>
+        <w:ind w:left="1440" w:hanging="360"/>
+      </w:pPr>
+      <w:rPr>
+        <w:rFonts w:ascii="Courier New" w:hAnsi="Courier New" w:cs="Courier New" w:hint="default"/>
+      </w:rPr>
+    </w:lvl>
+    <w:lvl w:ilvl="2" w:tplc="08090005" w:tentative="1">
+      <w:start w:val="1"/>
+      <w:numFmt w:val="bullet"/>
+      <w:lvlText w:val=""/>
+      <w:lvlJc w:val="left"/>
+      <w:pPr>
+        <w:ind w:left="2160" w:hanging="360"/>
+      </w:pPr>
+      <w:rPr>
+        <w:rFonts w:ascii="Wingdings" w:hAnsi="Wingdings" w:hint="default"/>
+      </w:rPr>
+    </w:lvl>
+    <w:lvl w:ilvl="3" w:tplc="08090001" w:tentative="1">
+      <w:start w:val="1"/>
+      <w:numFmt w:val="bullet"/>
+      <w:lvlText w:val=""/>
+      <w:lvlJc w:val="left"/>
+      <w:pPr>
+        <w:ind w:left="2880" w:hanging="360"/>
+      </w:pPr>
+      <w:rPr>
+        <w:rFonts w:ascii="Symbol" w:hAnsi="Symbol" w:hint="default"/>
+      </w:rPr>
+    </w:lvl>
+    <w:lvl w:ilvl="4" w:tplc="08090003" w:tentative="1">
+      <w:start w:val="1"/>
+      <w:numFmt w:val="bullet"/>
+      <w:lvlText w:val="o"/>
+      <w:lvlJc w:val="left"/>
+      <w:pPr>
+        <w:ind w:left="3600" w:hanging="360"/>
+      </w:pPr>
+      <w:rPr>
+        <w:rFonts w:ascii="Courier New" w:hAnsi="Courier New" w:cs="Courier New" w:hint="default"/>
+      </w:rPr>
+    </w:lvl>
+    <w:lvl w:ilvl="5" w:tplc="08090005" w:tentative="1">
+      <w:start w:val="1"/>
+      <w:numFmt w:val="bullet"/>
+      <w:lvlText w:val=""/>
+      <w:lvlJc w:val="left"/>
+      <w:pPr>
+        <w:ind w:left="4320" w:hanging="360"/>
+      </w:pPr>
+      <w:rPr>
+        <w:rFonts w:ascii="Wingdings" w:hAnsi="Wingdings" w:hint="default"/>
+      </w:rPr>
+    </w:lvl>
+    <w:lvl w:ilvl="6" w:tplc="08090001" w:tentative="1">
+      <w:start w:val="1"/>
+      <w:numFmt w:val="bullet"/>
+      <w:lvlText w:val=""/>
+      <w:lvlJc w:val="left"/>
+      <w:pPr>
+        <w:ind w:left="5040" w:hanging="360"/>
+      </w:pPr>
+      <w:rPr>
+        <w:rFonts w:ascii="Symbol" w:hAnsi="Symbol" w:hint="default"/>
+      </w:rPr>
+    </w:lvl>
+    <w:lvl w:ilvl="7" w:tplc="08090003" w:tentative="1">
+      <w:start w:val="1"/>
+      <w:numFmt w:val="bullet"/>
+      <w:lvlText w:val="o"/>
+      <w:lvlJc w:val="left"/>
+      <w:pPr>
+        <w:ind w:left="5760" w:hanging="360"/>
+      </w:pPr>
+      <w:rPr>
+        <w:rFonts w:ascii="Courier New" w:hAnsi="Courier New" w:cs="Courier New" w:hint="default"/>
+      </w:rPr>
+    </w:lvl>
+    <w:lvl w:ilvl="8" w:tplc="08090005" w:tentative="1">
+      <w:start w:val="1"/>
+      <w:numFmt w:val="bullet"/>
+      <w:lvlText w:val=""/>
+      <w:lvlJc w:val="left"/>
+      <w:pPr>
+        <w:ind w:left="6480" w:hanging="360"/>
+      </w:pPr>
+      <w:rPr>
+        <w:rFonts w:ascii="Wingdings" w:hAnsi="Wingdings" w:hint="default"/>
+      </w:rPr>
+    </w:lvl>
+  </w:abstractNum>
+  <w:abstractNum w:abstractNumId="8" w15:restartNumberingAfterBreak="0">
+    <w:nsid w:val="25001D72"/>
+    <w:multiLevelType w:val="hybridMultilevel"/>
+    <w:tmpl w:val="CD00209A"/>
+    <w:lvl w:ilvl="0" w:tplc="04190003">
+      <w:start w:val="1"/>
+      <w:numFmt w:val="bullet"/>
+      <w:lvlText w:val="o"/>
+      <w:lvlJc w:val="left"/>
+      <w:pPr>
+        <w:ind w:left="720" w:hanging="360"/>
+      </w:pPr>
+      <w:rPr>
+        <w:rFonts w:ascii="Courier New" w:hAnsi="Courier New" w:cs="Courier New" w:hint="default"/>
+      </w:rPr>
+    </w:lvl>
+    <w:lvl w:ilvl="1" w:tplc="08090003" w:tentative="1">
+      <w:start w:val="1"/>
+      <w:numFmt w:val="bullet"/>
+      <w:lvlText w:val="o"/>
+      <w:lvlJc w:val="left"/>
+      <w:pPr>
+        <w:ind w:left="1440" w:hanging="360"/>
+      </w:pPr>
+      <w:rPr>
+        <w:rFonts w:ascii="Courier New" w:hAnsi="Courier New" w:cs="Courier New" w:hint="default"/>
+      </w:rPr>
+    </w:lvl>
+    <w:lvl w:ilvl="2" w:tplc="08090005" w:tentative="1">
+      <w:start w:val="1"/>
+      <w:numFmt w:val="bullet"/>
+      <w:lvlText w:val=""/>
+      <w:lvlJc w:val="left"/>
+      <w:pPr>
+        <w:ind w:left="2160" w:hanging="360"/>
+      </w:pPr>
+      <w:rPr>
+        <w:rFonts w:ascii="Wingdings" w:hAnsi="Wingdings" w:hint="default"/>
+      </w:rPr>
+    </w:lvl>
+    <w:lvl w:ilvl="3" w:tplc="08090001" w:tentative="1">
+      <w:start w:val="1"/>
+      <w:numFmt w:val="bullet"/>
+      <w:lvlText w:val=""/>
+      <w:lvlJc w:val="left"/>
+      <w:pPr>
+        <w:ind w:left="2880" w:hanging="360"/>
+      </w:pPr>
+      <w:rPr>
+        <w:rFonts w:ascii="Symbol" w:hAnsi="Symbol" w:hint="default"/>
+      </w:rPr>
+    </w:lvl>
+    <w:lvl w:ilvl="4" w:tplc="08090003" w:tentative="1">
+      <w:start w:val="1"/>
+      <w:numFmt w:val="bullet"/>
+      <w:lvlText w:val="o"/>
+      <w:lvlJc w:val="left"/>
+      <w:pPr>
+        <w:ind w:left="3600" w:hanging="360"/>
+      </w:pPr>
+      <w:rPr>
+        <w:rFonts w:ascii="Courier New" w:hAnsi="Courier New" w:cs="Courier New" w:hint="default"/>
+      </w:rPr>
+    </w:lvl>
+    <w:lvl w:ilvl="5" w:tplc="08090005" w:tentative="1">
+      <w:start w:val="1"/>
+      <w:numFmt w:val="bullet"/>
+      <w:lvlText w:val=""/>
+      <w:lvlJc w:val="left"/>
+      <w:pPr>
+        <w:ind w:left="4320" w:hanging="360"/>
+      </w:pPr>
+      <w:rPr>
+        <w:rFonts w:ascii="Wingdings" w:hAnsi="Wingdings" w:hint="default"/>
+      </w:rPr>
+    </w:lvl>
+    <w:lvl w:ilvl="6" w:tplc="08090001" w:tentative="1">
+      <w:start w:val="1"/>
+      <w:numFmt w:val="bullet"/>
+      <w:lvlText w:val=""/>
+      <w:lvlJc w:val="left"/>
+      <w:pPr>
+        <w:ind w:left="5040" w:hanging="360"/>
+      </w:pPr>
+      <w:rPr>
+        <w:rFonts w:ascii="Symbol" w:hAnsi="Symbol" w:hint="default"/>
+      </w:rPr>
+    </w:lvl>
+    <w:lvl w:ilvl="7" w:tplc="08090003" w:tentative="1">
+      <w:start w:val="1"/>
+      <w:numFmt w:val="bullet"/>
+      <w:lvlText w:val="o"/>
+      <w:lvlJc w:val="left"/>
+      <w:pPr>
+        <w:ind w:left="5760" w:hanging="360"/>
+      </w:pPr>
+      <w:rPr>
+        <w:rFonts w:ascii="Courier New" w:hAnsi="Courier New" w:cs="Courier New" w:hint="default"/>
+      </w:rPr>
+    </w:lvl>
+    <w:lvl w:ilvl="8" w:tplc="08090005" w:tentative="1">
+      <w:start w:val="1"/>
+      <w:numFmt w:val="bullet"/>
+      <w:lvlText w:val=""/>
+      <w:lvlJc w:val="left"/>
+      <w:pPr>
+        <w:ind w:left="6480" w:hanging="360"/>
+      </w:pPr>
+      <w:rPr>
+        <w:rFonts w:ascii="Wingdings" w:hAnsi="Wingdings" w:hint="default"/>
+      </w:rPr>
+    </w:lvl>
+  </w:abstractNum>
+  <w:abstractNum w:abstractNumId="9" w15:restartNumberingAfterBreak="0">
+    <w:nsid w:val="27093C67"/>
+    <w:multiLevelType w:val="hybridMultilevel"/>
+    <w:tmpl w:val="E7FE879E"/>
+    <w:lvl w:ilvl="0" w:tplc="04190003">
+      <w:start w:val="1"/>
+      <w:numFmt w:val="bullet"/>
+      <w:lvlText w:val="o"/>
+      <w:lvlJc w:val="left"/>
+      <w:pPr>
+        <w:ind w:left="720" w:hanging="360"/>
+      </w:pPr>
+      <w:rPr>
+        <w:rFonts w:ascii="Courier New" w:hAnsi="Courier New" w:cs="Courier New" w:hint="default"/>
+      </w:rPr>
+    </w:lvl>
+    <w:lvl w:ilvl="1" w:tplc="08090003" w:tentative="1">
+      <w:start w:val="1"/>
+      <w:numFmt w:val="bullet"/>
+      <w:lvlText w:val="o"/>
+      <w:lvlJc w:val="left"/>
+      <w:pPr>
+        <w:ind w:left="1440" w:hanging="360"/>
+      </w:pPr>
+      <w:rPr>
+        <w:rFonts w:ascii="Courier New" w:hAnsi="Courier New" w:cs="Courier New" w:hint="default"/>
+      </w:rPr>
+    </w:lvl>
+    <w:lvl w:ilvl="2" w:tplc="08090005" w:tentative="1">
+      <w:start w:val="1"/>
+      <w:numFmt w:val="bullet"/>
+      <w:lvlText w:val=""/>
+      <w:lvlJc w:val="left"/>
+      <w:pPr>
+        <w:ind w:left="2160" w:hanging="360"/>
+      </w:pPr>
+      <w:rPr>
+        <w:rFonts w:ascii="Wingdings" w:hAnsi="Wingdings" w:hint="default"/>
+      </w:rPr>
+    </w:lvl>
+    <w:lvl w:ilvl="3" w:tplc="08090001" w:tentative="1">
+      <w:start w:val="1"/>
+      <w:numFmt w:val="bullet"/>
+      <w:lvlText w:val=""/>
+      <w:lvlJc w:val="left"/>
+      <w:pPr>
+        <w:ind w:left="2880" w:hanging="360"/>
+      </w:pPr>
+      <w:rPr>
+        <w:rFonts w:ascii="Symbol" w:hAnsi="Symbol" w:hint="default"/>
+      </w:rPr>
+    </w:lvl>
+    <w:lvl w:ilvl="4" w:tplc="08090003" w:tentative="1">
+      <w:start w:val="1"/>
+      <w:numFmt w:val="bullet"/>
+      <w:lvlText w:val="o"/>
+      <w:lvlJc w:val="left"/>
+      <w:pPr>
+        <w:ind w:left="3600" w:hanging="360"/>
+      </w:pPr>
+      <w:rPr>
+        <w:rFonts w:ascii="Courier New" w:hAnsi="Courier New" w:cs="Courier New" w:hint="default"/>
+      </w:rPr>
+    </w:lvl>
+    <w:lvl w:ilvl="5" w:tplc="08090005" w:tentative="1">
+      <w:start w:val="1"/>
+      <w:numFmt w:val="bullet"/>
+      <w:lvlText w:val=""/>
+      <w:lvlJc w:val="left"/>
+      <w:pPr>
+        <w:ind w:left="4320" w:hanging="360"/>
+      </w:pPr>
+      <w:rPr>
+        <w:rFonts w:ascii="Wingdings" w:hAnsi="Wingdings" w:hint="default"/>
+      </w:rPr>
+    </w:lvl>
+    <w:lvl w:ilvl="6" w:tplc="08090001" w:tentative="1">
+      <w:start w:val="1"/>
+      <w:numFmt w:val="bullet"/>
+      <w:lvlText w:val=""/>
+      <w:lvlJc w:val="left"/>
+      <w:pPr>
+        <w:ind w:left="5040" w:hanging="360"/>
+      </w:pPr>
+      <w:rPr>
+        <w:rFonts w:ascii="Symbol" w:hAnsi="Symbol" w:hint="default"/>
+      </w:rPr>
+    </w:lvl>
+    <w:lvl w:ilvl="7" w:tplc="08090003" w:tentative="1">
+      <w:start w:val="1"/>
+      <w:numFmt w:val="bullet"/>
+      <w:lvlText w:val="o"/>
+      <w:lvlJc w:val="left"/>
+      <w:pPr>
+        <w:ind w:left="5760" w:hanging="360"/>
+      </w:pPr>
+      <w:rPr>
+        <w:rFonts w:ascii="Courier New" w:hAnsi="Courier New" w:cs="Courier New" w:hint="default"/>
+      </w:rPr>
+    </w:lvl>
+    <w:lvl w:ilvl="8" w:tplc="08090005" w:tentative="1">
+      <w:start w:val="1"/>
+      <w:numFmt w:val="bullet"/>
+      <w:lvlText w:val=""/>
+      <w:lvlJc w:val="left"/>
+      <w:pPr>
+        <w:ind w:left="6480" w:hanging="360"/>
+      </w:pPr>
+      <w:rPr>
+        <w:rFonts w:ascii="Wingdings" w:hAnsi="Wingdings" w:hint="default"/>
+      </w:rPr>
+    </w:lvl>
+  </w:abstractNum>
+  <w:abstractNum w:abstractNumId="10" w15:restartNumberingAfterBreak="0">
     <w:nsid w:val="27134A83"/>
     <w:multiLevelType w:val="hybridMultilevel"/>
     <w:tmpl w:val="8AF4556E"/>
@@ -5742,7 +7324,120 @@
       </w:rPr>
     </w:lvl>
   </w:abstractNum>
-  <w:abstractNum w:abstractNumId="7" w15:restartNumberingAfterBreak="0">
+  <w:abstractNum w:abstractNumId="11" w15:restartNumberingAfterBreak="0">
+    <w:nsid w:val="28127B4C"/>
+    <w:multiLevelType w:val="hybridMultilevel"/>
+    <w:tmpl w:val="B052DCA8"/>
+    <w:lvl w:ilvl="0" w:tplc="04190003">
+      <w:start w:val="1"/>
+      <w:numFmt w:val="bullet"/>
+      <w:lvlText w:val="o"/>
+      <w:lvlJc w:val="left"/>
+      <w:pPr>
+        <w:ind w:left="720" w:hanging="360"/>
+      </w:pPr>
+      <w:rPr>
+        <w:rFonts w:ascii="Courier New" w:hAnsi="Courier New" w:cs="Courier New" w:hint="default"/>
+      </w:rPr>
+    </w:lvl>
+    <w:lvl w:ilvl="1" w:tplc="08090003">
+      <w:start w:val="1"/>
+      <w:numFmt w:val="bullet"/>
+      <w:lvlText w:val="o"/>
+      <w:lvlJc w:val="left"/>
+      <w:pPr>
+        <w:ind w:left="1440" w:hanging="360"/>
+      </w:pPr>
+      <w:rPr>
+        <w:rFonts w:ascii="Courier New" w:hAnsi="Courier New" w:cs="Courier New" w:hint="default"/>
+      </w:rPr>
+    </w:lvl>
+    <w:lvl w:ilvl="2" w:tplc="08090005" w:tentative="1">
+      <w:start w:val="1"/>
+      <w:numFmt w:val="bullet"/>
+      <w:lvlText w:val=""/>
+      <w:lvlJc w:val="left"/>
+      <w:pPr>
+        <w:ind w:left="2160" w:hanging="360"/>
+      </w:pPr>
+      <w:rPr>
+        <w:rFonts w:ascii="Wingdings" w:hAnsi="Wingdings" w:hint="default"/>
+      </w:rPr>
+    </w:lvl>
+    <w:lvl w:ilvl="3" w:tplc="08090001" w:tentative="1">
+      <w:start w:val="1"/>
+      <w:numFmt w:val="bullet"/>
+      <w:lvlText w:val=""/>
+      <w:lvlJc w:val="left"/>
+      <w:pPr>
+        <w:ind w:left="2880" w:hanging="360"/>
+      </w:pPr>
+      <w:rPr>
+        <w:rFonts w:ascii="Symbol" w:hAnsi="Symbol" w:hint="default"/>
+      </w:rPr>
+    </w:lvl>
+    <w:lvl w:ilvl="4" w:tplc="08090003" w:tentative="1">
+      <w:start w:val="1"/>
+      <w:numFmt w:val="bullet"/>
+      <w:lvlText w:val="o"/>
+      <w:lvlJc w:val="left"/>
+      <w:pPr>
+        <w:ind w:left="3600" w:hanging="360"/>
+      </w:pPr>
+      <w:rPr>
+        <w:rFonts w:ascii="Courier New" w:hAnsi="Courier New" w:cs="Courier New" w:hint="default"/>
+      </w:rPr>
+    </w:lvl>
+    <w:lvl w:ilvl="5" w:tplc="08090005" w:tentative="1">
+      <w:start w:val="1"/>
+      <w:numFmt w:val="bullet"/>
+      <w:lvlText w:val=""/>
+      <w:lvlJc w:val="left"/>
+      <w:pPr>
+        <w:ind w:left="4320" w:hanging="360"/>
+      </w:pPr>
+      <w:rPr>
+        <w:rFonts w:ascii="Wingdings" w:hAnsi="Wingdings" w:hint="default"/>
+      </w:rPr>
+    </w:lvl>
+    <w:lvl w:ilvl="6" w:tplc="08090001" w:tentative="1">
+      <w:start w:val="1"/>
+      <w:numFmt w:val="bullet"/>
+      <w:lvlText w:val=""/>
+      <w:lvlJc w:val="left"/>
+      <w:pPr>
+        <w:ind w:left="5040" w:hanging="360"/>
+      </w:pPr>
+      <w:rPr>
+        <w:rFonts w:ascii="Symbol" w:hAnsi="Symbol" w:hint="default"/>
+      </w:rPr>
+    </w:lvl>
+    <w:lvl w:ilvl="7" w:tplc="08090003" w:tentative="1">
+      <w:start w:val="1"/>
+      <w:numFmt w:val="bullet"/>
+      <w:lvlText w:val="o"/>
+      <w:lvlJc w:val="left"/>
+      <w:pPr>
+        <w:ind w:left="5760" w:hanging="360"/>
+      </w:pPr>
+      <w:rPr>
+        <w:rFonts w:ascii="Courier New" w:hAnsi="Courier New" w:cs="Courier New" w:hint="default"/>
+      </w:rPr>
+    </w:lvl>
+    <w:lvl w:ilvl="8" w:tplc="08090005" w:tentative="1">
+      <w:start w:val="1"/>
+      <w:numFmt w:val="bullet"/>
+      <w:lvlText w:val=""/>
+      <w:lvlJc w:val="left"/>
+      <w:pPr>
+        <w:ind w:left="6480" w:hanging="360"/>
+      </w:pPr>
+      <w:rPr>
+        <w:rFonts w:ascii="Wingdings" w:hAnsi="Wingdings" w:hint="default"/>
+      </w:rPr>
+    </w:lvl>
+  </w:abstractNum>
+  <w:abstractNum w:abstractNumId="12" w15:restartNumberingAfterBreak="0">
     <w:nsid w:val="2AFD5E72"/>
     <w:multiLevelType w:val="hybridMultilevel"/>
     <w:tmpl w:val="B9CECB16"/>
@@ -5855,7 +7550,120 @@
       </w:rPr>
     </w:lvl>
   </w:abstractNum>
-  <w:abstractNum w:abstractNumId="8" w15:restartNumberingAfterBreak="0">
+  <w:abstractNum w:abstractNumId="13" w15:restartNumberingAfterBreak="0">
+    <w:nsid w:val="2D875852"/>
+    <w:multiLevelType w:val="hybridMultilevel"/>
+    <w:tmpl w:val="0C72B880"/>
+    <w:lvl w:ilvl="0" w:tplc="04190003">
+      <w:start w:val="1"/>
+      <w:numFmt w:val="bullet"/>
+      <w:lvlText w:val="o"/>
+      <w:lvlJc w:val="left"/>
+      <w:pPr>
+        <w:ind w:left="720" w:hanging="360"/>
+      </w:pPr>
+      <w:rPr>
+        <w:rFonts w:ascii="Courier New" w:hAnsi="Courier New" w:cs="Courier New" w:hint="default"/>
+      </w:rPr>
+    </w:lvl>
+    <w:lvl w:ilvl="1" w:tplc="08090003" w:tentative="1">
+      <w:start w:val="1"/>
+      <w:numFmt w:val="bullet"/>
+      <w:lvlText w:val="o"/>
+      <w:lvlJc w:val="left"/>
+      <w:pPr>
+        <w:ind w:left="1440" w:hanging="360"/>
+      </w:pPr>
+      <w:rPr>
+        <w:rFonts w:ascii="Courier New" w:hAnsi="Courier New" w:cs="Courier New" w:hint="default"/>
+      </w:rPr>
+    </w:lvl>
+    <w:lvl w:ilvl="2" w:tplc="08090005" w:tentative="1">
+      <w:start w:val="1"/>
+      <w:numFmt w:val="bullet"/>
+      <w:lvlText w:val=""/>
+      <w:lvlJc w:val="left"/>
+      <w:pPr>
+        <w:ind w:left="2160" w:hanging="360"/>
+      </w:pPr>
+      <w:rPr>
+        <w:rFonts w:ascii="Wingdings" w:hAnsi="Wingdings" w:hint="default"/>
+      </w:rPr>
+    </w:lvl>
+    <w:lvl w:ilvl="3" w:tplc="08090001" w:tentative="1">
+      <w:start w:val="1"/>
+      <w:numFmt w:val="bullet"/>
+      <w:lvlText w:val=""/>
+      <w:lvlJc w:val="left"/>
+      <w:pPr>
+        <w:ind w:left="2880" w:hanging="360"/>
+      </w:pPr>
+      <w:rPr>
+        <w:rFonts w:ascii="Symbol" w:hAnsi="Symbol" w:hint="default"/>
+      </w:rPr>
+    </w:lvl>
+    <w:lvl w:ilvl="4" w:tplc="08090003" w:tentative="1">
+      <w:start w:val="1"/>
+      <w:numFmt w:val="bullet"/>
+      <w:lvlText w:val="o"/>
+      <w:lvlJc w:val="left"/>
+      <w:pPr>
+        <w:ind w:left="3600" w:hanging="360"/>
+      </w:pPr>
+      <w:rPr>
+        <w:rFonts w:ascii="Courier New" w:hAnsi="Courier New" w:cs="Courier New" w:hint="default"/>
+      </w:rPr>
+    </w:lvl>
+    <w:lvl w:ilvl="5" w:tplc="08090005" w:tentative="1">
+      <w:start w:val="1"/>
+      <w:numFmt w:val="bullet"/>
+      <w:lvlText w:val=""/>
+      <w:lvlJc w:val="left"/>
+      <w:pPr>
+        <w:ind w:left="4320" w:hanging="360"/>
+      </w:pPr>
+      <w:rPr>
+        <w:rFonts w:ascii="Wingdings" w:hAnsi="Wingdings" w:hint="default"/>
+      </w:rPr>
+    </w:lvl>
+    <w:lvl w:ilvl="6" w:tplc="08090001" w:tentative="1">
+      <w:start w:val="1"/>
+      <w:numFmt w:val="bullet"/>
+      <w:lvlText w:val=""/>
+      <w:lvlJc w:val="left"/>
+      <w:pPr>
+        <w:ind w:left="5040" w:hanging="360"/>
+      </w:pPr>
+      <w:rPr>
+        <w:rFonts w:ascii="Symbol" w:hAnsi="Symbol" w:hint="default"/>
+      </w:rPr>
+    </w:lvl>
+    <w:lvl w:ilvl="7" w:tplc="08090003" w:tentative="1">
+      <w:start w:val="1"/>
+      <w:numFmt w:val="bullet"/>
+      <w:lvlText w:val="o"/>
+      <w:lvlJc w:val="left"/>
+      <w:pPr>
+        <w:ind w:left="5760" w:hanging="360"/>
+      </w:pPr>
+      <w:rPr>
+        <w:rFonts w:ascii="Courier New" w:hAnsi="Courier New" w:cs="Courier New" w:hint="default"/>
+      </w:rPr>
+    </w:lvl>
+    <w:lvl w:ilvl="8" w:tplc="08090005" w:tentative="1">
+      <w:start w:val="1"/>
+      <w:numFmt w:val="bullet"/>
+      <w:lvlText w:val=""/>
+      <w:lvlJc w:val="left"/>
+      <w:pPr>
+        <w:ind w:left="6480" w:hanging="360"/>
+      </w:pPr>
+      <w:rPr>
+        <w:rFonts w:ascii="Wingdings" w:hAnsi="Wingdings" w:hint="default"/>
+      </w:rPr>
+    </w:lvl>
+  </w:abstractNum>
+  <w:abstractNum w:abstractNumId="14" w15:restartNumberingAfterBreak="0">
     <w:nsid w:val="2ED30147"/>
     <w:multiLevelType w:val="hybridMultilevel"/>
     <w:tmpl w:val="D272DE24"/>
@@ -5968,7 +7776,7 @@
       </w:rPr>
     </w:lvl>
   </w:abstractNum>
-  <w:abstractNum w:abstractNumId="9" w15:restartNumberingAfterBreak="0">
+  <w:abstractNum w:abstractNumId="15" w15:restartNumberingAfterBreak="0">
     <w:nsid w:val="37FB69AB"/>
     <w:multiLevelType w:val="hybridMultilevel"/>
     <w:tmpl w:val="02DAD498"/>
@@ -6054,7 +7862,7 @@
       </w:pPr>
     </w:lvl>
   </w:abstractNum>
-  <w:abstractNum w:abstractNumId="10" w15:restartNumberingAfterBreak="0">
+  <w:abstractNum w:abstractNumId="16" w15:restartNumberingAfterBreak="0">
     <w:nsid w:val="3BF560CC"/>
     <w:multiLevelType w:val="hybridMultilevel"/>
     <w:tmpl w:val="710C5A2C"/>
@@ -6167,7 +7975,7 @@
       </w:rPr>
     </w:lvl>
   </w:abstractNum>
-  <w:abstractNum w:abstractNumId="11" w15:restartNumberingAfterBreak="0">
+  <w:abstractNum w:abstractNumId="17" w15:restartNumberingAfterBreak="0">
     <w:nsid w:val="3CA25F02"/>
     <w:multiLevelType w:val="hybridMultilevel"/>
     <w:tmpl w:val="5718C412"/>
@@ -6280,7 +8088,7 @@
       </w:rPr>
     </w:lvl>
   </w:abstractNum>
-  <w:abstractNum w:abstractNumId="12" w15:restartNumberingAfterBreak="0">
+  <w:abstractNum w:abstractNumId="18" w15:restartNumberingAfterBreak="0">
     <w:nsid w:val="3CD90D6C"/>
     <w:multiLevelType w:val="hybridMultilevel"/>
     <w:tmpl w:val="D8444B4E"/>
@@ -6393,7 +8201,7 @@
       </w:rPr>
     </w:lvl>
   </w:abstractNum>
-  <w:abstractNum w:abstractNumId="13" w15:restartNumberingAfterBreak="0">
+  <w:abstractNum w:abstractNumId="19" w15:restartNumberingAfterBreak="0">
     <w:nsid w:val="3D04714E"/>
     <w:multiLevelType w:val="hybridMultilevel"/>
     <w:tmpl w:val="5F9C3DF4"/>
@@ -6506,7 +8314,120 @@
       </w:rPr>
     </w:lvl>
   </w:abstractNum>
-  <w:abstractNum w:abstractNumId="14" w15:restartNumberingAfterBreak="0">
+  <w:abstractNum w:abstractNumId="20" w15:restartNumberingAfterBreak="0">
+    <w:nsid w:val="3F3479AD"/>
+    <w:multiLevelType w:val="hybridMultilevel"/>
+    <w:tmpl w:val="5524AF3A"/>
+    <w:lvl w:ilvl="0" w:tplc="04190003">
+      <w:start w:val="1"/>
+      <w:numFmt w:val="bullet"/>
+      <w:lvlText w:val="o"/>
+      <w:lvlJc w:val="left"/>
+      <w:pPr>
+        <w:ind w:left="720" w:hanging="360"/>
+      </w:pPr>
+      <w:rPr>
+        <w:rFonts w:ascii="Courier New" w:hAnsi="Courier New" w:cs="Courier New" w:hint="default"/>
+      </w:rPr>
+    </w:lvl>
+    <w:lvl w:ilvl="1" w:tplc="08090003" w:tentative="1">
+      <w:start w:val="1"/>
+      <w:numFmt w:val="bullet"/>
+      <w:lvlText w:val="o"/>
+      <w:lvlJc w:val="left"/>
+      <w:pPr>
+        <w:ind w:left="1440" w:hanging="360"/>
+      </w:pPr>
+      <w:rPr>
+        <w:rFonts w:ascii="Courier New" w:hAnsi="Courier New" w:cs="Courier New" w:hint="default"/>
+      </w:rPr>
+    </w:lvl>
+    <w:lvl w:ilvl="2" w:tplc="08090005" w:tentative="1">
+      <w:start w:val="1"/>
+      <w:numFmt w:val="bullet"/>
+      <w:lvlText w:val=""/>
+      <w:lvlJc w:val="left"/>
+      <w:pPr>
+        <w:ind w:left="2160" w:hanging="360"/>
+      </w:pPr>
+      <w:rPr>
+        <w:rFonts w:ascii="Wingdings" w:hAnsi="Wingdings" w:hint="default"/>
+      </w:rPr>
+    </w:lvl>
+    <w:lvl w:ilvl="3" w:tplc="08090001" w:tentative="1">
+      <w:start w:val="1"/>
+      <w:numFmt w:val="bullet"/>
+      <w:lvlText w:val=""/>
+      <w:lvlJc w:val="left"/>
+      <w:pPr>
+        <w:ind w:left="2880" w:hanging="360"/>
+      </w:pPr>
+      <w:rPr>
+        <w:rFonts w:ascii="Symbol" w:hAnsi="Symbol" w:hint="default"/>
+      </w:rPr>
+    </w:lvl>
+    <w:lvl w:ilvl="4" w:tplc="08090003" w:tentative="1">
+      <w:start w:val="1"/>
+      <w:numFmt w:val="bullet"/>
+      <w:lvlText w:val="o"/>
+      <w:lvlJc w:val="left"/>
+      <w:pPr>
+        <w:ind w:left="3600" w:hanging="360"/>
+      </w:pPr>
+      <w:rPr>
+        <w:rFonts w:ascii="Courier New" w:hAnsi="Courier New" w:cs="Courier New" w:hint="default"/>
+      </w:rPr>
+    </w:lvl>
+    <w:lvl w:ilvl="5" w:tplc="08090005" w:tentative="1">
+      <w:start w:val="1"/>
+      <w:numFmt w:val="bullet"/>
+      <w:lvlText w:val=""/>
+      <w:lvlJc w:val="left"/>
+      <w:pPr>
+        <w:ind w:left="4320" w:hanging="360"/>
+      </w:pPr>
+      <w:rPr>
+        <w:rFonts w:ascii="Wingdings" w:hAnsi="Wingdings" w:hint="default"/>
+      </w:rPr>
+    </w:lvl>
+    <w:lvl w:ilvl="6" w:tplc="08090001" w:tentative="1">
+      <w:start w:val="1"/>
+      <w:numFmt w:val="bullet"/>
+      <w:lvlText w:val=""/>
+      <w:lvlJc w:val="left"/>
+      <w:pPr>
+        <w:ind w:left="5040" w:hanging="360"/>
+      </w:pPr>
+      <w:rPr>
+        <w:rFonts w:ascii="Symbol" w:hAnsi="Symbol" w:hint="default"/>
+      </w:rPr>
+    </w:lvl>
+    <w:lvl w:ilvl="7" w:tplc="08090003" w:tentative="1">
+      <w:start w:val="1"/>
+      <w:numFmt w:val="bullet"/>
+      <w:lvlText w:val="o"/>
+      <w:lvlJc w:val="left"/>
+      <w:pPr>
+        <w:ind w:left="5760" w:hanging="360"/>
+      </w:pPr>
+      <w:rPr>
+        <w:rFonts w:ascii="Courier New" w:hAnsi="Courier New" w:cs="Courier New" w:hint="default"/>
+      </w:rPr>
+    </w:lvl>
+    <w:lvl w:ilvl="8" w:tplc="08090005" w:tentative="1">
+      <w:start w:val="1"/>
+      <w:numFmt w:val="bullet"/>
+      <w:lvlText w:val=""/>
+      <w:lvlJc w:val="left"/>
+      <w:pPr>
+        <w:ind w:left="6480" w:hanging="360"/>
+      </w:pPr>
+      <w:rPr>
+        <w:rFonts w:ascii="Wingdings" w:hAnsi="Wingdings" w:hint="default"/>
+      </w:rPr>
+    </w:lvl>
+  </w:abstractNum>
+  <w:abstractNum w:abstractNumId="21" w15:restartNumberingAfterBreak="0">
     <w:nsid w:val="453B33E1"/>
     <w:multiLevelType w:val="hybridMultilevel"/>
     <w:tmpl w:val="F120F0E6"/>
@@ -6620,7 +8541,7 @@
       </w:rPr>
     </w:lvl>
   </w:abstractNum>
-  <w:abstractNum w:abstractNumId="15" w15:restartNumberingAfterBreak="0">
+  <w:abstractNum w:abstractNumId="22" w15:restartNumberingAfterBreak="0">
     <w:nsid w:val="470F5029"/>
     <w:multiLevelType w:val="hybridMultilevel"/>
     <w:tmpl w:val="EB90B4B2"/>
@@ -6733,7 +8654,7 @@
       </w:rPr>
     </w:lvl>
   </w:abstractNum>
-  <w:abstractNum w:abstractNumId="16" w15:restartNumberingAfterBreak="0">
+  <w:abstractNum w:abstractNumId="23" w15:restartNumberingAfterBreak="0">
     <w:nsid w:val="48095377"/>
     <w:multiLevelType w:val="multilevel"/>
     <w:tmpl w:val="A80ED424"/>
@@ -6882,7 +8803,7 @@
       </w:rPr>
     </w:lvl>
   </w:abstractNum>
-  <w:abstractNum w:abstractNumId="17" w15:restartNumberingAfterBreak="0">
+  <w:abstractNum w:abstractNumId="24" w15:restartNumberingAfterBreak="0">
     <w:nsid w:val="495F0919"/>
     <w:multiLevelType w:val="hybridMultilevel"/>
     <w:tmpl w:val="65725F00"/>
@@ -6968,7 +8889,7 @@
       </w:pPr>
     </w:lvl>
   </w:abstractNum>
-  <w:abstractNum w:abstractNumId="18" w15:restartNumberingAfterBreak="0">
+  <w:abstractNum w:abstractNumId="25" w15:restartNumberingAfterBreak="0">
     <w:nsid w:val="50DB2B87"/>
     <w:multiLevelType w:val="hybridMultilevel"/>
     <w:tmpl w:val="2982D086"/>
@@ -7081,7 +9002,7 @@
       </w:rPr>
     </w:lvl>
   </w:abstractNum>
-  <w:abstractNum w:abstractNumId="19" w15:restartNumberingAfterBreak="0">
+  <w:abstractNum w:abstractNumId="26" w15:restartNumberingAfterBreak="0">
     <w:nsid w:val="510569D1"/>
     <w:multiLevelType w:val="hybridMultilevel"/>
     <w:tmpl w:val="A996740E"/>
@@ -7194,7 +9115,7 @@
       </w:rPr>
     </w:lvl>
   </w:abstractNum>
-  <w:abstractNum w:abstractNumId="20" w15:restartNumberingAfterBreak="0">
+  <w:abstractNum w:abstractNumId="27" w15:restartNumberingAfterBreak="0">
     <w:nsid w:val="51917AA5"/>
     <w:multiLevelType w:val="hybridMultilevel"/>
     <w:tmpl w:val="D2C2DF86"/>
@@ -7306,7 +9227,7 @@
       </w:rPr>
     </w:lvl>
   </w:abstractNum>
-  <w:abstractNum w:abstractNumId="21" w15:restartNumberingAfterBreak="0">
+  <w:abstractNum w:abstractNumId="28" w15:restartNumberingAfterBreak="0">
     <w:nsid w:val="540D4D1C"/>
     <w:multiLevelType w:val="multilevel"/>
     <w:tmpl w:val="FCAE62CA"/>
@@ -7455,7 +9376,7 @@
       </w:rPr>
     </w:lvl>
   </w:abstractNum>
-  <w:abstractNum w:abstractNumId="22" w15:restartNumberingAfterBreak="0">
+  <w:abstractNum w:abstractNumId="29" w15:restartNumberingAfterBreak="0">
     <w:nsid w:val="546C7644"/>
     <w:multiLevelType w:val="hybridMultilevel"/>
     <w:tmpl w:val="9DC4FE98"/>
@@ -7568,7 +9489,7 @@
       </w:rPr>
     </w:lvl>
   </w:abstractNum>
-  <w:abstractNum w:abstractNumId="23" w15:restartNumberingAfterBreak="0">
+  <w:abstractNum w:abstractNumId="30" w15:restartNumberingAfterBreak="0">
     <w:nsid w:val="548A7F04"/>
     <w:multiLevelType w:val="hybridMultilevel"/>
     <w:tmpl w:val="35240576"/>
@@ -7681,7 +9602,7 @@
       </w:rPr>
     </w:lvl>
   </w:abstractNum>
-  <w:abstractNum w:abstractNumId="24" w15:restartNumberingAfterBreak="0">
+  <w:abstractNum w:abstractNumId="31" w15:restartNumberingAfterBreak="0">
     <w:nsid w:val="5547596D"/>
     <w:multiLevelType w:val="multilevel"/>
     <w:tmpl w:val="EC922B90"/>
@@ -7830,7 +9751,7 @@
       </w:rPr>
     </w:lvl>
   </w:abstractNum>
-  <w:abstractNum w:abstractNumId="25" w15:restartNumberingAfterBreak="0">
+  <w:abstractNum w:abstractNumId="32" w15:restartNumberingAfterBreak="0">
     <w:nsid w:val="563F7FAC"/>
     <w:multiLevelType w:val="multilevel"/>
     <w:tmpl w:val="9F88A25A"/>
@@ -7943,7 +9864,7 @@
       </w:pPr>
     </w:lvl>
   </w:abstractNum>
-  <w:abstractNum w:abstractNumId="26" w15:restartNumberingAfterBreak="0">
+  <w:abstractNum w:abstractNumId="33" w15:restartNumberingAfterBreak="0">
     <w:nsid w:val="57C61526"/>
     <w:multiLevelType w:val="hybridMultilevel"/>
     <w:tmpl w:val="1326E626"/>
@@ -8056,7 +9977,7 @@
       </w:rPr>
     </w:lvl>
   </w:abstractNum>
-  <w:abstractNum w:abstractNumId="27" w15:restartNumberingAfterBreak="0">
+  <w:abstractNum w:abstractNumId="34" w15:restartNumberingAfterBreak="0">
     <w:nsid w:val="59E97F18"/>
     <w:multiLevelType w:val="hybridMultilevel"/>
     <w:tmpl w:val="16448F94"/>
@@ -8169,7 +10090,7 @@
       </w:rPr>
     </w:lvl>
   </w:abstractNum>
-  <w:abstractNum w:abstractNumId="28" w15:restartNumberingAfterBreak="0">
+  <w:abstractNum w:abstractNumId="35" w15:restartNumberingAfterBreak="0">
     <w:nsid w:val="5D6D5C5A"/>
     <w:multiLevelType w:val="hybridMultilevel"/>
     <w:tmpl w:val="6EF2D338"/>
@@ -8282,7 +10203,7 @@
       </w:rPr>
     </w:lvl>
   </w:abstractNum>
-  <w:abstractNum w:abstractNumId="29" w15:restartNumberingAfterBreak="0">
+  <w:abstractNum w:abstractNumId="36" w15:restartNumberingAfterBreak="0">
     <w:nsid w:val="61345F1C"/>
     <w:multiLevelType w:val="hybridMultilevel"/>
     <w:tmpl w:val="1A64F046"/>
@@ -8395,7 +10316,7 @@
       </w:rPr>
     </w:lvl>
   </w:abstractNum>
-  <w:abstractNum w:abstractNumId="30" w15:restartNumberingAfterBreak="0">
+  <w:abstractNum w:abstractNumId="37" w15:restartNumberingAfterBreak="0">
     <w:nsid w:val="614A1692"/>
     <w:multiLevelType w:val="hybridMultilevel"/>
     <w:tmpl w:val="4156E2A8"/>
@@ -8508,7 +10429,7 @@
       </w:rPr>
     </w:lvl>
   </w:abstractNum>
-  <w:abstractNum w:abstractNumId="31" w15:restartNumberingAfterBreak="0">
+  <w:abstractNum w:abstractNumId="38" w15:restartNumberingAfterBreak="0">
     <w:nsid w:val="61D15A97"/>
     <w:multiLevelType w:val="hybridMultilevel"/>
     <w:tmpl w:val="14A2E350"/>
@@ -8621,7 +10542,120 @@
       </w:rPr>
     </w:lvl>
   </w:abstractNum>
-  <w:abstractNum w:abstractNumId="32" w15:restartNumberingAfterBreak="0">
+  <w:abstractNum w:abstractNumId="39" w15:restartNumberingAfterBreak="0">
+    <w:nsid w:val="664002F4"/>
+    <w:multiLevelType w:val="hybridMultilevel"/>
+    <w:tmpl w:val="074A2354"/>
+    <w:lvl w:ilvl="0" w:tplc="08090005">
+      <w:start w:val="1"/>
+      <w:numFmt w:val="bullet"/>
+      <w:lvlText w:val=""/>
+      <w:lvlJc w:val="left"/>
+      <w:pPr>
+        <w:ind w:left="2160" w:hanging="360"/>
+      </w:pPr>
+      <w:rPr>
+        <w:rFonts w:ascii="Wingdings" w:hAnsi="Wingdings" w:hint="default"/>
+      </w:rPr>
+    </w:lvl>
+    <w:lvl w:ilvl="1" w:tplc="08090003" w:tentative="1">
+      <w:start w:val="1"/>
+      <w:numFmt w:val="bullet"/>
+      <w:lvlText w:val="o"/>
+      <w:lvlJc w:val="left"/>
+      <w:pPr>
+        <w:ind w:left="2880" w:hanging="360"/>
+      </w:pPr>
+      <w:rPr>
+        <w:rFonts w:ascii="Courier New" w:hAnsi="Courier New" w:cs="Courier New" w:hint="default"/>
+      </w:rPr>
+    </w:lvl>
+    <w:lvl w:ilvl="2" w:tplc="08090005" w:tentative="1">
+      <w:start w:val="1"/>
+      <w:numFmt w:val="bullet"/>
+      <w:lvlText w:val=""/>
+      <w:lvlJc w:val="left"/>
+      <w:pPr>
+        <w:ind w:left="3600" w:hanging="360"/>
+      </w:pPr>
+      <w:rPr>
+        <w:rFonts w:ascii="Wingdings" w:hAnsi="Wingdings" w:hint="default"/>
+      </w:rPr>
+    </w:lvl>
+    <w:lvl w:ilvl="3" w:tplc="08090001" w:tentative="1">
+      <w:start w:val="1"/>
+      <w:numFmt w:val="bullet"/>
+      <w:lvlText w:val=""/>
+      <w:lvlJc w:val="left"/>
+      <w:pPr>
+        <w:ind w:left="4320" w:hanging="360"/>
+      </w:pPr>
+      <w:rPr>
+        <w:rFonts w:ascii="Symbol" w:hAnsi="Symbol" w:hint="default"/>
+      </w:rPr>
+    </w:lvl>
+    <w:lvl w:ilvl="4" w:tplc="08090003" w:tentative="1">
+      <w:start w:val="1"/>
+      <w:numFmt w:val="bullet"/>
+      <w:lvlText w:val="o"/>
+      <w:lvlJc w:val="left"/>
+      <w:pPr>
+        <w:ind w:left="5040" w:hanging="360"/>
+      </w:pPr>
+      <w:rPr>
+        <w:rFonts w:ascii="Courier New" w:hAnsi="Courier New" w:cs="Courier New" w:hint="default"/>
+      </w:rPr>
+    </w:lvl>
+    <w:lvl w:ilvl="5" w:tplc="08090005" w:tentative="1">
+      <w:start w:val="1"/>
+      <w:numFmt w:val="bullet"/>
+      <w:lvlText w:val=""/>
+      <w:lvlJc w:val="left"/>
+      <w:pPr>
+        <w:ind w:left="5760" w:hanging="360"/>
+      </w:pPr>
+      <w:rPr>
+        <w:rFonts w:ascii="Wingdings" w:hAnsi="Wingdings" w:hint="default"/>
+      </w:rPr>
+    </w:lvl>
+    <w:lvl w:ilvl="6" w:tplc="08090001" w:tentative="1">
+      <w:start w:val="1"/>
+      <w:numFmt w:val="bullet"/>
+      <w:lvlText w:val=""/>
+      <w:lvlJc w:val="left"/>
+      <w:pPr>
+        <w:ind w:left="6480" w:hanging="360"/>
+      </w:pPr>
+      <w:rPr>
+        <w:rFonts w:ascii="Symbol" w:hAnsi="Symbol" w:hint="default"/>
+      </w:rPr>
+    </w:lvl>
+    <w:lvl w:ilvl="7" w:tplc="08090003" w:tentative="1">
+      <w:start w:val="1"/>
+      <w:numFmt w:val="bullet"/>
+      <w:lvlText w:val="o"/>
+      <w:lvlJc w:val="left"/>
+      <w:pPr>
+        <w:ind w:left="7200" w:hanging="360"/>
+      </w:pPr>
+      <w:rPr>
+        <w:rFonts w:ascii="Courier New" w:hAnsi="Courier New" w:cs="Courier New" w:hint="default"/>
+      </w:rPr>
+    </w:lvl>
+    <w:lvl w:ilvl="8" w:tplc="08090005" w:tentative="1">
+      <w:start w:val="1"/>
+      <w:numFmt w:val="bullet"/>
+      <w:lvlText w:val=""/>
+      <w:lvlJc w:val="left"/>
+      <w:pPr>
+        <w:ind w:left="7920" w:hanging="360"/>
+      </w:pPr>
+      <w:rPr>
+        <w:rFonts w:ascii="Wingdings" w:hAnsi="Wingdings" w:hint="default"/>
+      </w:rPr>
+    </w:lvl>
+  </w:abstractNum>
+  <w:abstractNum w:abstractNumId="40" w15:restartNumberingAfterBreak="0">
     <w:nsid w:val="6BFE35FA"/>
     <w:multiLevelType w:val="hybridMultilevel"/>
     <w:tmpl w:val="CFF8F62C"/>
@@ -8734,7 +10768,7 @@
       </w:rPr>
     </w:lvl>
   </w:abstractNum>
-  <w:abstractNum w:abstractNumId="33" w15:restartNumberingAfterBreak="0">
+  <w:abstractNum w:abstractNumId="41" w15:restartNumberingAfterBreak="0">
     <w:nsid w:val="6C1103A6"/>
     <w:multiLevelType w:val="hybridMultilevel"/>
     <w:tmpl w:val="72441294"/>
@@ -8847,7 +10881,7 @@
       </w:rPr>
     </w:lvl>
   </w:abstractNum>
-  <w:abstractNum w:abstractNumId="34" w15:restartNumberingAfterBreak="0">
+  <w:abstractNum w:abstractNumId="42" w15:restartNumberingAfterBreak="0">
     <w:nsid w:val="6F265A76"/>
     <w:multiLevelType w:val="multilevel"/>
     <w:tmpl w:val="682CEAB2"/>
@@ -8996,7 +11030,7 @@
       </w:rPr>
     </w:lvl>
   </w:abstractNum>
-  <w:abstractNum w:abstractNumId="35" w15:restartNumberingAfterBreak="0">
+  <w:abstractNum w:abstractNumId="43" w15:restartNumberingAfterBreak="0">
     <w:nsid w:val="6FA8564D"/>
     <w:multiLevelType w:val="multilevel"/>
     <w:tmpl w:val="2B5A9E24"/>
@@ -9145,7 +11179,7 @@
       </w:rPr>
     </w:lvl>
   </w:abstractNum>
-  <w:abstractNum w:abstractNumId="36" w15:restartNumberingAfterBreak="0">
+  <w:abstractNum w:abstractNumId="44" w15:restartNumberingAfterBreak="0">
     <w:nsid w:val="71D132C3"/>
     <w:multiLevelType w:val="hybridMultilevel"/>
     <w:tmpl w:val="21E0DE52"/>
@@ -9258,7 +11292,120 @@
       </w:rPr>
     </w:lvl>
   </w:abstractNum>
-  <w:abstractNum w:abstractNumId="37" w15:restartNumberingAfterBreak="0">
+  <w:abstractNum w:abstractNumId="45" w15:restartNumberingAfterBreak="0">
+    <w:nsid w:val="726F6787"/>
+    <w:multiLevelType w:val="hybridMultilevel"/>
+    <w:tmpl w:val="C7B60C7A"/>
+    <w:lvl w:ilvl="0" w:tplc="04190003">
+      <w:start w:val="1"/>
+      <w:numFmt w:val="bullet"/>
+      <w:lvlText w:val="o"/>
+      <w:lvlJc w:val="left"/>
+      <w:pPr>
+        <w:ind w:left="720" w:hanging="360"/>
+      </w:pPr>
+      <w:rPr>
+        <w:rFonts w:ascii="Courier New" w:hAnsi="Courier New" w:cs="Courier New" w:hint="default"/>
+      </w:rPr>
+    </w:lvl>
+    <w:lvl w:ilvl="1" w:tplc="08090003" w:tentative="1">
+      <w:start w:val="1"/>
+      <w:numFmt w:val="bullet"/>
+      <w:lvlText w:val="o"/>
+      <w:lvlJc w:val="left"/>
+      <w:pPr>
+        <w:ind w:left="1440" w:hanging="360"/>
+      </w:pPr>
+      <w:rPr>
+        <w:rFonts w:ascii="Courier New" w:hAnsi="Courier New" w:cs="Courier New" w:hint="default"/>
+      </w:rPr>
+    </w:lvl>
+    <w:lvl w:ilvl="2" w:tplc="08090005" w:tentative="1">
+      <w:start w:val="1"/>
+      <w:numFmt w:val="bullet"/>
+      <w:lvlText w:val=""/>
+      <w:lvlJc w:val="left"/>
+      <w:pPr>
+        <w:ind w:left="2160" w:hanging="360"/>
+      </w:pPr>
+      <w:rPr>
+        <w:rFonts w:ascii="Wingdings" w:hAnsi="Wingdings" w:hint="default"/>
+      </w:rPr>
+    </w:lvl>
+    <w:lvl w:ilvl="3" w:tplc="08090001" w:tentative="1">
+      <w:start w:val="1"/>
+      <w:numFmt w:val="bullet"/>
+      <w:lvlText w:val=""/>
+      <w:lvlJc w:val="left"/>
+      <w:pPr>
+        <w:ind w:left="2880" w:hanging="360"/>
+      </w:pPr>
+      <w:rPr>
+        <w:rFonts w:ascii="Symbol" w:hAnsi="Symbol" w:hint="default"/>
+      </w:rPr>
+    </w:lvl>
+    <w:lvl w:ilvl="4" w:tplc="08090003" w:tentative="1">
+      <w:start w:val="1"/>
+      <w:numFmt w:val="bullet"/>
+      <w:lvlText w:val="o"/>
+      <w:lvlJc w:val="left"/>
+      <w:pPr>
+        <w:ind w:left="3600" w:hanging="360"/>
+      </w:pPr>
+      <w:rPr>
+        <w:rFonts w:ascii="Courier New" w:hAnsi="Courier New" w:cs="Courier New" w:hint="default"/>
+      </w:rPr>
+    </w:lvl>
+    <w:lvl w:ilvl="5" w:tplc="08090005" w:tentative="1">
+      <w:start w:val="1"/>
+      <w:numFmt w:val="bullet"/>
+      <w:lvlText w:val=""/>
+      <w:lvlJc w:val="left"/>
+      <w:pPr>
+        <w:ind w:left="4320" w:hanging="360"/>
+      </w:pPr>
+      <w:rPr>
+        <w:rFonts w:ascii="Wingdings" w:hAnsi="Wingdings" w:hint="default"/>
+      </w:rPr>
+    </w:lvl>
+    <w:lvl w:ilvl="6" w:tplc="08090001" w:tentative="1">
+      <w:start w:val="1"/>
+      <w:numFmt w:val="bullet"/>
+      <w:lvlText w:val=""/>
+      <w:lvlJc w:val="left"/>
+      <w:pPr>
+        <w:ind w:left="5040" w:hanging="360"/>
+      </w:pPr>
+      <w:rPr>
+        <w:rFonts w:ascii="Symbol" w:hAnsi="Symbol" w:hint="default"/>
+      </w:rPr>
+    </w:lvl>
+    <w:lvl w:ilvl="7" w:tplc="08090003" w:tentative="1">
+      <w:start w:val="1"/>
+      <w:numFmt w:val="bullet"/>
+      <w:lvlText w:val="o"/>
+      <w:lvlJc w:val="left"/>
+      <w:pPr>
+        <w:ind w:left="5760" w:hanging="360"/>
+      </w:pPr>
+      <w:rPr>
+        <w:rFonts w:ascii="Courier New" w:hAnsi="Courier New" w:cs="Courier New" w:hint="default"/>
+      </w:rPr>
+    </w:lvl>
+    <w:lvl w:ilvl="8" w:tplc="08090005" w:tentative="1">
+      <w:start w:val="1"/>
+      <w:numFmt w:val="bullet"/>
+      <w:lvlText w:val=""/>
+      <w:lvlJc w:val="left"/>
+      <w:pPr>
+        <w:ind w:left="6480" w:hanging="360"/>
+      </w:pPr>
+      <w:rPr>
+        <w:rFonts w:ascii="Wingdings" w:hAnsi="Wingdings" w:hint="default"/>
+      </w:rPr>
+    </w:lvl>
+  </w:abstractNum>
+  <w:abstractNum w:abstractNumId="46" w15:restartNumberingAfterBreak="0">
     <w:nsid w:val="79381DDD"/>
     <w:multiLevelType w:val="hybridMultilevel"/>
     <w:tmpl w:val="9FC61ECA"/>
@@ -9371,7 +11518,7 @@
       </w:rPr>
     </w:lvl>
   </w:abstractNum>
-  <w:abstractNum w:abstractNumId="38" w15:restartNumberingAfterBreak="0">
+  <w:abstractNum w:abstractNumId="47" w15:restartNumberingAfterBreak="0">
     <w:nsid w:val="7DBE2C1B"/>
     <w:multiLevelType w:val="hybridMultilevel"/>
     <w:tmpl w:val="D4DEFBD0"/>
@@ -9483,7 +11630,7 @@
       </w:rPr>
     </w:lvl>
   </w:abstractNum>
-  <w:abstractNum w:abstractNumId="39" w15:restartNumberingAfterBreak="0">
+  <w:abstractNum w:abstractNumId="48" w15:restartNumberingAfterBreak="0">
     <w:nsid w:val="7ED50EB6"/>
     <w:multiLevelType w:val="multilevel"/>
     <w:tmpl w:val="2E04D1A8"/>
@@ -9632,131 +11779,158 @@
       </w:rPr>
     </w:lvl>
   </w:abstractNum>
-  <w:num w:numId="1">
+  <w:num w:numId="1" w16cid:durableId="499465102">
     <w:abstractNumId w:val="1"/>
   </w:num>
-  <w:num w:numId="2">
+  <w:num w:numId="2" w16cid:durableId="384913264">
+    <w:abstractNumId w:val="33"/>
+  </w:num>
+  <w:num w:numId="3" w16cid:durableId="2023243125">
+    <w:abstractNumId w:val="34"/>
+  </w:num>
+  <w:num w:numId="4" w16cid:durableId="2056269584">
+    <w:abstractNumId w:val="25"/>
+  </w:num>
+  <w:num w:numId="5" w16cid:durableId="303703151">
+    <w:abstractNumId w:val="3"/>
+  </w:num>
+  <w:num w:numId="6" w16cid:durableId="938874738">
+    <w:abstractNumId w:val="47"/>
+  </w:num>
+  <w:num w:numId="7" w16cid:durableId="1250695812">
+    <w:abstractNumId w:val="10"/>
+  </w:num>
+  <w:num w:numId="8" w16cid:durableId="1856848248">
+    <w:abstractNumId w:val="6"/>
+  </w:num>
+  <w:num w:numId="9" w16cid:durableId="251202358">
+    <w:abstractNumId w:val="27"/>
+  </w:num>
+  <w:num w:numId="10" w16cid:durableId="419645676">
+    <w:abstractNumId w:val="17"/>
+  </w:num>
+  <w:num w:numId="11" w16cid:durableId="572928392">
+    <w:abstractNumId w:val="22"/>
+  </w:num>
+  <w:num w:numId="12" w16cid:durableId="1083335959">
+    <w:abstractNumId w:val="37"/>
+  </w:num>
+  <w:num w:numId="13" w16cid:durableId="419375774">
+    <w:abstractNumId w:val="41"/>
+  </w:num>
+  <w:num w:numId="14" w16cid:durableId="472601837">
+    <w:abstractNumId w:val="15"/>
+  </w:num>
+  <w:num w:numId="15" w16cid:durableId="1340893428">
+    <w:abstractNumId w:val="24"/>
+  </w:num>
+  <w:num w:numId="16" w16cid:durableId="2025938113">
+    <w:abstractNumId w:val="21"/>
+  </w:num>
+  <w:num w:numId="17" w16cid:durableId="2079090949">
     <w:abstractNumId w:val="26"/>
   </w:num>
-  <w:num w:numId="3">
-    <w:abstractNumId w:val="27"/>
+  <w:num w:numId="18" w16cid:durableId="1698654684">
+    <w:abstractNumId w:val="16"/>
   </w:num>
-  <w:num w:numId="4">
+  <w:num w:numId="19" w16cid:durableId="421608752">
+    <w:abstractNumId w:val="40"/>
+  </w:num>
+  <w:num w:numId="20" w16cid:durableId="2117748317">
+    <w:abstractNumId w:val="46"/>
+  </w:num>
+  <w:num w:numId="21" w16cid:durableId="1595282796">
+    <w:abstractNumId w:val="35"/>
+  </w:num>
+  <w:num w:numId="22" w16cid:durableId="1287275393">
+    <w:abstractNumId w:val="12"/>
+  </w:num>
+  <w:num w:numId="23" w16cid:durableId="1968200105">
+    <w:abstractNumId w:val="5"/>
+  </w:num>
+  <w:num w:numId="24" w16cid:durableId="871379423">
+    <w:abstractNumId w:val="42"/>
+  </w:num>
+  <w:num w:numId="25" w16cid:durableId="1775317555">
+    <w:abstractNumId w:val="32"/>
+  </w:num>
+  <w:num w:numId="26" w16cid:durableId="1018508330">
+    <w:abstractNumId w:val="30"/>
+  </w:num>
+  <w:num w:numId="27" w16cid:durableId="1624077405">
+    <w:abstractNumId w:val="38"/>
+  </w:num>
+  <w:num w:numId="28" w16cid:durableId="824278171">
+    <w:abstractNumId w:val="23"/>
+  </w:num>
+  <w:num w:numId="29" w16cid:durableId="2106418506">
+    <w:abstractNumId w:val="31"/>
+  </w:num>
+  <w:num w:numId="30" w16cid:durableId="1585147079">
+    <w:abstractNumId w:val="43"/>
+  </w:num>
+  <w:num w:numId="31" w16cid:durableId="1921214431">
+    <w:abstractNumId w:val="2"/>
+  </w:num>
+  <w:num w:numId="32" w16cid:durableId="1713726611">
+    <w:abstractNumId w:val="29"/>
+  </w:num>
+  <w:num w:numId="33" w16cid:durableId="1300964125">
+    <w:abstractNumId w:val="0"/>
+  </w:num>
+  <w:num w:numId="34" w16cid:durableId="1051075841">
+    <w:abstractNumId w:val="48"/>
+  </w:num>
+  <w:num w:numId="35" w16cid:durableId="1975401105">
+    <w:abstractNumId w:val="36"/>
+  </w:num>
+  <w:num w:numId="36" w16cid:durableId="460422521">
+    <w:abstractNumId w:val="28"/>
+  </w:num>
+  <w:num w:numId="37" w16cid:durableId="1327513134">
+    <w:abstractNumId w:val="44"/>
+  </w:num>
+  <w:num w:numId="38" w16cid:durableId="1694259667">
     <w:abstractNumId w:val="18"/>
   </w:num>
-  <w:num w:numId="5">
-    <w:abstractNumId w:val="3"/>
+  <w:num w:numId="39" w16cid:durableId="484665926">
+    <w:abstractNumId w:val="19"/>
   </w:num>
-  <w:num w:numId="6">
-    <w:abstractNumId w:val="38"/>
+  <w:num w:numId="40" w16cid:durableId="741298702">
+    <w:abstractNumId w:val="14"/>
   </w:num>
-  <w:num w:numId="7">
-    <w:abstractNumId w:val="6"/>
+  <w:num w:numId="41" w16cid:durableId="1008365382">
+    <w:abstractNumId w:val="8"/>
   </w:num>
-  <w:num w:numId="8">
-    <w:abstractNumId w:val="5"/>
+  <w:num w:numId="42" w16cid:durableId="269899171">
+    <w:abstractNumId w:val="4"/>
   </w:num>
-  <w:num w:numId="9">
+  <w:num w:numId="43" w16cid:durableId="287009388">
+    <w:abstractNumId w:val="45"/>
+  </w:num>
+  <w:num w:numId="44" w16cid:durableId="952590794">
     <w:abstractNumId w:val="20"/>
   </w:num>
-  <w:num w:numId="10">
+  <w:num w:numId="45" w16cid:durableId="303899460">
     <w:abstractNumId w:val="11"/>
   </w:num>
-  <w:num w:numId="11">
-    <w:abstractNumId w:val="15"/>
+  <w:num w:numId="46" w16cid:durableId="581259033">
+    <w:abstractNumId w:val="13"/>
   </w:num>
-  <w:num w:numId="12">
-    <w:abstractNumId w:val="30"/>
+  <w:num w:numId="47" w16cid:durableId="423187432">
+    <w:abstractNumId w:val="7"/>
   </w:num>
-  <w:num w:numId="13">
-    <w:abstractNumId w:val="33"/>
-  </w:num>
-  <w:num w:numId="14">
+  <w:num w:numId="48" w16cid:durableId="1849366319">
     <w:abstractNumId w:val="9"/>
   </w:num>
-  <w:num w:numId="15">
-    <w:abstractNumId w:val="17"/>
-  </w:num>
-  <w:num w:numId="16">
-    <w:abstractNumId w:val="14"/>
-  </w:num>
-  <w:num w:numId="17">
-    <w:abstractNumId w:val="19"/>
-  </w:num>
-  <w:num w:numId="18">
-    <w:abstractNumId w:val="10"/>
-  </w:num>
-  <w:num w:numId="19">
-    <w:abstractNumId w:val="32"/>
-  </w:num>
-  <w:num w:numId="20">
-    <w:abstractNumId w:val="37"/>
-  </w:num>
-  <w:num w:numId="21">
-    <w:abstractNumId w:val="28"/>
-  </w:num>
-  <w:num w:numId="22">
-    <w:abstractNumId w:val="7"/>
-  </w:num>
-  <w:num w:numId="23">
-    <w:abstractNumId w:val="4"/>
-  </w:num>
-  <w:num w:numId="24">
-    <w:abstractNumId w:val="34"/>
-  </w:num>
-  <w:num w:numId="25">
-    <w:abstractNumId w:val="25"/>
-  </w:num>
-  <w:num w:numId="26">
-    <w:abstractNumId w:val="23"/>
-  </w:num>
-  <w:num w:numId="27">
-    <w:abstractNumId w:val="31"/>
-  </w:num>
-  <w:num w:numId="28">
-    <w:abstractNumId w:val="16"/>
-  </w:num>
-  <w:num w:numId="29">
-    <w:abstractNumId w:val="24"/>
-  </w:num>
-  <w:num w:numId="30">
-    <w:abstractNumId w:val="35"/>
-  </w:num>
-  <w:num w:numId="31">
-    <w:abstractNumId w:val="2"/>
-  </w:num>
-  <w:num w:numId="32">
-    <w:abstractNumId w:val="22"/>
-  </w:num>
-  <w:num w:numId="33">
-    <w:abstractNumId w:val="0"/>
-  </w:num>
-  <w:num w:numId="34">
+  <w:num w:numId="49" w16cid:durableId="1289438368">
     <w:abstractNumId w:val="39"/>
-  </w:num>
-  <w:num w:numId="35">
-    <w:abstractNumId w:val="29"/>
-  </w:num>
-  <w:num w:numId="36">
-    <w:abstractNumId w:val="21"/>
-  </w:num>
-  <w:num w:numId="37">
-    <w:abstractNumId w:val="36"/>
-  </w:num>
-  <w:num w:numId="38">
-    <w:abstractNumId w:val="12"/>
-  </w:num>
-  <w:num w:numId="39">
-    <w:abstractNumId w:val="13"/>
-  </w:num>
-  <w:num w:numId="40">
-    <w:abstractNumId w:val="8"/>
   </w:num>
 </w:numbering>
 </file>
 
 <file path=word/styles.xml><?xml version="1.0" encoding="utf-8"?>
-<w:styles xmlns:mc="http://schemas.openxmlformats.org/markup-compatibility/2006" xmlns:r="http://schemas.openxmlformats.org/officeDocument/2006/relationships" xmlns:w="http://schemas.openxmlformats.org/wordprocessingml/2006/main" xmlns:w14="http://schemas.microsoft.com/office/word/2010/wordml" xmlns:w15="http://schemas.microsoft.com/office/word/2012/wordml" xmlns:w16cex="http://schemas.microsoft.com/office/word/2018/wordml/cex" xmlns:w16cid="http://schemas.microsoft.com/office/word/2016/wordml/cid" xmlns:w16="http://schemas.microsoft.com/office/word/2018/wordml" xmlns:w16sdtdh="http://schemas.microsoft.com/office/word/2020/wordml/sdtdatahash" xmlns:w16se="http://schemas.microsoft.com/office/word/2015/wordml/symex" mc:Ignorable="w14 w15 w16se w16cid w16 w16cex w16sdtdh">
+<w:styles xmlns:mc="http://schemas.openxmlformats.org/markup-compatibility/2006" xmlns:r="http://schemas.openxmlformats.org/officeDocument/2006/relationships" xmlns:w="http://schemas.openxmlformats.org/wordprocessingml/2006/main" xmlns:w14="http://schemas.microsoft.com/office/word/2010/wordml" xmlns:w15="http://schemas.microsoft.com/office/word/2012/wordml" xmlns:w16cex="http://schemas.microsoft.com/office/word/2018/wordml/cex" xmlns:w16cid="http://schemas.microsoft.com/office/word/2016/wordml/cid" xmlns:w16="http://schemas.microsoft.com/office/word/2018/wordml" xmlns:w16du="http://schemas.microsoft.com/office/word/2023/wordml/word16du" xmlns:w16sdtdh="http://schemas.microsoft.com/office/word/2020/wordml/sdtdatahash" xmlns:w16sdtfl="http://schemas.microsoft.com/office/word/2024/wordml/sdtformatlock" xmlns:w16se="http://schemas.microsoft.com/office/word/2015/wordml/symex" mc:Ignorable="w14 w15 w16se w16cid w16 w16cex w16sdtdh w16sdtfl w16du">
   <w:docDefaults>
     <w:rPrDefault>
       <w:rPr>

</xml_diff>

<commit_message>
MasterProfiles and serviceCategories API contracts and DTO
</commit_message>
<xml_diff>
--- a/docs/ProjectDoc.docx
+++ b/docs/ProjectDoc.docx
@@ -4977,19 +4977,7 @@
         <w:rPr>
           <w:lang w:val="en-US"/>
         </w:rPr>
-        <w:t xml:space="preserve">POST </w:t>
-      </w:r>
-      <w:r>
-        <w:rPr>
-          <w:lang w:val="en-US"/>
-        </w:rPr>
-        <w:t>/api/</w:t>
-      </w:r>
-      <w:r>
-        <w:rPr>
-          <w:lang w:val="en-US"/>
-        </w:rPr>
-        <w:t xml:space="preserve">auth/login – </w:t>
+        <w:t xml:space="preserve">POST /api/auth/login – </w:t>
       </w:r>
       <w:r>
         <w:rPr>
@@ -5423,13 +5411,7 @@
         <w:rPr>
           <w:lang w:val="ru-RU"/>
         </w:rPr>
-        <w:t xml:space="preserve"> </w:t>
-      </w:r>
-      <w:r>
-        <w:rPr>
-          <w:lang w:val="ru-RU"/>
-        </w:rPr>
-        <w:t>/</w:t>
+        <w:t xml:space="preserve"> /</w:t>
       </w:r>
       <w:r>
         <w:rPr>
@@ -5489,13 +5471,7 @@
         <w:rPr>
           <w:lang w:val="ru-RU"/>
         </w:rPr>
-        <w:t xml:space="preserve"> </w:t>
-      </w:r>
-      <w:r>
-        <w:rPr>
-          <w:lang w:val="ru-RU"/>
-        </w:rPr>
-        <w:t>/</w:t>
+        <w:t xml:space="preserve"> /</w:t>
       </w:r>
       <w:r>
         <w:rPr>
@@ -5818,13 +5794,7 @@
         <w:rPr>
           <w:lang w:val="ru-RU"/>
         </w:rPr>
-        <w:t xml:space="preserve"> </w:t>
-      </w:r>
-      <w:r>
-        <w:rPr>
-          <w:lang w:val="ru-RU"/>
-        </w:rPr>
-        <w:t>(рассчитывается)</w:t>
+        <w:t xml:space="preserve"> (рассчитывается)</w:t>
       </w:r>
     </w:p>
     <w:p>
@@ -5995,6 +5965,942 @@
           <w:lang w:val="ru-RU"/>
         </w:rPr>
       </w:pPr>
+    </w:p>
+    <w:p>
+      <w:pPr>
+        <w:rPr>
+          <w:b/>
+          <w:bCs/>
+          <w:lang w:val="en-US"/>
+        </w:rPr>
+      </w:pPr>
+      <w:r>
+        <w:rPr>
+          <w:b/>
+          <w:bCs/>
+          <w:lang w:val="en-US"/>
+        </w:rPr>
+        <w:t>Masters</w:t>
+      </w:r>
+    </w:p>
+    <w:p>
+      <w:pPr>
+        <w:rPr>
+          <w:lang w:val="en-US"/>
+        </w:rPr>
+      </w:pPr>
+      <w:r>
+        <w:rPr>
+          <w:lang w:val="en-US"/>
+        </w:rPr>
+        <w:t>API contracts</w:t>
+      </w:r>
+    </w:p>
+    <w:p>
+      <w:pPr>
+        <w:pStyle w:val="ListParagraph"/>
+        <w:numPr>
+          <w:ilvl w:val="0"/>
+          <w:numId w:val="50"/>
+        </w:numPr>
+        <w:rPr>
+          <w:lang w:val="ru-RU"/>
+        </w:rPr>
+      </w:pPr>
+      <w:r>
+        <w:rPr>
+          <w:lang w:val="en-US"/>
+        </w:rPr>
+        <w:t>GET</w:t>
+      </w:r>
+      <w:r>
+        <w:rPr>
+          <w:lang w:val="ru-RU"/>
+        </w:rPr>
+        <w:t xml:space="preserve"> /</w:t>
+      </w:r>
+      <w:r>
+        <w:rPr>
+          <w:lang w:val="en-US"/>
+        </w:rPr>
+        <w:t>api</w:t>
+      </w:r>
+      <w:r>
+        <w:rPr>
+          <w:lang w:val="ru-RU"/>
+        </w:rPr>
+        <w:t>/</w:t>
+      </w:r>
+      <w:r>
+        <w:rPr>
+          <w:lang w:val="en-US"/>
+        </w:rPr>
+        <w:t>masters</w:t>
+      </w:r>
+      <w:r>
+        <w:rPr>
+          <w:lang w:val="ru-RU"/>
+        </w:rPr>
+        <w:t>/</w:t>
+      </w:r>
+      <w:r>
+        <w:rPr>
+          <w:lang w:val="en-US"/>
+        </w:rPr>
+        <w:t>me</w:t>
+      </w:r>
+      <w:r>
+        <w:rPr>
+          <w:lang w:val="ru-RU"/>
+        </w:rPr>
+        <w:t xml:space="preserve"> – </w:t>
+      </w:r>
+      <w:r>
+        <w:rPr>
+          <w:lang w:val="ru-RU"/>
+        </w:rPr>
+        <w:t>получение</w:t>
+      </w:r>
+      <w:r>
+        <w:rPr>
+          <w:lang w:val="ru-RU"/>
+        </w:rPr>
+        <w:t xml:space="preserve"> </w:t>
+      </w:r>
+      <w:r>
+        <w:rPr>
+          <w:lang w:val="ru-RU"/>
+        </w:rPr>
+        <w:t>данных</w:t>
+      </w:r>
+      <w:r>
+        <w:rPr>
+          <w:lang w:val="ru-RU"/>
+        </w:rPr>
+        <w:t xml:space="preserve"> </w:t>
+      </w:r>
+      <w:r>
+        <w:rPr>
+          <w:lang w:val="ru-RU"/>
+        </w:rPr>
+        <w:t>текущего пользователя + уникальные данные для роли мастер</w:t>
+      </w:r>
+    </w:p>
+    <w:p>
+      <w:pPr>
+        <w:pStyle w:val="ListParagraph"/>
+        <w:numPr>
+          <w:ilvl w:val="0"/>
+          <w:numId w:val="50"/>
+        </w:numPr>
+        <w:rPr>
+          <w:lang w:val="ru-RU"/>
+        </w:rPr>
+      </w:pPr>
+      <w:r>
+        <w:rPr>
+          <w:lang w:val="en-US"/>
+        </w:rPr>
+        <w:t>PATCH</w:t>
+      </w:r>
+      <w:r>
+        <w:rPr>
+          <w:lang w:val="ru-RU"/>
+        </w:rPr>
+        <w:t xml:space="preserve"> /</w:t>
+      </w:r>
+      <w:r>
+        <w:rPr>
+          <w:lang w:val="en-US"/>
+        </w:rPr>
+        <w:t>api</w:t>
+      </w:r>
+      <w:r>
+        <w:rPr>
+          <w:lang w:val="ru-RU"/>
+        </w:rPr>
+        <w:t>/</w:t>
+      </w:r>
+      <w:r>
+        <w:rPr>
+          <w:lang w:val="en-US"/>
+        </w:rPr>
+        <w:t>masters</w:t>
+      </w:r>
+      <w:r>
+        <w:rPr>
+          <w:lang w:val="ru-RU"/>
+        </w:rPr>
+        <w:t>/</w:t>
+      </w:r>
+      <w:r>
+        <w:rPr>
+          <w:lang w:val="en-US"/>
+        </w:rPr>
+        <w:t>me</w:t>
+      </w:r>
+      <w:r>
+        <w:rPr>
+          <w:lang w:val="ru-RU"/>
+        </w:rPr>
+        <w:t xml:space="preserve"> – </w:t>
+      </w:r>
+      <w:r>
+        <w:rPr>
+          <w:lang w:val="ru-RU"/>
+        </w:rPr>
+        <w:t>изменение</w:t>
+      </w:r>
+      <w:r>
+        <w:rPr>
+          <w:lang w:val="ru-RU"/>
+        </w:rPr>
+        <w:t xml:space="preserve"> </w:t>
+      </w:r>
+      <w:r>
+        <w:rPr>
+          <w:lang w:val="ru-RU"/>
+        </w:rPr>
+        <w:t>описания и опыта работы</w:t>
+      </w:r>
+    </w:p>
+    <w:p>
+      <w:pPr>
+        <w:pStyle w:val="ListParagraph"/>
+        <w:numPr>
+          <w:ilvl w:val="0"/>
+          <w:numId w:val="50"/>
+        </w:numPr>
+        <w:rPr>
+          <w:lang w:val="ru-RU"/>
+        </w:rPr>
+      </w:pPr>
+      <w:r>
+        <w:rPr>
+          <w:lang w:val="en-US"/>
+        </w:rPr>
+        <w:t>GET</w:t>
+      </w:r>
+      <w:r>
+        <w:rPr>
+          <w:lang w:val="ru-RU"/>
+        </w:rPr>
+        <w:t xml:space="preserve"> /</w:t>
+      </w:r>
+      <w:r>
+        <w:rPr>
+          <w:lang w:val="en-US"/>
+        </w:rPr>
+        <w:t>api</w:t>
+      </w:r>
+      <w:r>
+        <w:rPr>
+          <w:lang w:val="ru-RU"/>
+        </w:rPr>
+        <w:t>/</w:t>
+      </w:r>
+      <w:r>
+        <w:rPr>
+          <w:lang w:val="en-US"/>
+        </w:rPr>
+        <w:t>masters</w:t>
+      </w:r>
+      <w:r>
+        <w:rPr>
+          <w:lang w:val="ru-RU"/>
+        </w:rPr>
+        <w:t>/</w:t>
+      </w:r>
+      <w:r>
+        <w:rPr>
+          <w:lang w:val="en-US"/>
+        </w:rPr>
+        <w:t>me</w:t>
+      </w:r>
+      <w:r>
+        <w:rPr>
+          <w:lang w:val="ru-RU"/>
+        </w:rPr>
+        <w:t>/</w:t>
+      </w:r>
+      <w:r>
+        <w:rPr>
+          <w:lang w:val="en-US"/>
+        </w:rPr>
+        <w:t>categories</w:t>
+      </w:r>
+      <w:r>
+        <w:rPr>
+          <w:lang w:val="ru-RU"/>
+        </w:rPr>
+        <w:t xml:space="preserve"> – </w:t>
+      </w:r>
+      <w:r>
+        <w:rPr>
+          <w:lang w:val="ru-RU"/>
+        </w:rPr>
+        <w:t>получение</w:t>
+      </w:r>
+      <w:r>
+        <w:rPr>
+          <w:lang w:val="ru-RU"/>
+        </w:rPr>
+        <w:t xml:space="preserve"> </w:t>
+      </w:r>
+      <w:r>
+        <w:rPr>
+          <w:lang w:val="ru-RU"/>
+        </w:rPr>
+        <w:t>списка</w:t>
+      </w:r>
+      <w:r>
+        <w:rPr>
+          <w:lang w:val="ru-RU"/>
+        </w:rPr>
+        <w:t xml:space="preserve"> </w:t>
+      </w:r>
+      <w:r>
+        <w:rPr>
+          <w:lang w:val="ru-RU"/>
+        </w:rPr>
+        <w:t>категорий мастера</w:t>
+      </w:r>
+      <w:r>
+        <w:rPr>
+          <w:lang w:val="ru-RU"/>
+        </w:rPr>
+        <w:t xml:space="preserve"> (</w:t>
+      </w:r>
+      <w:r>
+        <w:rPr>
+          <w:lang w:val="ru-RU"/>
+        </w:rPr>
+        <w:t xml:space="preserve">возвращается в формате списка из составных объектов </w:t>
+      </w:r>
+      <w:r>
+        <w:rPr>
+          <w:lang w:val="ru-RU"/>
+        </w:rPr>
+        <w:t>[(</w:t>
+      </w:r>
+      <w:r>
+        <w:rPr>
+          <w:lang w:val="en-US"/>
+        </w:rPr>
+        <w:t>categoryId</w:t>
+      </w:r>
+      <w:r>
+        <w:rPr>
+          <w:lang w:val="ru-RU"/>
+        </w:rPr>
+        <w:t xml:space="preserve">, </w:t>
+      </w:r>
+      <w:r>
+        <w:rPr>
+          <w:lang w:val="en-US"/>
+        </w:rPr>
+        <w:t>name</w:t>
+      </w:r>
+      <w:r>
+        <w:rPr>
+          <w:lang w:val="ru-RU"/>
+        </w:rPr>
+        <w:t>), (…)]</w:t>
+      </w:r>
+    </w:p>
+    <w:p>
+      <w:pPr>
+        <w:pStyle w:val="ListParagraph"/>
+        <w:numPr>
+          <w:ilvl w:val="0"/>
+          <w:numId w:val="50"/>
+        </w:numPr>
+        <w:rPr>
+          <w:lang w:val="ru-RU"/>
+        </w:rPr>
+      </w:pPr>
+      <w:r>
+        <w:rPr>
+          <w:lang w:val="en-US"/>
+        </w:rPr>
+        <w:t>PUT</w:t>
+      </w:r>
+      <w:r>
+        <w:rPr>
+          <w:lang w:val="ru-RU"/>
+        </w:rPr>
+        <w:t xml:space="preserve"> /</w:t>
+      </w:r>
+      <w:r>
+        <w:rPr>
+          <w:lang w:val="en-US"/>
+        </w:rPr>
+        <w:t>api</w:t>
+      </w:r>
+      <w:r>
+        <w:rPr>
+          <w:lang w:val="ru-RU"/>
+        </w:rPr>
+        <w:t>/</w:t>
+      </w:r>
+      <w:r>
+        <w:rPr>
+          <w:lang w:val="en-US"/>
+        </w:rPr>
+        <w:t>masters</w:t>
+      </w:r>
+      <w:r>
+        <w:rPr>
+          <w:lang w:val="ru-RU"/>
+        </w:rPr>
+        <w:t>/</w:t>
+      </w:r>
+      <w:r>
+        <w:rPr>
+          <w:lang w:val="en-US"/>
+        </w:rPr>
+        <w:t>me</w:t>
+      </w:r>
+      <w:r>
+        <w:rPr>
+          <w:lang w:val="ru-RU"/>
+        </w:rPr>
+        <w:t>/</w:t>
+      </w:r>
+      <w:r>
+        <w:rPr>
+          <w:lang w:val="en-US"/>
+        </w:rPr>
+        <w:t>categories</w:t>
+      </w:r>
+      <w:r>
+        <w:rPr>
+          <w:lang w:val="ru-RU"/>
+        </w:rPr>
+        <w:t xml:space="preserve"> – </w:t>
+      </w:r>
+      <w:r>
+        <w:rPr>
+          <w:lang w:val="ru-RU"/>
+        </w:rPr>
+        <w:t>изменение</w:t>
+      </w:r>
+      <w:r>
+        <w:rPr>
+          <w:lang w:val="ru-RU"/>
+        </w:rPr>
+        <w:t xml:space="preserve"> </w:t>
+      </w:r>
+      <w:r>
+        <w:rPr>
+          <w:lang w:val="ru-RU"/>
+        </w:rPr>
+        <w:t>списка</w:t>
+      </w:r>
+      <w:r>
+        <w:rPr>
+          <w:lang w:val="ru-RU"/>
+        </w:rPr>
+        <w:t xml:space="preserve"> </w:t>
+      </w:r>
+      <w:r>
+        <w:rPr>
+          <w:lang w:val="ru-RU"/>
+        </w:rPr>
+        <w:t>собственных специализаций мастера</w:t>
+      </w:r>
+      <w:r>
+        <w:rPr>
+          <w:lang w:val="ru-RU"/>
+        </w:rPr>
+        <w:t xml:space="preserve"> (</w:t>
+      </w:r>
+      <w:r>
+        <w:rPr>
+          <w:lang w:val="ru-RU"/>
+        </w:rPr>
+        <w:t>заменяет весь список на новый)</w:t>
+      </w:r>
+    </w:p>
+    <w:p>
+      <w:pPr>
+        <w:rPr>
+          <w:lang w:val="en-US" w:eastAsia="en-GB"/>
+        </w:rPr>
+      </w:pPr>
+      <w:r>
+        <w:rPr>
+          <w:lang w:val="ru-RU"/>
+        </w:rPr>
+        <w:br/>
+      </w:r>
+      <w:r>
+        <w:rPr>
+          <w:lang w:val="en-US" w:eastAsia="en-GB"/>
+        </w:rPr>
+        <w:t>DTO</w:t>
+      </w:r>
+    </w:p>
+    <w:p>
+      <w:pPr>
+        <w:rPr>
+          <w:lang w:val="en-US"/>
+        </w:rPr>
+      </w:pPr>
+      <w:r>
+        <w:rPr>
+          <w:lang w:val="en-US"/>
+        </w:rPr>
+        <w:t>MasterProfileResponse:</w:t>
+      </w:r>
+    </w:p>
+    <w:p>
+      <w:pPr>
+        <w:pStyle w:val="ListParagraph"/>
+        <w:numPr>
+          <w:ilvl w:val="0"/>
+          <w:numId w:val="52"/>
+        </w:numPr>
+        <w:rPr>
+          <w:lang w:val="en-US"/>
+        </w:rPr>
+      </w:pPr>
+      <w:r>
+        <w:rPr>
+          <w:lang w:val="en-US"/>
+        </w:rPr>
+        <w:t>userId</w:t>
+      </w:r>
+    </w:p>
+    <w:p>
+      <w:pPr>
+        <w:pStyle w:val="ListParagraph"/>
+        <w:numPr>
+          <w:ilvl w:val="0"/>
+          <w:numId w:val="52"/>
+        </w:numPr>
+        <w:rPr>
+          <w:lang w:val="en-US"/>
+        </w:rPr>
+      </w:pPr>
+      <w:r>
+        <w:rPr>
+          <w:lang w:val="en-US"/>
+        </w:rPr>
+        <w:t>login</w:t>
+      </w:r>
+    </w:p>
+    <w:p>
+      <w:pPr>
+        <w:pStyle w:val="ListParagraph"/>
+        <w:numPr>
+          <w:ilvl w:val="0"/>
+          <w:numId w:val="52"/>
+        </w:numPr>
+        <w:rPr>
+          <w:lang w:val="en-US"/>
+        </w:rPr>
+      </w:pPr>
+      <w:r>
+        <w:rPr>
+          <w:lang w:val="en-US"/>
+        </w:rPr>
+        <w:t>firstName</w:t>
+      </w:r>
+    </w:p>
+    <w:p>
+      <w:pPr>
+        <w:pStyle w:val="ListParagraph"/>
+        <w:numPr>
+          <w:ilvl w:val="0"/>
+          <w:numId w:val="52"/>
+        </w:numPr>
+        <w:rPr>
+          <w:lang w:val="en-US"/>
+        </w:rPr>
+      </w:pPr>
+      <w:r>
+        <w:rPr>
+          <w:lang w:val="en-US"/>
+        </w:rPr>
+        <w:t>lastName</w:t>
+      </w:r>
+    </w:p>
+    <w:p>
+      <w:pPr>
+        <w:pStyle w:val="ListParagraph"/>
+        <w:numPr>
+          <w:ilvl w:val="0"/>
+          <w:numId w:val="52"/>
+        </w:numPr>
+        <w:rPr>
+          <w:lang w:val="en-US"/>
+        </w:rPr>
+      </w:pPr>
+      <w:r>
+        <w:rPr>
+          <w:lang w:val="en-US"/>
+        </w:rPr>
+        <w:t>phone</w:t>
+      </w:r>
+    </w:p>
+    <w:p>
+      <w:pPr>
+        <w:pStyle w:val="ListParagraph"/>
+        <w:numPr>
+          <w:ilvl w:val="0"/>
+          <w:numId w:val="52"/>
+        </w:numPr>
+        <w:rPr>
+          <w:lang w:val="en-US"/>
+        </w:rPr>
+      </w:pPr>
+      <w:r>
+        <w:rPr>
+          <w:lang w:val="en-US"/>
+        </w:rPr>
+        <w:t>description</w:t>
+      </w:r>
+    </w:p>
+    <w:p>
+      <w:pPr>
+        <w:pStyle w:val="ListParagraph"/>
+        <w:numPr>
+          <w:ilvl w:val="0"/>
+          <w:numId w:val="52"/>
+        </w:numPr>
+        <w:rPr>
+          <w:lang w:val="en-US"/>
+        </w:rPr>
+      </w:pPr>
+      <w:r>
+        <w:rPr>
+          <w:lang w:val="en-US"/>
+        </w:rPr>
+        <w:t>experienceYears</w:t>
+      </w:r>
+    </w:p>
+    <w:p>
+      <w:pPr>
+        <w:pStyle w:val="ListParagraph"/>
+        <w:numPr>
+          <w:ilvl w:val="0"/>
+          <w:numId w:val="52"/>
+        </w:numPr>
+        <w:rPr>
+          <w:lang w:val="en-US"/>
+        </w:rPr>
+      </w:pPr>
+      <w:r>
+        <w:rPr>
+          <w:lang w:val="en-US"/>
+        </w:rPr>
+        <w:t>categories: List&lt;ServiceCategoriesResponse&gt;</w:t>
+      </w:r>
+      <w:r>
+        <w:rPr>
+          <w:lang w:val="en-US"/>
+        </w:rPr>
+        <w:br/>
+      </w:r>
+    </w:p>
+    <w:p>
+      <w:pPr>
+        <w:rPr>
+          <w:lang w:val="en-US"/>
+        </w:rPr>
+      </w:pPr>
+      <w:r>
+        <w:rPr>
+          <w:lang w:val="en-US"/>
+        </w:rPr>
+        <w:t>UpdateMasterProfileRequest:</w:t>
+      </w:r>
+    </w:p>
+    <w:p>
+      <w:pPr>
+        <w:pStyle w:val="ListParagraph"/>
+        <w:numPr>
+          <w:ilvl w:val="0"/>
+          <w:numId w:val="53"/>
+        </w:numPr>
+        <w:rPr>
+          <w:lang w:val="en-US"/>
+        </w:rPr>
+      </w:pPr>
+      <w:r>
+        <w:rPr>
+          <w:lang w:val="en-US"/>
+        </w:rPr>
+        <w:t>description</w:t>
+      </w:r>
+    </w:p>
+    <w:p>
+      <w:pPr>
+        <w:pStyle w:val="ListParagraph"/>
+        <w:numPr>
+          <w:ilvl w:val="0"/>
+          <w:numId w:val="53"/>
+        </w:numPr>
+        <w:rPr>
+          <w:lang w:val="en-US"/>
+        </w:rPr>
+      </w:pPr>
+      <w:r>
+        <w:rPr>
+          <w:lang w:val="en-US"/>
+        </w:rPr>
+        <w:t>experienceYears</w:t>
+      </w:r>
+      <w:r>
+        <w:rPr>
+          <w:lang w:val="en-US"/>
+        </w:rPr>
+        <w:br/>
+      </w:r>
+    </w:p>
+    <w:p>
+      <w:pPr>
+        <w:rPr>
+          <w:lang w:val="en-US"/>
+        </w:rPr>
+      </w:pPr>
+      <w:r>
+        <w:rPr>
+          <w:lang w:val="en-US"/>
+        </w:rPr>
+        <w:t>UpdateMasterCategoriesRequest:</w:t>
+      </w:r>
+    </w:p>
+    <w:p>
+      <w:pPr>
+        <w:pStyle w:val="ListParagraph"/>
+        <w:numPr>
+          <w:ilvl w:val="0"/>
+          <w:numId w:val="54"/>
+        </w:numPr>
+        <w:rPr>
+          <w:lang w:val="en-US"/>
+        </w:rPr>
+      </w:pPr>
+      <w:r>
+        <w:rPr>
+          <w:lang w:val="en-US"/>
+        </w:rPr>
+        <w:t>categoryIds</w:t>
+      </w:r>
+    </w:p>
+    <w:p>
+      <w:pPr>
+        <w:pStyle w:val="ListParagraph"/>
+        <w:rPr>
+          <w:lang w:val="en-US"/>
+        </w:rPr>
+      </w:pPr>
+    </w:p>
+    <w:p>
+      <w:pPr>
+        <w:rPr>
+          <w:b/>
+          <w:bCs/>
+          <w:lang w:val="en-US"/>
+        </w:rPr>
+      </w:pPr>
+      <w:r>
+        <w:rPr>
+          <w:b/>
+          <w:bCs/>
+          <w:lang w:val="en-US"/>
+        </w:rPr>
+        <w:t>Service</w:t>
+      </w:r>
+      <w:r>
+        <w:rPr>
+          <w:b/>
+          <w:bCs/>
+          <w:lang w:val="en-US"/>
+        </w:rPr>
+        <w:t>C</w:t>
+      </w:r>
+      <w:r>
+        <w:rPr>
+          <w:b/>
+          <w:bCs/>
+          <w:lang w:val="en-US"/>
+        </w:rPr>
+        <w:t>ategories</w:t>
+      </w:r>
+    </w:p>
+    <w:p>
+      <w:pPr>
+        <w:rPr>
+          <w:lang w:val="en-US"/>
+        </w:rPr>
+      </w:pPr>
+      <w:r>
+        <w:rPr>
+          <w:lang w:val="en-US"/>
+        </w:rPr>
+        <w:t>API contracts</w:t>
+      </w:r>
+    </w:p>
+    <w:p>
+      <w:pPr>
+        <w:pStyle w:val="ListParagraph"/>
+        <w:numPr>
+          <w:ilvl w:val="0"/>
+          <w:numId w:val="51"/>
+        </w:numPr>
+        <w:rPr>
+          <w:lang w:val="ru-RU"/>
+        </w:rPr>
+      </w:pPr>
+      <w:r>
+        <w:rPr>
+          <w:lang w:val="en-US"/>
+        </w:rPr>
+        <w:t>GET</w:t>
+      </w:r>
+      <w:r>
+        <w:rPr>
+          <w:lang w:val="ru-RU"/>
+        </w:rPr>
+        <w:t xml:space="preserve"> /</w:t>
+      </w:r>
+      <w:r>
+        <w:rPr>
+          <w:lang w:val="en-US"/>
+        </w:rPr>
+        <w:t>api</w:t>
+      </w:r>
+      <w:r>
+        <w:rPr>
+          <w:lang w:val="ru-RU"/>
+        </w:rPr>
+        <w:t>/</w:t>
+      </w:r>
+      <w:r>
+        <w:rPr>
+          <w:lang w:val="en-US"/>
+        </w:rPr>
+        <w:t>service</w:t>
+      </w:r>
+      <w:r>
+        <w:rPr>
+          <w:lang w:val="ru-RU"/>
+        </w:rPr>
+        <w:t>-</w:t>
+      </w:r>
+      <w:r>
+        <w:rPr>
+          <w:lang w:val="en-US"/>
+        </w:rPr>
+        <w:t>categories</w:t>
+      </w:r>
+      <w:r>
+        <w:rPr>
+          <w:lang w:val="ru-RU"/>
+        </w:rPr>
+        <w:t xml:space="preserve"> – </w:t>
+      </w:r>
+      <w:r>
+        <w:rPr>
+          <w:lang w:val="ru-RU"/>
+        </w:rPr>
+        <w:t>получение</w:t>
+      </w:r>
+      <w:r>
+        <w:rPr>
+          <w:lang w:val="ru-RU"/>
+        </w:rPr>
+        <w:t xml:space="preserve"> </w:t>
+      </w:r>
+      <w:r>
+        <w:rPr>
+          <w:lang w:val="ru-RU"/>
+        </w:rPr>
+        <w:t xml:space="preserve">существующего списка категорий, который может быть использован пользователями с любой ролью. Возвращается в формате списка из составных объектов </w:t>
+      </w:r>
+      <w:r>
+        <w:rPr>
+          <w:lang w:val="en-US"/>
+        </w:rPr>
+        <w:t>[(categoryId, name), (…)]</w:t>
+      </w:r>
+    </w:p>
+    <w:p>
+      <w:pPr>
+        <w:rPr>
+          <w:lang w:val="ru-RU"/>
+        </w:rPr>
+      </w:pPr>
+      <w:r>
+        <w:rPr>
+          <w:lang w:val="en-US"/>
+        </w:rPr>
+        <w:t>DTO</w:t>
+      </w:r>
+    </w:p>
+    <w:p>
+      <w:pPr>
+        <w:rPr>
+          <w:lang w:val="ru-RU"/>
+        </w:rPr>
+      </w:pPr>
+      <w:r>
+        <w:rPr>
+          <w:lang w:val="en-US"/>
+        </w:rPr>
+        <w:t>ServiceCategoryResponse</w:t>
+      </w:r>
+      <w:r>
+        <w:rPr>
+          <w:lang w:val="ru-RU"/>
+        </w:rPr>
+        <w:t xml:space="preserve"> (в том числе и для получения категорий конкретного мастера)</w:t>
+      </w:r>
+      <w:r>
+        <w:rPr>
+          <w:lang w:val="ru-RU"/>
+        </w:rPr>
+        <w:t>:</w:t>
+      </w:r>
+    </w:p>
+    <w:p>
+      <w:pPr>
+        <w:pStyle w:val="ListParagraph"/>
+        <w:numPr>
+          <w:ilvl w:val="0"/>
+          <w:numId w:val="51"/>
+        </w:numPr>
+        <w:rPr>
+          <w:lang w:val="en-US"/>
+        </w:rPr>
+      </w:pPr>
+      <w:r>
+        <w:rPr>
+          <w:lang w:val="en-US"/>
+        </w:rPr>
+        <w:t>categoryId</w:t>
+      </w:r>
+    </w:p>
+    <w:p>
+      <w:pPr>
+        <w:pStyle w:val="ListParagraph"/>
+        <w:numPr>
+          <w:ilvl w:val="0"/>
+          <w:numId w:val="51"/>
+        </w:numPr>
+        <w:rPr>
+          <w:lang w:val="en-US"/>
+        </w:rPr>
+      </w:pPr>
+      <w:r>
+        <w:rPr>
+          <w:lang w:val="en-US"/>
+        </w:rPr>
+        <w:t>name</w:t>
+      </w:r>
     </w:p>
     <w:p>
       <w:pPr>
@@ -8428,6 +9334,119 @@
     </w:lvl>
   </w:abstractNum>
   <w:abstractNum w:abstractNumId="21" w15:restartNumberingAfterBreak="0">
+    <w:nsid w:val="42156DA2"/>
+    <w:multiLevelType w:val="hybridMultilevel"/>
+    <w:tmpl w:val="55309BB6"/>
+    <w:lvl w:ilvl="0" w:tplc="04190003">
+      <w:start w:val="1"/>
+      <w:numFmt w:val="bullet"/>
+      <w:lvlText w:val="o"/>
+      <w:lvlJc w:val="left"/>
+      <w:pPr>
+        <w:ind w:left="720" w:hanging="360"/>
+      </w:pPr>
+      <w:rPr>
+        <w:rFonts w:ascii="Courier New" w:hAnsi="Courier New" w:cs="Courier New" w:hint="default"/>
+      </w:rPr>
+    </w:lvl>
+    <w:lvl w:ilvl="1" w:tplc="08090003" w:tentative="1">
+      <w:start w:val="1"/>
+      <w:numFmt w:val="bullet"/>
+      <w:lvlText w:val="o"/>
+      <w:lvlJc w:val="left"/>
+      <w:pPr>
+        <w:ind w:left="1440" w:hanging="360"/>
+      </w:pPr>
+      <w:rPr>
+        <w:rFonts w:ascii="Courier New" w:hAnsi="Courier New" w:cs="Courier New" w:hint="default"/>
+      </w:rPr>
+    </w:lvl>
+    <w:lvl w:ilvl="2" w:tplc="08090005" w:tentative="1">
+      <w:start w:val="1"/>
+      <w:numFmt w:val="bullet"/>
+      <w:lvlText w:val=""/>
+      <w:lvlJc w:val="left"/>
+      <w:pPr>
+        <w:ind w:left="2160" w:hanging="360"/>
+      </w:pPr>
+      <w:rPr>
+        <w:rFonts w:ascii="Wingdings" w:hAnsi="Wingdings" w:hint="default"/>
+      </w:rPr>
+    </w:lvl>
+    <w:lvl w:ilvl="3" w:tplc="08090001" w:tentative="1">
+      <w:start w:val="1"/>
+      <w:numFmt w:val="bullet"/>
+      <w:lvlText w:val=""/>
+      <w:lvlJc w:val="left"/>
+      <w:pPr>
+        <w:ind w:left="2880" w:hanging="360"/>
+      </w:pPr>
+      <w:rPr>
+        <w:rFonts w:ascii="Symbol" w:hAnsi="Symbol" w:hint="default"/>
+      </w:rPr>
+    </w:lvl>
+    <w:lvl w:ilvl="4" w:tplc="08090003" w:tentative="1">
+      <w:start w:val="1"/>
+      <w:numFmt w:val="bullet"/>
+      <w:lvlText w:val="o"/>
+      <w:lvlJc w:val="left"/>
+      <w:pPr>
+        <w:ind w:left="3600" w:hanging="360"/>
+      </w:pPr>
+      <w:rPr>
+        <w:rFonts w:ascii="Courier New" w:hAnsi="Courier New" w:cs="Courier New" w:hint="default"/>
+      </w:rPr>
+    </w:lvl>
+    <w:lvl w:ilvl="5" w:tplc="08090005" w:tentative="1">
+      <w:start w:val="1"/>
+      <w:numFmt w:val="bullet"/>
+      <w:lvlText w:val=""/>
+      <w:lvlJc w:val="left"/>
+      <w:pPr>
+        <w:ind w:left="4320" w:hanging="360"/>
+      </w:pPr>
+      <w:rPr>
+        <w:rFonts w:ascii="Wingdings" w:hAnsi="Wingdings" w:hint="default"/>
+      </w:rPr>
+    </w:lvl>
+    <w:lvl w:ilvl="6" w:tplc="08090001" w:tentative="1">
+      <w:start w:val="1"/>
+      <w:numFmt w:val="bullet"/>
+      <w:lvlText w:val=""/>
+      <w:lvlJc w:val="left"/>
+      <w:pPr>
+        <w:ind w:left="5040" w:hanging="360"/>
+      </w:pPr>
+      <w:rPr>
+        <w:rFonts w:ascii="Symbol" w:hAnsi="Symbol" w:hint="default"/>
+      </w:rPr>
+    </w:lvl>
+    <w:lvl w:ilvl="7" w:tplc="08090003" w:tentative="1">
+      <w:start w:val="1"/>
+      <w:numFmt w:val="bullet"/>
+      <w:lvlText w:val="o"/>
+      <w:lvlJc w:val="left"/>
+      <w:pPr>
+        <w:ind w:left="5760" w:hanging="360"/>
+      </w:pPr>
+      <w:rPr>
+        <w:rFonts w:ascii="Courier New" w:hAnsi="Courier New" w:cs="Courier New" w:hint="default"/>
+      </w:rPr>
+    </w:lvl>
+    <w:lvl w:ilvl="8" w:tplc="08090005" w:tentative="1">
+      <w:start w:val="1"/>
+      <w:numFmt w:val="bullet"/>
+      <w:lvlText w:val=""/>
+      <w:lvlJc w:val="left"/>
+      <w:pPr>
+        <w:ind w:left="6480" w:hanging="360"/>
+      </w:pPr>
+      <w:rPr>
+        <w:rFonts w:ascii="Wingdings" w:hAnsi="Wingdings" w:hint="default"/>
+      </w:rPr>
+    </w:lvl>
+  </w:abstractNum>
+  <w:abstractNum w:abstractNumId="22" w15:restartNumberingAfterBreak="0">
     <w:nsid w:val="453B33E1"/>
     <w:multiLevelType w:val="hybridMultilevel"/>
     <w:tmpl w:val="F120F0E6"/>
@@ -8541,7 +9560,7 @@
       </w:rPr>
     </w:lvl>
   </w:abstractNum>
-  <w:abstractNum w:abstractNumId="22" w15:restartNumberingAfterBreak="0">
+  <w:abstractNum w:abstractNumId="23" w15:restartNumberingAfterBreak="0">
     <w:nsid w:val="470F5029"/>
     <w:multiLevelType w:val="hybridMultilevel"/>
     <w:tmpl w:val="EB90B4B2"/>
@@ -8654,7 +9673,7 @@
       </w:rPr>
     </w:lvl>
   </w:abstractNum>
-  <w:abstractNum w:abstractNumId="23" w15:restartNumberingAfterBreak="0">
+  <w:abstractNum w:abstractNumId="24" w15:restartNumberingAfterBreak="0">
     <w:nsid w:val="48095377"/>
     <w:multiLevelType w:val="multilevel"/>
     <w:tmpl w:val="A80ED424"/>
@@ -8803,7 +9822,7 @@
       </w:rPr>
     </w:lvl>
   </w:abstractNum>
-  <w:abstractNum w:abstractNumId="24" w15:restartNumberingAfterBreak="0">
+  <w:abstractNum w:abstractNumId="25" w15:restartNumberingAfterBreak="0">
     <w:nsid w:val="495F0919"/>
     <w:multiLevelType w:val="hybridMultilevel"/>
     <w:tmpl w:val="65725F00"/>
@@ -8889,7 +9908,120 @@
       </w:pPr>
     </w:lvl>
   </w:abstractNum>
-  <w:abstractNum w:abstractNumId="25" w15:restartNumberingAfterBreak="0">
+  <w:abstractNum w:abstractNumId="26" w15:restartNumberingAfterBreak="0">
+    <w:nsid w:val="49F1780A"/>
+    <w:multiLevelType w:val="hybridMultilevel"/>
+    <w:tmpl w:val="2612D89A"/>
+    <w:lvl w:ilvl="0" w:tplc="04190003">
+      <w:start w:val="1"/>
+      <w:numFmt w:val="bullet"/>
+      <w:lvlText w:val="o"/>
+      <w:lvlJc w:val="left"/>
+      <w:pPr>
+        <w:ind w:left="720" w:hanging="360"/>
+      </w:pPr>
+      <w:rPr>
+        <w:rFonts w:ascii="Courier New" w:hAnsi="Courier New" w:cs="Courier New" w:hint="default"/>
+      </w:rPr>
+    </w:lvl>
+    <w:lvl w:ilvl="1" w:tplc="08090003" w:tentative="1">
+      <w:start w:val="1"/>
+      <w:numFmt w:val="bullet"/>
+      <w:lvlText w:val="o"/>
+      <w:lvlJc w:val="left"/>
+      <w:pPr>
+        <w:ind w:left="1440" w:hanging="360"/>
+      </w:pPr>
+      <w:rPr>
+        <w:rFonts w:ascii="Courier New" w:hAnsi="Courier New" w:cs="Courier New" w:hint="default"/>
+      </w:rPr>
+    </w:lvl>
+    <w:lvl w:ilvl="2" w:tplc="08090005" w:tentative="1">
+      <w:start w:val="1"/>
+      <w:numFmt w:val="bullet"/>
+      <w:lvlText w:val=""/>
+      <w:lvlJc w:val="left"/>
+      <w:pPr>
+        <w:ind w:left="2160" w:hanging="360"/>
+      </w:pPr>
+      <w:rPr>
+        <w:rFonts w:ascii="Wingdings" w:hAnsi="Wingdings" w:hint="default"/>
+      </w:rPr>
+    </w:lvl>
+    <w:lvl w:ilvl="3" w:tplc="08090001" w:tentative="1">
+      <w:start w:val="1"/>
+      <w:numFmt w:val="bullet"/>
+      <w:lvlText w:val=""/>
+      <w:lvlJc w:val="left"/>
+      <w:pPr>
+        <w:ind w:left="2880" w:hanging="360"/>
+      </w:pPr>
+      <w:rPr>
+        <w:rFonts w:ascii="Symbol" w:hAnsi="Symbol" w:hint="default"/>
+      </w:rPr>
+    </w:lvl>
+    <w:lvl w:ilvl="4" w:tplc="08090003" w:tentative="1">
+      <w:start w:val="1"/>
+      <w:numFmt w:val="bullet"/>
+      <w:lvlText w:val="o"/>
+      <w:lvlJc w:val="left"/>
+      <w:pPr>
+        <w:ind w:left="3600" w:hanging="360"/>
+      </w:pPr>
+      <w:rPr>
+        <w:rFonts w:ascii="Courier New" w:hAnsi="Courier New" w:cs="Courier New" w:hint="default"/>
+      </w:rPr>
+    </w:lvl>
+    <w:lvl w:ilvl="5" w:tplc="08090005" w:tentative="1">
+      <w:start w:val="1"/>
+      <w:numFmt w:val="bullet"/>
+      <w:lvlText w:val=""/>
+      <w:lvlJc w:val="left"/>
+      <w:pPr>
+        <w:ind w:left="4320" w:hanging="360"/>
+      </w:pPr>
+      <w:rPr>
+        <w:rFonts w:ascii="Wingdings" w:hAnsi="Wingdings" w:hint="default"/>
+      </w:rPr>
+    </w:lvl>
+    <w:lvl w:ilvl="6" w:tplc="08090001" w:tentative="1">
+      <w:start w:val="1"/>
+      <w:numFmt w:val="bullet"/>
+      <w:lvlText w:val=""/>
+      <w:lvlJc w:val="left"/>
+      <w:pPr>
+        <w:ind w:left="5040" w:hanging="360"/>
+      </w:pPr>
+      <w:rPr>
+        <w:rFonts w:ascii="Symbol" w:hAnsi="Symbol" w:hint="default"/>
+      </w:rPr>
+    </w:lvl>
+    <w:lvl w:ilvl="7" w:tplc="08090003" w:tentative="1">
+      <w:start w:val="1"/>
+      <w:numFmt w:val="bullet"/>
+      <w:lvlText w:val="o"/>
+      <w:lvlJc w:val="left"/>
+      <w:pPr>
+        <w:ind w:left="5760" w:hanging="360"/>
+      </w:pPr>
+      <w:rPr>
+        <w:rFonts w:ascii="Courier New" w:hAnsi="Courier New" w:cs="Courier New" w:hint="default"/>
+      </w:rPr>
+    </w:lvl>
+    <w:lvl w:ilvl="8" w:tplc="08090005" w:tentative="1">
+      <w:start w:val="1"/>
+      <w:numFmt w:val="bullet"/>
+      <w:lvlText w:val=""/>
+      <w:lvlJc w:val="left"/>
+      <w:pPr>
+        <w:ind w:left="6480" w:hanging="360"/>
+      </w:pPr>
+      <w:rPr>
+        <w:rFonts w:ascii="Wingdings" w:hAnsi="Wingdings" w:hint="default"/>
+      </w:rPr>
+    </w:lvl>
+  </w:abstractNum>
+  <w:abstractNum w:abstractNumId="27" w15:restartNumberingAfterBreak="0">
     <w:nsid w:val="50DB2B87"/>
     <w:multiLevelType w:val="hybridMultilevel"/>
     <w:tmpl w:val="2982D086"/>
@@ -9002,7 +10134,7 @@
       </w:rPr>
     </w:lvl>
   </w:abstractNum>
-  <w:abstractNum w:abstractNumId="26" w15:restartNumberingAfterBreak="0">
+  <w:abstractNum w:abstractNumId="28" w15:restartNumberingAfterBreak="0">
     <w:nsid w:val="510569D1"/>
     <w:multiLevelType w:val="hybridMultilevel"/>
     <w:tmpl w:val="A996740E"/>
@@ -9115,7 +10247,7 @@
       </w:rPr>
     </w:lvl>
   </w:abstractNum>
-  <w:abstractNum w:abstractNumId="27" w15:restartNumberingAfterBreak="0">
+  <w:abstractNum w:abstractNumId="29" w15:restartNumberingAfterBreak="0">
     <w:nsid w:val="51917AA5"/>
     <w:multiLevelType w:val="hybridMultilevel"/>
     <w:tmpl w:val="D2C2DF86"/>
@@ -9227,7 +10359,7 @@
       </w:rPr>
     </w:lvl>
   </w:abstractNum>
-  <w:abstractNum w:abstractNumId="28" w15:restartNumberingAfterBreak="0">
+  <w:abstractNum w:abstractNumId="30" w15:restartNumberingAfterBreak="0">
     <w:nsid w:val="540D4D1C"/>
     <w:multiLevelType w:val="multilevel"/>
     <w:tmpl w:val="FCAE62CA"/>
@@ -9376,7 +10508,7 @@
       </w:rPr>
     </w:lvl>
   </w:abstractNum>
-  <w:abstractNum w:abstractNumId="29" w15:restartNumberingAfterBreak="0">
+  <w:abstractNum w:abstractNumId="31" w15:restartNumberingAfterBreak="0">
     <w:nsid w:val="546C7644"/>
     <w:multiLevelType w:val="hybridMultilevel"/>
     <w:tmpl w:val="9DC4FE98"/>
@@ -9489,7 +10621,7 @@
       </w:rPr>
     </w:lvl>
   </w:abstractNum>
-  <w:abstractNum w:abstractNumId="30" w15:restartNumberingAfterBreak="0">
+  <w:abstractNum w:abstractNumId="32" w15:restartNumberingAfterBreak="0">
     <w:nsid w:val="548A7F04"/>
     <w:multiLevelType w:val="hybridMultilevel"/>
     <w:tmpl w:val="35240576"/>
@@ -9602,7 +10734,7 @@
       </w:rPr>
     </w:lvl>
   </w:abstractNum>
-  <w:abstractNum w:abstractNumId="31" w15:restartNumberingAfterBreak="0">
+  <w:abstractNum w:abstractNumId="33" w15:restartNumberingAfterBreak="0">
     <w:nsid w:val="5547596D"/>
     <w:multiLevelType w:val="multilevel"/>
     <w:tmpl w:val="EC922B90"/>
@@ -9751,7 +10883,7 @@
       </w:rPr>
     </w:lvl>
   </w:abstractNum>
-  <w:abstractNum w:abstractNumId="32" w15:restartNumberingAfterBreak="0">
+  <w:abstractNum w:abstractNumId="34" w15:restartNumberingAfterBreak="0">
     <w:nsid w:val="563F7FAC"/>
     <w:multiLevelType w:val="multilevel"/>
     <w:tmpl w:val="9F88A25A"/>
@@ -9864,7 +10996,7 @@
       </w:pPr>
     </w:lvl>
   </w:abstractNum>
-  <w:abstractNum w:abstractNumId="33" w15:restartNumberingAfterBreak="0">
+  <w:abstractNum w:abstractNumId="35" w15:restartNumberingAfterBreak="0">
     <w:nsid w:val="57C61526"/>
     <w:multiLevelType w:val="hybridMultilevel"/>
     <w:tmpl w:val="1326E626"/>
@@ -9977,7 +11109,120 @@
       </w:rPr>
     </w:lvl>
   </w:abstractNum>
-  <w:abstractNum w:abstractNumId="34" w15:restartNumberingAfterBreak="0">
+  <w:abstractNum w:abstractNumId="36" w15:restartNumberingAfterBreak="0">
+    <w:nsid w:val="59500FEE"/>
+    <w:multiLevelType w:val="hybridMultilevel"/>
+    <w:tmpl w:val="8C7A99A2"/>
+    <w:lvl w:ilvl="0" w:tplc="04190003">
+      <w:start w:val="1"/>
+      <w:numFmt w:val="bullet"/>
+      <w:lvlText w:val="o"/>
+      <w:lvlJc w:val="left"/>
+      <w:pPr>
+        <w:ind w:left="720" w:hanging="360"/>
+      </w:pPr>
+      <w:rPr>
+        <w:rFonts w:ascii="Courier New" w:hAnsi="Courier New" w:cs="Courier New" w:hint="default"/>
+      </w:rPr>
+    </w:lvl>
+    <w:lvl w:ilvl="1" w:tplc="08090003" w:tentative="1">
+      <w:start w:val="1"/>
+      <w:numFmt w:val="bullet"/>
+      <w:lvlText w:val="o"/>
+      <w:lvlJc w:val="left"/>
+      <w:pPr>
+        <w:ind w:left="1440" w:hanging="360"/>
+      </w:pPr>
+      <w:rPr>
+        <w:rFonts w:ascii="Courier New" w:hAnsi="Courier New" w:cs="Courier New" w:hint="default"/>
+      </w:rPr>
+    </w:lvl>
+    <w:lvl w:ilvl="2" w:tplc="08090005" w:tentative="1">
+      <w:start w:val="1"/>
+      <w:numFmt w:val="bullet"/>
+      <w:lvlText w:val=""/>
+      <w:lvlJc w:val="left"/>
+      <w:pPr>
+        <w:ind w:left="2160" w:hanging="360"/>
+      </w:pPr>
+      <w:rPr>
+        <w:rFonts w:ascii="Wingdings" w:hAnsi="Wingdings" w:hint="default"/>
+      </w:rPr>
+    </w:lvl>
+    <w:lvl w:ilvl="3" w:tplc="08090001" w:tentative="1">
+      <w:start w:val="1"/>
+      <w:numFmt w:val="bullet"/>
+      <w:lvlText w:val=""/>
+      <w:lvlJc w:val="left"/>
+      <w:pPr>
+        <w:ind w:left="2880" w:hanging="360"/>
+      </w:pPr>
+      <w:rPr>
+        <w:rFonts w:ascii="Symbol" w:hAnsi="Symbol" w:hint="default"/>
+      </w:rPr>
+    </w:lvl>
+    <w:lvl w:ilvl="4" w:tplc="08090003" w:tentative="1">
+      <w:start w:val="1"/>
+      <w:numFmt w:val="bullet"/>
+      <w:lvlText w:val="o"/>
+      <w:lvlJc w:val="left"/>
+      <w:pPr>
+        <w:ind w:left="3600" w:hanging="360"/>
+      </w:pPr>
+      <w:rPr>
+        <w:rFonts w:ascii="Courier New" w:hAnsi="Courier New" w:cs="Courier New" w:hint="default"/>
+      </w:rPr>
+    </w:lvl>
+    <w:lvl w:ilvl="5" w:tplc="08090005" w:tentative="1">
+      <w:start w:val="1"/>
+      <w:numFmt w:val="bullet"/>
+      <w:lvlText w:val=""/>
+      <w:lvlJc w:val="left"/>
+      <w:pPr>
+        <w:ind w:left="4320" w:hanging="360"/>
+      </w:pPr>
+      <w:rPr>
+        <w:rFonts w:ascii="Wingdings" w:hAnsi="Wingdings" w:hint="default"/>
+      </w:rPr>
+    </w:lvl>
+    <w:lvl w:ilvl="6" w:tplc="08090001" w:tentative="1">
+      <w:start w:val="1"/>
+      <w:numFmt w:val="bullet"/>
+      <w:lvlText w:val=""/>
+      <w:lvlJc w:val="left"/>
+      <w:pPr>
+        <w:ind w:left="5040" w:hanging="360"/>
+      </w:pPr>
+      <w:rPr>
+        <w:rFonts w:ascii="Symbol" w:hAnsi="Symbol" w:hint="default"/>
+      </w:rPr>
+    </w:lvl>
+    <w:lvl w:ilvl="7" w:tplc="08090003" w:tentative="1">
+      <w:start w:val="1"/>
+      <w:numFmt w:val="bullet"/>
+      <w:lvlText w:val="o"/>
+      <w:lvlJc w:val="left"/>
+      <w:pPr>
+        <w:ind w:left="5760" w:hanging="360"/>
+      </w:pPr>
+      <w:rPr>
+        <w:rFonts w:ascii="Courier New" w:hAnsi="Courier New" w:cs="Courier New" w:hint="default"/>
+      </w:rPr>
+    </w:lvl>
+    <w:lvl w:ilvl="8" w:tplc="08090005" w:tentative="1">
+      <w:start w:val="1"/>
+      <w:numFmt w:val="bullet"/>
+      <w:lvlText w:val=""/>
+      <w:lvlJc w:val="left"/>
+      <w:pPr>
+        <w:ind w:left="6480" w:hanging="360"/>
+      </w:pPr>
+      <w:rPr>
+        <w:rFonts w:ascii="Wingdings" w:hAnsi="Wingdings" w:hint="default"/>
+      </w:rPr>
+    </w:lvl>
+  </w:abstractNum>
+  <w:abstractNum w:abstractNumId="37" w15:restartNumberingAfterBreak="0">
     <w:nsid w:val="59E97F18"/>
     <w:multiLevelType w:val="hybridMultilevel"/>
     <w:tmpl w:val="16448F94"/>
@@ -10090,7 +11335,7 @@
       </w:rPr>
     </w:lvl>
   </w:abstractNum>
-  <w:abstractNum w:abstractNumId="35" w15:restartNumberingAfterBreak="0">
+  <w:abstractNum w:abstractNumId="38" w15:restartNumberingAfterBreak="0">
     <w:nsid w:val="5D6D5C5A"/>
     <w:multiLevelType w:val="hybridMultilevel"/>
     <w:tmpl w:val="6EF2D338"/>
@@ -10203,7 +11448,7 @@
       </w:rPr>
     </w:lvl>
   </w:abstractNum>
-  <w:abstractNum w:abstractNumId="36" w15:restartNumberingAfterBreak="0">
+  <w:abstractNum w:abstractNumId="39" w15:restartNumberingAfterBreak="0">
     <w:nsid w:val="61345F1C"/>
     <w:multiLevelType w:val="hybridMultilevel"/>
     <w:tmpl w:val="1A64F046"/>
@@ -10316,7 +11561,7 @@
       </w:rPr>
     </w:lvl>
   </w:abstractNum>
-  <w:abstractNum w:abstractNumId="37" w15:restartNumberingAfterBreak="0">
+  <w:abstractNum w:abstractNumId="40" w15:restartNumberingAfterBreak="0">
     <w:nsid w:val="614A1692"/>
     <w:multiLevelType w:val="hybridMultilevel"/>
     <w:tmpl w:val="4156E2A8"/>
@@ -10429,7 +11674,7 @@
       </w:rPr>
     </w:lvl>
   </w:abstractNum>
-  <w:abstractNum w:abstractNumId="38" w15:restartNumberingAfterBreak="0">
+  <w:abstractNum w:abstractNumId="41" w15:restartNumberingAfterBreak="0">
     <w:nsid w:val="61D15A97"/>
     <w:multiLevelType w:val="hybridMultilevel"/>
     <w:tmpl w:val="14A2E350"/>
@@ -10542,7 +11787,120 @@
       </w:rPr>
     </w:lvl>
   </w:abstractNum>
-  <w:abstractNum w:abstractNumId="39" w15:restartNumberingAfterBreak="0">
+  <w:abstractNum w:abstractNumId="42" w15:restartNumberingAfterBreak="0">
+    <w:nsid w:val="646A15EC"/>
+    <w:multiLevelType w:val="hybridMultilevel"/>
+    <w:tmpl w:val="4ECEA306"/>
+    <w:lvl w:ilvl="0" w:tplc="04190003">
+      <w:start w:val="1"/>
+      <w:numFmt w:val="bullet"/>
+      <w:lvlText w:val="o"/>
+      <w:lvlJc w:val="left"/>
+      <w:pPr>
+        <w:ind w:left="720" w:hanging="360"/>
+      </w:pPr>
+      <w:rPr>
+        <w:rFonts w:ascii="Courier New" w:hAnsi="Courier New" w:cs="Courier New" w:hint="default"/>
+      </w:rPr>
+    </w:lvl>
+    <w:lvl w:ilvl="1" w:tplc="08090003" w:tentative="1">
+      <w:start w:val="1"/>
+      <w:numFmt w:val="bullet"/>
+      <w:lvlText w:val="o"/>
+      <w:lvlJc w:val="left"/>
+      <w:pPr>
+        <w:ind w:left="1440" w:hanging="360"/>
+      </w:pPr>
+      <w:rPr>
+        <w:rFonts w:ascii="Courier New" w:hAnsi="Courier New" w:cs="Courier New" w:hint="default"/>
+      </w:rPr>
+    </w:lvl>
+    <w:lvl w:ilvl="2" w:tplc="08090005" w:tentative="1">
+      <w:start w:val="1"/>
+      <w:numFmt w:val="bullet"/>
+      <w:lvlText w:val=""/>
+      <w:lvlJc w:val="left"/>
+      <w:pPr>
+        <w:ind w:left="2160" w:hanging="360"/>
+      </w:pPr>
+      <w:rPr>
+        <w:rFonts w:ascii="Wingdings" w:hAnsi="Wingdings" w:hint="default"/>
+      </w:rPr>
+    </w:lvl>
+    <w:lvl w:ilvl="3" w:tplc="08090001" w:tentative="1">
+      <w:start w:val="1"/>
+      <w:numFmt w:val="bullet"/>
+      <w:lvlText w:val=""/>
+      <w:lvlJc w:val="left"/>
+      <w:pPr>
+        <w:ind w:left="2880" w:hanging="360"/>
+      </w:pPr>
+      <w:rPr>
+        <w:rFonts w:ascii="Symbol" w:hAnsi="Symbol" w:hint="default"/>
+      </w:rPr>
+    </w:lvl>
+    <w:lvl w:ilvl="4" w:tplc="08090003" w:tentative="1">
+      <w:start w:val="1"/>
+      <w:numFmt w:val="bullet"/>
+      <w:lvlText w:val="o"/>
+      <w:lvlJc w:val="left"/>
+      <w:pPr>
+        <w:ind w:left="3600" w:hanging="360"/>
+      </w:pPr>
+      <w:rPr>
+        <w:rFonts w:ascii="Courier New" w:hAnsi="Courier New" w:cs="Courier New" w:hint="default"/>
+      </w:rPr>
+    </w:lvl>
+    <w:lvl w:ilvl="5" w:tplc="08090005" w:tentative="1">
+      <w:start w:val="1"/>
+      <w:numFmt w:val="bullet"/>
+      <w:lvlText w:val=""/>
+      <w:lvlJc w:val="left"/>
+      <w:pPr>
+        <w:ind w:left="4320" w:hanging="360"/>
+      </w:pPr>
+      <w:rPr>
+        <w:rFonts w:ascii="Wingdings" w:hAnsi="Wingdings" w:hint="default"/>
+      </w:rPr>
+    </w:lvl>
+    <w:lvl w:ilvl="6" w:tplc="08090001" w:tentative="1">
+      <w:start w:val="1"/>
+      <w:numFmt w:val="bullet"/>
+      <w:lvlText w:val=""/>
+      <w:lvlJc w:val="left"/>
+      <w:pPr>
+        <w:ind w:left="5040" w:hanging="360"/>
+      </w:pPr>
+      <w:rPr>
+        <w:rFonts w:ascii="Symbol" w:hAnsi="Symbol" w:hint="default"/>
+      </w:rPr>
+    </w:lvl>
+    <w:lvl w:ilvl="7" w:tplc="08090003" w:tentative="1">
+      <w:start w:val="1"/>
+      <w:numFmt w:val="bullet"/>
+      <w:lvlText w:val="o"/>
+      <w:lvlJc w:val="left"/>
+      <w:pPr>
+        <w:ind w:left="5760" w:hanging="360"/>
+      </w:pPr>
+      <w:rPr>
+        <w:rFonts w:ascii="Courier New" w:hAnsi="Courier New" w:cs="Courier New" w:hint="default"/>
+      </w:rPr>
+    </w:lvl>
+    <w:lvl w:ilvl="8" w:tplc="08090005" w:tentative="1">
+      <w:start w:val="1"/>
+      <w:numFmt w:val="bullet"/>
+      <w:lvlText w:val=""/>
+      <w:lvlJc w:val="left"/>
+      <w:pPr>
+        <w:ind w:left="6480" w:hanging="360"/>
+      </w:pPr>
+      <w:rPr>
+        <w:rFonts w:ascii="Wingdings" w:hAnsi="Wingdings" w:hint="default"/>
+      </w:rPr>
+    </w:lvl>
+  </w:abstractNum>
+  <w:abstractNum w:abstractNumId="43" w15:restartNumberingAfterBreak="0">
     <w:nsid w:val="664002F4"/>
     <w:multiLevelType w:val="hybridMultilevel"/>
     <w:tmpl w:val="074A2354"/>
@@ -10655,7 +12013,7 @@
       </w:rPr>
     </w:lvl>
   </w:abstractNum>
-  <w:abstractNum w:abstractNumId="40" w15:restartNumberingAfterBreak="0">
+  <w:abstractNum w:abstractNumId="44" w15:restartNumberingAfterBreak="0">
     <w:nsid w:val="6BFE35FA"/>
     <w:multiLevelType w:val="hybridMultilevel"/>
     <w:tmpl w:val="CFF8F62C"/>
@@ -10768,7 +12126,7 @@
       </w:rPr>
     </w:lvl>
   </w:abstractNum>
-  <w:abstractNum w:abstractNumId="41" w15:restartNumberingAfterBreak="0">
+  <w:abstractNum w:abstractNumId="45" w15:restartNumberingAfterBreak="0">
     <w:nsid w:val="6C1103A6"/>
     <w:multiLevelType w:val="hybridMultilevel"/>
     <w:tmpl w:val="72441294"/>
@@ -10881,7 +12239,7 @@
       </w:rPr>
     </w:lvl>
   </w:abstractNum>
-  <w:abstractNum w:abstractNumId="42" w15:restartNumberingAfterBreak="0">
+  <w:abstractNum w:abstractNumId="46" w15:restartNumberingAfterBreak="0">
     <w:nsid w:val="6F265A76"/>
     <w:multiLevelType w:val="multilevel"/>
     <w:tmpl w:val="682CEAB2"/>
@@ -11030,7 +12388,7 @@
       </w:rPr>
     </w:lvl>
   </w:abstractNum>
-  <w:abstractNum w:abstractNumId="43" w15:restartNumberingAfterBreak="0">
+  <w:abstractNum w:abstractNumId="47" w15:restartNumberingAfterBreak="0">
     <w:nsid w:val="6FA8564D"/>
     <w:multiLevelType w:val="multilevel"/>
     <w:tmpl w:val="2B5A9E24"/>
@@ -11179,7 +12537,7 @@
       </w:rPr>
     </w:lvl>
   </w:abstractNum>
-  <w:abstractNum w:abstractNumId="44" w15:restartNumberingAfterBreak="0">
+  <w:abstractNum w:abstractNumId="48" w15:restartNumberingAfterBreak="0">
     <w:nsid w:val="71D132C3"/>
     <w:multiLevelType w:val="hybridMultilevel"/>
     <w:tmpl w:val="21E0DE52"/>
@@ -11292,7 +12650,7 @@
       </w:rPr>
     </w:lvl>
   </w:abstractNum>
-  <w:abstractNum w:abstractNumId="45" w15:restartNumberingAfterBreak="0">
+  <w:abstractNum w:abstractNumId="49" w15:restartNumberingAfterBreak="0">
     <w:nsid w:val="726F6787"/>
     <w:multiLevelType w:val="hybridMultilevel"/>
     <w:tmpl w:val="C7B60C7A"/>
@@ -11405,7 +12763,120 @@
       </w:rPr>
     </w:lvl>
   </w:abstractNum>
-  <w:abstractNum w:abstractNumId="46" w15:restartNumberingAfterBreak="0">
+  <w:abstractNum w:abstractNumId="50" w15:restartNumberingAfterBreak="0">
+    <w:nsid w:val="73677B48"/>
+    <w:multiLevelType w:val="hybridMultilevel"/>
+    <w:tmpl w:val="7D5A60BA"/>
+    <w:lvl w:ilvl="0" w:tplc="04190003">
+      <w:start w:val="1"/>
+      <w:numFmt w:val="bullet"/>
+      <w:lvlText w:val="o"/>
+      <w:lvlJc w:val="left"/>
+      <w:pPr>
+        <w:ind w:left="720" w:hanging="360"/>
+      </w:pPr>
+      <w:rPr>
+        <w:rFonts w:ascii="Courier New" w:hAnsi="Courier New" w:cs="Courier New" w:hint="default"/>
+      </w:rPr>
+    </w:lvl>
+    <w:lvl w:ilvl="1" w:tplc="08090003" w:tentative="1">
+      <w:start w:val="1"/>
+      <w:numFmt w:val="bullet"/>
+      <w:lvlText w:val="o"/>
+      <w:lvlJc w:val="left"/>
+      <w:pPr>
+        <w:ind w:left="1440" w:hanging="360"/>
+      </w:pPr>
+      <w:rPr>
+        <w:rFonts w:ascii="Courier New" w:hAnsi="Courier New" w:cs="Courier New" w:hint="default"/>
+      </w:rPr>
+    </w:lvl>
+    <w:lvl w:ilvl="2" w:tplc="08090005" w:tentative="1">
+      <w:start w:val="1"/>
+      <w:numFmt w:val="bullet"/>
+      <w:lvlText w:val=""/>
+      <w:lvlJc w:val="left"/>
+      <w:pPr>
+        <w:ind w:left="2160" w:hanging="360"/>
+      </w:pPr>
+      <w:rPr>
+        <w:rFonts w:ascii="Wingdings" w:hAnsi="Wingdings" w:hint="default"/>
+      </w:rPr>
+    </w:lvl>
+    <w:lvl w:ilvl="3" w:tplc="08090001" w:tentative="1">
+      <w:start w:val="1"/>
+      <w:numFmt w:val="bullet"/>
+      <w:lvlText w:val=""/>
+      <w:lvlJc w:val="left"/>
+      <w:pPr>
+        <w:ind w:left="2880" w:hanging="360"/>
+      </w:pPr>
+      <w:rPr>
+        <w:rFonts w:ascii="Symbol" w:hAnsi="Symbol" w:hint="default"/>
+      </w:rPr>
+    </w:lvl>
+    <w:lvl w:ilvl="4" w:tplc="08090003" w:tentative="1">
+      <w:start w:val="1"/>
+      <w:numFmt w:val="bullet"/>
+      <w:lvlText w:val="o"/>
+      <w:lvlJc w:val="left"/>
+      <w:pPr>
+        <w:ind w:left="3600" w:hanging="360"/>
+      </w:pPr>
+      <w:rPr>
+        <w:rFonts w:ascii="Courier New" w:hAnsi="Courier New" w:cs="Courier New" w:hint="default"/>
+      </w:rPr>
+    </w:lvl>
+    <w:lvl w:ilvl="5" w:tplc="08090005" w:tentative="1">
+      <w:start w:val="1"/>
+      <w:numFmt w:val="bullet"/>
+      <w:lvlText w:val=""/>
+      <w:lvlJc w:val="left"/>
+      <w:pPr>
+        <w:ind w:left="4320" w:hanging="360"/>
+      </w:pPr>
+      <w:rPr>
+        <w:rFonts w:ascii="Wingdings" w:hAnsi="Wingdings" w:hint="default"/>
+      </w:rPr>
+    </w:lvl>
+    <w:lvl w:ilvl="6" w:tplc="08090001" w:tentative="1">
+      <w:start w:val="1"/>
+      <w:numFmt w:val="bullet"/>
+      <w:lvlText w:val=""/>
+      <w:lvlJc w:val="left"/>
+      <w:pPr>
+        <w:ind w:left="5040" w:hanging="360"/>
+      </w:pPr>
+      <w:rPr>
+        <w:rFonts w:ascii="Symbol" w:hAnsi="Symbol" w:hint="default"/>
+      </w:rPr>
+    </w:lvl>
+    <w:lvl w:ilvl="7" w:tplc="08090003" w:tentative="1">
+      <w:start w:val="1"/>
+      <w:numFmt w:val="bullet"/>
+      <w:lvlText w:val="o"/>
+      <w:lvlJc w:val="left"/>
+      <w:pPr>
+        <w:ind w:left="5760" w:hanging="360"/>
+      </w:pPr>
+      <w:rPr>
+        <w:rFonts w:ascii="Courier New" w:hAnsi="Courier New" w:cs="Courier New" w:hint="default"/>
+      </w:rPr>
+    </w:lvl>
+    <w:lvl w:ilvl="8" w:tplc="08090005" w:tentative="1">
+      <w:start w:val="1"/>
+      <w:numFmt w:val="bullet"/>
+      <w:lvlText w:val=""/>
+      <w:lvlJc w:val="left"/>
+      <w:pPr>
+        <w:ind w:left="6480" w:hanging="360"/>
+      </w:pPr>
+      <w:rPr>
+        <w:rFonts w:ascii="Wingdings" w:hAnsi="Wingdings" w:hint="default"/>
+      </w:rPr>
+    </w:lvl>
+  </w:abstractNum>
+  <w:abstractNum w:abstractNumId="51" w15:restartNumberingAfterBreak="0">
     <w:nsid w:val="79381DDD"/>
     <w:multiLevelType w:val="hybridMultilevel"/>
     <w:tmpl w:val="9FC61ECA"/>
@@ -11518,7 +12989,7 @@
       </w:rPr>
     </w:lvl>
   </w:abstractNum>
-  <w:abstractNum w:abstractNumId="47" w15:restartNumberingAfterBreak="0">
+  <w:abstractNum w:abstractNumId="52" w15:restartNumberingAfterBreak="0">
     <w:nsid w:val="7DBE2C1B"/>
     <w:multiLevelType w:val="hybridMultilevel"/>
     <w:tmpl w:val="D4DEFBD0"/>
@@ -11630,7 +13101,7 @@
       </w:rPr>
     </w:lvl>
   </w:abstractNum>
-  <w:abstractNum w:abstractNumId="48" w15:restartNumberingAfterBreak="0">
+  <w:abstractNum w:abstractNumId="53" w15:restartNumberingAfterBreak="0">
     <w:nsid w:val="7ED50EB6"/>
     <w:multiLevelType w:val="multilevel"/>
     <w:tmpl w:val="2E04D1A8"/>
@@ -11783,19 +13254,19 @@
     <w:abstractNumId w:val="1"/>
   </w:num>
   <w:num w:numId="2" w16cid:durableId="384913264">
-    <w:abstractNumId w:val="33"/>
+    <w:abstractNumId w:val="35"/>
   </w:num>
   <w:num w:numId="3" w16cid:durableId="2023243125">
-    <w:abstractNumId w:val="34"/>
+    <w:abstractNumId w:val="37"/>
   </w:num>
   <w:num w:numId="4" w16cid:durableId="2056269584">
-    <w:abstractNumId w:val="25"/>
+    <w:abstractNumId w:val="27"/>
   </w:num>
   <w:num w:numId="5" w16cid:durableId="303703151">
     <w:abstractNumId w:val="3"/>
   </w:num>
   <w:num w:numId="6" w16cid:durableId="938874738">
-    <w:abstractNumId w:val="47"/>
+    <w:abstractNumId w:val="52"/>
   </w:num>
   <w:num w:numId="7" w16cid:durableId="1250695812">
     <w:abstractNumId w:val="10"/>
@@ -11804,43 +13275,43 @@
     <w:abstractNumId w:val="6"/>
   </w:num>
   <w:num w:numId="9" w16cid:durableId="251202358">
-    <w:abstractNumId w:val="27"/>
+    <w:abstractNumId w:val="29"/>
   </w:num>
   <w:num w:numId="10" w16cid:durableId="419645676">
     <w:abstractNumId w:val="17"/>
   </w:num>
   <w:num w:numId="11" w16cid:durableId="572928392">
-    <w:abstractNumId w:val="22"/>
+    <w:abstractNumId w:val="23"/>
   </w:num>
   <w:num w:numId="12" w16cid:durableId="1083335959">
-    <w:abstractNumId w:val="37"/>
+    <w:abstractNumId w:val="40"/>
   </w:num>
   <w:num w:numId="13" w16cid:durableId="419375774">
-    <w:abstractNumId w:val="41"/>
+    <w:abstractNumId w:val="45"/>
   </w:num>
   <w:num w:numId="14" w16cid:durableId="472601837">
     <w:abstractNumId w:val="15"/>
   </w:num>
   <w:num w:numId="15" w16cid:durableId="1340893428">
-    <w:abstractNumId w:val="24"/>
+    <w:abstractNumId w:val="25"/>
   </w:num>
   <w:num w:numId="16" w16cid:durableId="2025938113">
-    <w:abstractNumId w:val="21"/>
+    <w:abstractNumId w:val="22"/>
   </w:num>
   <w:num w:numId="17" w16cid:durableId="2079090949">
-    <w:abstractNumId w:val="26"/>
+    <w:abstractNumId w:val="28"/>
   </w:num>
   <w:num w:numId="18" w16cid:durableId="1698654684">
     <w:abstractNumId w:val="16"/>
   </w:num>
   <w:num w:numId="19" w16cid:durableId="421608752">
-    <w:abstractNumId w:val="40"/>
+    <w:abstractNumId w:val="44"/>
   </w:num>
   <w:num w:numId="20" w16cid:durableId="2117748317">
-    <w:abstractNumId w:val="46"/>
+    <w:abstractNumId w:val="51"/>
   </w:num>
   <w:num w:numId="21" w16cid:durableId="1595282796">
-    <w:abstractNumId w:val="35"/>
+    <w:abstractNumId w:val="38"/>
   </w:num>
   <w:num w:numId="22" w16cid:durableId="1287275393">
     <w:abstractNumId w:val="12"/>
@@ -11849,46 +13320,46 @@
     <w:abstractNumId w:val="5"/>
   </w:num>
   <w:num w:numId="24" w16cid:durableId="871379423">
-    <w:abstractNumId w:val="42"/>
+    <w:abstractNumId w:val="46"/>
   </w:num>
   <w:num w:numId="25" w16cid:durableId="1775317555">
+    <w:abstractNumId w:val="34"/>
+  </w:num>
+  <w:num w:numId="26" w16cid:durableId="1018508330">
     <w:abstractNumId w:val="32"/>
   </w:num>
-  <w:num w:numId="26" w16cid:durableId="1018508330">
-    <w:abstractNumId w:val="30"/>
-  </w:num>
   <w:num w:numId="27" w16cid:durableId="1624077405">
-    <w:abstractNumId w:val="38"/>
+    <w:abstractNumId w:val="41"/>
   </w:num>
   <w:num w:numId="28" w16cid:durableId="824278171">
-    <w:abstractNumId w:val="23"/>
+    <w:abstractNumId w:val="24"/>
   </w:num>
   <w:num w:numId="29" w16cid:durableId="2106418506">
-    <w:abstractNumId w:val="31"/>
+    <w:abstractNumId w:val="33"/>
   </w:num>
   <w:num w:numId="30" w16cid:durableId="1585147079">
-    <w:abstractNumId w:val="43"/>
+    <w:abstractNumId w:val="47"/>
   </w:num>
   <w:num w:numId="31" w16cid:durableId="1921214431">
     <w:abstractNumId w:val="2"/>
   </w:num>
   <w:num w:numId="32" w16cid:durableId="1713726611">
-    <w:abstractNumId w:val="29"/>
+    <w:abstractNumId w:val="31"/>
   </w:num>
   <w:num w:numId="33" w16cid:durableId="1300964125">
     <w:abstractNumId w:val="0"/>
   </w:num>
   <w:num w:numId="34" w16cid:durableId="1051075841">
-    <w:abstractNumId w:val="48"/>
+    <w:abstractNumId w:val="53"/>
   </w:num>
   <w:num w:numId="35" w16cid:durableId="1975401105">
-    <w:abstractNumId w:val="36"/>
+    <w:abstractNumId w:val="39"/>
   </w:num>
   <w:num w:numId="36" w16cid:durableId="460422521">
-    <w:abstractNumId w:val="28"/>
+    <w:abstractNumId w:val="30"/>
   </w:num>
   <w:num w:numId="37" w16cid:durableId="1327513134">
-    <w:abstractNumId w:val="44"/>
+    <w:abstractNumId w:val="48"/>
   </w:num>
   <w:num w:numId="38" w16cid:durableId="1694259667">
     <w:abstractNumId w:val="18"/>
@@ -11906,7 +13377,7 @@
     <w:abstractNumId w:val="4"/>
   </w:num>
   <w:num w:numId="43" w16cid:durableId="287009388">
-    <w:abstractNumId w:val="45"/>
+    <w:abstractNumId w:val="49"/>
   </w:num>
   <w:num w:numId="44" w16cid:durableId="952590794">
     <w:abstractNumId w:val="20"/>
@@ -11924,7 +13395,22 @@
     <w:abstractNumId w:val="9"/>
   </w:num>
   <w:num w:numId="49" w16cid:durableId="1289438368">
-    <w:abstractNumId w:val="39"/>
+    <w:abstractNumId w:val="43"/>
+  </w:num>
+  <w:num w:numId="50" w16cid:durableId="461463897">
+    <w:abstractNumId w:val="36"/>
+  </w:num>
+  <w:num w:numId="51" w16cid:durableId="794370098">
+    <w:abstractNumId w:val="26"/>
+  </w:num>
+  <w:num w:numId="52" w16cid:durableId="1458985455">
+    <w:abstractNumId w:val="50"/>
+  </w:num>
+  <w:num w:numId="53" w16cid:durableId="162163433">
+    <w:abstractNumId w:val="21"/>
+  </w:num>
+  <w:num w:numId="54" w16cid:durableId="1752777007">
+    <w:abstractNumId w:val="42"/>
   </w:num>
 </w:numbering>
 </file>

</xml_diff>

<commit_message>
Write error codes and their meanings + use cases
</commit_message>
<xml_diff>
--- a/docs/ProjectDoc.docx
+++ b/docs/ProjectDoc.docx
@@ -8354,7 +8354,7 @@
     <w:p>
       <w:pPr>
         <w:rPr>
-          <w:lang w:val="en-US" w:eastAsia="en-GB"/>
+          <w:lang w:eastAsia="en-GB"/>
         </w:rPr>
       </w:pPr>
     </w:p>
@@ -9474,14 +9474,20 @@
     <w:p>
       <w:pPr>
         <w:rPr>
-          <w:lang w:val="en-US" w:eastAsia="en-GB"/>
-        </w:rPr>
-      </w:pPr>
-      <w:r>
-        <w:rPr>
-          <w:lang w:val="en-US" w:eastAsia="en-GB"/>
-        </w:rPr>
-        <w:t>POST /</w:t>
+          <w:lang w:eastAsia="en-GB"/>
+        </w:rPr>
+      </w:pPr>
+      <w:r>
+        <w:rPr>
+          <w:lang w:val="en-US" w:eastAsia="en-GB"/>
+        </w:rPr>
+        <w:t>POST</w:t>
+      </w:r>
+      <w:r>
+        <w:rPr>
+          <w:lang w:eastAsia="en-GB"/>
+        </w:rPr>
+        <w:t xml:space="preserve"> /</w:t>
       </w:r>
       <w:proofErr w:type="spellStart"/>
       <w:r>
@@ -9493,9 +9499,21 @@
       <w:proofErr w:type="spellEnd"/>
       <w:r>
         <w:rPr>
-          <w:lang w:val="en-US" w:eastAsia="en-GB"/>
-        </w:rPr>
-        <w:t>/requests/{</w:t>
+          <w:lang w:eastAsia="en-GB"/>
+        </w:rPr>
+        <w:t>/</w:t>
+      </w:r>
+      <w:r>
+        <w:rPr>
+          <w:lang w:val="en-US" w:eastAsia="en-GB"/>
+        </w:rPr>
+        <w:t>requests</w:t>
+      </w:r>
+      <w:r>
+        <w:rPr>
+          <w:lang w:eastAsia="en-GB"/>
+        </w:rPr>
+        <w:t>/{</w:t>
       </w:r>
       <w:proofErr w:type="spellStart"/>
       <w:r>
@@ -9507,9 +9525,21 @@
       <w:proofErr w:type="spellEnd"/>
       <w:r>
         <w:rPr>
-          <w:lang w:val="en-US" w:eastAsia="en-GB"/>
-        </w:rPr>
-        <w:t xml:space="preserve">}/responses – </w:t>
+          <w:lang w:eastAsia="en-GB"/>
+        </w:rPr>
+        <w:t>}/</w:t>
+      </w:r>
+      <w:r>
+        <w:rPr>
+          <w:lang w:val="en-US" w:eastAsia="en-GB"/>
+        </w:rPr>
+        <w:t>responses</w:t>
+      </w:r>
+      <w:r>
+        <w:rPr>
+          <w:lang w:eastAsia="en-GB"/>
+        </w:rPr>
+        <w:t xml:space="preserve"> – </w:t>
       </w:r>
       <w:r>
         <w:rPr>
@@ -9519,7 +9549,7 @@
       </w:r>
       <w:r>
         <w:rPr>
-          <w:lang w:val="en-US" w:eastAsia="en-GB"/>
+          <w:lang w:eastAsia="en-GB"/>
         </w:rPr>
         <w:t xml:space="preserve"> </w:t>
       </w:r>
@@ -9531,7 +9561,7 @@
       </w:r>
       <w:r>
         <w:rPr>
-          <w:lang w:val="en-US" w:eastAsia="en-GB"/>
+          <w:lang w:eastAsia="en-GB"/>
         </w:rPr>
         <w:t xml:space="preserve"> </w:t>
       </w:r>
@@ -9543,7 +9573,7 @@
       </w:r>
       <w:r>
         <w:rPr>
-          <w:lang w:val="en-US" w:eastAsia="en-GB"/>
+          <w:lang w:eastAsia="en-GB"/>
         </w:rPr>
         <w:t xml:space="preserve"> </w:t>
       </w:r>
@@ -9555,7 +9585,7 @@
       </w:r>
       <w:r>
         <w:rPr>
-          <w:lang w:val="en-US" w:eastAsia="en-GB"/>
+          <w:lang w:eastAsia="en-GB"/>
         </w:rPr>
         <w:t xml:space="preserve"> </w:t>
       </w:r>
@@ -9567,7 +9597,7 @@
       </w:r>
       <w:r>
         <w:rPr>
-          <w:lang w:val="en-US" w:eastAsia="en-GB"/>
+          <w:lang w:eastAsia="en-GB"/>
         </w:rPr>
         <w:t xml:space="preserve"> </w:t>
       </w:r>
@@ -9581,7 +9611,7 @@
     <w:p>
       <w:pPr>
         <w:rPr>
-          <w:lang w:val="en-US" w:eastAsia="en-GB"/>
+          <w:lang w:eastAsia="en-GB"/>
         </w:rPr>
       </w:pPr>
     </w:p>
@@ -10292,6 +10322,1581 @@
         <w:t>createdAt</w:t>
       </w:r>
       <w:proofErr w:type="spellEnd"/>
+    </w:p>
+    <w:p>
+      <w:pPr>
+        <w:rPr>
+          <w:lang w:eastAsia="en-GB"/>
+        </w:rPr>
+      </w:pPr>
+    </w:p>
+    <w:p>
+      <w:pPr>
+        <w:rPr>
+          <w:lang w:eastAsia="en-GB"/>
+        </w:rPr>
+      </w:pPr>
+    </w:p>
+    <w:p>
+      <w:pPr>
+        <w:rPr>
+          <w:b/>
+          <w:bCs/>
+          <w:lang w:val="en-US" w:eastAsia="en-GB"/>
+        </w:rPr>
+      </w:pPr>
+      <w:r>
+        <w:rPr>
+          <w:b/>
+          <w:bCs/>
+          <w:lang w:eastAsia="en-GB"/>
+        </w:rPr>
+        <w:lastRenderedPageBreak/>
+        <w:t>Коды ответов</w:t>
+      </w:r>
+      <w:r>
+        <w:rPr>
+          <w:b/>
+          <w:bCs/>
+          <w:lang w:val="en-US" w:eastAsia="en-GB"/>
+        </w:rPr>
+        <w:t>:</w:t>
+      </w:r>
+    </w:p>
+    <w:p>
+      <w:pPr>
+        <w:rPr>
+          <w:lang w:val="en-US" w:eastAsia="en-GB"/>
+        </w:rPr>
+      </w:pPr>
+    </w:p>
+    <w:p>
+      <w:pPr>
+        <w:rPr>
+          <w:lang w:eastAsia="en-GB"/>
+        </w:rPr>
+      </w:pPr>
+      <w:r>
+        <w:rPr>
+          <w:lang w:eastAsia="en-GB"/>
+        </w:rPr>
+        <w:t xml:space="preserve">Для успешных операций </w:t>
+      </w:r>
+      <w:r>
+        <w:rPr>
+          <w:lang w:val="en-US" w:eastAsia="en-GB"/>
+        </w:rPr>
+        <w:t>API</w:t>
+      </w:r>
+      <w:r>
+        <w:rPr>
+          <w:lang w:eastAsia="en-GB"/>
+        </w:rPr>
+        <w:t xml:space="preserve"> возвращает стандартные </w:t>
+      </w:r>
+      <w:r>
+        <w:rPr>
+          <w:lang w:val="en-US" w:eastAsia="en-GB"/>
+        </w:rPr>
+        <w:t>HTTP</w:t>
+      </w:r>
+      <w:r>
+        <w:rPr>
+          <w:lang w:eastAsia="en-GB"/>
+        </w:rPr>
+        <w:t>-коды:</w:t>
+      </w:r>
+    </w:p>
+    <w:p>
+      <w:pPr>
+        <w:rPr>
+          <w:lang w:eastAsia="en-GB"/>
+        </w:rPr>
+      </w:pPr>
+    </w:p>
+    <w:p>
+      <w:pPr>
+        <w:rPr>
+          <w:lang w:eastAsia="en-GB"/>
+        </w:rPr>
+      </w:pPr>
+      <w:r>
+        <w:rPr>
+          <w:lang w:eastAsia="en-GB"/>
+        </w:rPr>
+        <w:t xml:space="preserve">200 </w:t>
+      </w:r>
+      <w:r>
+        <w:rPr>
+          <w:lang w:val="en-US" w:eastAsia="en-GB"/>
+        </w:rPr>
+        <w:t>OK</w:t>
+      </w:r>
+      <w:r>
+        <w:rPr>
+          <w:lang w:eastAsia="en-GB"/>
+        </w:rPr>
+        <w:t xml:space="preserve"> – запрос успешно выполнен, сервер возвращает данные.</w:t>
+      </w:r>
+    </w:p>
+    <w:p>
+      <w:pPr>
+        <w:rPr>
+          <w:lang w:eastAsia="en-GB"/>
+        </w:rPr>
+      </w:pPr>
+    </w:p>
+    <w:p>
+      <w:pPr>
+        <w:rPr>
+          <w:lang w:eastAsia="en-GB"/>
+        </w:rPr>
+      </w:pPr>
+      <w:r>
+        <w:rPr>
+          <w:lang w:eastAsia="en-GB"/>
+        </w:rPr>
+        <w:t xml:space="preserve">201 </w:t>
+      </w:r>
+      <w:r>
+        <w:rPr>
+          <w:lang w:val="en-US" w:eastAsia="en-GB"/>
+        </w:rPr>
+        <w:t>Created</w:t>
+      </w:r>
+      <w:r>
+        <w:rPr>
+          <w:lang w:eastAsia="en-GB"/>
+        </w:rPr>
+        <w:t xml:space="preserve"> – сущность успешно создана. Используется, например, при регистрации пользователя, создании заявки, отклика или отзыва.</w:t>
+      </w:r>
+    </w:p>
+    <w:p>
+      <w:pPr>
+        <w:rPr>
+          <w:lang w:eastAsia="en-GB"/>
+        </w:rPr>
+      </w:pPr>
+    </w:p>
+    <w:p>
+      <w:pPr>
+        <w:rPr>
+          <w:lang w:val="en-US" w:eastAsia="en-GB"/>
+        </w:rPr>
+      </w:pPr>
+      <w:r>
+        <w:rPr>
+          <w:lang w:eastAsia="en-GB"/>
+        </w:rPr>
+        <w:t xml:space="preserve">204 </w:t>
+      </w:r>
+      <w:r>
+        <w:rPr>
+          <w:lang w:val="en-US" w:eastAsia="en-GB"/>
+        </w:rPr>
+        <w:t>No</w:t>
+      </w:r>
+      <w:r>
+        <w:rPr>
+          <w:lang w:eastAsia="en-GB"/>
+        </w:rPr>
+        <w:t xml:space="preserve"> </w:t>
+      </w:r>
+      <w:r>
+        <w:rPr>
+          <w:lang w:val="en-US" w:eastAsia="en-GB"/>
+        </w:rPr>
+        <w:t>Content</w:t>
+      </w:r>
+      <w:r>
+        <w:rPr>
+          <w:lang w:eastAsia="en-GB"/>
+        </w:rPr>
+        <w:t xml:space="preserve"> – операция успешно выполнена, но тело ответа не возвращается. Используется, например, при изменении пароля, отмене заявки или отзыве отклика.</w:t>
+      </w:r>
+    </w:p>
+    <w:p>
+      <w:pPr>
+        <w:rPr>
+          <w:lang w:val="en-US" w:eastAsia="en-GB"/>
+        </w:rPr>
+      </w:pPr>
+    </w:p>
+    <w:p>
+      <w:pPr>
+        <w:rPr>
+          <w:lang w:eastAsia="en-GB"/>
+        </w:rPr>
+      </w:pPr>
+      <w:r>
+        <w:rPr>
+          <w:b/>
+          <w:bCs/>
+          <w:lang w:eastAsia="en-GB"/>
+        </w:rPr>
+        <w:t>Коды ошибо</w:t>
+      </w:r>
+      <w:r>
+        <w:rPr>
+          <w:b/>
+          <w:bCs/>
+          <w:lang w:eastAsia="en-GB"/>
+        </w:rPr>
+        <w:t>к</w:t>
+      </w:r>
+      <w:r>
+        <w:rPr>
+          <w:b/>
+          <w:bCs/>
+          <w:lang w:val="en-US" w:eastAsia="en-GB"/>
+        </w:rPr>
+        <w:t>:</w:t>
+      </w:r>
+    </w:p>
+    <w:p>
+      <w:pPr>
+        <w:rPr>
+          <w:lang w:eastAsia="en-GB"/>
+        </w:rPr>
+      </w:pPr>
+    </w:p>
+    <w:p>
+      <w:pPr>
+        <w:rPr>
+          <w:lang w:eastAsia="en-GB"/>
+        </w:rPr>
+      </w:pPr>
+      <w:r>
+        <w:rPr>
+          <w:lang w:eastAsia="en-GB"/>
+        </w:rPr>
+        <w:t xml:space="preserve">400 </w:t>
+      </w:r>
+      <w:r>
+        <w:rPr>
+          <w:lang w:val="en-US" w:eastAsia="en-GB"/>
+        </w:rPr>
+        <w:t>Bad</w:t>
+      </w:r>
+      <w:r>
+        <w:rPr>
+          <w:lang w:eastAsia="en-GB"/>
+        </w:rPr>
+        <w:t xml:space="preserve"> </w:t>
+      </w:r>
+      <w:r>
+        <w:rPr>
+          <w:lang w:val="en-US" w:eastAsia="en-GB"/>
+        </w:rPr>
+        <w:t>Request</w:t>
+      </w:r>
+      <w:r>
+        <w:rPr>
+          <w:lang w:eastAsia="en-GB"/>
+        </w:rPr>
+        <w:t xml:space="preserve"> – некорректный запрос.</w:t>
+      </w:r>
+    </w:p>
+    <w:p>
+      <w:pPr>
+        <w:rPr>
+          <w:lang w:eastAsia="en-GB"/>
+        </w:rPr>
+      </w:pPr>
+    </w:p>
+    <w:p>
+      <w:pPr>
+        <w:rPr>
+          <w:lang w:eastAsia="en-GB"/>
+        </w:rPr>
+      </w:pPr>
+      <w:r>
+        <w:rPr>
+          <w:lang w:eastAsia="en-GB"/>
+        </w:rPr>
+        <w:t>Возвращается, если клиент передал неверные или неполные данные.</w:t>
+      </w:r>
+    </w:p>
+    <w:p>
+      <w:pPr>
+        <w:rPr>
+          <w:lang w:eastAsia="en-GB"/>
+        </w:rPr>
+      </w:pPr>
+      <w:r>
+        <w:rPr>
+          <w:lang w:eastAsia="en-GB"/>
+        </w:rPr>
+        <w:t>Например:</w:t>
+      </w:r>
+    </w:p>
+    <w:p>
+      <w:pPr>
+        <w:rPr>
+          <w:lang w:eastAsia="en-GB"/>
+        </w:rPr>
+      </w:pPr>
+      <w:r>
+        <w:rPr>
+          <w:lang w:eastAsia="en-GB"/>
+        </w:rPr>
+        <w:t>- не заполнено обязательное поле;</w:t>
+      </w:r>
+    </w:p>
+    <w:p>
+      <w:pPr>
+        <w:rPr>
+          <w:lang w:eastAsia="en-GB"/>
+        </w:rPr>
+      </w:pPr>
+      <w:r>
+        <w:rPr>
+          <w:lang w:eastAsia="en-GB"/>
+        </w:rPr>
+        <w:t>- цена отклика меньше или равна нулю;</w:t>
+      </w:r>
+    </w:p>
+    <w:p>
+      <w:pPr>
+        <w:rPr>
+          <w:lang w:eastAsia="en-GB"/>
+        </w:rPr>
+      </w:pPr>
+      <w:r>
+        <w:rPr>
+          <w:lang w:eastAsia="en-GB"/>
+        </w:rPr>
+        <w:t>- дата заявки указана в прошлом;</w:t>
+      </w:r>
+    </w:p>
+    <w:p>
+      <w:pPr>
+        <w:rPr>
+          <w:lang w:eastAsia="en-GB"/>
+        </w:rPr>
+      </w:pPr>
+      <w:r>
+        <w:rPr>
+          <w:lang w:eastAsia="en-GB"/>
+        </w:rPr>
+        <w:t>- оценка отзыва находится вне допустимого диапазона.</w:t>
+      </w:r>
+    </w:p>
+    <w:p>
+      <w:pPr>
+        <w:rPr>
+          <w:lang w:eastAsia="en-GB"/>
+        </w:rPr>
+      </w:pPr>
+    </w:p>
+    <w:p>
+      <w:pPr>
+        <w:rPr>
+          <w:lang w:eastAsia="en-GB"/>
+        </w:rPr>
+      </w:pPr>
+      <w:r>
+        <w:rPr>
+          <w:lang w:eastAsia="en-GB"/>
+        </w:rPr>
+        <w:t xml:space="preserve">401 </w:t>
+      </w:r>
+      <w:r>
+        <w:rPr>
+          <w:lang w:val="en-US" w:eastAsia="en-GB"/>
+        </w:rPr>
+        <w:t>Unauthorized</w:t>
+      </w:r>
+      <w:r>
+        <w:rPr>
+          <w:lang w:eastAsia="en-GB"/>
+        </w:rPr>
+        <w:t xml:space="preserve"> – пользователь не авторизован.</w:t>
+      </w:r>
+    </w:p>
+    <w:p>
+      <w:pPr>
+        <w:rPr>
+          <w:lang w:eastAsia="en-GB"/>
+        </w:rPr>
+      </w:pPr>
+    </w:p>
+    <w:p>
+      <w:pPr>
+        <w:rPr>
+          <w:lang w:eastAsia="en-GB"/>
+        </w:rPr>
+      </w:pPr>
+      <w:r>
+        <w:rPr>
+          <w:lang w:eastAsia="en-GB"/>
+        </w:rPr>
+        <w:t>Возвращается, если пользователь пытается выполнить действие без входа в систему или без действительного токена.</w:t>
+      </w:r>
+    </w:p>
+    <w:p>
+      <w:pPr>
+        <w:rPr>
+          <w:lang w:eastAsia="en-GB"/>
+        </w:rPr>
+      </w:pPr>
+    </w:p>
+    <w:p>
+      <w:pPr>
+        <w:rPr>
+          <w:lang w:eastAsia="en-GB"/>
+        </w:rPr>
+      </w:pPr>
+      <w:r>
+        <w:rPr>
+          <w:lang w:eastAsia="en-GB"/>
+        </w:rPr>
+        <w:t xml:space="preserve">403 </w:t>
+      </w:r>
+      <w:r>
+        <w:rPr>
+          <w:lang w:val="en-US" w:eastAsia="en-GB"/>
+        </w:rPr>
+        <w:t>Forbidden</w:t>
+      </w:r>
+      <w:r>
+        <w:rPr>
+          <w:lang w:eastAsia="en-GB"/>
+        </w:rPr>
+        <w:t xml:space="preserve"> – недостаточно прав для выполнения действия.</w:t>
+      </w:r>
+    </w:p>
+    <w:p>
+      <w:pPr>
+        <w:rPr>
+          <w:lang w:eastAsia="en-GB"/>
+        </w:rPr>
+      </w:pPr>
+    </w:p>
+    <w:p>
+      <w:pPr>
+        <w:rPr>
+          <w:lang w:eastAsia="en-GB"/>
+        </w:rPr>
+      </w:pPr>
+      <w:r>
+        <w:rPr>
+          <w:lang w:eastAsia="en-GB"/>
+        </w:rPr>
+        <w:t>Возвращается, если пользователь авторизован, но его роль не позволяет выполнить действие.</w:t>
+      </w:r>
+    </w:p>
+    <w:p>
+      <w:pPr>
+        <w:rPr>
+          <w:lang w:eastAsia="en-GB"/>
+        </w:rPr>
+      </w:pPr>
+      <w:r>
+        <w:rPr>
+          <w:lang w:eastAsia="en-GB"/>
+        </w:rPr>
+        <w:t>Например:</w:t>
+      </w:r>
+    </w:p>
+    <w:p>
+      <w:pPr>
+        <w:rPr>
+          <w:lang w:eastAsia="en-GB"/>
+        </w:rPr>
+      </w:pPr>
+      <w:r>
+        <w:rPr>
+          <w:lang w:eastAsia="en-GB"/>
+        </w:rPr>
+        <w:t>- клиент пытается создать отклик;</w:t>
+      </w:r>
+    </w:p>
+    <w:p>
+      <w:pPr>
+        <w:rPr>
+          <w:lang w:eastAsia="en-GB"/>
+        </w:rPr>
+      </w:pPr>
+      <w:r>
+        <w:rPr>
+          <w:lang w:eastAsia="en-GB"/>
+        </w:rPr>
+        <w:t>- мастер пытается оставить отзыв;</w:t>
+      </w:r>
+    </w:p>
+    <w:p>
+      <w:pPr>
+        <w:rPr>
+          <w:lang w:eastAsia="en-GB"/>
+        </w:rPr>
+      </w:pPr>
+      <w:r>
+        <w:rPr>
+          <w:lang w:eastAsia="en-GB"/>
+        </w:rPr>
+        <w:t>- пользователь пытается изменить чужой профиль.</w:t>
+      </w:r>
+    </w:p>
+    <w:p>
+      <w:pPr>
+        <w:rPr>
+          <w:lang w:eastAsia="en-GB"/>
+        </w:rPr>
+      </w:pPr>
+    </w:p>
+    <w:p>
+      <w:pPr>
+        <w:rPr>
+          <w:lang w:eastAsia="en-GB"/>
+        </w:rPr>
+      </w:pPr>
+      <w:r>
+        <w:rPr>
+          <w:lang w:eastAsia="en-GB"/>
+        </w:rPr>
+        <w:t xml:space="preserve">404 </w:t>
+      </w:r>
+      <w:r>
+        <w:rPr>
+          <w:lang w:val="en-US" w:eastAsia="en-GB"/>
+        </w:rPr>
+        <w:t>Not</w:t>
+      </w:r>
+      <w:r>
+        <w:rPr>
+          <w:lang w:eastAsia="en-GB"/>
+        </w:rPr>
+        <w:t xml:space="preserve"> </w:t>
+      </w:r>
+      <w:r>
+        <w:rPr>
+          <w:lang w:val="en-US" w:eastAsia="en-GB"/>
+        </w:rPr>
+        <w:t>Found</w:t>
+      </w:r>
+      <w:r>
+        <w:rPr>
+          <w:lang w:eastAsia="en-GB"/>
+        </w:rPr>
+        <w:t xml:space="preserve"> – ресурс не найден.</w:t>
+      </w:r>
+    </w:p>
+    <w:p>
+      <w:pPr>
+        <w:rPr>
+          <w:lang w:eastAsia="en-GB"/>
+        </w:rPr>
+      </w:pPr>
+    </w:p>
+    <w:p>
+      <w:pPr>
+        <w:rPr>
+          <w:lang w:eastAsia="en-GB"/>
+        </w:rPr>
+      </w:pPr>
+      <w:r>
+        <w:rPr>
+          <w:lang w:eastAsia="en-GB"/>
+        </w:rPr>
+        <w:t>Возвращается, если запрашиваемая сущность не существует или недоступна пользователю.</w:t>
+      </w:r>
+    </w:p>
+    <w:p>
+      <w:pPr>
+        <w:rPr>
+          <w:lang w:eastAsia="en-GB"/>
+        </w:rPr>
+      </w:pPr>
+      <w:r>
+        <w:rPr>
+          <w:lang w:eastAsia="en-GB"/>
+        </w:rPr>
+        <w:t>Например:</w:t>
+      </w:r>
+    </w:p>
+    <w:p>
+      <w:pPr>
+        <w:rPr>
+          <w:lang w:eastAsia="en-GB"/>
+        </w:rPr>
+      </w:pPr>
+      <w:r>
+        <w:rPr>
+          <w:lang w:eastAsia="en-GB"/>
+        </w:rPr>
+        <w:t xml:space="preserve">- заявка с указанным </w:t>
+      </w:r>
+      <w:r>
+        <w:rPr>
+          <w:lang w:val="en-US" w:eastAsia="en-GB"/>
+        </w:rPr>
+        <w:t>id</w:t>
+      </w:r>
+      <w:r>
+        <w:rPr>
+          <w:lang w:eastAsia="en-GB"/>
+        </w:rPr>
+        <w:t xml:space="preserve"> не найдена;</w:t>
+      </w:r>
+    </w:p>
+    <w:p>
+      <w:pPr>
+        <w:rPr>
+          <w:lang w:eastAsia="en-GB"/>
+        </w:rPr>
+      </w:pPr>
+      <w:r>
+        <w:rPr>
+          <w:lang w:eastAsia="en-GB"/>
+        </w:rPr>
+        <w:t xml:space="preserve">- отклик с указанным </w:t>
+      </w:r>
+      <w:r>
+        <w:rPr>
+          <w:lang w:val="en-US" w:eastAsia="en-GB"/>
+        </w:rPr>
+        <w:t>id</w:t>
+      </w:r>
+      <w:r>
+        <w:rPr>
+          <w:lang w:eastAsia="en-GB"/>
+        </w:rPr>
+        <w:t xml:space="preserve"> не найден;</w:t>
+      </w:r>
+    </w:p>
+    <w:p>
+      <w:pPr>
+        <w:rPr>
+          <w:lang w:eastAsia="en-GB"/>
+        </w:rPr>
+      </w:pPr>
+      <w:r>
+        <w:rPr>
+          <w:lang w:eastAsia="en-GB"/>
+        </w:rPr>
+        <w:t xml:space="preserve">- заказ с указанным </w:t>
+      </w:r>
+      <w:r>
+        <w:rPr>
+          <w:lang w:val="en-US" w:eastAsia="en-GB"/>
+        </w:rPr>
+        <w:t>id</w:t>
+      </w:r>
+      <w:r>
+        <w:rPr>
+          <w:lang w:eastAsia="en-GB"/>
+        </w:rPr>
+        <w:t xml:space="preserve"> не найден;</w:t>
+      </w:r>
+    </w:p>
+    <w:p>
+      <w:pPr>
+        <w:rPr>
+          <w:lang w:eastAsia="en-GB"/>
+        </w:rPr>
+      </w:pPr>
+      <w:r>
+        <w:rPr>
+          <w:lang w:eastAsia="en-GB"/>
+        </w:rPr>
+        <w:t xml:space="preserve">- мастер с указанным </w:t>
+      </w:r>
+      <w:r>
+        <w:rPr>
+          <w:lang w:val="en-US" w:eastAsia="en-GB"/>
+        </w:rPr>
+        <w:t>id</w:t>
+      </w:r>
+      <w:r>
+        <w:rPr>
+          <w:lang w:eastAsia="en-GB"/>
+        </w:rPr>
+        <w:t xml:space="preserve"> не найден.</w:t>
+      </w:r>
+    </w:p>
+    <w:p>
+      <w:pPr>
+        <w:rPr>
+          <w:lang w:eastAsia="en-GB"/>
+        </w:rPr>
+      </w:pPr>
+    </w:p>
+    <w:p>
+      <w:pPr>
+        <w:rPr>
+          <w:lang w:eastAsia="en-GB"/>
+        </w:rPr>
+      </w:pPr>
+      <w:r>
+        <w:rPr>
+          <w:lang w:eastAsia="en-GB"/>
+        </w:rPr>
+        <w:lastRenderedPageBreak/>
+        <w:t xml:space="preserve">409 </w:t>
+      </w:r>
+      <w:r>
+        <w:rPr>
+          <w:lang w:val="en-US" w:eastAsia="en-GB"/>
+        </w:rPr>
+        <w:t>Conflict</w:t>
+      </w:r>
+      <w:r>
+        <w:rPr>
+          <w:lang w:eastAsia="en-GB"/>
+        </w:rPr>
+        <w:t xml:space="preserve"> – конфликт текущего состояния данных.</w:t>
+      </w:r>
+    </w:p>
+    <w:p>
+      <w:pPr>
+        <w:rPr>
+          <w:lang w:eastAsia="en-GB"/>
+        </w:rPr>
+      </w:pPr>
+    </w:p>
+    <w:p>
+      <w:pPr>
+        <w:rPr>
+          <w:lang w:eastAsia="en-GB"/>
+        </w:rPr>
+      </w:pPr>
+      <w:r>
+        <w:rPr>
+          <w:lang w:eastAsia="en-GB"/>
+        </w:rPr>
+        <w:t>Возвращается, если действие невозможно выполнить из-за бизнес-правил или текущего состояния сущности.</w:t>
+      </w:r>
+    </w:p>
+    <w:p>
+      <w:pPr>
+        <w:rPr>
+          <w:lang w:eastAsia="en-GB"/>
+        </w:rPr>
+      </w:pPr>
+      <w:r>
+        <w:rPr>
+          <w:lang w:eastAsia="en-GB"/>
+        </w:rPr>
+        <w:t>Например:</w:t>
+      </w:r>
+    </w:p>
+    <w:p>
+      <w:pPr>
+        <w:rPr>
+          <w:lang w:eastAsia="en-GB"/>
+        </w:rPr>
+      </w:pPr>
+      <w:r>
+        <w:rPr>
+          <w:lang w:eastAsia="en-GB"/>
+        </w:rPr>
+        <w:t>- мастер уже оставил отклик на эту заявку;</w:t>
+      </w:r>
+    </w:p>
+    <w:p>
+      <w:pPr>
+        <w:rPr>
+          <w:lang w:eastAsia="en-GB"/>
+        </w:rPr>
+      </w:pPr>
+      <w:r>
+        <w:rPr>
+          <w:lang w:eastAsia="en-GB"/>
+        </w:rPr>
+        <w:t>- заявка уже отменена или закрыта;</w:t>
+      </w:r>
+    </w:p>
+    <w:p>
+      <w:pPr>
+        <w:rPr>
+          <w:lang w:eastAsia="en-GB"/>
+        </w:rPr>
+      </w:pPr>
+      <w:r>
+        <w:rPr>
+          <w:lang w:eastAsia="en-GB"/>
+        </w:rPr>
+        <w:t>- отклик уже принят или отклонён;</w:t>
+      </w:r>
+    </w:p>
+    <w:p>
+      <w:pPr>
+        <w:rPr>
+          <w:lang w:eastAsia="en-GB"/>
+        </w:rPr>
+      </w:pPr>
+      <w:r>
+        <w:rPr>
+          <w:lang w:eastAsia="en-GB"/>
+        </w:rPr>
+        <w:t>- заказ уже имеет отзыв;</w:t>
+      </w:r>
+    </w:p>
+    <w:p>
+      <w:pPr>
+        <w:rPr>
+          <w:lang w:eastAsia="en-GB"/>
+        </w:rPr>
+      </w:pPr>
+      <w:r>
+        <w:rPr>
+          <w:lang w:eastAsia="en-GB"/>
+        </w:rPr>
+        <w:t>- логин уже занят при регистрации.</w:t>
+      </w:r>
+    </w:p>
+    <w:p>
+      <w:pPr>
+        <w:rPr>
+          <w:lang w:eastAsia="en-GB"/>
+        </w:rPr>
+      </w:pPr>
+    </w:p>
+    <w:p>
+      <w:pPr>
+        <w:rPr>
+          <w:lang w:val="en-US" w:eastAsia="en-GB"/>
+        </w:rPr>
+      </w:pPr>
+      <w:r>
+        <w:rPr>
+          <w:lang w:val="en-US" w:eastAsia="en-GB"/>
+        </w:rPr>
+        <w:t xml:space="preserve">500 Internal Server Error – </w:t>
+      </w:r>
+      <w:proofErr w:type="spellStart"/>
+      <w:r>
+        <w:rPr>
+          <w:lang w:val="en-US" w:eastAsia="en-GB"/>
+        </w:rPr>
+        <w:t>внутренняя</w:t>
+      </w:r>
+      <w:proofErr w:type="spellEnd"/>
+      <w:r>
+        <w:rPr>
+          <w:lang w:val="en-US" w:eastAsia="en-GB"/>
+        </w:rPr>
+        <w:t xml:space="preserve"> </w:t>
+      </w:r>
+      <w:proofErr w:type="spellStart"/>
+      <w:r>
+        <w:rPr>
+          <w:lang w:val="en-US" w:eastAsia="en-GB"/>
+        </w:rPr>
+        <w:t>ошибка</w:t>
+      </w:r>
+      <w:proofErr w:type="spellEnd"/>
+      <w:r>
+        <w:rPr>
+          <w:lang w:val="en-US" w:eastAsia="en-GB"/>
+        </w:rPr>
+        <w:t xml:space="preserve"> </w:t>
+      </w:r>
+      <w:proofErr w:type="spellStart"/>
+      <w:r>
+        <w:rPr>
+          <w:lang w:val="en-US" w:eastAsia="en-GB"/>
+        </w:rPr>
+        <w:t>сервера</w:t>
+      </w:r>
+      <w:proofErr w:type="spellEnd"/>
+      <w:r>
+        <w:rPr>
+          <w:lang w:val="en-US" w:eastAsia="en-GB"/>
+        </w:rPr>
+        <w:t>.</w:t>
+      </w:r>
+    </w:p>
+    <w:p>
+      <w:pPr>
+        <w:rPr>
+          <w:lang w:val="en-US" w:eastAsia="en-GB"/>
+        </w:rPr>
+      </w:pPr>
+    </w:p>
+    <w:p>
+      <w:pPr>
+        <w:rPr>
+          <w:lang w:eastAsia="en-GB"/>
+        </w:rPr>
+      </w:pPr>
+      <w:r>
+        <w:rPr>
+          <w:lang w:eastAsia="en-GB"/>
+        </w:rPr>
+        <w:t>Возвращается при непредвиденной ошибке на стороне сервера.</w:t>
+      </w:r>
+    </w:p>
+    <w:p>
+      <w:pPr>
+        <w:rPr>
+          <w:lang w:eastAsia="en-GB"/>
+        </w:rPr>
+      </w:pPr>
+      <w:r>
+        <w:rPr>
+          <w:lang w:eastAsia="en-GB"/>
+        </w:rPr>
+        <w:t>Клиенту не передаются технические детали ошибки.</w:t>
+      </w:r>
+    </w:p>
+    <w:p>
+      <w:pPr>
+        <w:rPr>
+          <w:lang w:eastAsia="en-GB"/>
+        </w:rPr>
+      </w:pPr>
+    </w:p>
+    <w:p>
+      <w:pPr>
+        <w:rPr>
+          <w:lang w:val="en-US" w:eastAsia="en-GB"/>
+        </w:rPr>
+      </w:pPr>
+      <w:r>
+        <w:rPr>
+          <w:lang w:eastAsia="en-GB"/>
+        </w:rPr>
+        <w:t xml:space="preserve">Основные </w:t>
+      </w:r>
+      <w:proofErr w:type="spellStart"/>
+      <w:r>
+        <w:rPr>
+          <w:lang w:val="en-US" w:eastAsia="en-GB"/>
+        </w:rPr>
+        <w:t>Usecases</w:t>
+      </w:r>
+      <w:proofErr w:type="spellEnd"/>
+      <w:r>
+        <w:rPr>
+          <w:lang w:val="en-US" w:eastAsia="en-GB"/>
+        </w:rPr>
+        <w:t>:</w:t>
+      </w:r>
+    </w:p>
+    <w:p>
+      <w:pPr>
+        <w:rPr>
+          <w:lang w:eastAsia="en-GB"/>
+        </w:rPr>
+      </w:pPr>
+    </w:p>
+    <w:p>
+      <w:pPr>
+        <w:rPr>
+          <w:lang w:eastAsia="en-GB"/>
+        </w:rPr>
+      </w:pPr>
+      <w:r>
+        <w:rPr>
+          <w:lang w:eastAsia="en-GB"/>
+        </w:rPr>
+        <w:t>1. Регистрация и вход пользователя</w:t>
+      </w:r>
+    </w:p>
+    <w:p>
+      <w:pPr>
+        <w:rPr>
+          <w:lang w:eastAsia="en-GB"/>
+        </w:rPr>
+      </w:pPr>
+    </w:p>
+    <w:p>
+      <w:pPr>
+        <w:pStyle w:val="a3"/>
+        <w:numPr>
+          <w:ilvl w:val="0"/>
+          <w:numId w:val="42"/>
+        </w:numPr>
+        <w:rPr>
+          <w:lang w:eastAsia="en-GB"/>
+        </w:rPr>
+      </w:pPr>
+      <w:r>
+        <w:rPr>
+          <w:lang w:eastAsia="en-GB"/>
+        </w:rPr>
+        <w:t>Пользователь открывает страницу регистрации, вводит личные данные и выбирает роль: клиент или мастер.</w:t>
+      </w:r>
+    </w:p>
+    <w:p>
+      <w:pPr>
+        <w:pStyle w:val="a3"/>
+        <w:numPr>
+          <w:ilvl w:val="0"/>
+          <w:numId w:val="42"/>
+        </w:numPr>
+        <w:rPr>
+          <w:lang w:eastAsia="en-GB"/>
+        </w:rPr>
+      </w:pPr>
+      <w:r>
+        <w:rPr>
+          <w:lang w:eastAsia="en-GB"/>
+        </w:rPr>
+        <w:t>Система проверяет данные, создаёт пользователя и назначает ему выбранную роль.</w:t>
+      </w:r>
+    </w:p>
+    <w:p>
+      <w:pPr>
+        <w:pStyle w:val="a3"/>
+        <w:numPr>
+          <w:ilvl w:val="0"/>
+          <w:numId w:val="42"/>
+        </w:numPr>
+        <w:rPr>
+          <w:lang w:eastAsia="en-GB"/>
+        </w:rPr>
+      </w:pPr>
+      <w:r>
+        <w:rPr>
+          <w:lang w:eastAsia="en-GB"/>
+        </w:rPr>
+        <w:t>Пользователь входит в систему по логину и паролю.</w:t>
+      </w:r>
+    </w:p>
+    <w:p>
+      <w:pPr>
+        <w:pStyle w:val="a3"/>
+        <w:numPr>
+          <w:ilvl w:val="0"/>
+          <w:numId w:val="42"/>
+        </w:numPr>
+        <w:rPr>
+          <w:lang w:eastAsia="en-GB"/>
+        </w:rPr>
+      </w:pPr>
+      <w:r>
+        <w:rPr>
+          <w:lang w:eastAsia="en-GB"/>
+        </w:rPr>
+        <w:t>Система определяет роль пользователя и открывает доступ к соответствующему личному кабинету.</w:t>
+      </w:r>
+    </w:p>
+    <w:p>
+      <w:pPr>
+        <w:rPr>
+          <w:lang w:eastAsia="en-GB"/>
+        </w:rPr>
+      </w:pPr>
+    </w:p>
+    <w:p>
+      <w:pPr>
+        <w:rPr>
+          <w:lang w:eastAsia="en-GB"/>
+        </w:rPr>
+      </w:pPr>
+      <w:r>
+        <w:rPr>
+          <w:lang w:eastAsia="en-GB"/>
+        </w:rPr>
+        <w:t>2. Создание заявки клиентом</w:t>
+      </w:r>
+    </w:p>
+    <w:p>
+      <w:pPr>
+        <w:rPr>
+          <w:lang w:eastAsia="en-GB"/>
+        </w:rPr>
+      </w:pPr>
+    </w:p>
+    <w:p>
+      <w:pPr>
+        <w:pStyle w:val="a3"/>
+        <w:numPr>
+          <w:ilvl w:val="0"/>
+          <w:numId w:val="43"/>
+        </w:numPr>
+        <w:rPr>
+          <w:lang w:eastAsia="en-GB"/>
+        </w:rPr>
+      </w:pPr>
+      <w:r>
+        <w:rPr>
+          <w:lang w:eastAsia="en-GB"/>
+        </w:rPr>
+        <w:t>Клиент открывает раздел заявок.</w:t>
+      </w:r>
+    </w:p>
+    <w:p>
+      <w:pPr>
+        <w:pStyle w:val="a3"/>
+        <w:numPr>
+          <w:ilvl w:val="0"/>
+          <w:numId w:val="43"/>
+        </w:numPr>
+        <w:rPr>
+          <w:lang w:eastAsia="en-GB"/>
+        </w:rPr>
+      </w:pPr>
+      <w:r>
+        <w:rPr>
+          <w:lang w:eastAsia="en-GB"/>
+        </w:rPr>
+        <w:t>Клиент заполняет форму: категория услуги, заголовок, описание, адрес и желаемая дата выполнения.</w:t>
+      </w:r>
+    </w:p>
+    <w:p>
+      <w:pPr>
+        <w:pStyle w:val="a3"/>
+        <w:numPr>
+          <w:ilvl w:val="0"/>
+          <w:numId w:val="43"/>
+        </w:numPr>
+        <w:rPr>
+          <w:lang w:eastAsia="en-GB"/>
+        </w:rPr>
+      </w:pPr>
+      <w:r>
+        <w:rPr>
+          <w:lang w:eastAsia="en-GB"/>
+        </w:rPr>
+        <w:t>Система проверяет данные и сохраняет заявку.</w:t>
+      </w:r>
+    </w:p>
+    <w:p>
+      <w:pPr>
+        <w:pStyle w:val="a3"/>
+        <w:numPr>
+          <w:ilvl w:val="0"/>
+          <w:numId w:val="43"/>
+        </w:numPr>
+        <w:rPr>
+          <w:lang w:eastAsia="en-GB"/>
+        </w:rPr>
+      </w:pPr>
+      <w:r>
+        <w:rPr>
+          <w:lang w:eastAsia="en-GB"/>
+        </w:rPr>
+        <w:t>Заявка появляется в списке заявок клиента и становится доступна мастерам.</w:t>
+      </w:r>
+    </w:p>
+    <w:p>
+      <w:pPr>
+        <w:rPr>
+          <w:lang w:eastAsia="en-GB"/>
+        </w:rPr>
+      </w:pPr>
+    </w:p>
+    <w:p>
+      <w:pPr>
+        <w:rPr>
+          <w:lang w:eastAsia="en-GB"/>
+        </w:rPr>
+      </w:pPr>
+      <w:r>
+        <w:rPr>
+          <w:lang w:eastAsia="en-GB"/>
+        </w:rPr>
+        <w:t>3. Создание отклика мастером</w:t>
+      </w:r>
+    </w:p>
+    <w:p>
+      <w:pPr>
+        <w:rPr>
+          <w:lang w:eastAsia="en-GB"/>
+        </w:rPr>
+      </w:pPr>
+    </w:p>
+    <w:p>
+      <w:pPr>
+        <w:pStyle w:val="a3"/>
+        <w:numPr>
+          <w:ilvl w:val="0"/>
+          <w:numId w:val="45"/>
+        </w:numPr>
+        <w:rPr>
+          <w:lang w:eastAsia="en-GB"/>
+        </w:rPr>
+      </w:pPr>
+      <w:r>
+        <w:rPr>
+          <w:lang w:eastAsia="en-GB"/>
+        </w:rPr>
+        <w:t>Мастер открывает список доступных заявок.</w:t>
+      </w:r>
+    </w:p>
+    <w:p>
+      <w:pPr>
+        <w:pStyle w:val="a3"/>
+        <w:numPr>
+          <w:ilvl w:val="0"/>
+          <w:numId w:val="45"/>
+        </w:numPr>
+        <w:rPr>
+          <w:lang w:eastAsia="en-GB"/>
+        </w:rPr>
+      </w:pPr>
+      <w:r>
+        <w:rPr>
+          <w:lang w:eastAsia="en-GB"/>
+        </w:rPr>
+        <w:t>Система отображает заявки, подходящие под специализации мастера.</w:t>
+      </w:r>
+    </w:p>
+    <w:p>
+      <w:pPr>
+        <w:pStyle w:val="a3"/>
+        <w:numPr>
+          <w:ilvl w:val="0"/>
+          <w:numId w:val="45"/>
+        </w:numPr>
+        <w:rPr>
+          <w:lang w:eastAsia="en-GB"/>
+        </w:rPr>
+      </w:pPr>
+      <w:r>
+        <w:rPr>
+          <w:lang w:eastAsia="en-GB"/>
+        </w:rPr>
+        <w:t>Мастер выбирает заявку и указывает предлагаемую цену и комментарий.</w:t>
+      </w:r>
+    </w:p>
+    <w:p>
+      <w:pPr>
+        <w:pStyle w:val="a3"/>
+        <w:numPr>
+          <w:ilvl w:val="0"/>
+          <w:numId w:val="45"/>
+        </w:numPr>
+        <w:rPr>
+          <w:lang w:eastAsia="en-GB"/>
+        </w:rPr>
+      </w:pPr>
+      <w:r>
+        <w:rPr>
+          <w:lang w:eastAsia="en-GB"/>
+        </w:rPr>
+        <w:t>Система сохраняет отклик и показывает его клиенту по соответствующей заявке.</w:t>
+      </w:r>
+    </w:p>
+    <w:p>
+      <w:pPr>
+        <w:rPr>
+          <w:lang w:eastAsia="en-GB"/>
+        </w:rPr>
+      </w:pPr>
+    </w:p>
+    <w:p>
+      <w:pPr>
+        <w:rPr>
+          <w:lang w:val="en-US" w:eastAsia="en-GB"/>
+        </w:rPr>
+      </w:pPr>
+    </w:p>
+    <w:p>
+      <w:pPr>
+        <w:rPr>
+          <w:lang w:val="en-US" w:eastAsia="en-GB"/>
+        </w:rPr>
+      </w:pPr>
+    </w:p>
+    <w:p>
+      <w:pPr>
+        <w:rPr>
+          <w:lang w:val="en-US" w:eastAsia="en-GB"/>
+        </w:rPr>
+      </w:pPr>
+    </w:p>
+    <w:p>
+      <w:pPr>
+        <w:rPr>
+          <w:lang w:val="en-US" w:eastAsia="en-GB"/>
+        </w:rPr>
+      </w:pPr>
+    </w:p>
+    <w:p>
+      <w:pPr>
+        <w:rPr>
+          <w:lang w:eastAsia="en-GB"/>
+        </w:rPr>
+      </w:pPr>
+      <w:r>
+        <w:rPr>
+          <w:lang w:eastAsia="en-GB"/>
+        </w:rPr>
+        <w:lastRenderedPageBreak/>
+        <w:t>4. Выбор отклика и создание заказа</w:t>
+      </w:r>
+    </w:p>
+    <w:p>
+      <w:pPr>
+        <w:rPr>
+          <w:lang w:eastAsia="en-GB"/>
+        </w:rPr>
+      </w:pPr>
+    </w:p>
+    <w:p>
+      <w:pPr>
+        <w:pStyle w:val="a3"/>
+        <w:numPr>
+          <w:ilvl w:val="0"/>
+          <w:numId w:val="47"/>
+        </w:numPr>
+        <w:rPr>
+          <w:lang w:eastAsia="en-GB"/>
+        </w:rPr>
+      </w:pPr>
+      <w:r>
+        <w:rPr>
+          <w:lang w:eastAsia="en-GB"/>
+        </w:rPr>
+        <w:t>Клиент открывает свою заявку и просматривает отклики мастеров.</w:t>
+      </w:r>
+    </w:p>
+    <w:p>
+      <w:pPr>
+        <w:pStyle w:val="a3"/>
+        <w:numPr>
+          <w:ilvl w:val="0"/>
+          <w:numId w:val="47"/>
+        </w:numPr>
+        <w:rPr>
+          <w:lang w:eastAsia="en-GB"/>
+        </w:rPr>
+      </w:pPr>
+      <w:r>
+        <w:rPr>
+          <w:lang w:eastAsia="en-GB"/>
+        </w:rPr>
+        <w:t>Клиент выбирает подходящий отклик.</w:t>
+      </w:r>
+    </w:p>
+    <w:p>
+      <w:pPr>
+        <w:pStyle w:val="a3"/>
+        <w:numPr>
+          <w:ilvl w:val="0"/>
+          <w:numId w:val="47"/>
+        </w:numPr>
+        <w:rPr>
+          <w:lang w:eastAsia="en-GB"/>
+        </w:rPr>
+      </w:pPr>
+      <w:r>
+        <w:rPr>
+          <w:lang w:eastAsia="en-GB"/>
+        </w:rPr>
+        <w:t>Система принимает выбранный отклик и отклоняет остальные отклики по этой заявке.</w:t>
+      </w:r>
+    </w:p>
+    <w:p>
+      <w:pPr>
+        <w:pStyle w:val="a3"/>
+        <w:numPr>
+          <w:ilvl w:val="0"/>
+          <w:numId w:val="47"/>
+        </w:numPr>
+        <w:rPr>
+          <w:lang w:eastAsia="en-GB"/>
+        </w:rPr>
+      </w:pPr>
+      <w:r>
+        <w:rPr>
+          <w:lang w:eastAsia="en-GB"/>
+        </w:rPr>
+        <w:t>Система создаёт заказ на основе выбранного отклика.</w:t>
+      </w:r>
+    </w:p>
+    <w:p>
+      <w:pPr>
+        <w:rPr>
+          <w:lang w:eastAsia="en-GB"/>
+        </w:rPr>
+      </w:pPr>
+    </w:p>
+    <w:p>
+      <w:pPr>
+        <w:rPr>
+          <w:lang w:eastAsia="en-GB"/>
+        </w:rPr>
+      </w:pPr>
+      <w:r>
+        <w:rPr>
+          <w:lang w:eastAsia="en-GB"/>
+        </w:rPr>
+        <w:t>5. Выполнение заказа</w:t>
+      </w:r>
+    </w:p>
+    <w:p>
+      <w:pPr>
+        <w:rPr>
+          <w:lang w:eastAsia="en-GB"/>
+        </w:rPr>
+      </w:pPr>
+    </w:p>
+    <w:p>
+      <w:pPr>
+        <w:pStyle w:val="a3"/>
+        <w:numPr>
+          <w:ilvl w:val="0"/>
+          <w:numId w:val="49"/>
+        </w:numPr>
+        <w:rPr>
+          <w:lang w:eastAsia="en-GB"/>
+        </w:rPr>
+      </w:pPr>
+      <w:r>
+        <w:rPr>
+          <w:lang w:eastAsia="en-GB"/>
+        </w:rPr>
+        <w:t>Клиент и мастер видят созданный заказ в своих личных кабинетах.</w:t>
+      </w:r>
+    </w:p>
+    <w:p>
+      <w:pPr>
+        <w:pStyle w:val="a3"/>
+        <w:numPr>
+          <w:ilvl w:val="0"/>
+          <w:numId w:val="49"/>
+        </w:numPr>
+        <w:rPr>
+          <w:lang w:eastAsia="en-GB"/>
+        </w:rPr>
+      </w:pPr>
+      <w:r>
+        <w:rPr>
+          <w:lang w:eastAsia="en-GB"/>
+        </w:rPr>
+        <w:t>Система отображает данные заказа: заявку, мастера, клиента, цену и статус.</w:t>
+      </w:r>
+    </w:p>
+    <w:p>
+      <w:pPr>
+        <w:pStyle w:val="a3"/>
+        <w:numPr>
+          <w:ilvl w:val="0"/>
+          <w:numId w:val="49"/>
+        </w:numPr>
+        <w:rPr>
+          <w:lang w:eastAsia="en-GB"/>
+        </w:rPr>
+      </w:pPr>
+      <w:r>
+        <w:rPr>
+          <w:lang w:eastAsia="en-GB"/>
+        </w:rPr>
+        <w:t>После выполнения услуги заказ переводится в завершённый статус.</w:t>
+      </w:r>
+    </w:p>
+    <w:p>
+      <w:pPr>
+        <w:pStyle w:val="a3"/>
+        <w:numPr>
+          <w:ilvl w:val="0"/>
+          <w:numId w:val="49"/>
+        </w:numPr>
+        <w:rPr>
+          <w:lang w:eastAsia="en-GB"/>
+        </w:rPr>
+      </w:pPr>
+      <w:r>
+        <w:rPr>
+          <w:lang w:eastAsia="en-GB"/>
+        </w:rPr>
+        <w:t>Завершённый заказ сохраняется в истории заказов.</w:t>
+      </w:r>
+    </w:p>
+    <w:p>
+      <w:pPr>
+        <w:rPr>
+          <w:lang w:eastAsia="en-GB"/>
+        </w:rPr>
+      </w:pPr>
+    </w:p>
+    <w:p>
+      <w:pPr>
+        <w:rPr>
+          <w:lang w:eastAsia="en-GB"/>
+        </w:rPr>
+      </w:pPr>
+      <w:r>
+        <w:rPr>
+          <w:lang w:eastAsia="en-GB"/>
+        </w:rPr>
+        <w:t>6. Оставление отзыва</w:t>
+      </w:r>
+    </w:p>
+    <w:p>
+      <w:pPr>
+        <w:rPr>
+          <w:lang w:eastAsia="en-GB"/>
+        </w:rPr>
+      </w:pPr>
+    </w:p>
+    <w:p>
+      <w:pPr>
+        <w:pStyle w:val="a3"/>
+        <w:numPr>
+          <w:ilvl w:val="0"/>
+          <w:numId w:val="51"/>
+        </w:numPr>
+        <w:rPr>
+          <w:lang w:eastAsia="en-GB"/>
+        </w:rPr>
+      </w:pPr>
+      <w:r>
+        <w:rPr>
+          <w:lang w:eastAsia="en-GB"/>
+        </w:rPr>
+        <w:t>Клиент открывает завершённый заказ.</w:t>
+      </w:r>
+    </w:p>
+    <w:p>
+      <w:pPr>
+        <w:pStyle w:val="a3"/>
+        <w:numPr>
+          <w:ilvl w:val="0"/>
+          <w:numId w:val="51"/>
+        </w:numPr>
+        <w:rPr>
+          <w:lang w:eastAsia="en-GB"/>
+        </w:rPr>
+      </w:pPr>
+      <w:r>
+        <w:rPr>
+          <w:lang w:eastAsia="en-GB"/>
+        </w:rPr>
+        <w:t>Клиент указывает оценку и при необходимости комментарий.</w:t>
+      </w:r>
+    </w:p>
+    <w:p>
+      <w:pPr>
+        <w:pStyle w:val="a3"/>
+        <w:numPr>
+          <w:ilvl w:val="0"/>
+          <w:numId w:val="51"/>
+        </w:numPr>
+        <w:rPr>
+          <w:lang w:eastAsia="en-GB"/>
+        </w:rPr>
+      </w:pPr>
+      <w:r>
+        <w:rPr>
+          <w:lang w:eastAsia="en-GB"/>
+        </w:rPr>
+        <w:t>Система проверяет, что по заказу ещё нет отзыва.</w:t>
+      </w:r>
+    </w:p>
+    <w:p>
+      <w:pPr>
+        <w:pStyle w:val="a3"/>
+        <w:numPr>
+          <w:ilvl w:val="0"/>
+          <w:numId w:val="51"/>
+        </w:numPr>
+        <w:rPr>
+          <w:lang w:eastAsia="en-GB"/>
+        </w:rPr>
+      </w:pPr>
+      <w:r>
+        <w:rPr>
+          <w:lang w:eastAsia="en-GB"/>
+        </w:rPr>
+        <w:t>Система сохраняет отзыв и отображает его в профиле мастера.</w:t>
+      </w:r>
     </w:p>
     <w:sectPr>
       <w:pgSz w:w="11906" w:h="16838"/>
@@ -10532,6 +12137,119 @@
     </w:lvl>
   </w:abstractNum>
   <w:abstractNum w:abstractNumId="2" w15:restartNumberingAfterBreak="0">
+    <w:nsid w:val="15A7556F"/>
+    <w:multiLevelType w:val="hybridMultilevel"/>
+    <w:tmpl w:val="8020B008"/>
+    <w:lvl w:ilvl="0" w:tplc="04190001">
+      <w:start w:val="1"/>
+      <w:numFmt w:val="bullet"/>
+      <w:lvlText w:val=""/>
+      <w:lvlJc w:val="left"/>
+      <w:pPr>
+        <w:ind w:left="720" w:hanging="360"/>
+      </w:pPr>
+      <w:rPr>
+        <w:rFonts w:ascii="Symbol" w:hAnsi="Symbol" w:hint="default"/>
+      </w:rPr>
+    </w:lvl>
+    <w:lvl w:ilvl="1" w:tplc="04190003" w:tentative="1">
+      <w:start w:val="1"/>
+      <w:numFmt w:val="bullet"/>
+      <w:lvlText w:val="o"/>
+      <w:lvlJc w:val="left"/>
+      <w:pPr>
+        <w:ind w:left="1440" w:hanging="360"/>
+      </w:pPr>
+      <w:rPr>
+        <w:rFonts w:ascii="Courier New" w:hAnsi="Courier New" w:cs="Courier New" w:hint="default"/>
+      </w:rPr>
+    </w:lvl>
+    <w:lvl w:ilvl="2" w:tplc="04190005" w:tentative="1">
+      <w:start w:val="1"/>
+      <w:numFmt w:val="bullet"/>
+      <w:lvlText w:val=""/>
+      <w:lvlJc w:val="left"/>
+      <w:pPr>
+        <w:ind w:left="2160" w:hanging="360"/>
+      </w:pPr>
+      <w:rPr>
+        <w:rFonts w:ascii="Wingdings" w:hAnsi="Wingdings" w:hint="default"/>
+      </w:rPr>
+    </w:lvl>
+    <w:lvl w:ilvl="3" w:tplc="04190001" w:tentative="1">
+      <w:start w:val="1"/>
+      <w:numFmt w:val="bullet"/>
+      <w:lvlText w:val=""/>
+      <w:lvlJc w:val="left"/>
+      <w:pPr>
+        <w:ind w:left="2880" w:hanging="360"/>
+      </w:pPr>
+      <w:rPr>
+        <w:rFonts w:ascii="Symbol" w:hAnsi="Symbol" w:hint="default"/>
+      </w:rPr>
+    </w:lvl>
+    <w:lvl w:ilvl="4" w:tplc="04190003" w:tentative="1">
+      <w:start w:val="1"/>
+      <w:numFmt w:val="bullet"/>
+      <w:lvlText w:val="o"/>
+      <w:lvlJc w:val="left"/>
+      <w:pPr>
+        <w:ind w:left="3600" w:hanging="360"/>
+      </w:pPr>
+      <w:rPr>
+        <w:rFonts w:ascii="Courier New" w:hAnsi="Courier New" w:cs="Courier New" w:hint="default"/>
+      </w:rPr>
+    </w:lvl>
+    <w:lvl w:ilvl="5" w:tplc="04190005" w:tentative="1">
+      <w:start w:val="1"/>
+      <w:numFmt w:val="bullet"/>
+      <w:lvlText w:val=""/>
+      <w:lvlJc w:val="left"/>
+      <w:pPr>
+        <w:ind w:left="4320" w:hanging="360"/>
+      </w:pPr>
+      <w:rPr>
+        <w:rFonts w:ascii="Wingdings" w:hAnsi="Wingdings" w:hint="default"/>
+      </w:rPr>
+    </w:lvl>
+    <w:lvl w:ilvl="6" w:tplc="04190001" w:tentative="1">
+      <w:start w:val="1"/>
+      <w:numFmt w:val="bullet"/>
+      <w:lvlText w:val=""/>
+      <w:lvlJc w:val="left"/>
+      <w:pPr>
+        <w:ind w:left="5040" w:hanging="360"/>
+      </w:pPr>
+      <w:rPr>
+        <w:rFonts w:ascii="Symbol" w:hAnsi="Symbol" w:hint="default"/>
+      </w:rPr>
+    </w:lvl>
+    <w:lvl w:ilvl="7" w:tplc="04190003" w:tentative="1">
+      <w:start w:val="1"/>
+      <w:numFmt w:val="bullet"/>
+      <w:lvlText w:val="o"/>
+      <w:lvlJc w:val="left"/>
+      <w:pPr>
+        <w:ind w:left="5760" w:hanging="360"/>
+      </w:pPr>
+      <w:rPr>
+        <w:rFonts w:ascii="Courier New" w:hAnsi="Courier New" w:cs="Courier New" w:hint="default"/>
+      </w:rPr>
+    </w:lvl>
+    <w:lvl w:ilvl="8" w:tplc="04190005" w:tentative="1">
+      <w:start w:val="1"/>
+      <w:numFmt w:val="bullet"/>
+      <w:lvlText w:val=""/>
+      <w:lvlJc w:val="left"/>
+      <w:pPr>
+        <w:ind w:left="6480" w:hanging="360"/>
+      </w:pPr>
+      <w:rPr>
+        <w:rFonts w:ascii="Wingdings" w:hAnsi="Wingdings" w:hint="default"/>
+      </w:rPr>
+    </w:lvl>
+  </w:abstractNum>
+  <w:abstractNum w:abstractNumId="3" w15:restartNumberingAfterBreak="0">
     <w:nsid w:val="1873214C"/>
     <w:multiLevelType w:val="hybridMultilevel"/>
     <w:tmpl w:val="20141ACA"/>
@@ -10644,7 +12362,7 @@
       </w:rPr>
     </w:lvl>
   </w:abstractNum>
-  <w:abstractNum w:abstractNumId="3" w15:restartNumberingAfterBreak="0">
+  <w:abstractNum w:abstractNumId="4" w15:restartNumberingAfterBreak="0">
     <w:nsid w:val="187A2E4C"/>
     <w:multiLevelType w:val="hybridMultilevel"/>
     <w:tmpl w:val="B69042C6"/>
@@ -10757,7 +12475,96 @@
       </w:rPr>
     </w:lvl>
   </w:abstractNum>
-  <w:abstractNum w:abstractNumId="4" w15:restartNumberingAfterBreak="0">
+  <w:abstractNum w:abstractNumId="5" w15:restartNumberingAfterBreak="0">
+    <w:nsid w:val="1C1D2FD4"/>
+    <w:multiLevelType w:val="hybridMultilevel"/>
+    <w:tmpl w:val="545CCED8"/>
+    <w:lvl w:ilvl="0" w:tplc="0419000F">
+      <w:start w:val="1"/>
+      <w:numFmt w:val="decimal"/>
+      <w:lvlText w:val="%1."/>
+      <w:lvlJc w:val="left"/>
+      <w:pPr>
+        <w:ind w:left="720" w:hanging="360"/>
+      </w:pPr>
+      <w:rPr>
+        <w:rFonts w:hint="default"/>
+      </w:rPr>
+    </w:lvl>
+    <w:lvl w:ilvl="1" w:tplc="04190019" w:tentative="1">
+      <w:start w:val="1"/>
+      <w:numFmt w:val="lowerLetter"/>
+      <w:lvlText w:val="%2."/>
+      <w:lvlJc w:val="left"/>
+      <w:pPr>
+        <w:ind w:left="1440" w:hanging="360"/>
+      </w:pPr>
+    </w:lvl>
+    <w:lvl w:ilvl="2" w:tplc="0419001B" w:tentative="1">
+      <w:start w:val="1"/>
+      <w:numFmt w:val="lowerRoman"/>
+      <w:lvlText w:val="%3."/>
+      <w:lvlJc w:val="right"/>
+      <w:pPr>
+        <w:ind w:left="2160" w:hanging="180"/>
+      </w:pPr>
+    </w:lvl>
+    <w:lvl w:ilvl="3" w:tplc="0419000F" w:tentative="1">
+      <w:start w:val="1"/>
+      <w:numFmt w:val="decimal"/>
+      <w:lvlText w:val="%4."/>
+      <w:lvlJc w:val="left"/>
+      <w:pPr>
+        <w:ind w:left="2880" w:hanging="360"/>
+      </w:pPr>
+    </w:lvl>
+    <w:lvl w:ilvl="4" w:tplc="04190019" w:tentative="1">
+      <w:start w:val="1"/>
+      <w:numFmt w:val="lowerLetter"/>
+      <w:lvlText w:val="%5."/>
+      <w:lvlJc w:val="left"/>
+      <w:pPr>
+        <w:ind w:left="3600" w:hanging="360"/>
+      </w:pPr>
+    </w:lvl>
+    <w:lvl w:ilvl="5" w:tplc="0419001B" w:tentative="1">
+      <w:start w:val="1"/>
+      <w:numFmt w:val="lowerRoman"/>
+      <w:lvlText w:val="%6."/>
+      <w:lvlJc w:val="right"/>
+      <w:pPr>
+        <w:ind w:left="4320" w:hanging="180"/>
+      </w:pPr>
+    </w:lvl>
+    <w:lvl w:ilvl="6" w:tplc="0419000F" w:tentative="1">
+      <w:start w:val="1"/>
+      <w:numFmt w:val="decimal"/>
+      <w:lvlText w:val="%7."/>
+      <w:lvlJc w:val="left"/>
+      <w:pPr>
+        <w:ind w:left="5040" w:hanging="360"/>
+      </w:pPr>
+    </w:lvl>
+    <w:lvl w:ilvl="7" w:tplc="04190019" w:tentative="1">
+      <w:start w:val="1"/>
+      <w:numFmt w:val="lowerLetter"/>
+      <w:lvlText w:val="%8."/>
+      <w:lvlJc w:val="left"/>
+      <w:pPr>
+        <w:ind w:left="5760" w:hanging="360"/>
+      </w:pPr>
+    </w:lvl>
+    <w:lvl w:ilvl="8" w:tplc="0419001B" w:tentative="1">
+      <w:start w:val="1"/>
+      <w:numFmt w:val="lowerRoman"/>
+      <w:lvlText w:val="%9."/>
+      <w:lvlJc w:val="right"/>
+      <w:pPr>
+        <w:ind w:left="6480" w:hanging="180"/>
+      </w:pPr>
+    </w:lvl>
+  </w:abstractNum>
+  <w:abstractNum w:abstractNumId="6" w15:restartNumberingAfterBreak="0">
     <w:nsid w:val="21405381"/>
     <w:multiLevelType w:val="hybridMultilevel"/>
     <w:tmpl w:val="8FA8AD64"/>
@@ -10870,7 +12677,7 @@
       </w:rPr>
     </w:lvl>
   </w:abstractNum>
-  <w:abstractNum w:abstractNumId="5" w15:restartNumberingAfterBreak="0">
+  <w:abstractNum w:abstractNumId="7" w15:restartNumberingAfterBreak="0">
     <w:nsid w:val="25001D72"/>
     <w:multiLevelType w:val="hybridMultilevel"/>
     <w:tmpl w:val="CD00209A"/>
@@ -10983,7 +12790,7 @@
       </w:rPr>
     </w:lvl>
   </w:abstractNum>
-  <w:abstractNum w:abstractNumId="6" w15:restartNumberingAfterBreak="0">
+  <w:abstractNum w:abstractNumId="8" w15:restartNumberingAfterBreak="0">
     <w:nsid w:val="265845F3"/>
     <w:multiLevelType w:val="hybridMultilevel"/>
     <w:tmpl w:val="63867D42"/>
@@ -11096,7 +12903,7 @@
       </w:rPr>
     </w:lvl>
   </w:abstractNum>
-  <w:abstractNum w:abstractNumId="7" w15:restartNumberingAfterBreak="0">
+  <w:abstractNum w:abstractNumId="9" w15:restartNumberingAfterBreak="0">
     <w:nsid w:val="27093C67"/>
     <w:multiLevelType w:val="hybridMultilevel"/>
     <w:tmpl w:val="E7FE879E"/>
@@ -11209,7 +13016,7 @@
       </w:rPr>
     </w:lvl>
   </w:abstractNum>
-  <w:abstractNum w:abstractNumId="8" w15:restartNumberingAfterBreak="0">
+  <w:abstractNum w:abstractNumId="10" w15:restartNumberingAfterBreak="0">
     <w:nsid w:val="28127B4C"/>
     <w:multiLevelType w:val="hybridMultilevel"/>
     <w:tmpl w:val="B052DCA8"/>
@@ -11322,7 +13129,7 @@
       </w:rPr>
     </w:lvl>
   </w:abstractNum>
-  <w:abstractNum w:abstractNumId="9" w15:restartNumberingAfterBreak="0">
+  <w:abstractNum w:abstractNumId="11" w15:restartNumberingAfterBreak="0">
     <w:nsid w:val="2AAA05E5"/>
     <w:multiLevelType w:val="hybridMultilevel"/>
     <w:tmpl w:val="C8F057BC"/>
@@ -11435,7 +13242,7 @@
       </w:rPr>
     </w:lvl>
   </w:abstractNum>
-  <w:abstractNum w:abstractNumId="10" w15:restartNumberingAfterBreak="0">
+  <w:abstractNum w:abstractNumId="12" w15:restartNumberingAfterBreak="0">
     <w:nsid w:val="2AFD5E72"/>
     <w:multiLevelType w:val="hybridMultilevel"/>
     <w:tmpl w:val="B9CECB16"/>
@@ -11548,7 +13355,7 @@
       </w:rPr>
     </w:lvl>
   </w:abstractNum>
-  <w:abstractNum w:abstractNumId="11" w15:restartNumberingAfterBreak="0">
+  <w:abstractNum w:abstractNumId="13" w15:restartNumberingAfterBreak="0">
     <w:nsid w:val="2D875852"/>
     <w:multiLevelType w:val="hybridMultilevel"/>
     <w:tmpl w:val="0C72B880"/>
@@ -11661,7 +13468,120 @@
       </w:rPr>
     </w:lvl>
   </w:abstractNum>
-  <w:abstractNum w:abstractNumId="12" w15:restartNumberingAfterBreak="0">
+  <w:abstractNum w:abstractNumId="14" w15:restartNumberingAfterBreak="0">
+    <w:nsid w:val="2E75702F"/>
+    <w:multiLevelType w:val="hybridMultilevel"/>
+    <w:tmpl w:val="3B7216A0"/>
+    <w:lvl w:ilvl="0" w:tplc="04190003">
+      <w:start w:val="1"/>
+      <w:numFmt w:val="bullet"/>
+      <w:lvlText w:val="o"/>
+      <w:lvlJc w:val="left"/>
+      <w:pPr>
+        <w:ind w:left="720" w:hanging="360"/>
+      </w:pPr>
+      <w:rPr>
+        <w:rFonts w:ascii="Courier New" w:hAnsi="Courier New" w:cs="Courier New" w:hint="default"/>
+      </w:rPr>
+    </w:lvl>
+    <w:lvl w:ilvl="1" w:tplc="04190003" w:tentative="1">
+      <w:start w:val="1"/>
+      <w:numFmt w:val="bullet"/>
+      <w:lvlText w:val="o"/>
+      <w:lvlJc w:val="left"/>
+      <w:pPr>
+        <w:ind w:left="1440" w:hanging="360"/>
+      </w:pPr>
+      <w:rPr>
+        <w:rFonts w:ascii="Courier New" w:hAnsi="Courier New" w:cs="Courier New" w:hint="default"/>
+      </w:rPr>
+    </w:lvl>
+    <w:lvl w:ilvl="2" w:tplc="04190005" w:tentative="1">
+      <w:start w:val="1"/>
+      <w:numFmt w:val="bullet"/>
+      <w:lvlText w:val=""/>
+      <w:lvlJc w:val="left"/>
+      <w:pPr>
+        <w:ind w:left="2160" w:hanging="360"/>
+      </w:pPr>
+      <w:rPr>
+        <w:rFonts w:ascii="Wingdings" w:hAnsi="Wingdings" w:hint="default"/>
+      </w:rPr>
+    </w:lvl>
+    <w:lvl w:ilvl="3" w:tplc="04190001" w:tentative="1">
+      <w:start w:val="1"/>
+      <w:numFmt w:val="bullet"/>
+      <w:lvlText w:val=""/>
+      <w:lvlJc w:val="left"/>
+      <w:pPr>
+        <w:ind w:left="2880" w:hanging="360"/>
+      </w:pPr>
+      <w:rPr>
+        <w:rFonts w:ascii="Symbol" w:hAnsi="Symbol" w:hint="default"/>
+      </w:rPr>
+    </w:lvl>
+    <w:lvl w:ilvl="4" w:tplc="04190003" w:tentative="1">
+      <w:start w:val="1"/>
+      <w:numFmt w:val="bullet"/>
+      <w:lvlText w:val="o"/>
+      <w:lvlJc w:val="left"/>
+      <w:pPr>
+        <w:ind w:left="3600" w:hanging="360"/>
+      </w:pPr>
+      <w:rPr>
+        <w:rFonts w:ascii="Courier New" w:hAnsi="Courier New" w:cs="Courier New" w:hint="default"/>
+      </w:rPr>
+    </w:lvl>
+    <w:lvl w:ilvl="5" w:tplc="04190005" w:tentative="1">
+      <w:start w:val="1"/>
+      <w:numFmt w:val="bullet"/>
+      <w:lvlText w:val=""/>
+      <w:lvlJc w:val="left"/>
+      <w:pPr>
+        <w:ind w:left="4320" w:hanging="360"/>
+      </w:pPr>
+      <w:rPr>
+        <w:rFonts w:ascii="Wingdings" w:hAnsi="Wingdings" w:hint="default"/>
+      </w:rPr>
+    </w:lvl>
+    <w:lvl w:ilvl="6" w:tplc="04190001" w:tentative="1">
+      <w:start w:val="1"/>
+      <w:numFmt w:val="bullet"/>
+      <w:lvlText w:val=""/>
+      <w:lvlJc w:val="left"/>
+      <w:pPr>
+        <w:ind w:left="5040" w:hanging="360"/>
+      </w:pPr>
+      <w:rPr>
+        <w:rFonts w:ascii="Symbol" w:hAnsi="Symbol" w:hint="default"/>
+      </w:rPr>
+    </w:lvl>
+    <w:lvl w:ilvl="7" w:tplc="04190003" w:tentative="1">
+      <w:start w:val="1"/>
+      <w:numFmt w:val="bullet"/>
+      <w:lvlText w:val="o"/>
+      <w:lvlJc w:val="left"/>
+      <w:pPr>
+        <w:ind w:left="5760" w:hanging="360"/>
+      </w:pPr>
+      <w:rPr>
+        <w:rFonts w:ascii="Courier New" w:hAnsi="Courier New" w:cs="Courier New" w:hint="default"/>
+      </w:rPr>
+    </w:lvl>
+    <w:lvl w:ilvl="8" w:tplc="04190005" w:tentative="1">
+      <w:start w:val="1"/>
+      <w:numFmt w:val="bullet"/>
+      <w:lvlText w:val=""/>
+      <w:lvlJc w:val="left"/>
+      <w:pPr>
+        <w:ind w:left="6480" w:hanging="360"/>
+      </w:pPr>
+      <w:rPr>
+        <w:rFonts w:ascii="Wingdings" w:hAnsi="Wingdings" w:hint="default"/>
+      </w:rPr>
+    </w:lvl>
+  </w:abstractNum>
+  <w:abstractNum w:abstractNumId="15" w15:restartNumberingAfterBreak="0">
     <w:nsid w:val="2ED30147"/>
     <w:multiLevelType w:val="hybridMultilevel"/>
     <w:tmpl w:val="D272DE24"/>
@@ -11774,7 +13694,7 @@
       </w:rPr>
     </w:lvl>
   </w:abstractNum>
-  <w:abstractNum w:abstractNumId="13" w15:restartNumberingAfterBreak="0">
+  <w:abstractNum w:abstractNumId="16" w15:restartNumberingAfterBreak="0">
     <w:nsid w:val="32AA6650"/>
     <w:multiLevelType w:val="hybridMultilevel"/>
     <w:tmpl w:val="CD76E4FA"/>
@@ -11887,7 +13807,7 @@
       </w:rPr>
     </w:lvl>
   </w:abstractNum>
-  <w:abstractNum w:abstractNumId="14" w15:restartNumberingAfterBreak="0">
+  <w:abstractNum w:abstractNumId="17" w15:restartNumberingAfterBreak="0">
     <w:nsid w:val="33866317"/>
     <w:multiLevelType w:val="hybridMultilevel"/>
     <w:tmpl w:val="455431E6"/>
@@ -12000,7 +13920,7 @@
       </w:rPr>
     </w:lvl>
   </w:abstractNum>
-  <w:abstractNum w:abstractNumId="15" w15:restartNumberingAfterBreak="0">
+  <w:abstractNum w:abstractNumId="18" w15:restartNumberingAfterBreak="0">
     <w:nsid w:val="3CD90D6C"/>
     <w:multiLevelType w:val="hybridMultilevel"/>
     <w:tmpl w:val="D8444B4E"/>
@@ -12113,7 +14033,7 @@
       </w:rPr>
     </w:lvl>
   </w:abstractNum>
-  <w:abstractNum w:abstractNumId="16" w15:restartNumberingAfterBreak="0">
+  <w:abstractNum w:abstractNumId="19" w15:restartNumberingAfterBreak="0">
     <w:nsid w:val="3D04714E"/>
     <w:multiLevelType w:val="hybridMultilevel"/>
     <w:tmpl w:val="5F9C3DF4"/>
@@ -12226,7 +14146,7 @@
       </w:rPr>
     </w:lvl>
   </w:abstractNum>
-  <w:abstractNum w:abstractNumId="17" w15:restartNumberingAfterBreak="0">
+  <w:abstractNum w:abstractNumId="20" w15:restartNumberingAfterBreak="0">
     <w:nsid w:val="3F3479AD"/>
     <w:multiLevelType w:val="hybridMultilevel"/>
     <w:tmpl w:val="5524AF3A"/>
@@ -12339,7 +14259,7 @@
       </w:rPr>
     </w:lvl>
   </w:abstractNum>
-  <w:abstractNum w:abstractNumId="18" w15:restartNumberingAfterBreak="0">
+  <w:abstractNum w:abstractNumId="21" w15:restartNumberingAfterBreak="0">
     <w:nsid w:val="42156DA2"/>
     <w:multiLevelType w:val="hybridMultilevel"/>
     <w:tmpl w:val="55309BB6"/>
@@ -12452,7 +14372,209 @@
       </w:rPr>
     </w:lvl>
   </w:abstractNum>
-  <w:abstractNum w:abstractNumId="19" w15:restartNumberingAfterBreak="0">
+  <w:abstractNum w:abstractNumId="22" w15:restartNumberingAfterBreak="0">
+    <w:nsid w:val="422547FC"/>
+    <w:multiLevelType w:val="hybridMultilevel"/>
+    <w:tmpl w:val="285A5FFA"/>
+    <w:lvl w:ilvl="0" w:tplc="0419000F">
+      <w:start w:val="1"/>
+      <w:numFmt w:val="decimal"/>
+      <w:lvlText w:val="%1."/>
+      <w:lvlJc w:val="left"/>
+      <w:pPr>
+        <w:ind w:left="720" w:hanging="360"/>
+      </w:pPr>
+      <w:rPr>
+        <w:rFonts w:hint="default"/>
+      </w:rPr>
+    </w:lvl>
+    <w:lvl w:ilvl="1" w:tplc="04190019" w:tentative="1">
+      <w:start w:val="1"/>
+      <w:numFmt w:val="lowerLetter"/>
+      <w:lvlText w:val="%2."/>
+      <w:lvlJc w:val="left"/>
+      <w:pPr>
+        <w:ind w:left="1440" w:hanging="360"/>
+      </w:pPr>
+    </w:lvl>
+    <w:lvl w:ilvl="2" w:tplc="0419001B" w:tentative="1">
+      <w:start w:val="1"/>
+      <w:numFmt w:val="lowerRoman"/>
+      <w:lvlText w:val="%3."/>
+      <w:lvlJc w:val="right"/>
+      <w:pPr>
+        <w:ind w:left="2160" w:hanging="180"/>
+      </w:pPr>
+    </w:lvl>
+    <w:lvl w:ilvl="3" w:tplc="0419000F" w:tentative="1">
+      <w:start w:val="1"/>
+      <w:numFmt w:val="decimal"/>
+      <w:lvlText w:val="%4."/>
+      <w:lvlJc w:val="left"/>
+      <w:pPr>
+        <w:ind w:left="2880" w:hanging="360"/>
+      </w:pPr>
+    </w:lvl>
+    <w:lvl w:ilvl="4" w:tplc="04190019" w:tentative="1">
+      <w:start w:val="1"/>
+      <w:numFmt w:val="lowerLetter"/>
+      <w:lvlText w:val="%5."/>
+      <w:lvlJc w:val="left"/>
+      <w:pPr>
+        <w:ind w:left="3600" w:hanging="360"/>
+      </w:pPr>
+    </w:lvl>
+    <w:lvl w:ilvl="5" w:tplc="0419001B" w:tentative="1">
+      <w:start w:val="1"/>
+      <w:numFmt w:val="lowerRoman"/>
+      <w:lvlText w:val="%6."/>
+      <w:lvlJc w:val="right"/>
+      <w:pPr>
+        <w:ind w:left="4320" w:hanging="180"/>
+      </w:pPr>
+    </w:lvl>
+    <w:lvl w:ilvl="6" w:tplc="0419000F" w:tentative="1">
+      <w:start w:val="1"/>
+      <w:numFmt w:val="decimal"/>
+      <w:lvlText w:val="%7."/>
+      <w:lvlJc w:val="left"/>
+      <w:pPr>
+        <w:ind w:left="5040" w:hanging="360"/>
+      </w:pPr>
+    </w:lvl>
+    <w:lvl w:ilvl="7" w:tplc="04190019" w:tentative="1">
+      <w:start w:val="1"/>
+      <w:numFmt w:val="lowerLetter"/>
+      <w:lvlText w:val="%8."/>
+      <w:lvlJc w:val="left"/>
+      <w:pPr>
+        <w:ind w:left="5760" w:hanging="360"/>
+      </w:pPr>
+    </w:lvl>
+    <w:lvl w:ilvl="8" w:tplc="0419001B" w:tentative="1">
+      <w:start w:val="1"/>
+      <w:numFmt w:val="lowerRoman"/>
+      <w:lvlText w:val="%9."/>
+      <w:lvlJc w:val="right"/>
+      <w:pPr>
+        <w:ind w:left="6480" w:hanging="180"/>
+      </w:pPr>
+    </w:lvl>
+  </w:abstractNum>
+  <w:abstractNum w:abstractNumId="23" w15:restartNumberingAfterBreak="0">
+    <w:nsid w:val="47821685"/>
+    <w:multiLevelType w:val="hybridMultilevel"/>
+    <w:tmpl w:val="472E47C4"/>
+    <w:lvl w:ilvl="0" w:tplc="04190003">
+      <w:start w:val="1"/>
+      <w:numFmt w:val="bullet"/>
+      <w:lvlText w:val="o"/>
+      <w:lvlJc w:val="left"/>
+      <w:pPr>
+        <w:ind w:left="720" w:hanging="360"/>
+      </w:pPr>
+      <w:rPr>
+        <w:rFonts w:ascii="Courier New" w:hAnsi="Courier New" w:cs="Courier New" w:hint="default"/>
+      </w:rPr>
+    </w:lvl>
+    <w:lvl w:ilvl="1" w:tplc="04190003" w:tentative="1">
+      <w:start w:val="1"/>
+      <w:numFmt w:val="bullet"/>
+      <w:lvlText w:val="o"/>
+      <w:lvlJc w:val="left"/>
+      <w:pPr>
+        <w:ind w:left="1440" w:hanging="360"/>
+      </w:pPr>
+      <w:rPr>
+        <w:rFonts w:ascii="Courier New" w:hAnsi="Courier New" w:cs="Courier New" w:hint="default"/>
+      </w:rPr>
+    </w:lvl>
+    <w:lvl w:ilvl="2" w:tplc="04190005" w:tentative="1">
+      <w:start w:val="1"/>
+      <w:numFmt w:val="bullet"/>
+      <w:lvlText w:val=""/>
+      <w:lvlJc w:val="left"/>
+      <w:pPr>
+        <w:ind w:left="2160" w:hanging="360"/>
+      </w:pPr>
+      <w:rPr>
+        <w:rFonts w:ascii="Wingdings" w:hAnsi="Wingdings" w:hint="default"/>
+      </w:rPr>
+    </w:lvl>
+    <w:lvl w:ilvl="3" w:tplc="04190001" w:tentative="1">
+      <w:start w:val="1"/>
+      <w:numFmt w:val="bullet"/>
+      <w:lvlText w:val=""/>
+      <w:lvlJc w:val="left"/>
+      <w:pPr>
+        <w:ind w:left="2880" w:hanging="360"/>
+      </w:pPr>
+      <w:rPr>
+        <w:rFonts w:ascii="Symbol" w:hAnsi="Symbol" w:hint="default"/>
+      </w:rPr>
+    </w:lvl>
+    <w:lvl w:ilvl="4" w:tplc="04190003" w:tentative="1">
+      <w:start w:val="1"/>
+      <w:numFmt w:val="bullet"/>
+      <w:lvlText w:val="o"/>
+      <w:lvlJc w:val="left"/>
+      <w:pPr>
+        <w:ind w:left="3600" w:hanging="360"/>
+      </w:pPr>
+      <w:rPr>
+        <w:rFonts w:ascii="Courier New" w:hAnsi="Courier New" w:cs="Courier New" w:hint="default"/>
+      </w:rPr>
+    </w:lvl>
+    <w:lvl w:ilvl="5" w:tplc="04190005" w:tentative="1">
+      <w:start w:val="1"/>
+      <w:numFmt w:val="bullet"/>
+      <w:lvlText w:val=""/>
+      <w:lvlJc w:val="left"/>
+      <w:pPr>
+        <w:ind w:left="4320" w:hanging="360"/>
+      </w:pPr>
+      <w:rPr>
+        <w:rFonts w:ascii="Wingdings" w:hAnsi="Wingdings" w:hint="default"/>
+      </w:rPr>
+    </w:lvl>
+    <w:lvl w:ilvl="6" w:tplc="04190001" w:tentative="1">
+      <w:start w:val="1"/>
+      <w:numFmt w:val="bullet"/>
+      <w:lvlText w:val=""/>
+      <w:lvlJc w:val="left"/>
+      <w:pPr>
+        <w:ind w:left="5040" w:hanging="360"/>
+      </w:pPr>
+      <w:rPr>
+        <w:rFonts w:ascii="Symbol" w:hAnsi="Symbol" w:hint="default"/>
+      </w:rPr>
+    </w:lvl>
+    <w:lvl w:ilvl="7" w:tplc="04190003" w:tentative="1">
+      <w:start w:val="1"/>
+      <w:numFmt w:val="bullet"/>
+      <w:lvlText w:val="o"/>
+      <w:lvlJc w:val="left"/>
+      <w:pPr>
+        <w:ind w:left="5760" w:hanging="360"/>
+      </w:pPr>
+      <w:rPr>
+        <w:rFonts w:ascii="Courier New" w:hAnsi="Courier New" w:cs="Courier New" w:hint="default"/>
+      </w:rPr>
+    </w:lvl>
+    <w:lvl w:ilvl="8" w:tplc="04190005" w:tentative="1">
+      <w:start w:val="1"/>
+      <w:numFmt w:val="bullet"/>
+      <w:lvlText w:val=""/>
+      <w:lvlJc w:val="left"/>
+      <w:pPr>
+        <w:ind w:left="6480" w:hanging="360"/>
+      </w:pPr>
+      <w:rPr>
+        <w:rFonts w:ascii="Wingdings" w:hAnsi="Wingdings" w:hint="default"/>
+      </w:rPr>
+    </w:lvl>
+  </w:abstractNum>
+  <w:abstractNum w:abstractNumId="24" w15:restartNumberingAfterBreak="0">
     <w:nsid w:val="495F0919"/>
     <w:multiLevelType w:val="hybridMultilevel"/>
     <w:tmpl w:val="65725F00"/>
@@ -12538,7 +14660,7 @@
       </w:pPr>
     </w:lvl>
   </w:abstractNum>
-  <w:abstractNum w:abstractNumId="20" w15:restartNumberingAfterBreak="0">
+  <w:abstractNum w:abstractNumId="25" w15:restartNumberingAfterBreak="0">
     <w:nsid w:val="49F1780A"/>
     <w:multiLevelType w:val="hybridMultilevel"/>
     <w:tmpl w:val="2612D89A"/>
@@ -12651,7 +14773,7 @@
       </w:rPr>
     </w:lvl>
   </w:abstractNum>
-  <w:abstractNum w:abstractNumId="21" w15:restartNumberingAfterBreak="0">
+  <w:abstractNum w:abstractNumId="26" w15:restartNumberingAfterBreak="0">
     <w:nsid w:val="4A3A4DDC"/>
     <w:multiLevelType w:val="hybridMultilevel"/>
     <w:tmpl w:val="89D656C8"/>
@@ -12764,7 +14886,7 @@
       </w:rPr>
     </w:lvl>
   </w:abstractNum>
-  <w:abstractNum w:abstractNumId="22" w15:restartNumberingAfterBreak="0">
+  <w:abstractNum w:abstractNumId="27" w15:restartNumberingAfterBreak="0">
     <w:nsid w:val="4D8E0364"/>
     <w:multiLevelType w:val="hybridMultilevel"/>
     <w:tmpl w:val="7130A090"/>
@@ -12877,7 +14999,185 @@
       </w:rPr>
     </w:lvl>
   </w:abstractNum>
-  <w:abstractNum w:abstractNumId="23" w15:restartNumberingAfterBreak="0">
+  <w:abstractNum w:abstractNumId="28" w15:restartNumberingAfterBreak="0">
+    <w:nsid w:val="4E461F16"/>
+    <w:multiLevelType w:val="hybridMultilevel"/>
+    <w:tmpl w:val="21BED2AA"/>
+    <w:lvl w:ilvl="0" w:tplc="0419000F">
+      <w:start w:val="1"/>
+      <w:numFmt w:val="decimal"/>
+      <w:lvlText w:val="%1."/>
+      <w:lvlJc w:val="left"/>
+      <w:pPr>
+        <w:ind w:left="720" w:hanging="360"/>
+      </w:pPr>
+      <w:rPr>
+        <w:rFonts w:hint="default"/>
+      </w:rPr>
+    </w:lvl>
+    <w:lvl w:ilvl="1" w:tplc="04190019" w:tentative="1">
+      <w:start w:val="1"/>
+      <w:numFmt w:val="lowerLetter"/>
+      <w:lvlText w:val="%2."/>
+      <w:lvlJc w:val="left"/>
+      <w:pPr>
+        <w:ind w:left="1440" w:hanging="360"/>
+      </w:pPr>
+    </w:lvl>
+    <w:lvl w:ilvl="2" w:tplc="0419001B" w:tentative="1">
+      <w:start w:val="1"/>
+      <w:numFmt w:val="lowerRoman"/>
+      <w:lvlText w:val="%3."/>
+      <w:lvlJc w:val="right"/>
+      <w:pPr>
+        <w:ind w:left="2160" w:hanging="180"/>
+      </w:pPr>
+    </w:lvl>
+    <w:lvl w:ilvl="3" w:tplc="0419000F" w:tentative="1">
+      <w:start w:val="1"/>
+      <w:numFmt w:val="decimal"/>
+      <w:lvlText w:val="%4."/>
+      <w:lvlJc w:val="left"/>
+      <w:pPr>
+        <w:ind w:left="2880" w:hanging="360"/>
+      </w:pPr>
+    </w:lvl>
+    <w:lvl w:ilvl="4" w:tplc="04190019" w:tentative="1">
+      <w:start w:val="1"/>
+      <w:numFmt w:val="lowerLetter"/>
+      <w:lvlText w:val="%5."/>
+      <w:lvlJc w:val="left"/>
+      <w:pPr>
+        <w:ind w:left="3600" w:hanging="360"/>
+      </w:pPr>
+    </w:lvl>
+    <w:lvl w:ilvl="5" w:tplc="0419001B" w:tentative="1">
+      <w:start w:val="1"/>
+      <w:numFmt w:val="lowerRoman"/>
+      <w:lvlText w:val="%6."/>
+      <w:lvlJc w:val="right"/>
+      <w:pPr>
+        <w:ind w:left="4320" w:hanging="180"/>
+      </w:pPr>
+    </w:lvl>
+    <w:lvl w:ilvl="6" w:tplc="0419000F" w:tentative="1">
+      <w:start w:val="1"/>
+      <w:numFmt w:val="decimal"/>
+      <w:lvlText w:val="%7."/>
+      <w:lvlJc w:val="left"/>
+      <w:pPr>
+        <w:ind w:left="5040" w:hanging="360"/>
+      </w:pPr>
+    </w:lvl>
+    <w:lvl w:ilvl="7" w:tplc="04190019" w:tentative="1">
+      <w:start w:val="1"/>
+      <w:numFmt w:val="lowerLetter"/>
+      <w:lvlText w:val="%8."/>
+      <w:lvlJc w:val="left"/>
+      <w:pPr>
+        <w:ind w:left="5760" w:hanging="360"/>
+      </w:pPr>
+    </w:lvl>
+    <w:lvl w:ilvl="8" w:tplc="0419001B" w:tentative="1">
+      <w:start w:val="1"/>
+      <w:numFmt w:val="lowerRoman"/>
+      <w:lvlText w:val="%9."/>
+      <w:lvlJc w:val="right"/>
+      <w:pPr>
+        <w:ind w:left="6480" w:hanging="180"/>
+      </w:pPr>
+    </w:lvl>
+  </w:abstractNum>
+  <w:abstractNum w:abstractNumId="29" w15:restartNumberingAfterBreak="0">
+    <w:nsid w:val="506613DE"/>
+    <w:multiLevelType w:val="hybridMultilevel"/>
+    <w:tmpl w:val="0944B878"/>
+    <w:lvl w:ilvl="0" w:tplc="0419000F">
+      <w:start w:val="1"/>
+      <w:numFmt w:val="decimal"/>
+      <w:lvlText w:val="%1."/>
+      <w:lvlJc w:val="left"/>
+      <w:pPr>
+        <w:ind w:left="720" w:hanging="360"/>
+      </w:pPr>
+      <w:rPr>
+        <w:rFonts w:hint="default"/>
+      </w:rPr>
+    </w:lvl>
+    <w:lvl w:ilvl="1" w:tplc="04190019" w:tentative="1">
+      <w:start w:val="1"/>
+      <w:numFmt w:val="lowerLetter"/>
+      <w:lvlText w:val="%2."/>
+      <w:lvlJc w:val="left"/>
+      <w:pPr>
+        <w:ind w:left="1440" w:hanging="360"/>
+      </w:pPr>
+    </w:lvl>
+    <w:lvl w:ilvl="2" w:tplc="0419001B" w:tentative="1">
+      <w:start w:val="1"/>
+      <w:numFmt w:val="lowerRoman"/>
+      <w:lvlText w:val="%3."/>
+      <w:lvlJc w:val="right"/>
+      <w:pPr>
+        <w:ind w:left="2160" w:hanging="180"/>
+      </w:pPr>
+    </w:lvl>
+    <w:lvl w:ilvl="3" w:tplc="0419000F" w:tentative="1">
+      <w:start w:val="1"/>
+      <w:numFmt w:val="decimal"/>
+      <w:lvlText w:val="%4."/>
+      <w:lvlJc w:val="left"/>
+      <w:pPr>
+        <w:ind w:left="2880" w:hanging="360"/>
+      </w:pPr>
+    </w:lvl>
+    <w:lvl w:ilvl="4" w:tplc="04190019" w:tentative="1">
+      <w:start w:val="1"/>
+      <w:numFmt w:val="lowerLetter"/>
+      <w:lvlText w:val="%5."/>
+      <w:lvlJc w:val="left"/>
+      <w:pPr>
+        <w:ind w:left="3600" w:hanging="360"/>
+      </w:pPr>
+    </w:lvl>
+    <w:lvl w:ilvl="5" w:tplc="0419001B" w:tentative="1">
+      <w:start w:val="1"/>
+      <w:numFmt w:val="lowerRoman"/>
+      <w:lvlText w:val="%6."/>
+      <w:lvlJc w:val="right"/>
+      <w:pPr>
+        <w:ind w:left="4320" w:hanging="180"/>
+      </w:pPr>
+    </w:lvl>
+    <w:lvl w:ilvl="6" w:tplc="0419000F" w:tentative="1">
+      <w:start w:val="1"/>
+      <w:numFmt w:val="decimal"/>
+      <w:lvlText w:val="%7."/>
+      <w:lvlJc w:val="left"/>
+      <w:pPr>
+        <w:ind w:left="5040" w:hanging="360"/>
+      </w:pPr>
+    </w:lvl>
+    <w:lvl w:ilvl="7" w:tplc="04190019" w:tentative="1">
+      <w:start w:val="1"/>
+      <w:numFmt w:val="lowerLetter"/>
+      <w:lvlText w:val="%8."/>
+      <w:lvlJc w:val="left"/>
+      <w:pPr>
+        <w:ind w:left="5760" w:hanging="360"/>
+      </w:pPr>
+    </w:lvl>
+    <w:lvl w:ilvl="8" w:tplc="0419001B" w:tentative="1">
+      <w:start w:val="1"/>
+      <w:numFmt w:val="lowerRoman"/>
+      <w:lvlText w:val="%9."/>
+      <w:lvlJc w:val="right"/>
+      <w:pPr>
+        <w:ind w:left="6480" w:hanging="180"/>
+      </w:pPr>
+    </w:lvl>
+  </w:abstractNum>
+  <w:abstractNum w:abstractNumId="30" w15:restartNumberingAfterBreak="0">
     <w:nsid w:val="546C7644"/>
     <w:multiLevelType w:val="hybridMultilevel"/>
     <w:tmpl w:val="9DC4FE98"/>
@@ -12990,7 +15290,7 @@
       </w:rPr>
     </w:lvl>
   </w:abstractNum>
-  <w:abstractNum w:abstractNumId="24" w15:restartNumberingAfterBreak="0">
+  <w:abstractNum w:abstractNumId="31" w15:restartNumberingAfterBreak="0">
     <w:nsid w:val="59500FEE"/>
     <w:multiLevelType w:val="hybridMultilevel"/>
     <w:tmpl w:val="8C7A99A2"/>
@@ -13103,7 +15403,120 @@
       </w:rPr>
     </w:lvl>
   </w:abstractNum>
-  <w:abstractNum w:abstractNumId="25" w15:restartNumberingAfterBreak="0">
+  <w:abstractNum w:abstractNumId="32" w15:restartNumberingAfterBreak="0">
+    <w:nsid w:val="5AED0DE1"/>
+    <w:multiLevelType w:val="hybridMultilevel"/>
+    <w:tmpl w:val="48320052"/>
+    <w:lvl w:ilvl="0" w:tplc="04190003">
+      <w:start w:val="1"/>
+      <w:numFmt w:val="bullet"/>
+      <w:lvlText w:val="o"/>
+      <w:lvlJc w:val="left"/>
+      <w:pPr>
+        <w:ind w:left="720" w:hanging="360"/>
+      </w:pPr>
+      <w:rPr>
+        <w:rFonts w:ascii="Courier New" w:hAnsi="Courier New" w:cs="Courier New" w:hint="default"/>
+      </w:rPr>
+    </w:lvl>
+    <w:lvl w:ilvl="1" w:tplc="04190003" w:tentative="1">
+      <w:start w:val="1"/>
+      <w:numFmt w:val="bullet"/>
+      <w:lvlText w:val="o"/>
+      <w:lvlJc w:val="left"/>
+      <w:pPr>
+        <w:ind w:left="1440" w:hanging="360"/>
+      </w:pPr>
+      <w:rPr>
+        <w:rFonts w:ascii="Courier New" w:hAnsi="Courier New" w:cs="Courier New" w:hint="default"/>
+      </w:rPr>
+    </w:lvl>
+    <w:lvl w:ilvl="2" w:tplc="04190005" w:tentative="1">
+      <w:start w:val="1"/>
+      <w:numFmt w:val="bullet"/>
+      <w:lvlText w:val=""/>
+      <w:lvlJc w:val="left"/>
+      <w:pPr>
+        <w:ind w:left="2160" w:hanging="360"/>
+      </w:pPr>
+      <w:rPr>
+        <w:rFonts w:ascii="Wingdings" w:hAnsi="Wingdings" w:hint="default"/>
+      </w:rPr>
+    </w:lvl>
+    <w:lvl w:ilvl="3" w:tplc="04190001" w:tentative="1">
+      <w:start w:val="1"/>
+      <w:numFmt w:val="bullet"/>
+      <w:lvlText w:val=""/>
+      <w:lvlJc w:val="left"/>
+      <w:pPr>
+        <w:ind w:left="2880" w:hanging="360"/>
+      </w:pPr>
+      <w:rPr>
+        <w:rFonts w:ascii="Symbol" w:hAnsi="Symbol" w:hint="default"/>
+      </w:rPr>
+    </w:lvl>
+    <w:lvl w:ilvl="4" w:tplc="04190003" w:tentative="1">
+      <w:start w:val="1"/>
+      <w:numFmt w:val="bullet"/>
+      <w:lvlText w:val="o"/>
+      <w:lvlJc w:val="left"/>
+      <w:pPr>
+        <w:ind w:left="3600" w:hanging="360"/>
+      </w:pPr>
+      <w:rPr>
+        <w:rFonts w:ascii="Courier New" w:hAnsi="Courier New" w:cs="Courier New" w:hint="default"/>
+      </w:rPr>
+    </w:lvl>
+    <w:lvl w:ilvl="5" w:tplc="04190005" w:tentative="1">
+      <w:start w:val="1"/>
+      <w:numFmt w:val="bullet"/>
+      <w:lvlText w:val=""/>
+      <w:lvlJc w:val="left"/>
+      <w:pPr>
+        <w:ind w:left="4320" w:hanging="360"/>
+      </w:pPr>
+      <w:rPr>
+        <w:rFonts w:ascii="Wingdings" w:hAnsi="Wingdings" w:hint="default"/>
+      </w:rPr>
+    </w:lvl>
+    <w:lvl w:ilvl="6" w:tplc="04190001" w:tentative="1">
+      <w:start w:val="1"/>
+      <w:numFmt w:val="bullet"/>
+      <w:lvlText w:val=""/>
+      <w:lvlJc w:val="left"/>
+      <w:pPr>
+        <w:ind w:left="5040" w:hanging="360"/>
+      </w:pPr>
+      <w:rPr>
+        <w:rFonts w:ascii="Symbol" w:hAnsi="Symbol" w:hint="default"/>
+      </w:rPr>
+    </w:lvl>
+    <w:lvl w:ilvl="7" w:tplc="04190003" w:tentative="1">
+      <w:start w:val="1"/>
+      <w:numFmt w:val="bullet"/>
+      <w:lvlText w:val="o"/>
+      <w:lvlJc w:val="left"/>
+      <w:pPr>
+        <w:ind w:left="5760" w:hanging="360"/>
+      </w:pPr>
+      <w:rPr>
+        <w:rFonts w:ascii="Courier New" w:hAnsi="Courier New" w:cs="Courier New" w:hint="default"/>
+      </w:rPr>
+    </w:lvl>
+    <w:lvl w:ilvl="8" w:tplc="04190005" w:tentative="1">
+      <w:start w:val="1"/>
+      <w:numFmt w:val="bullet"/>
+      <w:lvlText w:val=""/>
+      <w:lvlJc w:val="left"/>
+      <w:pPr>
+        <w:ind w:left="6480" w:hanging="360"/>
+      </w:pPr>
+      <w:rPr>
+        <w:rFonts w:ascii="Wingdings" w:hAnsi="Wingdings" w:hint="default"/>
+      </w:rPr>
+    </w:lvl>
+  </w:abstractNum>
+  <w:abstractNum w:abstractNumId="33" w15:restartNumberingAfterBreak="0">
     <w:nsid w:val="5D6D5C5A"/>
     <w:multiLevelType w:val="hybridMultilevel"/>
     <w:tmpl w:val="6EF2D338"/>
@@ -13216,7 +15629,7 @@
       </w:rPr>
     </w:lvl>
   </w:abstractNum>
-  <w:abstractNum w:abstractNumId="26" w15:restartNumberingAfterBreak="0">
+  <w:abstractNum w:abstractNumId="34" w15:restartNumberingAfterBreak="0">
     <w:nsid w:val="61345F1C"/>
     <w:multiLevelType w:val="hybridMultilevel"/>
     <w:tmpl w:val="1A64F046"/>
@@ -13329,7 +15742,7 @@
       </w:rPr>
     </w:lvl>
   </w:abstractNum>
-  <w:abstractNum w:abstractNumId="27" w15:restartNumberingAfterBreak="0">
+  <w:abstractNum w:abstractNumId="35" w15:restartNumberingAfterBreak="0">
     <w:nsid w:val="61D15A97"/>
     <w:multiLevelType w:val="hybridMultilevel"/>
     <w:tmpl w:val="14A2E350"/>
@@ -13442,7 +15855,7 @@
       </w:rPr>
     </w:lvl>
   </w:abstractNum>
-  <w:abstractNum w:abstractNumId="28" w15:restartNumberingAfterBreak="0">
+  <w:abstractNum w:abstractNumId="36" w15:restartNumberingAfterBreak="0">
     <w:nsid w:val="646A15EC"/>
     <w:multiLevelType w:val="hybridMultilevel"/>
     <w:tmpl w:val="4ECEA306"/>
@@ -13555,7 +15968,7 @@
       </w:rPr>
     </w:lvl>
   </w:abstractNum>
-  <w:abstractNum w:abstractNumId="29" w15:restartNumberingAfterBreak="0">
+  <w:abstractNum w:abstractNumId="37" w15:restartNumberingAfterBreak="0">
     <w:nsid w:val="65E142BE"/>
     <w:multiLevelType w:val="hybridMultilevel"/>
     <w:tmpl w:val="7B865F90"/>
@@ -13668,7 +16081,7 @@
       </w:rPr>
     </w:lvl>
   </w:abstractNum>
-  <w:abstractNum w:abstractNumId="30" w15:restartNumberingAfterBreak="0">
+  <w:abstractNum w:abstractNumId="38" w15:restartNumberingAfterBreak="0">
     <w:nsid w:val="6BFE35FA"/>
     <w:multiLevelType w:val="hybridMultilevel"/>
     <w:tmpl w:val="CFF8F62C"/>
@@ -13781,7 +16194,7 @@
       </w:rPr>
     </w:lvl>
   </w:abstractNum>
-  <w:abstractNum w:abstractNumId="31" w15:restartNumberingAfterBreak="0">
+  <w:abstractNum w:abstractNumId="39" w15:restartNumberingAfterBreak="0">
     <w:nsid w:val="6EA20F3B"/>
     <w:multiLevelType w:val="hybridMultilevel"/>
     <w:tmpl w:val="1736EDC8"/>
@@ -13894,7 +16307,7 @@
       </w:rPr>
     </w:lvl>
   </w:abstractNum>
-  <w:abstractNum w:abstractNumId="32" w15:restartNumberingAfterBreak="0">
+  <w:abstractNum w:abstractNumId="40" w15:restartNumberingAfterBreak="0">
     <w:nsid w:val="71010D1F"/>
     <w:multiLevelType w:val="hybridMultilevel"/>
     <w:tmpl w:val="36165ED8"/>
@@ -14007,7 +16420,7 @@
       </w:rPr>
     </w:lvl>
   </w:abstractNum>
-  <w:abstractNum w:abstractNumId="33" w15:restartNumberingAfterBreak="0">
+  <w:abstractNum w:abstractNumId="41" w15:restartNumberingAfterBreak="0">
     <w:nsid w:val="714F2C06"/>
     <w:multiLevelType w:val="hybridMultilevel"/>
     <w:tmpl w:val="E3B64A1A"/>
@@ -14120,7 +16533,7 @@
       </w:rPr>
     </w:lvl>
   </w:abstractNum>
-  <w:abstractNum w:abstractNumId="34" w15:restartNumberingAfterBreak="0">
+  <w:abstractNum w:abstractNumId="42" w15:restartNumberingAfterBreak="0">
     <w:nsid w:val="71D132C3"/>
     <w:multiLevelType w:val="hybridMultilevel"/>
     <w:tmpl w:val="21E0DE52"/>
@@ -14233,7 +16646,7 @@
       </w:rPr>
     </w:lvl>
   </w:abstractNum>
-  <w:abstractNum w:abstractNumId="35" w15:restartNumberingAfterBreak="0">
+  <w:abstractNum w:abstractNumId="43" w15:restartNumberingAfterBreak="0">
     <w:nsid w:val="726F6787"/>
     <w:multiLevelType w:val="hybridMultilevel"/>
     <w:tmpl w:val="C7B60C7A"/>
@@ -14346,7 +16759,120 @@
       </w:rPr>
     </w:lvl>
   </w:abstractNum>
-  <w:abstractNum w:abstractNumId="36" w15:restartNumberingAfterBreak="0">
+  <w:abstractNum w:abstractNumId="44" w15:restartNumberingAfterBreak="0">
+    <w:nsid w:val="72D77E02"/>
+    <w:multiLevelType w:val="hybridMultilevel"/>
+    <w:tmpl w:val="B8C856AC"/>
+    <w:lvl w:ilvl="0" w:tplc="04190003">
+      <w:start w:val="1"/>
+      <w:numFmt w:val="bullet"/>
+      <w:lvlText w:val="o"/>
+      <w:lvlJc w:val="left"/>
+      <w:pPr>
+        <w:ind w:left="720" w:hanging="360"/>
+      </w:pPr>
+      <w:rPr>
+        <w:rFonts w:ascii="Courier New" w:hAnsi="Courier New" w:cs="Courier New" w:hint="default"/>
+      </w:rPr>
+    </w:lvl>
+    <w:lvl w:ilvl="1" w:tplc="04190003" w:tentative="1">
+      <w:start w:val="1"/>
+      <w:numFmt w:val="bullet"/>
+      <w:lvlText w:val="o"/>
+      <w:lvlJc w:val="left"/>
+      <w:pPr>
+        <w:ind w:left="1440" w:hanging="360"/>
+      </w:pPr>
+      <w:rPr>
+        <w:rFonts w:ascii="Courier New" w:hAnsi="Courier New" w:cs="Courier New" w:hint="default"/>
+      </w:rPr>
+    </w:lvl>
+    <w:lvl w:ilvl="2" w:tplc="04190005" w:tentative="1">
+      <w:start w:val="1"/>
+      <w:numFmt w:val="bullet"/>
+      <w:lvlText w:val=""/>
+      <w:lvlJc w:val="left"/>
+      <w:pPr>
+        <w:ind w:left="2160" w:hanging="360"/>
+      </w:pPr>
+      <w:rPr>
+        <w:rFonts w:ascii="Wingdings" w:hAnsi="Wingdings" w:hint="default"/>
+      </w:rPr>
+    </w:lvl>
+    <w:lvl w:ilvl="3" w:tplc="04190001" w:tentative="1">
+      <w:start w:val="1"/>
+      <w:numFmt w:val="bullet"/>
+      <w:lvlText w:val=""/>
+      <w:lvlJc w:val="left"/>
+      <w:pPr>
+        <w:ind w:left="2880" w:hanging="360"/>
+      </w:pPr>
+      <w:rPr>
+        <w:rFonts w:ascii="Symbol" w:hAnsi="Symbol" w:hint="default"/>
+      </w:rPr>
+    </w:lvl>
+    <w:lvl w:ilvl="4" w:tplc="04190003" w:tentative="1">
+      <w:start w:val="1"/>
+      <w:numFmt w:val="bullet"/>
+      <w:lvlText w:val="o"/>
+      <w:lvlJc w:val="left"/>
+      <w:pPr>
+        <w:ind w:left="3600" w:hanging="360"/>
+      </w:pPr>
+      <w:rPr>
+        <w:rFonts w:ascii="Courier New" w:hAnsi="Courier New" w:cs="Courier New" w:hint="default"/>
+      </w:rPr>
+    </w:lvl>
+    <w:lvl w:ilvl="5" w:tplc="04190005" w:tentative="1">
+      <w:start w:val="1"/>
+      <w:numFmt w:val="bullet"/>
+      <w:lvlText w:val=""/>
+      <w:lvlJc w:val="left"/>
+      <w:pPr>
+        <w:ind w:left="4320" w:hanging="360"/>
+      </w:pPr>
+      <w:rPr>
+        <w:rFonts w:ascii="Wingdings" w:hAnsi="Wingdings" w:hint="default"/>
+      </w:rPr>
+    </w:lvl>
+    <w:lvl w:ilvl="6" w:tplc="04190001" w:tentative="1">
+      <w:start w:val="1"/>
+      <w:numFmt w:val="bullet"/>
+      <w:lvlText w:val=""/>
+      <w:lvlJc w:val="left"/>
+      <w:pPr>
+        <w:ind w:left="5040" w:hanging="360"/>
+      </w:pPr>
+      <w:rPr>
+        <w:rFonts w:ascii="Symbol" w:hAnsi="Symbol" w:hint="default"/>
+      </w:rPr>
+    </w:lvl>
+    <w:lvl w:ilvl="7" w:tplc="04190003" w:tentative="1">
+      <w:start w:val="1"/>
+      <w:numFmt w:val="bullet"/>
+      <w:lvlText w:val="o"/>
+      <w:lvlJc w:val="left"/>
+      <w:pPr>
+        <w:ind w:left="5760" w:hanging="360"/>
+      </w:pPr>
+      <w:rPr>
+        <w:rFonts w:ascii="Courier New" w:hAnsi="Courier New" w:cs="Courier New" w:hint="default"/>
+      </w:rPr>
+    </w:lvl>
+    <w:lvl w:ilvl="8" w:tplc="04190005" w:tentative="1">
+      <w:start w:val="1"/>
+      <w:numFmt w:val="bullet"/>
+      <w:lvlText w:val=""/>
+      <w:lvlJc w:val="left"/>
+      <w:pPr>
+        <w:ind w:left="6480" w:hanging="360"/>
+      </w:pPr>
+      <w:rPr>
+        <w:rFonts w:ascii="Wingdings" w:hAnsi="Wingdings" w:hint="default"/>
+      </w:rPr>
+    </w:lvl>
+  </w:abstractNum>
+  <w:abstractNum w:abstractNumId="45" w15:restartNumberingAfterBreak="0">
     <w:nsid w:val="73677B48"/>
     <w:multiLevelType w:val="hybridMultilevel"/>
     <w:tmpl w:val="7D5A60BA"/>
@@ -14459,7 +16985,120 @@
       </w:rPr>
     </w:lvl>
   </w:abstractNum>
-  <w:abstractNum w:abstractNumId="37" w15:restartNumberingAfterBreak="0">
+  <w:abstractNum w:abstractNumId="46" w15:restartNumberingAfterBreak="0">
+    <w:nsid w:val="75591D5A"/>
+    <w:multiLevelType w:val="hybridMultilevel"/>
+    <w:tmpl w:val="7020F420"/>
+    <w:lvl w:ilvl="0" w:tplc="04190003">
+      <w:start w:val="1"/>
+      <w:numFmt w:val="bullet"/>
+      <w:lvlText w:val="o"/>
+      <w:lvlJc w:val="left"/>
+      <w:pPr>
+        <w:ind w:left="720" w:hanging="360"/>
+      </w:pPr>
+      <w:rPr>
+        <w:rFonts w:ascii="Courier New" w:hAnsi="Courier New" w:cs="Courier New" w:hint="default"/>
+      </w:rPr>
+    </w:lvl>
+    <w:lvl w:ilvl="1" w:tplc="04190003" w:tentative="1">
+      <w:start w:val="1"/>
+      <w:numFmt w:val="bullet"/>
+      <w:lvlText w:val="o"/>
+      <w:lvlJc w:val="left"/>
+      <w:pPr>
+        <w:ind w:left="1440" w:hanging="360"/>
+      </w:pPr>
+      <w:rPr>
+        <w:rFonts w:ascii="Courier New" w:hAnsi="Courier New" w:cs="Courier New" w:hint="default"/>
+      </w:rPr>
+    </w:lvl>
+    <w:lvl w:ilvl="2" w:tplc="04190005" w:tentative="1">
+      <w:start w:val="1"/>
+      <w:numFmt w:val="bullet"/>
+      <w:lvlText w:val=""/>
+      <w:lvlJc w:val="left"/>
+      <w:pPr>
+        <w:ind w:left="2160" w:hanging="360"/>
+      </w:pPr>
+      <w:rPr>
+        <w:rFonts w:ascii="Wingdings" w:hAnsi="Wingdings" w:hint="default"/>
+      </w:rPr>
+    </w:lvl>
+    <w:lvl w:ilvl="3" w:tplc="04190001" w:tentative="1">
+      <w:start w:val="1"/>
+      <w:numFmt w:val="bullet"/>
+      <w:lvlText w:val=""/>
+      <w:lvlJc w:val="left"/>
+      <w:pPr>
+        <w:ind w:left="2880" w:hanging="360"/>
+      </w:pPr>
+      <w:rPr>
+        <w:rFonts w:ascii="Symbol" w:hAnsi="Symbol" w:hint="default"/>
+      </w:rPr>
+    </w:lvl>
+    <w:lvl w:ilvl="4" w:tplc="04190003" w:tentative="1">
+      <w:start w:val="1"/>
+      <w:numFmt w:val="bullet"/>
+      <w:lvlText w:val="o"/>
+      <w:lvlJc w:val="left"/>
+      <w:pPr>
+        <w:ind w:left="3600" w:hanging="360"/>
+      </w:pPr>
+      <w:rPr>
+        <w:rFonts w:ascii="Courier New" w:hAnsi="Courier New" w:cs="Courier New" w:hint="default"/>
+      </w:rPr>
+    </w:lvl>
+    <w:lvl w:ilvl="5" w:tplc="04190005" w:tentative="1">
+      <w:start w:val="1"/>
+      <w:numFmt w:val="bullet"/>
+      <w:lvlText w:val=""/>
+      <w:lvlJc w:val="left"/>
+      <w:pPr>
+        <w:ind w:left="4320" w:hanging="360"/>
+      </w:pPr>
+      <w:rPr>
+        <w:rFonts w:ascii="Wingdings" w:hAnsi="Wingdings" w:hint="default"/>
+      </w:rPr>
+    </w:lvl>
+    <w:lvl w:ilvl="6" w:tplc="04190001" w:tentative="1">
+      <w:start w:val="1"/>
+      <w:numFmt w:val="bullet"/>
+      <w:lvlText w:val=""/>
+      <w:lvlJc w:val="left"/>
+      <w:pPr>
+        <w:ind w:left="5040" w:hanging="360"/>
+      </w:pPr>
+      <w:rPr>
+        <w:rFonts w:ascii="Symbol" w:hAnsi="Symbol" w:hint="default"/>
+      </w:rPr>
+    </w:lvl>
+    <w:lvl w:ilvl="7" w:tplc="04190003" w:tentative="1">
+      <w:start w:val="1"/>
+      <w:numFmt w:val="bullet"/>
+      <w:lvlText w:val="o"/>
+      <w:lvlJc w:val="left"/>
+      <w:pPr>
+        <w:ind w:left="5760" w:hanging="360"/>
+      </w:pPr>
+      <w:rPr>
+        <w:rFonts w:ascii="Courier New" w:hAnsi="Courier New" w:cs="Courier New" w:hint="default"/>
+      </w:rPr>
+    </w:lvl>
+    <w:lvl w:ilvl="8" w:tplc="04190005" w:tentative="1">
+      <w:start w:val="1"/>
+      <w:numFmt w:val="bullet"/>
+      <w:lvlText w:val=""/>
+      <w:lvlJc w:val="left"/>
+      <w:pPr>
+        <w:ind w:left="6480" w:hanging="360"/>
+      </w:pPr>
+      <w:rPr>
+        <w:rFonts w:ascii="Wingdings" w:hAnsi="Wingdings" w:hint="default"/>
+      </w:rPr>
+    </w:lvl>
+  </w:abstractNum>
+  <w:abstractNum w:abstractNumId="47" w15:restartNumberingAfterBreak="0">
     <w:nsid w:val="76F566CB"/>
     <w:multiLevelType w:val="hybridMultilevel"/>
     <w:tmpl w:val="B3509B6E"/>
@@ -14572,7 +17211,209 @@
       </w:rPr>
     </w:lvl>
   </w:abstractNum>
-  <w:abstractNum w:abstractNumId="38" w15:restartNumberingAfterBreak="0">
+  <w:abstractNum w:abstractNumId="48" w15:restartNumberingAfterBreak="0">
+    <w:nsid w:val="77246CDC"/>
+    <w:multiLevelType w:val="hybridMultilevel"/>
+    <w:tmpl w:val="FFCE0FD4"/>
+    <w:lvl w:ilvl="0" w:tplc="04190003">
+      <w:start w:val="1"/>
+      <w:numFmt w:val="bullet"/>
+      <w:lvlText w:val="o"/>
+      <w:lvlJc w:val="left"/>
+      <w:pPr>
+        <w:ind w:left="720" w:hanging="360"/>
+      </w:pPr>
+      <w:rPr>
+        <w:rFonts w:ascii="Courier New" w:hAnsi="Courier New" w:cs="Courier New" w:hint="default"/>
+      </w:rPr>
+    </w:lvl>
+    <w:lvl w:ilvl="1" w:tplc="FFFFFFFF" w:tentative="1">
+      <w:start w:val="1"/>
+      <w:numFmt w:val="bullet"/>
+      <w:lvlText w:val="o"/>
+      <w:lvlJc w:val="left"/>
+      <w:pPr>
+        <w:ind w:left="1440" w:hanging="360"/>
+      </w:pPr>
+      <w:rPr>
+        <w:rFonts w:ascii="Courier New" w:hAnsi="Courier New" w:cs="Courier New" w:hint="default"/>
+      </w:rPr>
+    </w:lvl>
+    <w:lvl w:ilvl="2" w:tplc="FFFFFFFF" w:tentative="1">
+      <w:start w:val="1"/>
+      <w:numFmt w:val="bullet"/>
+      <w:lvlText w:val=""/>
+      <w:lvlJc w:val="left"/>
+      <w:pPr>
+        <w:ind w:left="2160" w:hanging="360"/>
+      </w:pPr>
+      <w:rPr>
+        <w:rFonts w:ascii="Wingdings" w:hAnsi="Wingdings" w:hint="default"/>
+      </w:rPr>
+    </w:lvl>
+    <w:lvl w:ilvl="3" w:tplc="FFFFFFFF" w:tentative="1">
+      <w:start w:val="1"/>
+      <w:numFmt w:val="bullet"/>
+      <w:lvlText w:val=""/>
+      <w:lvlJc w:val="left"/>
+      <w:pPr>
+        <w:ind w:left="2880" w:hanging="360"/>
+      </w:pPr>
+      <w:rPr>
+        <w:rFonts w:ascii="Symbol" w:hAnsi="Symbol" w:hint="default"/>
+      </w:rPr>
+    </w:lvl>
+    <w:lvl w:ilvl="4" w:tplc="FFFFFFFF" w:tentative="1">
+      <w:start w:val="1"/>
+      <w:numFmt w:val="bullet"/>
+      <w:lvlText w:val="o"/>
+      <w:lvlJc w:val="left"/>
+      <w:pPr>
+        <w:ind w:left="3600" w:hanging="360"/>
+      </w:pPr>
+      <w:rPr>
+        <w:rFonts w:ascii="Courier New" w:hAnsi="Courier New" w:cs="Courier New" w:hint="default"/>
+      </w:rPr>
+    </w:lvl>
+    <w:lvl w:ilvl="5" w:tplc="FFFFFFFF" w:tentative="1">
+      <w:start w:val="1"/>
+      <w:numFmt w:val="bullet"/>
+      <w:lvlText w:val=""/>
+      <w:lvlJc w:val="left"/>
+      <w:pPr>
+        <w:ind w:left="4320" w:hanging="360"/>
+      </w:pPr>
+      <w:rPr>
+        <w:rFonts w:ascii="Wingdings" w:hAnsi="Wingdings" w:hint="default"/>
+      </w:rPr>
+    </w:lvl>
+    <w:lvl w:ilvl="6" w:tplc="FFFFFFFF" w:tentative="1">
+      <w:start w:val="1"/>
+      <w:numFmt w:val="bullet"/>
+      <w:lvlText w:val=""/>
+      <w:lvlJc w:val="left"/>
+      <w:pPr>
+        <w:ind w:left="5040" w:hanging="360"/>
+      </w:pPr>
+      <w:rPr>
+        <w:rFonts w:ascii="Symbol" w:hAnsi="Symbol" w:hint="default"/>
+      </w:rPr>
+    </w:lvl>
+    <w:lvl w:ilvl="7" w:tplc="FFFFFFFF" w:tentative="1">
+      <w:start w:val="1"/>
+      <w:numFmt w:val="bullet"/>
+      <w:lvlText w:val="o"/>
+      <w:lvlJc w:val="left"/>
+      <w:pPr>
+        <w:ind w:left="5760" w:hanging="360"/>
+      </w:pPr>
+      <w:rPr>
+        <w:rFonts w:ascii="Courier New" w:hAnsi="Courier New" w:cs="Courier New" w:hint="default"/>
+      </w:rPr>
+    </w:lvl>
+    <w:lvl w:ilvl="8" w:tplc="FFFFFFFF" w:tentative="1">
+      <w:start w:val="1"/>
+      <w:numFmt w:val="bullet"/>
+      <w:lvlText w:val=""/>
+      <w:lvlJc w:val="left"/>
+      <w:pPr>
+        <w:ind w:left="6480" w:hanging="360"/>
+      </w:pPr>
+      <w:rPr>
+        <w:rFonts w:ascii="Wingdings" w:hAnsi="Wingdings" w:hint="default"/>
+      </w:rPr>
+    </w:lvl>
+  </w:abstractNum>
+  <w:abstractNum w:abstractNumId="49" w15:restartNumberingAfterBreak="0">
+    <w:nsid w:val="788E3B9E"/>
+    <w:multiLevelType w:val="hybridMultilevel"/>
+    <w:tmpl w:val="D898FCAE"/>
+    <w:lvl w:ilvl="0" w:tplc="0419000F">
+      <w:start w:val="1"/>
+      <w:numFmt w:val="decimal"/>
+      <w:lvlText w:val="%1."/>
+      <w:lvlJc w:val="left"/>
+      <w:pPr>
+        <w:ind w:left="720" w:hanging="360"/>
+      </w:pPr>
+      <w:rPr>
+        <w:rFonts w:hint="default"/>
+      </w:rPr>
+    </w:lvl>
+    <w:lvl w:ilvl="1" w:tplc="04190019" w:tentative="1">
+      <w:start w:val="1"/>
+      <w:numFmt w:val="lowerLetter"/>
+      <w:lvlText w:val="%2."/>
+      <w:lvlJc w:val="left"/>
+      <w:pPr>
+        <w:ind w:left="1440" w:hanging="360"/>
+      </w:pPr>
+    </w:lvl>
+    <w:lvl w:ilvl="2" w:tplc="0419001B" w:tentative="1">
+      <w:start w:val="1"/>
+      <w:numFmt w:val="lowerRoman"/>
+      <w:lvlText w:val="%3."/>
+      <w:lvlJc w:val="right"/>
+      <w:pPr>
+        <w:ind w:left="2160" w:hanging="180"/>
+      </w:pPr>
+    </w:lvl>
+    <w:lvl w:ilvl="3" w:tplc="0419000F" w:tentative="1">
+      <w:start w:val="1"/>
+      <w:numFmt w:val="decimal"/>
+      <w:lvlText w:val="%4."/>
+      <w:lvlJc w:val="left"/>
+      <w:pPr>
+        <w:ind w:left="2880" w:hanging="360"/>
+      </w:pPr>
+    </w:lvl>
+    <w:lvl w:ilvl="4" w:tplc="04190019" w:tentative="1">
+      <w:start w:val="1"/>
+      <w:numFmt w:val="lowerLetter"/>
+      <w:lvlText w:val="%5."/>
+      <w:lvlJc w:val="left"/>
+      <w:pPr>
+        <w:ind w:left="3600" w:hanging="360"/>
+      </w:pPr>
+    </w:lvl>
+    <w:lvl w:ilvl="5" w:tplc="0419001B" w:tentative="1">
+      <w:start w:val="1"/>
+      <w:numFmt w:val="lowerRoman"/>
+      <w:lvlText w:val="%6."/>
+      <w:lvlJc w:val="right"/>
+      <w:pPr>
+        <w:ind w:left="4320" w:hanging="180"/>
+      </w:pPr>
+    </w:lvl>
+    <w:lvl w:ilvl="6" w:tplc="0419000F" w:tentative="1">
+      <w:start w:val="1"/>
+      <w:numFmt w:val="decimal"/>
+      <w:lvlText w:val="%7."/>
+      <w:lvlJc w:val="left"/>
+      <w:pPr>
+        <w:ind w:left="5040" w:hanging="360"/>
+      </w:pPr>
+    </w:lvl>
+    <w:lvl w:ilvl="7" w:tplc="04190019" w:tentative="1">
+      <w:start w:val="1"/>
+      <w:numFmt w:val="lowerLetter"/>
+      <w:lvlText w:val="%8."/>
+      <w:lvlJc w:val="left"/>
+      <w:pPr>
+        <w:ind w:left="5760" w:hanging="360"/>
+      </w:pPr>
+    </w:lvl>
+    <w:lvl w:ilvl="8" w:tplc="0419001B" w:tentative="1">
+      <w:start w:val="1"/>
+      <w:numFmt w:val="lowerRoman"/>
+      <w:lvlText w:val="%9."/>
+      <w:lvlJc w:val="right"/>
+      <w:pPr>
+        <w:ind w:left="6480" w:hanging="180"/>
+      </w:pPr>
+    </w:lvl>
+  </w:abstractNum>
+  <w:abstractNum w:abstractNumId="50" w15:restartNumberingAfterBreak="0">
     <w:nsid w:val="7E8468BF"/>
     <w:multiLevelType w:val="hybridMultilevel"/>
     <w:tmpl w:val="8856C3A4"/>
@@ -14685,122 +17526,250 @@
       </w:rPr>
     </w:lvl>
   </w:abstractNum>
+  <w:abstractNum w:abstractNumId="51" w15:restartNumberingAfterBreak="0">
+    <w:nsid w:val="7FA53ACF"/>
+    <w:multiLevelType w:val="hybridMultilevel"/>
+    <w:tmpl w:val="43F0AFC6"/>
+    <w:lvl w:ilvl="0" w:tplc="0419000F">
+      <w:start w:val="1"/>
+      <w:numFmt w:val="decimal"/>
+      <w:lvlText w:val="%1."/>
+      <w:lvlJc w:val="left"/>
+      <w:pPr>
+        <w:ind w:left="720" w:hanging="360"/>
+      </w:pPr>
+      <w:rPr>
+        <w:rFonts w:hint="default"/>
+      </w:rPr>
+    </w:lvl>
+    <w:lvl w:ilvl="1" w:tplc="04190019" w:tentative="1">
+      <w:start w:val="1"/>
+      <w:numFmt w:val="lowerLetter"/>
+      <w:lvlText w:val="%2."/>
+      <w:lvlJc w:val="left"/>
+      <w:pPr>
+        <w:ind w:left="1440" w:hanging="360"/>
+      </w:pPr>
+    </w:lvl>
+    <w:lvl w:ilvl="2" w:tplc="0419001B" w:tentative="1">
+      <w:start w:val="1"/>
+      <w:numFmt w:val="lowerRoman"/>
+      <w:lvlText w:val="%3."/>
+      <w:lvlJc w:val="right"/>
+      <w:pPr>
+        <w:ind w:left="2160" w:hanging="180"/>
+      </w:pPr>
+    </w:lvl>
+    <w:lvl w:ilvl="3" w:tplc="0419000F" w:tentative="1">
+      <w:start w:val="1"/>
+      <w:numFmt w:val="decimal"/>
+      <w:lvlText w:val="%4."/>
+      <w:lvlJc w:val="left"/>
+      <w:pPr>
+        <w:ind w:left="2880" w:hanging="360"/>
+      </w:pPr>
+    </w:lvl>
+    <w:lvl w:ilvl="4" w:tplc="04190019" w:tentative="1">
+      <w:start w:val="1"/>
+      <w:numFmt w:val="lowerLetter"/>
+      <w:lvlText w:val="%5."/>
+      <w:lvlJc w:val="left"/>
+      <w:pPr>
+        <w:ind w:left="3600" w:hanging="360"/>
+      </w:pPr>
+    </w:lvl>
+    <w:lvl w:ilvl="5" w:tplc="0419001B" w:tentative="1">
+      <w:start w:val="1"/>
+      <w:numFmt w:val="lowerRoman"/>
+      <w:lvlText w:val="%6."/>
+      <w:lvlJc w:val="right"/>
+      <w:pPr>
+        <w:ind w:left="4320" w:hanging="180"/>
+      </w:pPr>
+    </w:lvl>
+    <w:lvl w:ilvl="6" w:tplc="0419000F" w:tentative="1">
+      <w:start w:val="1"/>
+      <w:numFmt w:val="decimal"/>
+      <w:lvlText w:val="%7."/>
+      <w:lvlJc w:val="left"/>
+      <w:pPr>
+        <w:ind w:left="5040" w:hanging="360"/>
+      </w:pPr>
+    </w:lvl>
+    <w:lvl w:ilvl="7" w:tplc="04190019" w:tentative="1">
+      <w:start w:val="1"/>
+      <w:numFmt w:val="lowerLetter"/>
+      <w:lvlText w:val="%8."/>
+      <w:lvlJc w:val="left"/>
+      <w:pPr>
+        <w:ind w:left="5760" w:hanging="360"/>
+      </w:pPr>
+    </w:lvl>
+    <w:lvl w:ilvl="8" w:tplc="0419001B" w:tentative="1">
+      <w:start w:val="1"/>
+      <w:numFmt w:val="lowerRoman"/>
+      <w:lvlText w:val="%9."/>
+      <w:lvlJc w:val="right"/>
+      <w:pPr>
+        <w:ind w:left="6480" w:hanging="180"/>
+      </w:pPr>
+    </w:lvl>
+  </w:abstractNum>
   <w:num w:numId="1" w16cid:durableId="1340893428">
-    <w:abstractNumId w:val="19"/>
+    <w:abstractNumId w:val="24"/>
   </w:num>
   <w:num w:numId="2" w16cid:durableId="421608752">
-    <w:abstractNumId w:val="30"/>
+    <w:abstractNumId w:val="38"/>
   </w:num>
   <w:num w:numId="3" w16cid:durableId="1595282796">
-    <w:abstractNumId w:val="25"/>
+    <w:abstractNumId w:val="33"/>
   </w:num>
   <w:num w:numId="4" w16cid:durableId="1287275393">
-    <w:abstractNumId w:val="10"/>
+    <w:abstractNumId w:val="12"/>
   </w:num>
   <w:num w:numId="5" w16cid:durableId="1624077405">
-    <w:abstractNumId w:val="27"/>
+    <w:abstractNumId w:val="35"/>
   </w:num>
   <w:num w:numId="6" w16cid:durableId="1713726611">
-    <w:abstractNumId w:val="23"/>
+    <w:abstractNumId w:val="30"/>
   </w:num>
   <w:num w:numId="7" w16cid:durableId="1300964125">
     <w:abstractNumId w:val="0"/>
   </w:num>
   <w:num w:numId="8" w16cid:durableId="1975401105">
-    <w:abstractNumId w:val="26"/>
+    <w:abstractNumId w:val="34"/>
   </w:num>
   <w:num w:numId="9" w16cid:durableId="1327513134">
-    <w:abstractNumId w:val="34"/>
+    <w:abstractNumId w:val="42"/>
   </w:num>
   <w:num w:numId="10" w16cid:durableId="1694259667">
+    <w:abstractNumId w:val="18"/>
+  </w:num>
+  <w:num w:numId="11" w16cid:durableId="484665926">
+    <w:abstractNumId w:val="19"/>
+  </w:num>
+  <w:num w:numId="12" w16cid:durableId="741298702">
     <w:abstractNumId w:val="15"/>
   </w:num>
-  <w:num w:numId="11" w16cid:durableId="484665926">
-    <w:abstractNumId w:val="16"/>
-  </w:num>
-  <w:num w:numId="12" w16cid:durableId="741298702">
-    <w:abstractNumId w:val="12"/>
-  </w:num>
   <w:num w:numId="13" w16cid:durableId="1008365382">
-    <w:abstractNumId w:val="5"/>
+    <w:abstractNumId w:val="7"/>
   </w:num>
   <w:num w:numId="14" w16cid:durableId="269899171">
-    <w:abstractNumId w:val="3"/>
+    <w:abstractNumId w:val="4"/>
   </w:num>
   <w:num w:numId="15" w16cid:durableId="287009388">
-    <w:abstractNumId w:val="35"/>
+    <w:abstractNumId w:val="43"/>
   </w:num>
   <w:num w:numId="16" w16cid:durableId="952590794">
+    <w:abstractNumId w:val="20"/>
+  </w:num>
+  <w:num w:numId="17" w16cid:durableId="303899460">
+    <w:abstractNumId w:val="10"/>
+  </w:num>
+  <w:num w:numId="18" w16cid:durableId="581259033">
+    <w:abstractNumId w:val="13"/>
+  </w:num>
+  <w:num w:numId="19" w16cid:durableId="423187432">
+    <w:abstractNumId w:val="6"/>
+  </w:num>
+  <w:num w:numId="20" w16cid:durableId="1849366319">
+    <w:abstractNumId w:val="9"/>
+  </w:num>
+  <w:num w:numId="21" w16cid:durableId="461463897">
+    <w:abstractNumId w:val="31"/>
+  </w:num>
+  <w:num w:numId="22" w16cid:durableId="794370098">
+    <w:abstractNumId w:val="25"/>
+  </w:num>
+  <w:num w:numId="23" w16cid:durableId="1458985455">
+    <w:abstractNumId w:val="45"/>
+  </w:num>
+  <w:num w:numId="24" w16cid:durableId="162163433">
+    <w:abstractNumId w:val="21"/>
+  </w:num>
+  <w:num w:numId="25" w16cid:durableId="1752777007">
+    <w:abstractNumId w:val="36"/>
+  </w:num>
+  <w:num w:numId="26" w16cid:durableId="192545055">
+    <w:abstractNumId w:val="8"/>
+  </w:num>
+  <w:num w:numId="27" w16cid:durableId="120154475">
+    <w:abstractNumId w:val="47"/>
+  </w:num>
+  <w:num w:numId="28" w16cid:durableId="2002156193">
     <w:abstractNumId w:val="17"/>
   </w:num>
-  <w:num w:numId="17" w16cid:durableId="303899460">
-    <w:abstractNumId w:val="8"/>
-  </w:num>
-  <w:num w:numId="18" w16cid:durableId="581259033">
-    <w:abstractNumId w:val="11"/>
-  </w:num>
-  <w:num w:numId="19" w16cid:durableId="423187432">
-    <w:abstractNumId w:val="4"/>
-  </w:num>
-  <w:num w:numId="20" w16cid:durableId="1849366319">
-    <w:abstractNumId w:val="7"/>
-  </w:num>
-  <w:num w:numId="21" w16cid:durableId="461463897">
-    <w:abstractNumId w:val="24"/>
-  </w:num>
-  <w:num w:numId="22" w16cid:durableId="794370098">
-    <w:abstractNumId w:val="20"/>
-  </w:num>
-  <w:num w:numId="23" w16cid:durableId="1458985455">
-    <w:abstractNumId w:val="36"/>
-  </w:num>
-  <w:num w:numId="24" w16cid:durableId="162163433">
-    <w:abstractNumId w:val="18"/>
-  </w:num>
-  <w:num w:numId="25" w16cid:durableId="1752777007">
-    <w:abstractNumId w:val="28"/>
-  </w:num>
-  <w:num w:numId="26" w16cid:durableId="192545055">
-    <w:abstractNumId w:val="6"/>
-  </w:num>
-  <w:num w:numId="27" w16cid:durableId="120154475">
+  <w:num w:numId="29" w16cid:durableId="230778555">
     <w:abstractNumId w:val="37"/>
-  </w:num>
-  <w:num w:numId="28" w16cid:durableId="2002156193">
-    <w:abstractNumId w:val="14"/>
-  </w:num>
-  <w:num w:numId="29" w16cid:durableId="230778555">
-    <w:abstractNumId w:val="29"/>
   </w:num>
   <w:num w:numId="30" w16cid:durableId="182943051">
     <w:abstractNumId w:val="1"/>
   </w:num>
   <w:num w:numId="31" w16cid:durableId="2012217841">
+    <w:abstractNumId w:val="3"/>
+  </w:num>
+  <w:num w:numId="32" w16cid:durableId="803233297">
+    <w:abstractNumId w:val="41"/>
+  </w:num>
+  <w:num w:numId="33" w16cid:durableId="867370957">
+    <w:abstractNumId w:val="39"/>
+  </w:num>
+  <w:num w:numId="34" w16cid:durableId="106462127">
+    <w:abstractNumId w:val="11"/>
+  </w:num>
+  <w:num w:numId="35" w16cid:durableId="664207540">
+    <w:abstractNumId w:val="16"/>
+  </w:num>
+  <w:num w:numId="36" w16cid:durableId="837693978">
+    <w:abstractNumId w:val="27"/>
+  </w:num>
+  <w:num w:numId="37" w16cid:durableId="1217164946">
+    <w:abstractNumId w:val="50"/>
+  </w:num>
+  <w:num w:numId="38" w16cid:durableId="2031027559">
+    <w:abstractNumId w:val="40"/>
+  </w:num>
+  <w:num w:numId="39" w16cid:durableId="482434682">
+    <w:abstractNumId w:val="26"/>
+  </w:num>
+  <w:num w:numId="40" w16cid:durableId="150104104">
     <w:abstractNumId w:val="2"/>
   </w:num>
-  <w:num w:numId="32" w16cid:durableId="803233297">
-    <w:abstractNumId w:val="33"/>
+  <w:num w:numId="41" w16cid:durableId="796148100">
+    <w:abstractNumId w:val="51"/>
   </w:num>
-  <w:num w:numId="33" w16cid:durableId="867370957">
-    <w:abstractNumId w:val="31"/>
+  <w:num w:numId="42" w16cid:durableId="254746859">
+    <w:abstractNumId w:val="48"/>
   </w:num>
-  <w:num w:numId="34" w16cid:durableId="106462127">
-    <w:abstractNumId w:val="9"/>
+  <w:num w:numId="43" w16cid:durableId="1877310677">
+    <w:abstractNumId w:val="32"/>
   </w:num>
-  <w:num w:numId="35" w16cid:durableId="664207540">
-    <w:abstractNumId w:val="13"/>
-  </w:num>
-  <w:num w:numId="36" w16cid:durableId="837693978">
+  <w:num w:numId="44" w16cid:durableId="1947884116">
     <w:abstractNumId w:val="22"/>
   </w:num>
-  <w:num w:numId="37" w16cid:durableId="1217164946">
-    <w:abstractNumId w:val="38"/>
+  <w:num w:numId="45" w16cid:durableId="451098755">
+    <w:abstractNumId w:val="14"/>
   </w:num>
-  <w:num w:numId="38" w16cid:durableId="2031027559">
-    <w:abstractNumId w:val="32"/>
+  <w:num w:numId="46" w16cid:durableId="1421636895">
+    <w:abstractNumId w:val="29"/>
   </w:num>
-  <w:num w:numId="39" w16cid:durableId="482434682">
-    <w:abstractNumId w:val="21"/>
+  <w:num w:numId="47" w16cid:durableId="117260091">
+    <w:abstractNumId w:val="44"/>
+  </w:num>
+  <w:num w:numId="48" w16cid:durableId="1039163358">
+    <w:abstractNumId w:val="28"/>
+  </w:num>
+  <w:num w:numId="49" w16cid:durableId="972637436">
+    <w:abstractNumId w:val="23"/>
+  </w:num>
+  <w:num w:numId="50" w16cid:durableId="1296334480">
+    <w:abstractNumId w:val="5"/>
+  </w:num>
+  <w:num w:numId="51" w16cid:durableId="663974932">
+    <w:abstractNumId w:val="46"/>
+  </w:num>
+  <w:num w:numId="52" w16cid:durableId="1155413014">
+    <w:abstractNumId w:val="49"/>
   </w:num>
   <w:numIdMacAtCleanup w:val="30"/>
 </w:numbering>

</xml_diff>

<commit_message>
documentation update + fixed order seed data + new migration
</commit_message>
<xml_diff>
--- a/docs/ProjectDoc.docx
+++ b/docs/ProjectDoc.docx
@@ -1,6 +1,6 @@
 
 <file path=word/document.xml><?xml version="1.0" encoding="utf-8"?>
-<w:document xmlns:wpc="http://schemas.microsoft.com/office/word/2010/wordprocessingCanvas" xmlns:cx="http://schemas.microsoft.com/office/drawing/2014/chartex" xmlns:cx1="http://schemas.microsoft.com/office/drawing/2015/9/8/chartex" xmlns:cx2="http://schemas.microsoft.com/office/drawing/2015/10/21/chartex" xmlns:cx3="http://schemas.microsoft.com/office/drawing/2016/5/9/chartex" xmlns:cx4="http://schemas.microsoft.com/office/drawing/2016/5/10/chartex" xmlns:cx5="http://schemas.microsoft.com/office/drawing/2016/5/11/chartex" xmlns:cx6="http://schemas.microsoft.com/office/drawing/2016/5/12/chartex" xmlns:cx7="http://schemas.microsoft.com/office/drawing/2016/5/13/chartex" xmlns:cx8="http://schemas.microsoft.com/office/drawing/2016/5/14/chartex" xmlns:mc="http://schemas.openxmlformats.org/markup-compatibility/2006" xmlns:aink="http://schemas.microsoft.com/office/drawing/2016/ink" xmlns:am3d="http://schemas.microsoft.com/office/drawing/2017/model3d" xmlns:o="urn:schemas-microsoft-com:office:office" xmlns:r="http://schemas.openxmlformats.org/officeDocument/2006/relationships" xmlns:m="http://schemas.openxmlformats.org/officeDocument/2006/math" xmlns:v="urn:schemas-microsoft-com:vml" xmlns:wp14="http://schemas.microsoft.com/office/word/2010/wordprocessingDrawing" xmlns:wp="http://schemas.openxmlformats.org/drawingml/2006/wordprocessingDrawing" xmlns:w10="urn:schemas-microsoft-com:office:word" xmlns:w="http://schemas.openxmlformats.org/wordprocessingml/2006/main" xmlns:w14="http://schemas.microsoft.com/office/word/2010/wordml" xmlns:w15="http://schemas.microsoft.com/office/word/2012/wordml" xmlns:w16cex="http://schemas.microsoft.com/office/word/2018/wordml/cex" xmlns:w16cid="http://schemas.microsoft.com/office/word/2016/wordml/cid" xmlns:w16="http://schemas.microsoft.com/office/word/2018/wordml" xmlns:w16sdtdh="http://schemas.microsoft.com/office/word/2020/wordml/sdtdatahash" xmlns:w16se="http://schemas.microsoft.com/office/word/2015/wordml/symex" xmlns:wpg="http://schemas.microsoft.com/office/word/2010/wordprocessingGroup" xmlns:wpi="http://schemas.microsoft.com/office/word/2010/wordprocessingInk" xmlns:wne="http://schemas.microsoft.com/office/word/2006/wordml" xmlns:wps="http://schemas.microsoft.com/office/word/2010/wordprocessingShape" mc:Ignorable="w14 w15 w16se w16cid w16 w16cex w16sdtdh wp14">
+<w:document xmlns:wpc="http://schemas.microsoft.com/office/word/2010/wordprocessingCanvas" xmlns:cx="http://schemas.microsoft.com/office/drawing/2014/chartex" xmlns:cx1="http://schemas.microsoft.com/office/drawing/2015/9/8/chartex" xmlns:cx2="http://schemas.microsoft.com/office/drawing/2015/10/21/chartex" xmlns:cx3="http://schemas.microsoft.com/office/drawing/2016/5/9/chartex" xmlns:cx4="http://schemas.microsoft.com/office/drawing/2016/5/10/chartex" xmlns:cx5="http://schemas.microsoft.com/office/drawing/2016/5/11/chartex" xmlns:cx6="http://schemas.microsoft.com/office/drawing/2016/5/12/chartex" xmlns:cx7="http://schemas.microsoft.com/office/drawing/2016/5/13/chartex" xmlns:cx8="http://schemas.microsoft.com/office/drawing/2016/5/14/chartex" xmlns:mc="http://schemas.openxmlformats.org/markup-compatibility/2006" xmlns:aink="http://schemas.microsoft.com/office/drawing/2016/ink" xmlns:am3d="http://schemas.microsoft.com/office/drawing/2017/model3d" xmlns:o="urn:schemas-microsoft-com:office:office" xmlns:oel="http://schemas.microsoft.com/office/2019/extlst" xmlns:r="http://schemas.openxmlformats.org/officeDocument/2006/relationships" xmlns:m="http://schemas.openxmlformats.org/officeDocument/2006/math" xmlns:v="urn:schemas-microsoft-com:vml" xmlns:wp14="http://schemas.microsoft.com/office/word/2010/wordprocessingDrawing" xmlns:wp="http://schemas.openxmlformats.org/drawingml/2006/wordprocessingDrawing" xmlns:w10="urn:schemas-microsoft-com:office:word" xmlns:w="http://schemas.openxmlformats.org/wordprocessingml/2006/main" xmlns:w14="http://schemas.microsoft.com/office/word/2010/wordml" xmlns:w15="http://schemas.microsoft.com/office/word/2012/wordml" xmlns:w16cex="http://schemas.microsoft.com/office/word/2018/wordml/cex" xmlns:w16cid="http://schemas.microsoft.com/office/word/2016/wordml/cid" xmlns:w16="http://schemas.microsoft.com/office/word/2018/wordml" xmlns:w16du="http://schemas.microsoft.com/office/word/2023/wordml/word16du" xmlns:w16sdtdh="http://schemas.microsoft.com/office/word/2020/wordml/sdtdatahash" xmlns:w16sdtfl="http://schemas.microsoft.com/office/word/2024/wordml/sdtformatlock" xmlns:w16se="http://schemas.microsoft.com/office/word/2015/wordml/symex" xmlns:wpg="http://schemas.microsoft.com/office/word/2010/wordprocessingGroup" xmlns:wpi="http://schemas.microsoft.com/office/word/2010/wordprocessingInk" xmlns:wne="http://schemas.microsoft.com/office/word/2006/wordml" xmlns:wps="http://schemas.microsoft.com/office/word/2010/wordprocessingShape" mc:Ignorable="w14 w15 w16se w16cid w16 w16cex w16sdtdh w16sdtfl w16du wp14">
   <w:body>
     <w:p>
       <w:pPr>
@@ -6634,11 +6634,25 @@
     </w:p>
     <w:p/>
     <w:p>
-      <w:pPr>
-        <w:rPr>
-          <w:lang w:val="en-US"/>
-        </w:rPr>
-      </w:pPr>
+      <w:r>
+        <w:t>PATCH /api/orders/{orderId}/complete — завершение заказа клиентом</w:t>
+      </w:r>
+      <w:r>
+        <w:t xml:space="preserve"> (берется айди клиента из заказа и сравнивается с айди в токене</w:t>
+      </w:r>
+      <w:r>
+        <w:t xml:space="preserve"> и там же проверяется роль пользователя</w:t>
+      </w:r>
+      <w:r>
+        <w:t>, чтобы она соответствовала клиенту</w:t>
+      </w:r>
+      <w:r>
+        <w:t>)</w:t>
+      </w:r>
+    </w:p>
+    <w:p/>
+    <w:p/>
+    <w:p>
       <w:r>
         <w:rPr>
           <w:lang w:val="en-US"/>
@@ -6646,13 +6660,7 @@
         <w:t>DTO</w:t>
       </w:r>
     </w:p>
-    <w:p>
-      <w:pPr>
-        <w:rPr>
-          <w:lang w:val="en-US"/>
-        </w:rPr>
-      </w:pPr>
-    </w:p>
+    <w:p/>
     <w:p>
       <w:pPr>
         <w:rPr>
@@ -6913,6 +6921,7 @@
         <w:rPr>
           <w:lang w:val="en-US"/>
         </w:rPr>
+        <w:lastRenderedPageBreak/>
         <w:t>categoryName</w:t>
       </w:r>
     </w:p>
@@ -8501,7 +8510,6 @@
         <w:rPr>
           <w:lang w:val="en-US" w:eastAsia="en-GB"/>
         </w:rPr>
-        <w:lastRenderedPageBreak/>
         <w:t>description</w:t>
       </w:r>
     </w:p>
@@ -9504,19 +9512,25 @@
         <w:rPr>
           <w:lang w:val="en-US" w:eastAsia="en-GB"/>
         </w:rPr>
+        <w:t xml:space="preserve"> — </w:t>
+      </w:r>
+      <w:r>
+        <w:rPr>
+          <w:lang w:eastAsia="en-GB"/>
+        </w:rPr>
+        <w:t>принятие</w:t>
+      </w:r>
+      <w:r>
+        <w:rPr>
+          <w:lang w:val="en-US" w:eastAsia="en-GB"/>
+        </w:rPr>
         <w:t xml:space="preserve"> </w:t>
       </w:r>
       <w:r>
         <w:rPr>
-          <w:lang w:val="en-US" w:eastAsia="en-GB"/>
-        </w:rPr>
-        <w:t xml:space="preserve">— </w:t>
-      </w:r>
-      <w:r>
-        <w:rPr>
-          <w:lang w:eastAsia="en-GB"/>
-        </w:rPr>
-        <w:t>принятие</w:t>
+          <w:lang w:eastAsia="en-GB"/>
+        </w:rPr>
+        <w:t>отклика</w:t>
       </w:r>
       <w:r>
         <w:rPr>
@@ -9528,6 +9542,37 @@
         <w:rPr>
           <w:lang w:eastAsia="en-GB"/>
         </w:rPr>
+        <w:t>клиентом</w:t>
+      </w:r>
+    </w:p>
+    <w:p>
+      <w:pPr>
+        <w:rPr>
+          <w:lang w:val="en-US" w:eastAsia="en-GB"/>
+        </w:rPr>
+      </w:pPr>
+      <w:r>
+        <w:rPr>
+          <w:lang w:val="en-US" w:eastAsia="en-GB"/>
+        </w:rPr>
+        <w:t xml:space="preserve">POST /api/responses/{responseId}/cancel — </w:t>
+      </w:r>
+      <w:r>
+        <w:rPr>
+          <w:lang w:eastAsia="en-GB"/>
+        </w:rPr>
+        <w:t>отмена</w:t>
+      </w:r>
+      <w:r>
+        <w:rPr>
+          <w:lang w:val="en-US" w:eastAsia="en-GB"/>
+        </w:rPr>
+        <w:t xml:space="preserve"> </w:t>
+      </w:r>
+      <w:r>
+        <w:rPr>
+          <w:lang w:eastAsia="en-GB"/>
+        </w:rPr>
         <w:t>отклика</w:t>
       </w:r>
       <w:r>
@@ -9540,49 +9585,6 @@
         <w:rPr>
           <w:lang w:eastAsia="en-GB"/>
         </w:rPr>
-        <w:t>клиентом</w:t>
-      </w:r>
-    </w:p>
-    <w:p>
-      <w:pPr>
-        <w:rPr>
-          <w:lang w:val="en-US" w:eastAsia="en-GB"/>
-        </w:rPr>
-      </w:pPr>
-      <w:r>
-        <w:rPr>
-          <w:lang w:val="en-US" w:eastAsia="en-GB"/>
-        </w:rPr>
-        <w:t xml:space="preserve">POST /api/responses/{responseId}/cancel — </w:t>
-      </w:r>
-      <w:r>
-        <w:rPr>
-          <w:lang w:eastAsia="en-GB"/>
-        </w:rPr>
-        <w:t>отмена</w:t>
-      </w:r>
-      <w:r>
-        <w:rPr>
-          <w:lang w:val="en-US" w:eastAsia="en-GB"/>
-        </w:rPr>
-        <w:t xml:space="preserve"> </w:t>
-      </w:r>
-      <w:r>
-        <w:rPr>
-          <w:lang w:eastAsia="en-GB"/>
-        </w:rPr>
-        <w:t>отклика</w:t>
-      </w:r>
-      <w:r>
-        <w:rPr>
-          <w:lang w:val="en-US" w:eastAsia="en-GB"/>
-        </w:rPr>
-        <w:t xml:space="preserve"> </w:t>
-      </w:r>
-      <w:r>
-        <w:rPr>
-          <w:lang w:eastAsia="en-GB"/>
-        </w:rPr>
         <w:t>мастером</w:t>
       </w:r>
     </w:p>
@@ -10038,7 +10040,6 @@
         <w:rPr>
           <w:lang w:val="en-US" w:eastAsia="en-GB"/>
         </w:rPr>
-        <w:lastRenderedPageBreak/>
         <w:t>status</w:t>
       </w:r>
     </w:p>
@@ -10994,7 +10995,7 @@
 </file>
 
 <file path=word/numbering.xml><?xml version="1.0" encoding="utf-8"?>
-<w:numbering xmlns:wpc="http://schemas.microsoft.com/office/word/2010/wordprocessingCanvas" xmlns:cx="http://schemas.microsoft.com/office/drawing/2014/chartex" xmlns:cx1="http://schemas.microsoft.com/office/drawing/2015/9/8/chartex" xmlns:cx2="http://schemas.microsoft.com/office/drawing/2015/10/21/chartex" xmlns:cx3="http://schemas.microsoft.com/office/drawing/2016/5/9/chartex" xmlns:cx4="http://schemas.microsoft.com/office/drawing/2016/5/10/chartex" xmlns:cx5="http://schemas.microsoft.com/office/drawing/2016/5/11/chartex" xmlns:cx6="http://schemas.microsoft.com/office/drawing/2016/5/12/chartex" xmlns:cx7="http://schemas.microsoft.com/office/drawing/2016/5/13/chartex" xmlns:cx8="http://schemas.microsoft.com/office/drawing/2016/5/14/chartex" xmlns:mc="http://schemas.openxmlformats.org/markup-compatibility/2006" xmlns:aink="http://schemas.microsoft.com/office/drawing/2016/ink" xmlns:am3d="http://schemas.microsoft.com/office/drawing/2017/model3d" xmlns:o="urn:schemas-microsoft-com:office:office" xmlns:r="http://schemas.openxmlformats.org/officeDocument/2006/relationships" xmlns:m="http://schemas.openxmlformats.org/officeDocument/2006/math" xmlns:v="urn:schemas-microsoft-com:vml" xmlns:wp14="http://schemas.microsoft.com/office/word/2010/wordprocessingDrawing" xmlns:wp="http://schemas.openxmlformats.org/drawingml/2006/wordprocessingDrawing" xmlns:w10="urn:schemas-microsoft-com:office:word" xmlns:w="http://schemas.openxmlformats.org/wordprocessingml/2006/main" xmlns:w14="http://schemas.microsoft.com/office/word/2010/wordml" xmlns:w15="http://schemas.microsoft.com/office/word/2012/wordml" xmlns:w16cex="http://schemas.microsoft.com/office/word/2018/wordml/cex" xmlns:w16cid="http://schemas.microsoft.com/office/word/2016/wordml/cid" xmlns:w16="http://schemas.microsoft.com/office/word/2018/wordml" xmlns:w16sdtdh="http://schemas.microsoft.com/office/word/2020/wordml/sdtdatahash" xmlns:w16se="http://schemas.microsoft.com/office/word/2015/wordml/symex" xmlns:wpg="http://schemas.microsoft.com/office/word/2010/wordprocessingGroup" xmlns:wpi="http://schemas.microsoft.com/office/word/2010/wordprocessingInk" xmlns:wne="http://schemas.microsoft.com/office/word/2006/wordml" xmlns:wps="http://schemas.microsoft.com/office/word/2010/wordprocessingShape" mc:Ignorable="w14 w15 w16se w16cid w16 w16cex w16sdtdh wp14">
+<w:numbering xmlns:wpc="http://schemas.microsoft.com/office/word/2010/wordprocessingCanvas" xmlns:cx="http://schemas.microsoft.com/office/drawing/2014/chartex" xmlns:cx1="http://schemas.microsoft.com/office/drawing/2015/9/8/chartex" xmlns:cx2="http://schemas.microsoft.com/office/drawing/2015/10/21/chartex" xmlns:cx3="http://schemas.microsoft.com/office/drawing/2016/5/9/chartex" xmlns:cx4="http://schemas.microsoft.com/office/drawing/2016/5/10/chartex" xmlns:cx5="http://schemas.microsoft.com/office/drawing/2016/5/11/chartex" xmlns:cx6="http://schemas.microsoft.com/office/drawing/2016/5/12/chartex" xmlns:cx7="http://schemas.microsoft.com/office/drawing/2016/5/13/chartex" xmlns:cx8="http://schemas.microsoft.com/office/drawing/2016/5/14/chartex" xmlns:mc="http://schemas.openxmlformats.org/markup-compatibility/2006" xmlns:aink="http://schemas.microsoft.com/office/drawing/2016/ink" xmlns:am3d="http://schemas.microsoft.com/office/drawing/2017/model3d" xmlns:o="urn:schemas-microsoft-com:office:office" xmlns:oel="http://schemas.microsoft.com/office/2019/extlst" xmlns:r="http://schemas.openxmlformats.org/officeDocument/2006/relationships" xmlns:m="http://schemas.openxmlformats.org/officeDocument/2006/math" xmlns:v="urn:schemas-microsoft-com:vml" xmlns:wp14="http://schemas.microsoft.com/office/word/2010/wordprocessingDrawing" xmlns:wp="http://schemas.openxmlformats.org/drawingml/2006/wordprocessingDrawing" xmlns:w10="urn:schemas-microsoft-com:office:word" xmlns:w="http://schemas.openxmlformats.org/wordprocessingml/2006/main" xmlns:w14="http://schemas.microsoft.com/office/word/2010/wordml" xmlns:w15="http://schemas.microsoft.com/office/word/2012/wordml" xmlns:w16cex="http://schemas.microsoft.com/office/word/2018/wordml/cex" xmlns:w16cid="http://schemas.microsoft.com/office/word/2016/wordml/cid" xmlns:w16="http://schemas.microsoft.com/office/word/2018/wordml" xmlns:w16du="http://schemas.microsoft.com/office/word/2023/wordml/word16du" xmlns:w16sdtdh="http://schemas.microsoft.com/office/word/2020/wordml/sdtdatahash" xmlns:w16sdtfl="http://schemas.microsoft.com/office/word/2024/wordml/sdtformatlock" xmlns:w16se="http://schemas.microsoft.com/office/word/2015/wordml/symex" xmlns:wpg="http://schemas.microsoft.com/office/word/2010/wordprocessingGroup" xmlns:wpi="http://schemas.microsoft.com/office/word/2010/wordprocessingInk" xmlns:wne="http://schemas.microsoft.com/office/word/2006/wordml" xmlns:wps="http://schemas.microsoft.com/office/word/2010/wordprocessingShape" mc:Ignorable="w14 w15 w16se w16cid w16 w16cex w16sdtdh w16sdtfl w16du wp14">
   <w:abstractNum w:abstractNumId="0" w15:restartNumberingAfterBreak="0">
     <w:nsid w:val="003B1325"/>
     <w:multiLevelType w:val="hybridMultilevel"/>
@@ -15827,133 +15828,133 @@
       </w:rPr>
     </w:lvl>
   </w:abstractNum>
-  <w:num w:numId="1">
+  <w:num w:numId="1" w16cid:durableId="1149245036">
     <w:abstractNumId w:val="20"/>
   </w:num>
-  <w:num w:numId="2">
+  <w:num w:numId="2" w16cid:durableId="1069380166">
     <w:abstractNumId w:val="32"/>
   </w:num>
-  <w:num w:numId="3">
+  <w:num w:numId="3" w16cid:durableId="1556504257">
     <w:abstractNumId w:val="27"/>
   </w:num>
-  <w:num w:numId="4">
+  <w:num w:numId="4" w16cid:durableId="536741122">
     <w:abstractNumId w:val="9"/>
   </w:num>
-  <w:num w:numId="5">
+  <w:num w:numId="5" w16cid:durableId="674573229">
     <w:abstractNumId w:val="29"/>
   </w:num>
-  <w:num w:numId="6">
+  <w:num w:numId="6" w16cid:durableId="250629259">
     <w:abstractNumId w:val="24"/>
   </w:num>
-  <w:num w:numId="7">
+  <w:num w:numId="7" w16cid:durableId="3746152">
     <w:abstractNumId w:val="0"/>
   </w:num>
-  <w:num w:numId="8">
+  <w:num w:numId="8" w16cid:durableId="1293360851">
     <w:abstractNumId w:val="28"/>
   </w:num>
-  <w:num w:numId="9">
+  <w:num w:numId="9" w16cid:durableId="606160508">
     <w:abstractNumId w:val="36"/>
   </w:num>
-  <w:num w:numId="10">
+  <w:num w:numId="10" w16cid:durableId="206797666">
     <w:abstractNumId w:val="15"/>
   </w:num>
-  <w:num w:numId="11">
+  <w:num w:numId="11" w16cid:durableId="1477646647">
     <w:abstractNumId w:val="16"/>
   </w:num>
-  <w:num w:numId="12">
+  <w:num w:numId="12" w16cid:durableId="583957546">
     <w:abstractNumId w:val="12"/>
   </w:num>
-  <w:num w:numId="13">
+  <w:num w:numId="13" w16cid:durableId="856895347">
     <w:abstractNumId w:val="4"/>
   </w:num>
-  <w:num w:numId="14">
+  <w:num w:numId="14" w16cid:durableId="187959438">
     <w:abstractNumId w:val="2"/>
   </w:num>
-  <w:num w:numId="15">
+  <w:num w:numId="15" w16cid:durableId="571768503">
     <w:abstractNumId w:val="37"/>
   </w:num>
-  <w:num w:numId="16">
+  <w:num w:numId="16" w16cid:durableId="1769740422">
     <w:abstractNumId w:val="17"/>
   </w:num>
-  <w:num w:numId="17">
+  <w:num w:numId="17" w16cid:durableId="2054571575">
     <w:abstractNumId w:val="7"/>
   </w:num>
-  <w:num w:numId="18">
+  <w:num w:numId="18" w16cid:durableId="287931365">
     <w:abstractNumId w:val="10"/>
   </w:num>
-  <w:num w:numId="19">
+  <w:num w:numId="19" w16cid:durableId="2052804559">
     <w:abstractNumId w:val="3"/>
   </w:num>
-  <w:num w:numId="20">
+  <w:num w:numId="20" w16cid:durableId="135757033">
     <w:abstractNumId w:val="6"/>
   </w:num>
-  <w:num w:numId="21">
+  <w:num w:numId="21" w16cid:durableId="1147629526">
     <w:abstractNumId w:val="25"/>
   </w:num>
-  <w:num w:numId="22">
+  <w:num w:numId="22" w16cid:durableId="1721785993">
     <w:abstractNumId w:val="21"/>
   </w:num>
-  <w:num w:numId="23">
+  <w:num w:numId="23" w16cid:durableId="1193835177">
     <w:abstractNumId w:val="39"/>
   </w:num>
-  <w:num w:numId="24">
+  <w:num w:numId="24" w16cid:durableId="61032092">
     <w:abstractNumId w:val="18"/>
   </w:num>
-  <w:num w:numId="25">
+  <w:num w:numId="25" w16cid:durableId="844826513">
     <w:abstractNumId w:val="30"/>
   </w:num>
-  <w:num w:numId="26">
+  <w:num w:numId="26" w16cid:durableId="702874288">
     <w:abstractNumId w:val="5"/>
   </w:num>
-  <w:num w:numId="27">
+  <w:num w:numId="27" w16cid:durableId="849222817">
     <w:abstractNumId w:val="41"/>
   </w:num>
-  <w:num w:numId="28">
+  <w:num w:numId="28" w16cid:durableId="2028017740">
     <w:abstractNumId w:val="14"/>
   </w:num>
-  <w:num w:numId="29">
+  <w:num w:numId="29" w16cid:durableId="1731881896">
     <w:abstractNumId w:val="31"/>
   </w:num>
-  <w:num w:numId="30">
+  <w:num w:numId="30" w16cid:durableId="1713726070">
     <w:abstractNumId w:val="1"/>
   </w:num>
-  <w:num w:numId="31">
+  <w:num w:numId="31" w16cid:durableId="1863400324">
     <w:abstractNumId w:val="35"/>
   </w:num>
-  <w:num w:numId="32">
+  <w:num w:numId="32" w16cid:durableId="1451127149">
     <w:abstractNumId w:val="33"/>
   </w:num>
-  <w:num w:numId="33">
+  <w:num w:numId="33" w16cid:durableId="1753434617">
     <w:abstractNumId w:val="8"/>
   </w:num>
-  <w:num w:numId="34">
+  <w:num w:numId="34" w16cid:durableId="1326319269">
     <w:abstractNumId w:val="13"/>
   </w:num>
-  <w:num w:numId="35">
+  <w:num w:numId="35" w16cid:durableId="1714888635">
     <w:abstractNumId w:val="23"/>
   </w:num>
-  <w:num w:numId="36">
+  <w:num w:numId="36" w16cid:durableId="443574104">
     <w:abstractNumId w:val="34"/>
   </w:num>
-  <w:num w:numId="37">
+  <w:num w:numId="37" w16cid:durableId="830606218">
     <w:abstractNumId w:val="22"/>
   </w:num>
-  <w:num w:numId="38">
+  <w:num w:numId="38" w16cid:durableId="870149209">
     <w:abstractNumId w:val="42"/>
   </w:num>
-  <w:num w:numId="39">
+  <w:num w:numId="39" w16cid:durableId="8917970">
     <w:abstractNumId w:val="26"/>
   </w:num>
-  <w:num w:numId="40">
+  <w:num w:numId="40" w16cid:durableId="1440759888">
     <w:abstractNumId w:val="11"/>
   </w:num>
-  <w:num w:numId="41">
+  <w:num w:numId="41" w16cid:durableId="1522624453">
     <w:abstractNumId w:val="38"/>
   </w:num>
-  <w:num w:numId="42">
+  <w:num w:numId="42" w16cid:durableId="1973441820">
     <w:abstractNumId w:val="19"/>
   </w:num>
-  <w:num w:numId="43">
+  <w:num w:numId="43" w16cid:durableId="1240407185">
     <w:abstractNumId w:val="40"/>
   </w:num>
   <w:numIdMacAtCleanup w:val="43"/>
@@ -15961,7 +15962,7 @@
 </file>
 
 <file path=word/styles.xml><?xml version="1.0" encoding="utf-8"?>
-<w:styles xmlns:mc="http://schemas.openxmlformats.org/markup-compatibility/2006" xmlns:r="http://schemas.openxmlformats.org/officeDocument/2006/relationships" xmlns:w="http://schemas.openxmlformats.org/wordprocessingml/2006/main" xmlns:w14="http://schemas.microsoft.com/office/word/2010/wordml" xmlns:w15="http://schemas.microsoft.com/office/word/2012/wordml" xmlns:w16cex="http://schemas.microsoft.com/office/word/2018/wordml/cex" xmlns:w16cid="http://schemas.microsoft.com/office/word/2016/wordml/cid" xmlns:w16="http://schemas.microsoft.com/office/word/2018/wordml" xmlns:w16sdtdh="http://schemas.microsoft.com/office/word/2020/wordml/sdtdatahash" xmlns:w16se="http://schemas.microsoft.com/office/word/2015/wordml/symex" mc:Ignorable="w14 w15 w16se w16cid w16 w16cex w16sdtdh">
+<w:styles xmlns:mc="http://schemas.openxmlformats.org/markup-compatibility/2006" xmlns:r="http://schemas.openxmlformats.org/officeDocument/2006/relationships" xmlns:w="http://schemas.openxmlformats.org/wordprocessingml/2006/main" xmlns:w14="http://schemas.microsoft.com/office/word/2010/wordml" xmlns:w15="http://schemas.microsoft.com/office/word/2012/wordml" xmlns:w16cex="http://schemas.microsoft.com/office/word/2018/wordml/cex" xmlns:w16cid="http://schemas.microsoft.com/office/word/2016/wordml/cid" xmlns:w16="http://schemas.microsoft.com/office/word/2018/wordml" xmlns:w16du="http://schemas.microsoft.com/office/word/2023/wordml/word16du" xmlns:w16sdtdh="http://schemas.microsoft.com/office/word/2020/wordml/sdtdatahash" xmlns:w16sdtfl="http://schemas.microsoft.com/office/word/2024/wordml/sdtformatlock" xmlns:w16se="http://schemas.microsoft.com/office/word/2015/wordml/symex" mc:Ignorable="w14 w15 w16se w16cid w16 w16cex w16sdtdh w16sdtfl w16du">
   <w:docDefaults>
     <w:rPrDefault>
       <w:rPr>

</xml_diff>

<commit_message>
Trigger functions update in docs
</commit_message>
<xml_diff>
--- a/docs/ProjectDoc.docx
+++ b/docs/ProjectDoc.docx
@@ -1519,6 +1519,7 @@
         <w:rPr>
           <w:i/>
           <w:iCs/>
+          <w:color w:val="EE0000"/>
         </w:rPr>
       </w:pPr>
     </w:p>
@@ -1527,12 +1528,14 @@
         <w:rPr>
           <w:i/>
           <w:iCs/>
+          <w:color w:val="EE0000"/>
         </w:rPr>
       </w:pPr>
       <w:r>
         <w:rPr>
           <w:i/>
           <w:iCs/>
+          <w:color w:val="EE0000"/>
         </w:rPr>
         <w:t>Триггер – система должна проверять роль пользователя при совершении дейсвтий доступных определенной роли</w:t>
       </w:r>
@@ -2132,6 +2135,7 @@
           <w:rFonts w:eastAsia="Times New Roman" w:cs="Times New Roman"/>
           <w:i/>
           <w:iCs/>
+          <w:color w:val="70AD47" w:themeColor="accent6"/>
           <w:lang w:eastAsia="en-GB"/>
         </w:rPr>
       </w:pPr>
@@ -2140,6 +2144,7 @@
           <w:rFonts w:eastAsia="Times New Roman" w:cs="Times New Roman"/>
           <w:i/>
           <w:iCs/>
+          <w:color w:val="70AD47" w:themeColor="accent6"/>
           <w:lang w:eastAsia="en-GB"/>
         </w:rPr>
         <w:t>Триггер - Система должна инициировать создание заказа на основе принятого отклика</w:t>
@@ -2151,6 +2156,7 @@
           <w:rFonts w:eastAsia="Times New Roman" w:cs="Times New Roman"/>
           <w:i/>
           <w:iCs/>
+          <w:color w:val="70AD47" w:themeColor="accent6"/>
           <w:lang w:eastAsia="en-GB"/>
         </w:rPr>
       </w:pPr>
@@ -2160,6 +2166,7 @@
         <w:rPr>
           <w:i/>
           <w:iCs/>
+          <w:color w:val="70AD47" w:themeColor="accent6"/>
         </w:rPr>
       </w:pPr>
       <w:r>
@@ -2167,6 +2174,7 @@
           <w:rFonts w:eastAsia="Times New Roman" w:cs="Times New Roman"/>
           <w:i/>
           <w:iCs/>
+          <w:color w:val="70AD47" w:themeColor="accent6"/>
           <w:lang w:eastAsia="en-GB"/>
         </w:rPr>
         <w:t xml:space="preserve">Триггер - </w:t>
@@ -2175,6 +2183,7 @@
         <w:rPr>
           <w:i/>
           <w:iCs/>
+          <w:color w:val="70AD47" w:themeColor="accent6"/>
         </w:rPr>
         <w:t xml:space="preserve">При выборе одного отклика на заявку, все остальные отклики должны получить статус </w:t>
       </w:r>
@@ -2182,6 +2191,7 @@
         <w:rPr>
           <w:i/>
           <w:iCs/>
+          <w:color w:val="70AD47" w:themeColor="accent6"/>
           <w:lang w:val="en-GB"/>
         </w:rPr>
         <w:t>rejected</w:t>
@@ -2723,6 +2733,7 @@
           <w:rFonts w:ascii="Andale Mono" w:hAnsi="Andale Mono"/>
           <w:i/>
           <w:iCs/>
+          <w:color w:val="EE0000"/>
         </w:rPr>
       </w:pPr>
       <w:r>
@@ -2731,6 +2742,7 @@
           <w:rFonts w:ascii="Andale Mono" w:hAnsi="Andale Mono"/>
           <w:i/>
           <w:iCs/>
+          <w:color w:val="EE0000"/>
         </w:rPr>
         <w:t>Триггер</w:t>
       </w:r>
@@ -2740,11 +2752,13 @@
         <w:pStyle w:val="NormalWeb"/>
         <w:rPr>
           <w:rFonts w:ascii="Andale Mono" w:hAnsi="Andale Mono"/>
+          <w:color w:val="EE0000"/>
         </w:rPr>
       </w:pPr>
       <w:r>
         <w:rPr>
           <w:rFonts w:ascii="Andale Mono" w:hAnsi="Andale Mono"/>
+          <w:color w:val="EE0000"/>
         </w:rPr>
         <w:t>Система должна автоматически проверять возможность создания отклика только для активной заявки.</w:t>
       </w:r>
@@ -2756,6 +2770,7 @@
           <w:rFonts w:ascii="Andale Mono" w:hAnsi="Andale Mono"/>
           <w:i/>
           <w:iCs/>
+          <w:color w:val="70AD47" w:themeColor="accent6"/>
         </w:rPr>
       </w:pPr>
       <w:r>
@@ -2764,6 +2779,7 @@
           <w:rFonts w:ascii="Andale Mono" w:hAnsi="Andale Mono"/>
           <w:i/>
           <w:iCs/>
+          <w:color w:val="70AD47" w:themeColor="accent6"/>
         </w:rPr>
         <w:t>Триггер</w:t>
       </w:r>
@@ -2773,11 +2789,13 @@
         <w:pStyle w:val="NormalWeb"/>
         <w:rPr>
           <w:rFonts w:ascii="Andale Mono" w:hAnsi="Andale Mono"/>
+          <w:color w:val="70AD47" w:themeColor="accent6"/>
         </w:rPr>
       </w:pPr>
       <w:r>
         <w:rPr>
           <w:rFonts w:ascii="Andale Mono" w:hAnsi="Andale Mono"/>
+          <w:color w:val="70AD47" w:themeColor="accent6"/>
         </w:rPr>
         <w:t>Система должна автоматически закрывать заявку после создания заказа</w:t>
       </w:r>
@@ -2847,6 +2865,7 @@
           <w:rFonts w:ascii="Andale Mono" w:hAnsi="Andale Mono"/>
           <w:i/>
           <w:iCs/>
+          <w:color w:val="70AD47" w:themeColor="accent6"/>
         </w:rPr>
       </w:pPr>
       <w:r>
@@ -2855,6 +2874,7 @@
           <w:rFonts w:ascii="Andale Mono" w:hAnsi="Andale Mono"/>
           <w:i/>
           <w:iCs/>
+          <w:color w:val="70AD47" w:themeColor="accent6"/>
         </w:rPr>
         <w:t>Триггер</w:t>
       </w:r>
@@ -2864,11 +2884,13 @@
         <w:pStyle w:val="NormalWeb"/>
         <w:rPr>
           <w:rFonts w:ascii="Andale Mono" w:hAnsi="Andale Mono"/>
+          <w:color w:val="70AD47" w:themeColor="accent6"/>
         </w:rPr>
       </w:pPr>
       <w:r>
         <w:rPr>
           <w:rFonts w:ascii="Andale Mono" w:hAnsi="Andale Mono"/>
+          <w:color w:val="70AD47" w:themeColor="accent6"/>
         </w:rPr>
         <w:t>Система должна автоматически устанавливать дату завершения заказа при переводе его в статус завершённого</w:t>
       </w:r>
@@ -2907,15 +2929,103 @@
     </w:p>
     <w:p>
       <w:pPr>
-        <w:rPr>
-          <w:lang w:eastAsia="en-GB"/>
-        </w:rPr>
-      </w:pPr>
-    </w:p>
-    <w:p>
-      <w:pPr>
-        <w:rPr>
-          <w:lang w:val="en-US" w:eastAsia="en-GB"/>
+        <w:pStyle w:val="NormalWeb"/>
+        <w:rPr>
+          <w:rFonts w:ascii="Andale Mono" w:hAnsi="Andale Mono"/>
+          <w:b/>
+          <w:bCs/>
+          <w:i/>
+          <w:iCs/>
+          <w:color w:val="70AD47" w:themeColor="accent6"/>
+        </w:rPr>
+      </w:pPr>
+      <w:r>
+        <w:rPr>
+          <w:rFonts w:ascii="Andale Mono" w:hAnsi="Andale Mono"/>
+          <w:b/>
+          <w:bCs/>
+          <w:i/>
+          <w:iCs/>
+          <w:color w:val="70AD47" w:themeColor="accent6"/>
+        </w:rPr>
+        <w:t>Триггер</w:t>
+      </w:r>
+    </w:p>
+    <w:p>
+      <w:pPr>
+        <w:pStyle w:val="NormalWeb"/>
+        <w:rPr>
+          <w:rFonts w:ascii="Andale Mono" w:hAnsi="Andale Mono"/>
+          <w:color w:val="70AD47" w:themeColor="accent6"/>
+        </w:rPr>
+      </w:pPr>
+      <w:r>
+        <w:rPr>
+          <w:rFonts w:ascii="Andale Mono" w:hAnsi="Andale Mono"/>
+          <w:color w:val="70AD47" w:themeColor="accent6"/>
+          <w:lang w:val="en-RU"/>
+        </w:rPr>
+        <w:t>Система должна запрещать создание второго отзыва для одного и того же заказа</w:t>
+      </w:r>
+      <w:r>
+        <w:rPr>
+          <w:rFonts w:ascii="Andale Mono" w:hAnsi="Andale Mono"/>
+          <w:color w:val="70AD47" w:themeColor="accent6"/>
+        </w:rPr>
+        <w:t xml:space="preserve"> через проверку в бд</w:t>
+      </w:r>
+    </w:p>
+    <w:p>
+      <w:pPr>
+        <w:pStyle w:val="NormalWeb"/>
+        <w:rPr>
+          <w:rFonts w:ascii="Andale Mono" w:hAnsi="Andale Mono"/>
+          <w:b/>
+          <w:bCs/>
+          <w:i/>
+          <w:iCs/>
+          <w:color w:val="70AD47" w:themeColor="accent6"/>
+        </w:rPr>
+      </w:pPr>
+      <w:r>
+        <w:rPr>
+          <w:rFonts w:ascii="Andale Mono" w:hAnsi="Andale Mono"/>
+          <w:b/>
+          <w:bCs/>
+          <w:i/>
+          <w:iCs/>
+          <w:color w:val="70AD47" w:themeColor="accent6"/>
+        </w:rPr>
+        <w:t>Триггер</w:t>
+      </w:r>
+    </w:p>
+    <w:p>
+      <w:pPr>
+        <w:rPr>
+          <w:color w:val="70AD47" w:themeColor="accent6"/>
+          <w:lang w:eastAsia="en-GB"/>
+        </w:rPr>
+      </w:pPr>
+      <w:r>
+        <w:rPr>
+          <w:color w:val="70AD47" w:themeColor="accent6"/>
+          <w:lang w:eastAsia="en-GB"/>
+        </w:rPr>
+        <w:t>Система должна запрещать создание отзыва для заказа, который не находится в статусе completed</w:t>
+      </w:r>
+    </w:p>
+    <w:p>
+      <w:pPr>
+        <w:rPr>
+          <w:color w:val="70AD47" w:themeColor="accent6"/>
+          <w:lang w:eastAsia="en-GB"/>
+        </w:rPr>
+      </w:pPr>
+    </w:p>
+    <w:p>
+      <w:pPr>
+        <w:rPr>
+          <w:lang w:eastAsia="en-GB"/>
         </w:rPr>
       </w:pPr>
       <w:r>
@@ -3202,6 +3312,7 @@
         <w:rPr>
           <w:lang w:eastAsia="en-GB"/>
         </w:rPr>
+        <w:lastRenderedPageBreak/>
         <w:t>Мастер выбирает заявку и указывает предлагаемую цену и комментарий.</w:t>
       </w:r>
     </w:p>
@@ -3293,7 +3404,6 @@
         <w:rPr>
           <w:lang w:eastAsia="en-GB"/>
         </w:rPr>
-        <w:lastRenderedPageBreak/>
         <w:t>Клиент открывает свою заявку и просматривает отклики мастеров.</w:t>
       </w:r>
     </w:p>
@@ -6651,7 +6761,69 @@
       </w:r>
     </w:p>
     <w:p/>
+    <w:p>
+      <w:pPr>
+        <w:rPr>
+          <w:lang w:val="en-US"/>
+        </w:rPr>
+      </w:pPr>
+      <w:r>
+        <w:rPr>
+          <w:lang w:val="en-US"/>
+        </w:rPr>
+        <w:t>PATCH</w:t>
+      </w:r>
+      <w:r>
+        <w:t xml:space="preserve"> /</w:t>
+      </w:r>
+      <w:r>
+        <w:rPr>
+          <w:lang w:val="en-US"/>
+        </w:rPr>
+        <w:t>api</w:t>
+      </w:r>
+      <w:r>
+        <w:t>/</w:t>
+      </w:r>
+      <w:r>
+        <w:rPr>
+          <w:lang w:val="en-US"/>
+        </w:rPr>
+        <w:t>orders</w:t>
+      </w:r>
+      <w:r>
+        <w:t>/{</w:t>
+      </w:r>
+      <w:r>
+        <w:rPr>
+          <w:lang w:val="en-US"/>
+        </w:rPr>
+        <w:t>orderId</w:t>
+      </w:r>
+      <w:r>
+        <w:t>}/</w:t>
+      </w:r>
+      <w:r>
+        <w:rPr>
+          <w:lang w:val="en-US"/>
+        </w:rPr>
+        <w:t>cancelled</w:t>
+      </w:r>
+      <w:r>
+        <w:t xml:space="preserve"> – </w:t>
+      </w:r>
+      <w:r>
+        <w:t xml:space="preserve">отмена заказа в одностороннем порядке. Может быть сделана как </w:t>
+      </w:r>
+      <w:r>
+        <w:rPr>
+          <w:lang w:val="en-US"/>
+        </w:rPr>
+        <w:t>`</w:t>
+      </w:r>
+    </w:p>
     <w:p/>
+    <w:p/>
     <w:p>
       <w:r>
         <w:rPr>
@@ -6867,6 +7039,7 @@
         <w:rPr>
           <w:lang w:val="en-US"/>
         </w:rPr>
+        <w:lastRenderedPageBreak/>
         <w:t>requestAddress</w:t>
       </w:r>
     </w:p>
@@ -6921,7 +7094,6 @@
         <w:rPr>
           <w:lang w:val="en-US"/>
         </w:rPr>
-        <w:lastRenderedPageBreak/>
         <w:t>categoryName</w:t>
       </w:r>
     </w:p>
@@ -7657,6 +7829,7 @@
         <w:rPr>
           <w:lang w:val="en-US" w:eastAsia="en-GB"/>
         </w:rPr>
+        <w:lastRenderedPageBreak/>
         <w:t>GET</w:t>
       </w:r>
       <w:r>
@@ -8403,6 +8576,7 @@
         <w:rPr>
           <w:lang w:eastAsia="en-GB"/>
         </w:rPr>
+        <w:lastRenderedPageBreak/>
         <w:t>Список /api/users/me/requests нужен клиенту для просмотра своих заявок.</w:t>
       </w:r>
     </w:p>
@@ -9185,6 +9359,7 @@
         <w:rPr>
           <w:lang w:val="en-US" w:eastAsia="en-GB"/>
         </w:rPr>
+        <w:lastRenderedPageBreak/>
         <w:t>createdAt</w:t>
       </w:r>
     </w:p>
@@ -9876,6 +10051,7 @@
         <w:rPr>
           <w:lang w:val="en-US" w:eastAsia="en-GB"/>
         </w:rPr>
+        <w:lastRenderedPageBreak/>
         <w:t>masterLastName</w:t>
       </w:r>
     </w:p>

</xml_diff>

<commit_message>
Master Profile service + DTO done
</commit_message>
<xml_diff>
--- a/docs/ProjectDoc.docx
+++ b/docs/ProjectDoc.docx
@@ -1,6 +1,6 @@
 
 <file path=word/document.xml><?xml version="1.0" encoding="utf-8"?>
-<w:document xmlns:wpc="http://schemas.microsoft.com/office/word/2010/wordprocessingCanvas" xmlns:cx="http://schemas.microsoft.com/office/drawing/2014/chartex" xmlns:cx1="http://schemas.microsoft.com/office/drawing/2015/9/8/chartex" xmlns:cx2="http://schemas.microsoft.com/office/drawing/2015/10/21/chartex" xmlns:cx3="http://schemas.microsoft.com/office/drawing/2016/5/9/chartex" xmlns:cx4="http://schemas.microsoft.com/office/drawing/2016/5/10/chartex" xmlns:cx5="http://schemas.microsoft.com/office/drawing/2016/5/11/chartex" xmlns:cx6="http://schemas.microsoft.com/office/drawing/2016/5/12/chartex" xmlns:cx7="http://schemas.microsoft.com/office/drawing/2016/5/13/chartex" xmlns:cx8="http://schemas.microsoft.com/office/drawing/2016/5/14/chartex" xmlns:mc="http://schemas.openxmlformats.org/markup-compatibility/2006" xmlns:aink="http://schemas.microsoft.com/office/drawing/2016/ink" xmlns:am3d="http://schemas.microsoft.com/office/drawing/2017/model3d" xmlns:o="urn:schemas-microsoft-com:office:office" xmlns:oel="http://schemas.microsoft.com/office/2019/extlst" xmlns:r="http://schemas.openxmlformats.org/officeDocument/2006/relationships" xmlns:m="http://schemas.openxmlformats.org/officeDocument/2006/math" xmlns:v="urn:schemas-microsoft-com:vml" xmlns:wp14="http://schemas.microsoft.com/office/word/2010/wordprocessingDrawing" xmlns:wp="http://schemas.openxmlformats.org/drawingml/2006/wordprocessingDrawing" xmlns:w10="urn:schemas-microsoft-com:office:word" xmlns:w="http://schemas.openxmlformats.org/wordprocessingml/2006/main" xmlns:w14="http://schemas.microsoft.com/office/word/2010/wordml" xmlns:w15="http://schemas.microsoft.com/office/word/2012/wordml" xmlns:w16cex="http://schemas.microsoft.com/office/word/2018/wordml/cex" xmlns:w16cid="http://schemas.microsoft.com/office/word/2016/wordml/cid" xmlns:w16="http://schemas.microsoft.com/office/word/2018/wordml" xmlns:w16du="http://schemas.microsoft.com/office/word/2023/wordml/word16du" xmlns:w16sdtdh="http://schemas.microsoft.com/office/word/2020/wordml/sdtdatahash" xmlns:w16sdtfl="http://schemas.microsoft.com/office/word/2024/wordml/sdtformatlock" xmlns:w16se="http://schemas.microsoft.com/office/word/2015/wordml/symex" xmlns:wpg="http://schemas.microsoft.com/office/word/2010/wordprocessingGroup" xmlns:wpi="http://schemas.microsoft.com/office/word/2010/wordprocessingInk" xmlns:wne="http://schemas.microsoft.com/office/word/2006/wordml" xmlns:wps="http://schemas.microsoft.com/office/word/2010/wordprocessingShape" mc:Ignorable="w14 w15 w16se w16cid w16 w16cex w16sdtdh w16sdtfl w16du wp14">
+<w:document xmlns:wpc="http://schemas.microsoft.com/office/word/2010/wordprocessingCanvas" xmlns:cx="http://schemas.microsoft.com/office/drawing/2014/chartex" xmlns:cx1="http://schemas.microsoft.com/office/drawing/2015/9/8/chartex" xmlns:cx2="http://schemas.microsoft.com/office/drawing/2015/10/21/chartex" xmlns:cx3="http://schemas.microsoft.com/office/drawing/2016/5/9/chartex" xmlns:cx4="http://schemas.microsoft.com/office/drawing/2016/5/10/chartex" xmlns:cx5="http://schemas.microsoft.com/office/drawing/2016/5/11/chartex" xmlns:cx6="http://schemas.microsoft.com/office/drawing/2016/5/12/chartex" xmlns:cx7="http://schemas.microsoft.com/office/drawing/2016/5/13/chartex" xmlns:cx8="http://schemas.microsoft.com/office/drawing/2016/5/14/chartex" xmlns:mc="http://schemas.openxmlformats.org/markup-compatibility/2006" xmlns:aink="http://schemas.microsoft.com/office/drawing/2016/ink" xmlns:am3d="http://schemas.microsoft.com/office/drawing/2017/model3d" xmlns:o="urn:schemas-microsoft-com:office:office" xmlns:r="http://schemas.openxmlformats.org/officeDocument/2006/relationships" xmlns:m="http://schemas.openxmlformats.org/officeDocument/2006/math" xmlns:v="urn:schemas-microsoft-com:vml" xmlns:wp14="http://schemas.microsoft.com/office/word/2010/wordprocessingDrawing" xmlns:wp="http://schemas.openxmlformats.org/drawingml/2006/wordprocessingDrawing" xmlns:w10="urn:schemas-microsoft-com:office:word" xmlns:w="http://schemas.openxmlformats.org/wordprocessingml/2006/main" xmlns:w14="http://schemas.microsoft.com/office/word/2010/wordml" xmlns:w15="http://schemas.microsoft.com/office/word/2012/wordml" xmlns:w16cex="http://schemas.microsoft.com/office/word/2018/wordml/cex" xmlns:w16cid="http://schemas.microsoft.com/office/word/2016/wordml/cid" xmlns:w16="http://schemas.microsoft.com/office/word/2018/wordml" xmlns:w16sdtdh="http://schemas.microsoft.com/office/word/2020/wordml/sdtdatahash" xmlns:w16se="http://schemas.microsoft.com/office/word/2015/wordml/symex" xmlns:wpg="http://schemas.microsoft.com/office/word/2010/wordprocessingGroup" xmlns:wpi="http://schemas.microsoft.com/office/word/2010/wordprocessingInk" xmlns:wne="http://schemas.microsoft.com/office/word/2006/wordml" xmlns:wps="http://schemas.microsoft.com/office/word/2010/wordprocessingShape" mc:Ignorable="w14 w15 w16se w16cid w16 w16cex w16sdtdh wp14">
   <w:body>
     <w:p>
       <w:pPr>
@@ -1514,32 +1514,6 @@
         <w:t>Система должна проверять корректность введенных данных при входу</w:t>
       </w:r>
     </w:p>
-    <w:p>
-      <w:pPr>
-        <w:rPr>
-          <w:i/>
-          <w:iCs/>
-          <w:color w:val="EE0000"/>
-        </w:rPr>
-      </w:pPr>
-    </w:p>
-    <w:p>
-      <w:pPr>
-        <w:rPr>
-          <w:i/>
-          <w:iCs/>
-          <w:color w:val="EE0000"/>
-        </w:rPr>
-      </w:pPr>
-      <w:r>
-        <w:rPr>
-          <w:i/>
-          <w:iCs/>
-          <w:color w:val="EE0000"/>
-        </w:rPr>
-        <w:t>Триггер – система должна проверять роль пользователя при совершении дейсвтий доступных определенной роли</w:t>
-      </w:r>
-    </w:p>
     <w:p/>
     <w:p>
       <w:pPr>
@@ -1633,7 +1607,6 @@
         <w:rPr>
           <w:color w:val="000000" w:themeColor="text1"/>
         </w:rPr>
-        <w:lastRenderedPageBreak/>
         <w:t xml:space="preserve">Система должна предоставлять возможность пользователю редактировать имя, фамилию, номер телефона и </w:t>
       </w:r>
       <w:r>
@@ -1686,6 +1659,7 @@
         <w:rPr>
           <w:color w:val="000000" w:themeColor="text1"/>
         </w:rPr>
+        <w:lastRenderedPageBreak/>
         <w:t xml:space="preserve">Система должна предоставлять </w:t>
       </w:r>
       <w:r>
@@ -2223,7 +2197,6 @@
           <w:bCs/>
           <w:lang w:eastAsia="en-GB"/>
         </w:rPr>
-        <w:lastRenderedPageBreak/>
         <w:t>Завершенные заказы</w:t>
       </w:r>
     </w:p>
@@ -2331,6 +2304,7 @@
         <w:rPr>
           <w:lang w:eastAsia="en-GB"/>
         </w:rPr>
+        <w:lastRenderedPageBreak/>
         <w:t>Система должна отображать статус и дату завершения заказа.</w:t>
       </w:r>
     </w:p>
@@ -2643,6 +2617,7 @@
     </w:p>
     <w:p>
       <w:r>
+        <w:lastRenderedPageBreak/>
         <w:t>Система должна предоставлять мастеру возможность просматривать список открытых заявок клиентов</w:t>
       </w:r>
       <w:r>
@@ -2724,43 +2699,6 @@
     <w:p>
       <w:r>
         <w:t>Система должна предоставлять мастеру возможность отозвать свой отклик, пока клиент не выбрал исполнителя</w:t>
-      </w:r>
-    </w:p>
-    <w:p>
-      <w:pPr>
-        <w:pStyle w:val="NormalWeb"/>
-        <w:rPr>
-          <w:rFonts w:ascii="Andale Mono" w:hAnsi="Andale Mono"/>
-          <w:i/>
-          <w:iCs/>
-          <w:color w:val="EE0000"/>
-        </w:rPr>
-      </w:pPr>
-      <w:r>
-        <w:rPr>
-          <w:rStyle w:val="Strong"/>
-          <w:rFonts w:ascii="Andale Mono" w:hAnsi="Andale Mono"/>
-          <w:i/>
-          <w:iCs/>
-          <w:color w:val="EE0000"/>
-        </w:rPr>
-        <w:t>Триггер</w:t>
-      </w:r>
-    </w:p>
-    <w:p>
-      <w:pPr>
-        <w:pStyle w:val="NormalWeb"/>
-        <w:rPr>
-          <w:rFonts w:ascii="Andale Mono" w:hAnsi="Andale Mono"/>
-          <w:color w:val="EE0000"/>
-        </w:rPr>
-      </w:pPr>
-      <w:r>
-        <w:rPr>
-          <w:rFonts w:ascii="Andale Mono" w:hAnsi="Andale Mono"/>
-          <w:color w:val="EE0000"/>
-        </w:rPr>
-        <w:t>Система должна автоматически проверять возможность создания отклика только для активной заявки.</w:t>
       </w:r>
     </w:p>
     <w:p>
@@ -2854,7 +2792,6 @@
         <w:rPr>
           <w:rFonts w:ascii="Andale Mono" w:hAnsi="Andale Mono"/>
         </w:rPr>
-        <w:lastRenderedPageBreak/>
         <w:t>Система должна предоставлять мастеру возможность просматривать активные, завершённые, отменённые заказы</w:t>
       </w:r>
     </w:p>
@@ -2910,6 +2847,7 @@
           <w:b/>
           <w:bCs/>
         </w:rPr>
+        <w:lastRenderedPageBreak/>
         <w:t>Отзывы о мастере</w:t>
       </w:r>
     </w:p>
@@ -3312,7 +3250,6 @@
         <w:rPr>
           <w:lang w:eastAsia="en-GB"/>
         </w:rPr>
-        <w:lastRenderedPageBreak/>
         <w:t>Мастер выбирает заявку и указывает предлагаемую цену и комментарий.</w:t>
       </w:r>
     </w:p>
@@ -11171,7 +11108,7 @@
 </file>
 
 <file path=word/numbering.xml><?xml version="1.0" encoding="utf-8"?>
-<w:numbering xmlns:wpc="http://schemas.microsoft.com/office/word/2010/wordprocessingCanvas" xmlns:cx="http://schemas.microsoft.com/office/drawing/2014/chartex" xmlns:cx1="http://schemas.microsoft.com/office/drawing/2015/9/8/chartex" xmlns:cx2="http://schemas.microsoft.com/office/drawing/2015/10/21/chartex" xmlns:cx3="http://schemas.microsoft.com/office/drawing/2016/5/9/chartex" xmlns:cx4="http://schemas.microsoft.com/office/drawing/2016/5/10/chartex" xmlns:cx5="http://schemas.microsoft.com/office/drawing/2016/5/11/chartex" xmlns:cx6="http://schemas.microsoft.com/office/drawing/2016/5/12/chartex" xmlns:cx7="http://schemas.microsoft.com/office/drawing/2016/5/13/chartex" xmlns:cx8="http://schemas.microsoft.com/office/drawing/2016/5/14/chartex" xmlns:mc="http://schemas.openxmlformats.org/markup-compatibility/2006" xmlns:aink="http://schemas.microsoft.com/office/drawing/2016/ink" xmlns:am3d="http://schemas.microsoft.com/office/drawing/2017/model3d" xmlns:o="urn:schemas-microsoft-com:office:office" xmlns:oel="http://schemas.microsoft.com/office/2019/extlst" xmlns:r="http://schemas.openxmlformats.org/officeDocument/2006/relationships" xmlns:m="http://schemas.openxmlformats.org/officeDocument/2006/math" xmlns:v="urn:schemas-microsoft-com:vml" xmlns:wp14="http://schemas.microsoft.com/office/word/2010/wordprocessingDrawing" xmlns:wp="http://schemas.openxmlformats.org/drawingml/2006/wordprocessingDrawing" xmlns:w10="urn:schemas-microsoft-com:office:word" xmlns:w="http://schemas.openxmlformats.org/wordprocessingml/2006/main" xmlns:w14="http://schemas.microsoft.com/office/word/2010/wordml" xmlns:w15="http://schemas.microsoft.com/office/word/2012/wordml" xmlns:w16cex="http://schemas.microsoft.com/office/word/2018/wordml/cex" xmlns:w16cid="http://schemas.microsoft.com/office/word/2016/wordml/cid" xmlns:w16="http://schemas.microsoft.com/office/word/2018/wordml" xmlns:w16du="http://schemas.microsoft.com/office/word/2023/wordml/word16du" xmlns:w16sdtdh="http://schemas.microsoft.com/office/word/2020/wordml/sdtdatahash" xmlns:w16sdtfl="http://schemas.microsoft.com/office/word/2024/wordml/sdtformatlock" xmlns:w16se="http://schemas.microsoft.com/office/word/2015/wordml/symex" xmlns:wpg="http://schemas.microsoft.com/office/word/2010/wordprocessingGroup" xmlns:wpi="http://schemas.microsoft.com/office/word/2010/wordprocessingInk" xmlns:wne="http://schemas.microsoft.com/office/word/2006/wordml" xmlns:wps="http://schemas.microsoft.com/office/word/2010/wordprocessingShape" mc:Ignorable="w14 w15 w16se w16cid w16 w16cex w16sdtdh w16sdtfl w16du wp14">
+<w:numbering xmlns:wpc="http://schemas.microsoft.com/office/word/2010/wordprocessingCanvas" xmlns:cx="http://schemas.microsoft.com/office/drawing/2014/chartex" xmlns:cx1="http://schemas.microsoft.com/office/drawing/2015/9/8/chartex" xmlns:cx2="http://schemas.microsoft.com/office/drawing/2015/10/21/chartex" xmlns:cx3="http://schemas.microsoft.com/office/drawing/2016/5/9/chartex" xmlns:cx4="http://schemas.microsoft.com/office/drawing/2016/5/10/chartex" xmlns:cx5="http://schemas.microsoft.com/office/drawing/2016/5/11/chartex" xmlns:cx6="http://schemas.microsoft.com/office/drawing/2016/5/12/chartex" xmlns:cx7="http://schemas.microsoft.com/office/drawing/2016/5/13/chartex" xmlns:cx8="http://schemas.microsoft.com/office/drawing/2016/5/14/chartex" xmlns:mc="http://schemas.openxmlformats.org/markup-compatibility/2006" xmlns:aink="http://schemas.microsoft.com/office/drawing/2016/ink" xmlns:am3d="http://schemas.microsoft.com/office/drawing/2017/model3d" xmlns:o="urn:schemas-microsoft-com:office:office" xmlns:r="http://schemas.openxmlformats.org/officeDocument/2006/relationships" xmlns:m="http://schemas.openxmlformats.org/officeDocument/2006/math" xmlns:v="urn:schemas-microsoft-com:vml" xmlns:wp14="http://schemas.microsoft.com/office/word/2010/wordprocessingDrawing" xmlns:wp="http://schemas.openxmlformats.org/drawingml/2006/wordprocessingDrawing" xmlns:w10="urn:schemas-microsoft-com:office:word" xmlns:w="http://schemas.openxmlformats.org/wordprocessingml/2006/main" xmlns:w14="http://schemas.microsoft.com/office/word/2010/wordml" xmlns:w15="http://schemas.microsoft.com/office/word/2012/wordml" xmlns:w16cex="http://schemas.microsoft.com/office/word/2018/wordml/cex" xmlns:w16cid="http://schemas.microsoft.com/office/word/2016/wordml/cid" xmlns:w16="http://schemas.microsoft.com/office/word/2018/wordml" xmlns:w16sdtdh="http://schemas.microsoft.com/office/word/2020/wordml/sdtdatahash" xmlns:w16se="http://schemas.microsoft.com/office/word/2015/wordml/symex" xmlns:wpg="http://schemas.microsoft.com/office/word/2010/wordprocessingGroup" xmlns:wpi="http://schemas.microsoft.com/office/word/2010/wordprocessingInk" xmlns:wne="http://schemas.microsoft.com/office/word/2006/wordml" xmlns:wps="http://schemas.microsoft.com/office/word/2010/wordprocessingShape" mc:Ignorable="w14 w15 w16se w16cid w16 w16cex w16sdtdh wp14">
   <w:abstractNum w:abstractNumId="0" w15:restartNumberingAfterBreak="0">
     <w:nsid w:val="003B1325"/>
     <w:multiLevelType w:val="hybridMultilevel"/>
@@ -16004,133 +15941,133 @@
       </w:rPr>
     </w:lvl>
   </w:abstractNum>
-  <w:num w:numId="1" w16cid:durableId="1149245036">
+  <w:num w:numId="1">
     <w:abstractNumId w:val="20"/>
   </w:num>
-  <w:num w:numId="2" w16cid:durableId="1069380166">
+  <w:num w:numId="2">
     <w:abstractNumId w:val="32"/>
   </w:num>
-  <w:num w:numId="3" w16cid:durableId="1556504257">
+  <w:num w:numId="3">
     <w:abstractNumId w:val="27"/>
   </w:num>
-  <w:num w:numId="4" w16cid:durableId="536741122">
+  <w:num w:numId="4">
     <w:abstractNumId w:val="9"/>
   </w:num>
-  <w:num w:numId="5" w16cid:durableId="674573229">
+  <w:num w:numId="5">
     <w:abstractNumId w:val="29"/>
   </w:num>
-  <w:num w:numId="6" w16cid:durableId="250629259">
+  <w:num w:numId="6">
     <w:abstractNumId w:val="24"/>
   </w:num>
-  <w:num w:numId="7" w16cid:durableId="3746152">
+  <w:num w:numId="7">
     <w:abstractNumId w:val="0"/>
   </w:num>
-  <w:num w:numId="8" w16cid:durableId="1293360851">
+  <w:num w:numId="8">
     <w:abstractNumId w:val="28"/>
   </w:num>
-  <w:num w:numId="9" w16cid:durableId="606160508">
+  <w:num w:numId="9">
     <w:abstractNumId w:val="36"/>
   </w:num>
-  <w:num w:numId="10" w16cid:durableId="206797666">
+  <w:num w:numId="10">
     <w:abstractNumId w:val="15"/>
   </w:num>
-  <w:num w:numId="11" w16cid:durableId="1477646647">
+  <w:num w:numId="11">
     <w:abstractNumId w:val="16"/>
   </w:num>
-  <w:num w:numId="12" w16cid:durableId="583957546">
+  <w:num w:numId="12">
     <w:abstractNumId w:val="12"/>
   </w:num>
-  <w:num w:numId="13" w16cid:durableId="856895347">
+  <w:num w:numId="13">
     <w:abstractNumId w:val="4"/>
   </w:num>
-  <w:num w:numId="14" w16cid:durableId="187959438">
+  <w:num w:numId="14">
     <w:abstractNumId w:val="2"/>
   </w:num>
-  <w:num w:numId="15" w16cid:durableId="571768503">
+  <w:num w:numId="15">
     <w:abstractNumId w:val="37"/>
   </w:num>
-  <w:num w:numId="16" w16cid:durableId="1769740422">
+  <w:num w:numId="16">
     <w:abstractNumId w:val="17"/>
   </w:num>
-  <w:num w:numId="17" w16cid:durableId="2054571575">
+  <w:num w:numId="17">
     <w:abstractNumId w:val="7"/>
   </w:num>
-  <w:num w:numId="18" w16cid:durableId="287931365">
+  <w:num w:numId="18">
     <w:abstractNumId w:val="10"/>
   </w:num>
-  <w:num w:numId="19" w16cid:durableId="2052804559">
+  <w:num w:numId="19">
     <w:abstractNumId w:val="3"/>
   </w:num>
-  <w:num w:numId="20" w16cid:durableId="135757033">
+  <w:num w:numId="20">
     <w:abstractNumId w:val="6"/>
   </w:num>
-  <w:num w:numId="21" w16cid:durableId="1147629526">
+  <w:num w:numId="21">
     <w:abstractNumId w:val="25"/>
   </w:num>
-  <w:num w:numId="22" w16cid:durableId="1721785993">
+  <w:num w:numId="22">
     <w:abstractNumId w:val="21"/>
   </w:num>
-  <w:num w:numId="23" w16cid:durableId="1193835177">
+  <w:num w:numId="23">
     <w:abstractNumId w:val="39"/>
   </w:num>
-  <w:num w:numId="24" w16cid:durableId="61032092">
+  <w:num w:numId="24">
     <w:abstractNumId w:val="18"/>
   </w:num>
-  <w:num w:numId="25" w16cid:durableId="844826513">
+  <w:num w:numId="25">
     <w:abstractNumId w:val="30"/>
   </w:num>
-  <w:num w:numId="26" w16cid:durableId="702874288">
+  <w:num w:numId="26">
     <w:abstractNumId w:val="5"/>
   </w:num>
-  <w:num w:numId="27" w16cid:durableId="849222817">
+  <w:num w:numId="27">
     <w:abstractNumId w:val="41"/>
   </w:num>
-  <w:num w:numId="28" w16cid:durableId="2028017740">
+  <w:num w:numId="28">
     <w:abstractNumId w:val="14"/>
   </w:num>
-  <w:num w:numId="29" w16cid:durableId="1731881896">
+  <w:num w:numId="29">
     <w:abstractNumId w:val="31"/>
   </w:num>
-  <w:num w:numId="30" w16cid:durableId="1713726070">
+  <w:num w:numId="30">
     <w:abstractNumId w:val="1"/>
   </w:num>
-  <w:num w:numId="31" w16cid:durableId="1863400324">
+  <w:num w:numId="31">
     <w:abstractNumId w:val="35"/>
   </w:num>
-  <w:num w:numId="32" w16cid:durableId="1451127149">
+  <w:num w:numId="32">
     <w:abstractNumId w:val="33"/>
   </w:num>
-  <w:num w:numId="33" w16cid:durableId="1753434617">
+  <w:num w:numId="33">
     <w:abstractNumId w:val="8"/>
   </w:num>
-  <w:num w:numId="34" w16cid:durableId="1326319269">
+  <w:num w:numId="34">
     <w:abstractNumId w:val="13"/>
   </w:num>
-  <w:num w:numId="35" w16cid:durableId="1714888635">
+  <w:num w:numId="35">
     <w:abstractNumId w:val="23"/>
   </w:num>
-  <w:num w:numId="36" w16cid:durableId="443574104">
+  <w:num w:numId="36">
     <w:abstractNumId w:val="34"/>
   </w:num>
-  <w:num w:numId="37" w16cid:durableId="830606218">
+  <w:num w:numId="37">
     <w:abstractNumId w:val="22"/>
   </w:num>
-  <w:num w:numId="38" w16cid:durableId="870149209">
+  <w:num w:numId="38">
     <w:abstractNumId w:val="42"/>
   </w:num>
-  <w:num w:numId="39" w16cid:durableId="8917970">
+  <w:num w:numId="39">
     <w:abstractNumId w:val="26"/>
   </w:num>
-  <w:num w:numId="40" w16cid:durableId="1440759888">
+  <w:num w:numId="40">
     <w:abstractNumId w:val="11"/>
   </w:num>
-  <w:num w:numId="41" w16cid:durableId="1522624453">
+  <w:num w:numId="41">
     <w:abstractNumId w:val="38"/>
   </w:num>
-  <w:num w:numId="42" w16cid:durableId="1973441820">
+  <w:num w:numId="42">
     <w:abstractNumId w:val="19"/>
   </w:num>
-  <w:num w:numId="43" w16cid:durableId="1240407185">
+  <w:num w:numId="43">
     <w:abstractNumId w:val="40"/>
   </w:num>
   <w:numIdMacAtCleanup w:val="43"/>
@@ -16138,7 +16075,7 @@
 </file>
 
 <file path=word/styles.xml><?xml version="1.0" encoding="utf-8"?>
-<w:styles xmlns:mc="http://schemas.openxmlformats.org/markup-compatibility/2006" xmlns:r="http://schemas.openxmlformats.org/officeDocument/2006/relationships" xmlns:w="http://schemas.openxmlformats.org/wordprocessingml/2006/main" xmlns:w14="http://schemas.microsoft.com/office/word/2010/wordml" xmlns:w15="http://schemas.microsoft.com/office/word/2012/wordml" xmlns:w16cex="http://schemas.microsoft.com/office/word/2018/wordml/cex" xmlns:w16cid="http://schemas.microsoft.com/office/word/2016/wordml/cid" xmlns:w16="http://schemas.microsoft.com/office/word/2018/wordml" xmlns:w16du="http://schemas.microsoft.com/office/word/2023/wordml/word16du" xmlns:w16sdtdh="http://schemas.microsoft.com/office/word/2020/wordml/sdtdatahash" xmlns:w16sdtfl="http://schemas.microsoft.com/office/word/2024/wordml/sdtformatlock" xmlns:w16se="http://schemas.microsoft.com/office/word/2015/wordml/symex" mc:Ignorable="w14 w15 w16se w16cid w16 w16cex w16sdtdh w16sdtfl w16du">
+<w:styles xmlns:mc="http://schemas.openxmlformats.org/markup-compatibility/2006" xmlns:r="http://schemas.openxmlformats.org/officeDocument/2006/relationships" xmlns:w="http://schemas.openxmlformats.org/wordprocessingml/2006/main" xmlns:w14="http://schemas.microsoft.com/office/word/2010/wordml" xmlns:w15="http://schemas.microsoft.com/office/word/2012/wordml" xmlns:w16cex="http://schemas.microsoft.com/office/word/2018/wordml/cex" xmlns:w16cid="http://schemas.microsoft.com/office/word/2016/wordml/cid" xmlns:w16="http://schemas.microsoft.com/office/word/2018/wordml" xmlns:w16sdtdh="http://schemas.microsoft.com/office/word/2020/wordml/sdtdatahash" xmlns:w16se="http://schemas.microsoft.com/office/word/2015/wordml/symex" mc:Ignorable="w14 w15 w16se w16cid w16 w16cex w16sdtdh">
   <w:docDefaults>
     <w:rPrDefault>
       <w:rPr>

</xml_diff>